<commit_message>
IPO note v2: internal-email tone, xueqiu ceiling as 4-step deduction (frequency/basket/CAC/ad-auction), post-table valuation views (SHEIN band US$20-28bn vs PDD anchor; Mech-Mind through-cycle vs Rokae tactical read)
Co-Authored-By: Claude Fable 5 <noreply@anthropic.com>
</commit_message>
<xml_diff>
--- a/SHEIN_MechMind_HK_IPO_Note.docx
+++ b/SHEIN_MechMind_HK_IPO_Note.docx
@@ -7,7 +7,7 @@
         <w:pStyle w:val="Title"/>
       </w:pPr>
       <w:r>
-        <w:t>SHEIN &amp; Mech-Mind — HK IPO Desk Note</w:t>
+        <w:t>SHEIN &amp; Mech-Mind — HK IPO Note</w:t>
       </w:r>
     </w:p>
     <w:p>
@@ -17,7 +17,12 @@
           <w:color w:val="606060"/>
           <w:sz w:val="19"/>
         </w:rPr>
-        <w:t>Both list Monday 1 September 2026  ·  Note date: 27 August 2026  ·  Returns quoted vs offer price unless stated</w:t>
+        <w:t>Both list Monday 1 Sep 2026  ·  Written 27 Aug 2026  ·  Returns vs offer price unless stated</w:t>
+      </w:r>
+    </w:p>
+    <w:p>
+      <w:r>
+        <w:t>Short version up front: SHEIN is the cheap-looking deal with no buyers and a real ceiling — skip the debut. Mech-Mind is the expensive deal with a 518x retail book and a 7% float — it will pop; the only question is whether you stay for the second act. Detail below.</w:t>
       </w:r>
     </w:p>
     <w:p>
@@ -41,7 +46,7 @@
         <w:pStyle w:val="ListBullet"/>
       </w:pPr>
       <w:r>
-        <w:t xml:space="preserve">Raising ~US$1.7bn at roughly </w:t>
+        <w:t xml:space="preserve">Raising ~US$1.7bn at about </w:t>
       </w:r>
       <w:r>
         <w:rPr>
@@ -50,7 +55,7 @@
         <w:t>US$26.5bn</w:t>
       </w:r>
       <w:r>
-        <w:t xml:space="preserve"> valuation. Guidance is pricing just above midpoint (~HK$48.56); formal price 31 Aug.</w:t>
+        <w:t>. Guidance is pricing just above midpoint (~HK$48.56); formal number out 31 Aug.</w:t>
       </w:r>
     </w:p>
     <w:p>
@@ -58,7 +63,34 @@
         <w:pStyle w:val="ListBullet"/>
       </w:pPr>
       <w:r>
-        <w:t>Third listing attempt; valuation cut repeatedly: US$100bn peak in 2022 → US$35bn target at launch → ~US$26.5bn now.</w:t>
+        <w:t xml:space="preserve">Third attempt at a listing (NY failed, London failed), and each pass has come cheaper: </w:t>
+      </w:r>
+      <w:r>
+        <w:rPr>
+          <w:b/>
+        </w:rPr>
+        <w:t>US$100bn</w:t>
+      </w:r>
+      <w:r>
+        <w:t xml:space="preserve"> in the 2022 round → </w:t>
+      </w:r>
+      <w:r>
+        <w:rPr>
+          <w:b/>
+        </w:rPr>
+        <w:t>US$35bn</w:t>
+      </w:r>
+      <w:r>
+        <w:t xml:space="preserve"> when this roadshow started → </w:t>
+      </w:r>
+      <w:r>
+        <w:rPr>
+          <w:b/>
+        </w:rPr>
+        <w:t>US$26.5bn</w:t>
+      </w:r>
+      <w:r>
+        <w:t xml:space="preserve"> now. When a deal gets marked down twice inside its own bookbuild, the bookrunners are telling you where real demand actually is.</w:t>
       </w:r>
     </w:p>
     <w:p>
@@ -66,15 +98,20 @@
         <w:pStyle w:val="Heading2"/>
       </w:pPr>
       <w:r>
-        <w:t>The structural point, explained (the “upside-down IPO”)</w:t>
+        <w:t>The “upside-down IPO” — what that actually means</w:t>
+      </w:r>
+    </w:p>
+    <w:p>
+      <w:r>
+        <w:t>Worth two minutes because it affects how you think about the cash and the register:</w:t>
       </w:r>
     </w:p>
     <w:p>
       <w:pPr>
-        <w:pStyle w:val="ListBullet"/>
+        <w:pStyle w:val="ListNumber"/>
       </w:pPr>
       <w:r>
-        <w:t xml:space="preserve">SHEIN's 2022–23 fundraises (Series D and D+, at US$66–100bn valuations) came with </w:t>
+        <w:t xml:space="preserve">Background: when Boyu, Tiger, General Atlantic, Mubadala etc. invested in 2022–23, they paid US$66–100bn valuations. Their term sheets carried </w:t>
       </w:r>
       <w:r>
         <w:rPr>
@@ -83,7 +120,7 @@
         <w:t>anti-dilution ratchets</w:t>
       </w:r>
       <w:r>
-        <w:t xml:space="preserve">: if SHEIN lists below those investors' entry price, the company must compensate them so their effective cost resets down to the IPO price. The D+ round is </w:t>
+        <w:t xml:space="preserve"> — if the company ever lists below their entry, it must top them up until their effective cost equals the IPO price. The last round (D+) got the harshest version, a </w:t>
       </w:r>
       <w:r>
         <w:rPr>
@@ -92,58 +129,59 @@
         <w:t>full ratchet</w:t>
       </w:r>
       <w:r>
-        <w:t xml:space="preserve"> — the harshest form, a complete repricing.</w:t>
+        <w:t>: complete repricing, no sharing of the pain.</w:t>
       </w:r>
     </w:p>
     <w:p>
       <w:pPr>
-        <w:pStyle w:val="ListBullet"/>
+        <w:pStyle w:val="ListNumber"/>
       </w:pPr>
       <w:r>
-        <w:t xml:space="preserve">Listing at US$26.5bn — 60–75% below their entry — triggers those clauses in size: roughly </w:t>
+        <w:t xml:space="preserve">Listing at US$26.5bn — 60–75% below what they paid — triggers all of it: roughly </w:t>
       </w:r>
       <w:r>
         <w:rPr>
           <w:b/>
         </w:rPr>
-        <w:t>US$2.2bn in cash adjustments plus ~19.6m free extra shares</w:t>
+        <w:t>US$2.2bn in cash</w:t>
       </w:r>
       <w:r>
-        <w:t xml:space="preserve">, and a further </w:t>
+        <w:t xml:space="preserve">, </w:t>
       </w:r>
       <w:r>
         <w:rPr>
           <w:b/>
         </w:rPr>
-        <w:t>~US$1.33bn in separately negotiated payments</w:t>
+        <w:t>~19.6m free shares</w:t>
       </w:r>
       <w:r>
-        <w:t xml:space="preserve"> to the same investors (Boyu, Tiger, General Atlantic, Mubadala, etc.).</w:t>
-      </w:r>
-    </w:p>
-    <w:p>
-      <w:pPr>
-        <w:pStyle w:val="ListBullet"/>
-      </w:pPr>
-      <w:r>
-        <w:t xml:space="preserve">Total ≈ </w:t>
+        <w:t xml:space="preserve">, plus </w:t>
       </w:r>
       <w:r>
         <w:rPr>
           <w:b/>
         </w:rPr>
-        <w:t>US$3.5bn — about twice what the IPO raises</w:t>
+        <w:t>~US$1.33bn</w:t>
       </w:r>
       <w:r>
-        <w:t>. On listing day, more money flows out to old investors than in from new ones; hence Breakingviews' “upside-down IPO”.</w:t>
+        <w:t xml:space="preserve"> in separately negotiated payments. Call it </w:t>
+      </w:r>
+      <w:r>
+        <w:rPr>
+          <w:b/>
+        </w:rPr>
+        <w:t>US$3.5bn all-in, about double what the IPO raises</w:t>
+      </w:r>
+      <w:r>
+        <w:t>. On day one, more money leaves the company than comes in.</w:t>
       </w:r>
     </w:p>
     <w:p>
       <w:pPr>
-        <w:pStyle w:val="ListBullet"/>
+        <w:pStyle w:val="ListNumber"/>
       </w:pPr>
       <w:r>
-        <w:t>Why it matters: (1) it drains ~24% of the US$14.7bn net cash underpinning the value case; (2) the extra shares dilute new investors at pricing; (3) these holders were made whole by contract, not conviction — once lockups roll off they are natural sellers with a reset cost base sitting at your entry price.</w:t>
+        <w:t>Why you should care: (a) a quarter of the US$14.7bn net cash pile — the main pillar of the value case — walks out the door at pricing; (b) the free shares dilute you before you own a single one; (c) these holders are now made whole by contract, with a cost base reset to exactly your entry. When their lockups roll off, they have no reason to hold. That is a known seller overhang, at your price, on a timer.</w:t>
       </w:r>
     </w:p>
     <w:p>
@@ -159,7 +197,7 @@
         <w:pStyle w:val="ListBullet"/>
       </w:pPr>
       <w:r>
-        <w:t xml:space="preserve">2025 revenue US$41.8bn, up only 8%. Net profit US$2.1bn, </w:t>
+        <w:t xml:space="preserve">2025: revenue US$41.8bn, up only 8%. Net profit US$2.1bn, </w:t>
       </w:r>
       <w:r>
         <w:rPr>
@@ -176,7 +214,7 @@
         <w:pStyle w:val="ListBullet"/>
       </w:pPr>
       <w:r>
-        <w:t>Q1 2026 worse: revenue +1%, small net loss. Cause is the US killing the de minimis exemption — US revenue fell 14%, fulfilment costs jumped ~5 points of order value.</w:t>
+        <w:t>Q1 2026 was worse: revenue +1%, and a small net loss. The cause is not mysterious — the US killed the de minimis exemption, US revenue fell 14%, and fulfilment cost jumped about 5 points of basket value.</w:t>
       </w:r>
     </w:p>
     <w:p>
@@ -184,7 +222,7 @@
         <w:pStyle w:val="ListBullet"/>
       </w:pPr>
       <w:r>
-        <w:t>Net cash ~US$14.7bn (before the ~US$3.5bn ratchet payout above).</w:t>
+        <w:t>Balance sheet is the bright spot: ~US$14.7bn net cash (before the ratchet payout above).</w:t>
       </w:r>
     </w:p>
     <w:p>
@@ -192,7 +230,7 @@
         <w:pStyle w:val="Heading2"/>
       </w:pPr>
       <w:r>
-        <w:t>What's its edge — and is it intact?</w:t>
+        <w:t>The edge — real, but being taxed away</w:t>
       </w:r>
     </w:p>
     <w:p>
@@ -200,7 +238,7 @@
         <w:pStyle w:val="ListBullet"/>
       </w:pPr>
       <w:r>
-        <w:t xml:space="preserve">The real moat is the </w:t>
+        <w:t xml:space="preserve">The genuine moat is the </w:t>
       </w:r>
       <w:r>
         <w:rPr>
@@ -209,7 +247,7 @@
         <w:t>on-demand supply chain</w:t>
       </w:r>
       <w:r>
-        <w:t>: ~7,500 contract factories producing initial runs of just 100–200 units, scaling only what sells. Inventory turns ~10x a year versus 2–3x for Zara/H&amp;M, on a 36-day cycle. Nobody else runs fast fashion with essentially no inventory risk — this is why it earns a 68% gross margin at US$8 price points.</w:t>
+        <w:t>: ~7,500 contract factories, first runs of only 100–200 units, scale up only what sells. Inventory turns ~10x a year versus 2–3x at Zara/H&amp;M. Nobody else runs fashion with essentially zero inventory risk — that is how a US$8 top carries a 68% gross margin.</w:t>
       </w:r>
     </w:p>
     <w:p>
@@ -217,16 +255,16 @@
         <w:pStyle w:val="ListBullet"/>
       </w:pPr>
       <w:r>
-        <w:t xml:space="preserve">But the moat is </w:t>
+        <w:t xml:space="preserve">The problem: the moat only works </w:t>
       </w:r>
       <w:r>
         <w:rPr>
           <w:b/>
         </w:rPr>
-        <w:t>geography-dependent</w:t>
+        <w:t>because production sits in China</w:t>
       </w:r>
       <w:r>
-        <w:t>: it works because production sits in China. Tariffs force localized warehousing and sourcing (Brazil, Turkey, EU DCs), which dilutes exactly the arbitrage that makes the model special — while Temu and Amazon Haul copy the playbook with deeper pockets.</w:t>
+        <w:t>. Tariffs force local warehouses and local sourcing (Brazil, Turkey, EU), which unwinds exactly the arbitrage that makes the model special — and Temu and Amazon Haul are copying the playbook with deeper pockets while it happens.</w:t>
       </w:r>
     </w:p>
     <w:p>
@@ -234,91 +272,91 @@
         <w:pStyle w:val="Heading2"/>
       </w:pPr>
       <w:r>
-        <w:t>The ceiling (the xueqiu thesis — we agree with it)</w:t>
+        <w:t>Why growth is capped — the xueqiu argument, step by step</w:t>
       </w:r>
     </w:p>
     <w:p>
       <w:r>
-        <w:t xml:space="preserve">The xueqiu piece (“SHEIN上市，TEMU的利润账终于能算了”) makes the sharpest argument on this deal: SHEIN's prospectus is the first audited proof that low-price cross-border e-commerce is structurally profitable — but the same numbers show the model has a </w:t>
+        <w:t>The xueqiu piece on the prospectus is the best thing written on this deal. Its point is that SHEIN's own numbers prove the model works — and also prove it has a ceiling. The logic runs in four steps:</w:t>
+      </w:r>
+    </w:p>
+    <w:p>
+      <w:pPr>
+        <w:pStyle w:val="ListNumber"/>
+      </w:pPr>
+      <w:r>
+        <w:rPr>
+          <w:b/>
+        </w:rPr>
+        <w:t>Advertising cannot change purchase frequency (~4 orders/user/year).</w:t>
+      </w:r>
+      <w:r>
+        <w:t xml:space="preserve"> Clothes are seasonal, low-frequency purchases — not food delivery. People restock a wardrobe about four times a year, and no amount of TikTok retargeting turns that into twenty. Past a point, ads aimed at existing users are just noise; they don't create extra orders.</w:t>
+      </w:r>
+    </w:p>
+    <w:p>
+      <w:pPr>
+        <w:pStyle w:val="ListNumber"/>
+      </w:pPr>
+      <w:r>
+        <w:rPr>
+          <w:b/>
+        </w:rPr>
+        <w:t>Advertising cannot lift the basket either (~US$39/order).</w:t>
+      </w:r>
+      <w:r>
+        <w:t xml:space="preserve"> The entire brand promise is “extremely cheap” — US$5–10 tops. Users come precisely to bargain-hunt, so the basket is pinned around US$39. You cannot market a polyester-basics platform into a higher price point without breaking the reason people come.</w:t>
+      </w:r>
+    </w:p>
+    <w:p>
+      <w:pPr>
+        <w:pStyle w:val="ListNumber"/>
+      </w:pPr>
+      <w:r>
+        <w:rPr>
+          <w:b/>
+        </w:rPr>
+        <w:t>With frequency and basket both fixed, growth can only come from new users — and the cheap ones are gone.</w:t>
+      </w:r>
+      <w:r>
+        <w:t xml:space="preserve"> 273m active users across ~160 markets means the natural audience (young, price-sensitive, easy to convert) has already been acquired once. Whoever is left either doesn't want fast fashion, wants better quality, or is the wrong demographic. Converting them costs multiples of what the first 273m cost.</w:t>
+      </w:r>
+    </w:p>
+    <w:p>
+      <w:pPr>
+        <w:pStyle w:val="ListNumber"/>
+      </w:pPr>
+      <w:r>
+        <w:rPr>
+          <w:b/>
+        </w:rPr>
+        <w:t>And the ad auction itself got more expensive.</w:t>
+      </w:r>
+      <w:r>
+        <w:t xml:space="preserve"> Digital ads are a bidding market. Temu's global spending spree pushed Google/Meta CPMs up for everyone, so SHEIN had to spend </w:t>
       </w:r>
       <w:r>
         <w:rPr>
           <w:b/>
         </w:rPr>
-        <w:t>built-in ceiling</w:t>
+        <w:t>+48.9%</w:t>
       </w:r>
       <w:r>
-        <w:t>:</w:t>
+        <w:t xml:space="preserve"> just to keep its slots — and all that bought was </w:t>
       </w:r>
-    </w:p>
-    <w:p>
-      <w:pPr>
-        <w:pStyle w:val="ListBullet"/>
-      </w:pPr>
       <w:r>
         <w:rPr>
           <w:b/>
         </w:rPr>
-        <w:t>Frequency is capped by the category.</w:t>
+        <w:t>+8%</w:t>
       </w:r>
       <w:r>
-        <w:t xml:space="preserve"> Fashion buyers order ~4 times a year at ~US$39 a basket, and no amount of spend changes that. So growth can only come from new users — and with 273m active users across ~160 markets, the cheap users are already acquired.</w:t>
+        <w:t xml:space="preserve"> revenue. Marketing went from 10.7% to 14.8% of revenue not as a phase, but as the new steady state.</w:t>
       </w:r>
     </w:p>
     <w:p>
-      <w:pPr>
-        <w:pStyle w:val="ListBullet"/>
-      </w:pPr>
       <w:r>
-        <w:rPr>
-          <w:b/>
-        </w:rPr>
-        <w:t>Because frequency is fixed, marketing never dilutes.</w:t>
-      </w:r>
-      <w:r>
-        <w:t xml:space="preserve"> Marketing ratio rose from 10.7% to 14.8% of revenue while growth collapsed: spend +48.9% YoY bought only +8% revenue. SHEIN is buying growth it is not getting — the ratio is structural, not a phase.</w:t>
-      </w:r>
-    </w:p>
-    <w:p>
-      <w:pPr>
-        <w:pStyle w:val="ListBullet"/>
-      </w:pPr>
-      <w:r>
-        <w:rPr>
-          <w:b/>
-        </w:rPr>
-        <w:t>Fulfilment economics are going the wrong way.</w:t>
-      </w:r>
-      <w:r>
-        <w:t xml:space="preserve"> US$17.7 per order = 45.6% of basket value, pushed to 47.7% once de minimis died. The fix — local warehouses and local inventory — breaks the zero-inventory model that is the moat in the first place.</w:t>
-      </w:r>
-    </w:p>
-    <w:p>
-      <w:pPr>
-        <w:pStyle w:val="ListBullet"/>
-      </w:pPr>
-      <w:r>
-        <w:rPr>
-          <w:b/>
-        </w:rPr>
-        <w:t>The category cap is also a strategy cap.</w:t>
-      </w:r>
-      <w:r>
-        <w:t xml:space="preserve"> The on-demand supply chain is uniquely suited to fashion; extending into general merchandise means fighting Temu and Amazon head-on without the supply-chain edge.</w:t>
-      </w:r>
-    </w:p>
-    <w:p>
-      <w:pPr>
-        <w:pStyle w:val="ListBullet"/>
-      </w:pPr>
-      <w:r>
-        <w:rPr>
-          <w:b/>
-        </w:rPr>
-        <w:t>Conclusion we endorse:</w:t>
-      </w:r>
-      <w:r>
-        <w:t xml:space="preserve"> the prospectus validates the economics (~4.1% operating margin at ~US$50bn GMV) but growth is structurally bounded. SHEIN is the proof of concept; </w:t>
+        <w:t xml:space="preserve">Put the four together: revenue is capped by category physics, the marketing ratio is structural, and fulfilment economics are deteriorating on top (45.6% of basket → 47.7% post-de-minimis, and the fix — local inventory — breaks the zero-inventory moat itself). The prospectus validates the economics (~4.1% operating margin at ~US$50bn GMV) and simultaneously shows the growth is bounded. The read-through the article draws, which we agree with: SHEIN is the proof of concept, </w:t>
       </w:r>
       <w:r>
         <w:rPr>
@@ -327,7 +365,7 @@
         <w:t>TEMU is the beneficiary</w:t>
       </w:r>
       <w:r>
-        <w:t xml:space="preserve"> — multi-category means 10+ orders/user/year potential, a platform take-rate, and a local-fulfilment pivot already underway. At 13x earnings the market is pricing SHEIN's ceiling roughly correctly: fair, not mispriced.</w:t>
+        <w:t xml:space="preserve"> — multi-category means real frequency (10+ orders/year possible), a platform take-rate instead of 1P inventory, and a local-fulfilment pivot already underway.</w:t>
       </w:r>
     </w:p>
     <w:p>
@@ -335,7 +373,7 @@
         <w:pStyle w:val="Heading2"/>
       </w:pPr>
       <w:r>
-        <w:t>Valuation</w:t>
+        <w:t>Valuation — and where it should trade</w:t>
       </w:r>
     </w:p>
     <w:tbl>
@@ -357,14 +395,11 @@
             <w:tcW w:type="dxa" w:w="3168"/>
           </w:tcPr>
           <w:p>
-            <w:r>
-              <w:rPr>
-                <w:sz w:val="19"/>
-              </w:rPr>
-            </w:r>
+            <w:r/>
             <w:r>
               <w:rPr>
                 <w:b/>
+                <w:sz w:val="19"/>
               </w:rPr>
             </w:r>
           </w:p>
@@ -374,14 +409,11 @@
             <w:tcW w:type="dxa" w:w="1872"/>
           </w:tcPr>
           <w:p>
-            <w:r>
-              <w:rPr>
-                <w:sz w:val="19"/>
-              </w:rPr>
-            </w:r>
+            <w:r/>
             <w:r>
               <w:rPr>
                 <w:b/>
+                <w:sz w:val="19"/>
               </w:rPr>
               <w:t>Trailing P/E</w:t>
             </w:r>
@@ -392,14 +424,11 @@
             <w:tcW w:type="dxa" w:w="1296"/>
           </w:tcPr>
           <w:p>
-            <w:r>
-              <w:rPr>
-                <w:sz w:val="19"/>
-              </w:rPr>
-            </w:r>
+            <w:r/>
             <w:r>
               <w:rPr>
                 <w:b/>
+                <w:sz w:val="19"/>
               </w:rPr>
               <w:t>P/S</w:t>
             </w:r>
@@ -410,14 +439,11 @@
             <w:tcW w:type="dxa" w:w="2304"/>
           </w:tcPr>
           <w:p>
-            <w:r>
-              <w:rPr>
-                <w:sz w:val="19"/>
-              </w:rPr>
-            </w:r>
+            <w:r/>
             <w:r>
               <w:rPr>
                 <w:b/>
+                <w:sz w:val="19"/>
               </w:rPr>
               <w:t>EV/Sales</w:t>
             </w:r>
@@ -428,14 +454,11 @@
             <w:tcW w:type="dxa" w:w="1872"/>
           </w:tcPr>
           <w:p>
-            <w:r>
-              <w:rPr>
-                <w:sz w:val="19"/>
-              </w:rPr>
-            </w:r>
+            <w:r/>
             <w:r>
               <w:rPr>
                 <w:b/>
+                <w:sz w:val="19"/>
               </w:rPr>
               <w:t>Rev growth</w:t>
             </w:r>
@@ -552,7 +575,7 @@
               <w:rPr>
                 <w:sz w:val="19"/>
               </w:rPr>
-              <w:t>PDD (the real comp)</w:t>
+              <w:t>PDD (closest business)</w:t>
             </w:r>
           </w:p>
         </w:tc>
@@ -1012,7 +1035,7 @@
               <w:rPr>
                 <w:sz w:val="19"/>
               </w:rPr>
-              <w:t>Reference: Bloomberg Intelligence fair value</w:t>
+              <w:t>Bloomberg Intelligence fair value</w:t>
             </w:r>
           </w:p>
         </w:tc>
@@ -1074,11 +1097,61 @@
     </w:tbl>
     <w:p/>
     <w:p>
+      <w:r>
+        <w:t xml:space="preserve">How to read this: the lazy take is “13x is half of H&amp;M, so it's cheap.” We'd read it the other way. The closest business in the table is </w:t>
+      </w:r>
+      <w:r>
+        <w:rPr>
+          <w:b/>
+        </w:rPr>
+        <w:t>PDD</w:t>
+      </w:r>
+      <w:r>
+        <w:t xml:space="preserve"> — China-sourced, low-price, cross-border, same tariff exposure — and PDD is bigger, growing faster, more profitable, holding more cash, and trades at </w:t>
+      </w:r>
+      <w:r>
+        <w:rPr>
+          <w:b/>
+        </w:rPr>
+        <w:t>9.5x</w:t>
+      </w:r>
+      <w:r>
+        <w:t xml:space="preserve">. Against that anchor, SHEIN at 12.9x is </w:t>
+      </w:r>
+      <w:r>
+        <w:rPr>
+          <w:b/>
+        </w:rPr>
+        <w:t>not cheap; it's a premium to its best comp</w:t>
+      </w:r>
+      <w:r>
+        <w:t xml:space="preserve">. It clearly should not get H&amp;M's 22x either: H&amp;M has no growth ceiling being freshly discovered, no WVR governance discount, no ratchet overhang, and pays a dividend. So the deserved band is between the two — call it </w:t>
+      </w:r>
+      <w:r>
+        <w:rPr>
+          <w:b/>
+        </w:rPr>
+        <w:t>10–14x on ~US$2bn of normalised earnings, i.e. US$20–28bn fair value</w:t>
+      </w:r>
+      <w:r>
+        <w:t xml:space="preserve">. The deal at US$26.5bn prices at the </w:t>
+      </w:r>
+      <w:r>
+        <w:rPr>
+          <w:b/>
+        </w:rPr>
+        <w:t>top of the fair band</w:t>
+      </w:r>
+      <w:r>
+        <w:t>, and above BI's US$22–25bn. There is no mispricing here to harvest — which is precisely why the book is cold.</w:t>
+      </w:r>
+    </w:p>
+    <w:p>
       <w:pPr>
         <w:pStyle w:val="Heading2"/>
       </w:pPr>
       <w:r>
-        <w:t>Sentiment and flow — both weak</w:t>
+        <w:t>Sentiment and flow</w:t>
       </w:r>
     </w:p>
     <w:p>
@@ -1095,7 +1168,7 @@
         <w:t>~3x covered</w:t>
       </w:r>
       <w:r>
-        <w:t>; a mid-cap appliance deal the same week did 188x. Retail passed.</w:t>
+        <w:t>. For scale: a mid-cap appliance deal the same week did 188x. Retail looked and passed.</w:t>
       </w:r>
     </w:p>
     <w:p>
@@ -1103,7 +1176,7 @@
         <w:pStyle w:val="ListBullet"/>
       </w:pPr>
       <w:r>
-        <w:t>Institutional book “covered” day one, but no multiple leaked; buyers are existing shareholders and China-focused funds. Cornerstones (Tencent, Boyu, Taikang — 21% of deal) read supportive, not enthusiastic.</w:t>
+        <w:t>Institutional book “covered” day one — but no multiple ever leaked, and the buyers named are existing shareholders and China-focused funds. The cornerstone list (Tencent, Boyu, Taikang; 21% of deal) reads as support, not appetite.</w:t>
       </w:r>
     </w:p>
     <w:p>
@@ -1111,7 +1184,7 @@
         <w:pStyle w:val="ListBullet"/>
       </w:pPr>
       <w:r>
-        <w:t>Analyst tone cautious across the board: uSMART's Dickie Wong “not that positive… growth has slowed a lot”; Coresight sees ~2% growth in 2026.</w:t>
+        <w:t>Street tone is uniformly lukewarm — uSMART's Dickie Wong: “not that positive… growth has slowed a lot”; Coresight models ~2% growth for 2026.</w:t>
       </w:r>
     </w:p>
     <w:p>
@@ -1119,16 +1192,16 @@
         <w:pStyle w:val="ListBullet"/>
       </w:pPr>
       <w:r>
-        <w:t xml:space="preserve">Flow catch: SHEIN has weighted voting rights, so no Stock Connect fast-entry — </w:t>
+        <w:t xml:space="preserve">And the flow catch: SHEIN is a WVR stock, so no Connect fast-entry — </w:t>
       </w:r>
       <w:r>
         <w:rPr>
           <w:b/>
         </w:rPr>
-        <w:t>southbound money is locked out until ~March 2027</w:t>
+        <w:t>southbound money is locked out until roughly March 2027</w:t>
       </w:r>
       <w:r>
-        <w:t>.</w:t>
+        <w:t>. The one natural marginal buyer can't show up for six months.</w:t>
       </w:r>
     </w:p>
     <w:p>
@@ -1136,7 +1209,7 @@
         <w:pStyle w:val="Heading2"/>
       </w:pPr>
       <w:r>
-        <w:t>Our view</w:t>
+        <w:t>View</w:t>
       </w:r>
     </w:p>
     <w:p>
@@ -1144,7 +1217,7 @@
         <w:pStyle w:val="ListBullet"/>
       </w:pPr>
       <w:r>
-        <w:t>No pop expected — flat to ±5% debut, then a heavy tape.</w:t>
+        <w:t>No pop — flat to ±5% on debut, then a heavy tape with no catalyst until H2 results (does the tariff hit annualise?) or the Connect window next March.</w:t>
       </w:r>
     </w:p>
     <w:p>
@@ -1152,24 +1225,16 @@
         <w:pStyle w:val="ListBullet"/>
       </w:pPr>
       <w:r>
-        <w:t>No catalyst until H2 results prove the tariff hit is digested, or the Connect window opens in March 2027.</w:t>
-      </w:r>
-    </w:p>
-    <w:p>
-      <w:pPr>
-        <w:pStyle w:val="ListBullet"/>
-      </w:pPr>
-      <w:r>
-        <w:t xml:space="preserve">The cleaner expression of the validated-economics thesis is </w:t>
+        <w:t xml:space="preserve">If you like the validated-economics story, </w:t>
       </w:r>
       <w:r>
         <w:rPr>
           <w:b/>
         </w:rPr>
-        <w:t>long PDD</w:t>
+        <w:t>buy PDD instead</w:t>
       </w:r>
       <w:r>
-        <w:t xml:space="preserve"> — it owns the ceiling-free version of the model.</w:t>
+        <w:t xml:space="preserve"> — it owns the version of the model without the ceiling, at a cheaper multiple.</w:t>
       </w:r>
     </w:p>
     <w:p>
@@ -1193,7 +1258,16 @@
         <w:pStyle w:val="ListBullet"/>
       </w:pPr>
       <w:r>
-        <w:t>3D vision + AI software for industrial robots — the “eyes and brain”, not the robot itself.</w:t>
+        <w:t xml:space="preserve">3D vision plus AI software for industrial robots — it sells the </w:t>
+      </w:r>
+      <w:r>
+        <w:rPr>
+          <w:b/>
+        </w:rPr>
+        <w:t>eyes and brain</w:t>
+      </w:r>
+      <w:r>
+        <w:t>, not the robot.</w:t>
       </w:r>
     </w:p>
     <w:p>
@@ -1201,7 +1275,7 @@
         <w:pStyle w:val="ListBullet"/>
       </w:pPr>
       <w:r>
-        <w:t>Raising ~HK$2.3bn at HK$95.30–101.70, market cap ~HK$12.7bn (~US$1.6bn); will price at the top.</w:t>
+        <w:t>Raising ~HK$2.3bn at HK$95.30–101.70; market cap ~HK$12.7bn (~US$1.6bn). Will price at the top.</w:t>
       </w:r>
     </w:p>
     <w:p>
@@ -1218,7 +1292,7 @@
         <w:t>64% of the deal</w:t>
       </w:r>
       <w:r>
-        <w:t xml:space="preserve"> — Baillie Gifford US$60m lead, plus Taikang, Jane Street, E Fund, and a </w:t>
+        <w:t xml:space="preserve"> — Baillie Gifford leads with US$60m, alongside Taikang, Jane Street, E Fund and a </w:t>
       </w:r>
       <w:r>
         <w:rPr>
@@ -1227,7 +1301,16 @@
         <w:t>BYD subsidiary</w:t>
       </w:r>
       <w:r>
-        <w:t xml:space="preserve"> (customer validation inside the book). Post-cornerstone free float ~7% of market cap.</w:t>
+        <w:t xml:space="preserve"> (a customer putting money in the book, which is worth more than any broker note). After cornerstones, free float is roughly </w:t>
+      </w:r>
+      <w:r>
+        <w:rPr>
+          <w:b/>
+        </w:rPr>
+        <w:t>7% of market cap</w:t>
+      </w:r>
+      <w:r>
+        <w:t>.</w:t>
       </w:r>
     </w:p>
     <w:p>
@@ -1235,7 +1318,7 @@
         <w:pStyle w:val="ListBullet"/>
       </w:pPr>
       <w:r>
-        <w:t xml:space="preserve">Retail margin book </w:t>
+        <w:t xml:space="preserve">Retail is already all over it: margin book </w:t>
       </w:r>
       <w:r>
         <w:rPr>
@@ -1244,7 +1327,7 @@
         <w:t>518x covered</w:t>
       </w:r>
       <w:r>
-        <w:t xml:space="preserve"> with a day still to go.</w:t>
+        <w:t xml:space="preserve"> with a day still to run.</w:t>
       </w:r>
     </w:p>
     <w:p>
@@ -1260,7 +1343,7 @@
         <w:pStyle w:val="ListBullet"/>
       </w:pPr>
       <w:r>
-        <w:t xml:space="preserve">Revenue growing ~45%/year and accelerating — </w:t>
+        <w:t xml:space="preserve">Revenue compounding ~45% a year and accelerating — </w:t>
       </w:r>
       <w:r>
         <w:rPr>
@@ -1286,7 +1369,7 @@
         <w:t>65%</w:t>
       </w:r>
       <w:r>
-        <w:t>, software-like; hardware robot peers run 20–40%.</w:t>
+        <w:t xml:space="preserve"> — software economics, where the hardware robot names run 20–40%.</w:t>
       </w:r>
     </w:p>
     <w:p>
@@ -1294,7 +1377,7 @@
         <w:pStyle w:val="ListBullet"/>
       </w:pPr>
       <w:r>
-        <w:t>Half of revenue now overseas (Japan, US, Europe) at better margins than domestic.</w:t>
+        <w:t>Half of revenue is now overseas (Japan, US, Europe) at better margins than domestic — rare for a Chinese industrial name at this size.</w:t>
       </w:r>
     </w:p>
     <w:p>
@@ -1302,7 +1385,7 @@
         <w:pStyle w:val="ListBullet"/>
       </w:pPr>
       <w:r>
-        <w:t>Adjusted loss shrinking fast (RMB 334m → 109m → 33m in Q1), though still loss-making; 80% of sales via system integrators; pre-deal cash was thin — the IPO was needed, not optional.</w:t>
+        <w:t>Still loss-making, but the adjusted loss is collapsing: RMB 334m → 109m → 33m in Q1 alone. Two flags worth remembering: 80% of sales run through system integrators (it doesn't fully own its customers), and pre-deal cash was thin — this IPO was needed, not opportunistic.</w:t>
       </w:r>
     </w:p>
     <w:p>
@@ -1310,7 +1393,7 @@
         <w:pStyle w:val="Heading2"/>
       </w:pPr>
       <w:r>
-        <w:t>What's its edge — does it deserve the premium?</w:t>
+        <w:t>The edge — why it's not just another robotics deal</w:t>
       </w:r>
     </w:p>
     <w:p>
@@ -1321,10 +1404,10 @@
         <w:rPr>
           <w:b/>
         </w:rPr>
-        <w:t>Category leader by a wide margin</w:t>
+        <w:t>It's the category leader by a distance</w:t>
       </w:r>
       <w:r>
-        <w:t>: &gt;27% global share by shipments in AI-powered 3D vision components — more than the next four competitors combined, and #1 in China, Japan and North America simultaneously. In a fragmented, young market that is a real scarcity claim.</w:t>
+        <w:t>: over 27% global share by shipments in AI 3D-vision components — more than the next four competitors combined — and #1 in China, Japan and North America at the same time. In a young, fragmented market, that is a real claim.</w:t>
       </w:r>
     </w:p>
     <w:p>
@@ -1335,10 +1418,10 @@
         <w:rPr>
           <w:b/>
         </w:rPr>
-        <w:t>Full-stack and data-compounding</w:t>
+        <w:t>The moat compounds</w:t>
       </w:r>
       <w:r>
-        <w:t>: it makes the camera (Mech-Eye), the software (Mech-Vision) and the AI model (Mech-GPT), all self-developed and trained on data from 27,000+ deployed units across 1,600 customers. Repeat customers already generate 86% of revenue — real stickiness, and an installed-base data flywheel a new entrant cannot shortcut.</w:t>
+        <w:t>: it builds the camera (Mech-Eye), the software (Mech-Vision) and the AI model (Mech-GPT) in-house, trained on data from 27,000+ deployed units at 1,600 customers. 86% of revenue already comes from repeat customers. A new entrant can copy the camera; it cannot shortcut the installed-base data.</w:t>
       </w:r>
     </w:p>
     <w:p>
@@ -1349,10 +1432,10 @@
         <w:rPr>
           <w:b/>
         </w:rPr>
-        <w:t>Scarcity on the exchange itself</w:t>
+        <w:t>And it's the only listed way to play the layer</w:t>
       </w:r>
       <w:r>
-        <w:t>: no other listed pure-play on robot perception exists. UBTech/Dobot/Rokae sell bodies, Horizon sells auto chips — Mech-Mind is the only “picks and shovels on every robot's eyes” ticket in HK, and scarcity names get paid in this market.</w:t>
+        <w:t>: UBTech, Dobot, Rokae sell robot bodies; Horizon sells auto chips. There is no other pure-play on robot perception on any exchange — the picks-and-shovels ticket on every humanoid program. Scarcity gets paid in this market.</w:t>
       </w:r>
     </w:p>
     <w:p>
@@ -1360,7 +1443,7 @@
         <w:pStyle w:val="ListBullet"/>
       </w:pPr>
       <w:r>
-        <w:t xml:space="preserve">Honest caveat: the moat is share + data + integration speed, </w:t>
+        <w:t xml:space="preserve">Being fair about the limits: the moat is share, data and speed — </w:t>
       </w:r>
       <w:r>
         <w:rPr>
@@ -1369,7 +1452,7 @@
         <w:t>not patents or locked-in contracts</w:t>
       </w:r>
       <w:r>
-        <w:t xml:space="preserve"> — Keyence and Cognex could push down into the niche, and 80% integrator-channel dependence means it does not fully own its customer relationships. It deserves a premium; whether it deserves the top-of-market premium is the whole debate.</w:t>
+        <w:t>. Keyence or Cognex could push down into the niche, and the integrator channel means the customer relationship is one step removed. It deserves a premium; whether it deserves the biggest premium in the sector is the debate the price forces.</w:t>
       </w:r>
     </w:p>
     <w:p>
@@ -1377,7 +1460,7 @@
         <w:pStyle w:val="Heading2"/>
       </w:pPr>
       <w:r>
-        <w:t>Is the secular trend good? Yes, genuinely</w:t>
+        <w:t>The secular trend — yes, it's real</w:t>
       </w:r>
     </w:p>
     <w:p>
@@ -1385,16 +1468,16 @@
         <w:pStyle w:val="ListBullet"/>
       </w:pPr>
       <w:r>
-        <w:t xml:space="preserve">3D vision penetration on China's industrial robots is only </w:t>
+        <w:t xml:space="preserve">3D vision sits on only </w:t>
       </w:r>
       <w:r>
         <w:rPr>
           <w:b/>
         </w:rPr>
-        <w:t>~7% today</w:t>
+        <w:t>~7% of China's industrial robots</w:t>
       </w:r>
       <w:r>
-        <w:t>, rising — early innings of a real adoption curve (GGII: 6.75% 2025 → 8.24% 2026e).</w:t>
+        <w:t xml:space="preserve"> today, heading to 8%+ next year — this is early on a genuine adoption curve, not a mature market being re-rated.</w:t>
       </w:r>
     </w:p>
     <w:p>
@@ -1402,7 +1485,7 @@
         <w:pStyle w:val="ListBullet"/>
       </w:pPr>
       <w:r>
-        <w:t>Every humanoid program (UBTech on BYD lines, Unitree, Tesla Optimus) needs vision systems — a direct tailwind for exactly what it sells.</w:t>
+        <w:t>Every humanoid program on earth (UBTech on BYD's lines, Unitree, Tesla Optimus) needs vision systems. Their ramp is a direct order book for exactly what Mech-Mind sells.</w:t>
       </w:r>
     </w:p>
     <w:p>
@@ -1410,7 +1493,16 @@
         <w:pStyle w:val="ListBullet"/>
       </w:pPr>
       <w:r>
-        <w:t>The risk is China supply-side, not demand: price wars have started in humanoids, the NDRC has warned on overcrowding, and Lenovo Capital expects a shakeout of ~370 robotics startups. Mech-Mind's 65% margin says it is escaping commoditization so far — but the IPO price already assumes that continues.</w:t>
+        <w:t xml:space="preserve">The risk is China supply-side, not demand: price wars have already started in humanoids, the NDRC has publicly warned about overcrowding, and Lenovo Capital is calling a shakeout across ~370 robotics startups. Mech-Mind's 65% margin says it has escaped commoditisation </w:t>
+      </w:r>
+      <w:r>
+        <w:rPr>
+          <w:b/>
+        </w:rPr>
+        <w:t>so far</w:t>
+      </w:r>
+      <w:r>
+        <w:t xml:space="preserve"> — but the IPO price assumes that continues.</w:t>
       </w:r>
     </w:p>
     <w:p>
@@ -1418,7 +1510,7 @@
         <w:pStyle w:val="Heading2"/>
       </w:pPr>
       <w:r>
-        <w:t>Valuation</w:t>
+        <w:t>Valuation — and where it should trade</w:t>
       </w:r>
     </w:p>
     <w:tbl>
@@ -1439,14 +1531,11 @@
             <w:tcW w:type="dxa" w:w="3312"/>
           </w:tcPr>
           <w:p>
-            <w:r>
-              <w:rPr>
-                <w:sz w:val="19"/>
-              </w:rPr>
-            </w:r>
+            <w:r/>
             <w:r>
               <w:rPr>
                 <w:b/>
+                <w:sz w:val="19"/>
               </w:rPr>
             </w:r>
           </w:p>
@@ -1456,14 +1545,11 @@
             <w:tcW w:type="dxa" w:w="2736"/>
           </w:tcPr>
           <w:p>
-            <w:r>
-              <w:rPr>
-                <w:sz w:val="19"/>
-              </w:rPr>
-            </w:r>
+            <w:r/>
             <w:r>
               <w:rPr>
                 <w:b/>
+                <w:sz w:val="19"/>
               </w:rPr>
               <w:t>Trailing P/S</w:t>
             </w:r>
@@ -1474,14 +1560,11 @@
             <w:tcW w:type="dxa" w:w="1872"/>
           </w:tcPr>
           <w:p>
-            <w:r>
-              <w:rPr>
-                <w:sz w:val="19"/>
-              </w:rPr>
-            </w:r>
+            <w:r/>
             <w:r>
               <w:rPr>
                 <w:b/>
+                <w:sz w:val="19"/>
               </w:rPr>
               <w:t>Rev growth</w:t>
             </w:r>
@@ -1492,14 +1575,11 @@
             <w:tcW w:type="dxa" w:w="3456"/>
           </w:tcPr>
           <w:p>
-            <w:r>
-              <w:rPr>
-                <w:sz w:val="19"/>
-              </w:rPr>
-            </w:r>
+            <w:r/>
             <w:r>
               <w:rPr>
                 <w:b/>
+                <w:sz w:val="19"/>
               </w:rPr>
               <w:t>Note</w:t>
             </w:r>
@@ -1629,7 +1709,7 @@
               <w:rPr>
                 <w:sz w:val="19"/>
               </w:rPr>
-              <w:t xml:space="preserve"> (~19x on H1-26 annualized)</w:t>
+              <w:t xml:space="preserve"> (~19x on H1-26 annualised)</w:t>
             </w:r>
           </w:p>
         </w:tc>
@@ -1833,7 +1913,7 @@
               <w:rPr>
                 <w:sz w:val="19"/>
               </w:rPr>
-              <w:t>Keyence (quality anchor, profitable)</w:t>
+              <w:t>Keyence (profitable anchor)</w:t>
             </w:r>
           </w:p>
         </w:tc>
@@ -2179,34 +2259,77 @@
     </w:tbl>
     <w:p/>
     <w:p>
+      <w:r>
+        <w:t>Two ways to read the table, and it matters which one you trade:</w:t>
+      </w:r>
+    </w:p>
+    <w:p>
       <w:pPr>
-        <w:pStyle w:val="ListBullet"/>
+        <w:pStyle w:val="ListNumber"/>
       </w:pPr>
       <w:r>
         <w:rPr>
           <w:b/>
         </w:rPr>
-        <w:t>Rokae is a peer — but a complement, not a competitor</w:t>
+        <w:t>Through-cycle read</w:t>
       </w:r>
       <w:r>
-        <w:t xml:space="preserve"> (Rokae builds the arms; Mech-Mind builds the vision that guides them). And it is the key to the pricing: Rokae listed seven weeks ago at 17x, ran +69% on a July profit alert, and now trades at ~29x — </w:t>
+        <w:t xml:space="preserve">: the proven growth leaders in the cohort — Horizon, UBTech — trade 16–18x sales. Grant Mech-Mind a full quality premium for the 65% margin, the +73% acceleration and the #1 global slot — say 40–50% over those anchors — and you land at 23–26x, or a fair market cap of </w:t>
       </w:r>
       <w:r>
         <w:rPr>
           <w:b/>
         </w:rPr>
-        <w:t>exactly Mech-Mind's ask, with Mech-Mind carrying triple Rokae's gross margin</w:t>
+        <w:t>~HK$10–11bn</w:t>
       </w:r>
       <w:r>
-        <w:t>. The syndicate priced this deal off Rokae's current level, not the older comps.</w:t>
+        <w:t xml:space="preserve">. The range asks 12.7bn. So on fundamentals the deal is </w:t>
+      </w:r>
+      <w:r>
+        <w:rPr>
+          <w:b/>
+        </w:rPr>
+        <w:t>~15–25% rich</w:t>
+      </w:r>
+      <w:r>
+        <w:t>, and rich against every profitable comp on the planet (Keyence, 16x, actually makes money).</w:t>
       </w:r>
     </w:p>
     <w:p>
       <w:pPr>
-        <w:pStyle w:val="ListBullet"/>
+        <w:pStyle w:val="ListNumber"/>
       </w:pPr>
       <w:r>
-        <w:t xml:space="preserve">The same scoreboard cuts the other way: </w:t>
+        <w:rPr>
+          <w:b/>
+        </w:rPr>
+        <w:t>Tactical read</w:t>
+      </w:r>
+      <w:r>
+        <w:t xml:space="preserve">: the anchor the market will actually use on Monday is </w:t>
+      </w:r>
+      <w:r>
+        <w:rPr>
+          <w:b/>
+        </w:rPr>
+        <w:t>Rokae at ~29x</w:t>
+      </w:r>
+      <w:r>
+        <w:t xml:space="preserve"> — listed seven weeks ago at 17x, ran +69% on a July profit alert, now trades at exactly Mech-Mind's asking multiple. Against that live benchmark, Mech-Mind at the same 29x with </w:t>
+      </w:r>
+      <w:r>
+        <w:rPr>
+          <w:b/>
+        </w:rPr>
+        <w:t>triple Rokae's gross margin</w:t>
+      </w:r>
+      <w:r>
+        <w:t xml:space="preserve"> screens relatively cheap — and that relative-cheapness is what the momentum crowd will buy. (Rokae, to be clear, is a peer but a complement, not a competitor: it builds the arms, Mech-Mind builds the vision that guides them. Same wave, different layer — which is why the read-across works for pricing but not for market-share worries.)</w:t>
+      </w:r>
+    </w:p>
+    <w:p>
+      <w:r>
+        <w:t xml:space="preserve">So: fundamentally rich, tactically at par with the hottest name on the tape. The syndicate knew exactly what it was doing. The warning label is </w:t>
       </w:r>
       <w:r>
         <w:rPr>
@@ -2215,7 +2338,7 @@
         <w:t>Seer 6106</w:t>
       </w:r>
       <w:r>
-        <w:t xml:space="preserve">, a near-identical June debut at HK$101.60, doubled in month one then collapsed to </w:t>
+        <w:t xml:space="preserve"> — near-identical June debut at HK$101.60, doubled in month one, now </w:t>
       </w:r>
       <w:r>
         <w:rPr>
@@ -2224,7 +2347,7 @@
         <w:t>36% below issue</w:t>
       </w:r>
       <w:r>
-        <w:t>.</w:t>
+        <w:t>. Same setup, no delivery. The difference between the Rokae path and the Seer path was a single earnings print.</w:t>
       </w:r>
     </w:p>
     <w:p>
@@ -2232,7 +2355,7 @@
         <w:pStyle w:val="Heading2"/>
       </w:pPr>
       <w:r>
-        <w:t>Our view</w:t>
+        <w:t>View</w:t>
       </w:r>
     </w:p>
     <w:p>
@@ -2243,16 +2366,16 @@
         <w:rPr>
           <w:b/>
         </w:rPr>
-        <w:t>It will pop</w:t>
+        <w:t>It pops.</w:t>
       </w:r>
       <w:r>
-        <w:t xml:space="preserve">: ~7% float + 518x book + sector momentum + Everbright's strategist publicly calling it the better of the two debuts. Grey market Monday evening confirms; </w:t>
+        <w:t xml:space="preserve"> 7% float, 518x book, sector momentum, and Everbright's strategist publicly calling it the better debut of the two. Grey market Monday evening confirms; </w:t>
       </w:r>
       <w:r>
         <w:rPr>
           <w:b/>
         </w:rPr>
-        <w:t>+20–60% day 1 is plausible</w:t>
+        <w:t>+20–60% on day one is plausible</w:t>
       </w:r>
       <w:r>
         <w:t>.</w:t>
@@ -2266,10 +2389,10 @@
         <w:rPr>
           <w:b/>
         </w:rPr>
-        <w:t>Keeping the pop depends entirely on the first earnings print.</w:t>
+        <w:t>Whether you keep it is decided by the first print.</w:t>
       </w:r>
       <w:r>
-        <w:t xml:space="preserve"> Rokae held because it delivered profit acceleration three weeks post-listing; Seer delivered nothing and round-tripped. Mech-Mind has the cohort's best shot at the Rokae path — but at 29x sales there is zero room for a miss.</w:t>
+        <w:t xml:space="preserve"> Rokae held its gains because it showed profit acceleration three weeks after listing; Seer showed nothing and round-tripped. Mech-Mind has the best shot in the cohort at the Rokae path — but at 29x sales there is zero room for a miss.</w:t>
       </w:r>
     </w:p>
     <w:p>
@@ -2277,7 +2400,7 @@
         <w:pStyle w:val="ListBullet"/>
       </w:pPr>
       <w:r>
-        <w:t xml:space="preserve">Trade it as a debut flip unless consciously underwriting that print. Diarize </w:t>
+        <w:t xml:space="preserve">Treat it as a debut trade unless you are consciously underwriting that first print. And diarise </w:t>
       </w:r>
       <w:r>
         <w:rPr>
@@ -2286,7 +2409,7 @@
         <w:t>March 2027</w:t>
       </w:r>
       <w:r>
-        <w:t>: cornerstone + pre-IPO lockups (~35% of the company, all sitting on big gains) expire into a tiny float, roughly when southbound eligibility could arrive as the offset.</w:t>
+        <w:t>: cornerstones plus pre-IPO holders (~35% of the company, all sitting on big gains) unlock into a 7% float — with possible southbound eligibility arriving around the same time as the offset.</w:t>
       </w:r>
     </w:p>
     <w:p>
@@ -2308,7 +2431,7 @@
         <w:t>SHEIN</w:t>
       </w:r>
       <w:r>
-        <w:t xml:space="preserve"> — fairly priced but cold book, no growth, ratchet leakage at the door, a structural ceiling on the model, and the southbound bid locked out until March. Skip the debut; play the theme through PDD.</w:t>
+        <w:t xml:space="preserve"> — priced at the top of its fair band, cold book, capped model, US$3.5bn out the door to old investors, and the southbound bid locked out until March. Skip the debut; express the theme through PDD.</w:t>
       </w:r>
     </w:p>
     <w:p>
@@ -2322,7 +2445,7 @@
         <w:t>Mech-Mind</w:t>
       </w:r>
       <w:r>
-        <w:t xml:space="preserve"> — expensive but genuinely best-in-cohort, and mechanically built to pop. Participate for the debut, take profit into strength, hold only if you believe the Q1 acceleration is real.</w:t>
+        <w:t xml:space="preserve"> — rich on fundamentals but priced at par with the live benchmark, with the mechanics of a squeeze. Take the debut, sell into strength, stay only if you believe the Q1 acceleration is real.</w:t>
       </w:r>
     </w:p>
     <w:p>
@@ -2330,7 +2453,7 @@
         <w:pStyle w:val="ListBullet"/>
       </w:pPr>
       <w:r>
-        <w:t>Same-day listings split liquidity, and the contrast should show immediately: the cheap deal flat, the expensive one flying.</w:t>
+        <w:t>Same-day listings will split liquidity, and the contrast should be visible by lunch: the cheap one flat, the expensive one flying.</w:t>
       </w:r>
     </w:p>
     <w:p>
@@ -2346,7 +2469,7 @@
         <w:pStyle w:val="ListBullet"/>
       </w:pPr>
       <w:r>
-        <w:t>28 Aug noon — Mech-Mind final price  ·  31 Aug — SHEIN formal price, both allotments, grey market 16:15–18:30  ·  1 Sep — debuts  ·  ~mid-Sep — SHEIN HSCI fast entry  ·  H2-26 prints  ·  Mar 2027 — Mech-Mind unlock + both names' southbound windows.</w:t>
+        <w:t>28 Aug noon — Mech-Mind final price · 31 Aug — SHEIN formal price, allotments, grey market 16:15–18:30 · 1 Sep — debuts · ~mid-Sep — SHEIN HSCI fast entry · H2-26 earnings prints · Mar 2027 — Mech-Mind unlock + both names' southbound windows.</w:t>
       </w:r>
     </w:p>
     <w:sectPr>

</xml_diff>

<commit_message>
IPO note v3: head-to-head verdicts — SHEIN does not deserve its 35% premium to PDD (pure margin-recovery bet); Mech-Mind deserves a premium to Rokae (45x vs 130x gross profit) but only earns it at first print
Co-Authored-By: Claude Fable 5 <noreply@anthropic.com>
</commit_message>
<xml_diff>
--- a/SHEIN_MechMind_HK_IPO_Note.docx
+++ b/SHEIN_MechMind_HK_IPO_Note.docx
@@ -2417,7 +2417,222 @@
         <w:pStyle w:val="Heading1"/>
       </w:pPr>
       <w:r>
-        <w:t>3. Bottom line</w:t>
+        <w:t>3. The head-to-head: does either deserve a premium to its anchor?</w:t>
+      </w:r>
+    </w:p>
+    <w:p>
+      <w:pPr>
+        <w:pStyle w:val="Heading2"/>
+      </w:pPr>
+      <w:r>
+        <w:t>SHEIN vs PDD — no. And it's priced at a premium anyway.</w:t>
+      </w:r>
+    </w:p>
+    <w:p>
+      <w:r>
+        <w:t>Run the comparison row by row and PDD wins nearly every one:</w:t>
+      </w:r>
+    </w:p>
+    <w:p>
+      <w:pPr>
+        <w:pStyle w:val="ListBullet"/>
+      </w:pPr>
+      <w:r>
+        <w:rPr>
+          <w:b/>
+        </w:rPr>
+        <w:t>Growth</w:t>
+      </w:r>
+      <w:r>
+        <w:t>: PDD ~10% and stable; SHEIN went +8% (2025) → +1% (Q1'26) and is still decelerating.</w:t>
+      </w:r>
+    </w:p>
+    <w:p>
+      <w:pPr>
+        <w:pStyle w:val="ListBullet"/>
+      </w:pPr>
+      <w:r>
+        <w:rPr>
+          <w:b/>
+        </w:rPr>
+        <w:t>Margin</w:t>
+      </w:r>
+      <w:r>
+        <w:t>: PDD nets ~20%; SHEIN nets 4.9% and falling.</w:t>
+      </w:r>
+    </w:p>
+    <w:p>
+      <w:pPr>
+        <w:pStyle w:val="ListBullet"/>
+      </w:pPr>
+      <w:r>
+        <w:rPr>
+          <w:b/>
+        </w:rPr>
+        <w:t>Model</w:t>
+      </w:r>
+      <w:r>
+        <w:t>: PDD is a platform — take-rate, ads, no inventory. SHEIN is a 1P retailer, however clever the supply chain.</w:t>
+      </w:r>
+    </w:p>
+    <w:p>
+      <w:pPr>
+        <w:pStyle w:val="ListBullet"/>
+      </w:pPr>
+      <w:r>
+        <w:rPr>
+          <w:b/>
+        </w:rPr>
+        <w:t>Ceiling</w:t>
+      </w:r>
+      <w:r>
+        <w:t>: PDD is multi-category, so frequency compounds; SHEIN's 4-orders-a-year cap is the whole bear case above.</w:t>
+      </w:r>
+    </w:p>
+    <w:p>
+      <w:pPr>
+        <w:pStyle w:val="ListBullet"/>
+      </w:pPr>
+      <w:r>
+        <w:rPr>
+          <w:b/>
+        </w:rPr>
+        <w:t>Shared discounts</w:t>
+      </w:r>
+      <w:r>
+        <w:t>: both carry the China/tariff/regulatory haircut — that cancels out. But SHEIN then adds three of its own: WVR governance, the made-whole ratchet holders sitting at your entry price, and no southbound access for six months.</w:t>
+      </w:r>
+    </w:p>
+    <w:p>
+      <w:r>
+        <w:t xml:space="preserve">So on merit SHEIN should trade </w:t>
+      </w:r>
+      <w:r>
+        <w:rPr>
+          <w:b/>
+        </w:rPr>
+        <w:t>at a discount to PDD's 9.5x</w:t>
+      </w:r>
+      <w:r>
+        <w:t xml:space="preserve"> — yet the deal asks 12.9x, a ~35% premium. The only way to defend that is to argue 2025 earnings are artificially depressed mid-tariff-transition: on BI's 2027 rebound (US$1.67bn, then ~20%/yr) you're paying ~13x “normal” falling to ~10x. In other words, </w:t>
+      </w:r>
+      <w:r>
+        <w:rPr>
+          <w:b/>
+        </w:rPr>
+        <w:t>the entire premium is a bet on margin recovery</w:t>
+      </w:r>
+      <w:r>
+        <w:t>. If it lands, the gap closes by itself; if it doesn't, the stock de-rates to PDD's multiple — roughly US$20bn, ~25% below deal price. The asymmetry runs against you, which is the final reason we skip.</w:t>
+      </w:r>
+    </w:p>
+    <w:p>
+      <w:pPr>
+        <w:pStyle w:val="Heading2"/>
+      </w:pPr>
+      <w:r>
+        <w:t>Mech-Mind vs Rokae — yes. Parity is actually a relative discount.</w:t>
+      </w:r>
+    </w:p>
+    <w:p>
+      <w:r>
+        <w:t xml:space="preserve">P/S is the wrong lens here, because one company keeps 65 cents of every revenue dollar and the other keeps 22. Switch to </w:t>
+      </w:r>
+      <w:r>
+        <w:rPr>
+          <w:b/>
+        </w:rPr>
+        <w:t>price-to-gross-profit</w:t>
+      </w:r>
+      <w:r>
+        <w:t xml:space="preserve"> — the honest unit when comparing a software-rich model against hardware:</w:t>
+      </w:r>
+    </w:p>
+    <w:p>
+      <w:pPr>
+        <w:pStyle w:val="ListBullet"/>
+      </w:pPr>
+      <w:r>
+        <w:t xml:space="preserve">Mech-Mind at 29x sales ÷ 65% margin ≈ </w:t>
+      </w:r>
+      <w:r>
+        <w:rPr>
+          <w:b/>
+        </w:rPr>
+        <w:t>45x gross profit</w:t>
+      </w:r>
+      <w:r>
+        <w:t>.</w:t>
+      </w:r>
+    </w:p>
+    <w:p>
+      <w:pPr>
+        <w:pStyle w:val="ListBullet"/>
+      </w:pPr>
+      <w:r>
+        <w:t xml:space="preserve">Rokae at 29x trailing ÷ 22% margin ≈ </w:t>
+      </w:r>
+      <w:r>
+        <w:rPr>
+          <w:b/>
+        </w:rPr>
+        <w:t>130x gross profit</w:t>
+      </w:r>
+      <w:r>
+        <w:t xml:space="preserve"> (still ~85x on H1-annualised numbers).</w:t>
+      </w:r>
+    </w:p>
+    <w:p>
+      <w:pPr>
+        <w:pStyle w:val="ListBullet"/>
+      </w:pPr>
+      <w:r>
+        <w:t xml:space="preserve">Per dollar of gross profit, Mech-Mind at issue costs </w:t>
+      </w:r>
+      <w:r>
+        <w:rPr>
+          <w:b/>
+        </w:rPr>
+        <w:t>one-half to one-third of Rokae</w:t>
+      </w:r>
+      <w:r>
+        <w:t>.</w:t>
+      </w:r>
+    </w:p>
+    <w:p>
+      <w:r>
+        <w:t xml:space="preserve">The qualitative rows point the same way: #1 </w:t>
+      </w:r>
+      <w:r>
+        <w:rPr>
+          <w:b/>
+        </w:rPr>
+        <w:t>globally</w:t>
+      </w:r>
+      <w:r>
+        <w:t xml:space="preserve"> with 27% share versus Rokae's #1-in-a-China-niche (47% of domestic cobots, but 5.8% in light industrial and 9% overseas against Mech-Mind's 50%); and structurally, arms are where the price war is happening — Rokae's embodied segment runs a 10.7% gross margin — while eyes are sold to every arm maker, the picks-and-shovels seat.</w:t>
+      </w:r>
+    </w:p>
+    <w:p>
+      <w:r>
+        <w:t xml:space="preserve">What Rokae has that Mech-Mind doesn't is the one thing the market actually pays for: a </w:t>
+      </w:r>
+      <w:r>
+        <w:rPr>
+          <w:b/>
+        </w:rPr>
+        <w:t>printed profit inflection</w:t>
+      </w:r>
+      <w:r>
+        <w:t xml:space="preserve"> (the 30 Jul alert). So the fair statement is: Mech-Mind *deserves* the premium, but only *earns* it at its first accelerating print. That's why the syndicate cleared the deal at parity — and why parity is your margin of safety in relative terms. Both remain expensive in absolute; the relative case is the trade.</w:t>
+      </w:r>
+    </w:p>
+    <w:p>
+      <w:pPr>
+        <w:pStyle w:val="Heading1"/>
+      </w:pPr>
+      <w:r>
+        <w:t>4. Bottom line</w:t>
       </w:r>
     </w:p>
     <w:p>

</xml_diff>

<commit_message>
IPO note v4: head-to-head rewritten as buyside three-driver deduction (earnings quality / growth duration / risk) — SHEIN fails all three vs PDD, premium = pure recovery bet; Mech-Mind wins all three vs Rokae, P/GP shows parity embeds a 65% relative discount
Co-Authored-By: Claude Fable 5 <noreply@anthropic.com>
</commit_message>
<xml_diff>
--- a/SHEIN_MechMind_HK_IPO_Note.docx
+++ b/SHEIN_MechMind_HK_IPO_Note.docx
@@ -2421,109 +2421,35 @@
       </w:r>
     </w:p>
     <w:p>
-      <w:pPr>
-        <w:pStyle w:val="Heading2"/>
-      </w:pPr>
       <w:r>
-        <w:t>SHEIN vs PDD — no. And it's priced at a premium anyway.</w:t>
-      </w:r>
-    </w:p>
-    <w:p>
-      <w:r>
-        <w:t>Run the comparison row by row and PDD wins nearly every one:</w:t>
-      </w:r>
-    </w:p>
-    <w:p>
-      <w:pPr>
-        <w:pStyle w:val="ListBullet"/>
-      </w:pPr>
-      <w:r>
-        <w:rPr>
-          <w:b/>
-        </w:rPr>
-        <w:t>Growth</w:t>
-      </w:r>
-      <w:r>
-        <w:t>: PDD ~10% and stable; SHEIN went +8% (2025) → +1% (Q1'26) and is still decelerating.</w:t>
-      </w:r>
-    </w:p>
-    <w:p>
-      <w:pPr>
-        <w:pStyle w:val="ListBullet"/>
-      </w:pPr>
-      <w:r>
-        <w:rPr>
-          <w:b/>
-        </w:rPr>
-        <w:t>Margin</w:t>
-      </w:r>
-      <w:r>
-        <w:t>: PDD nets ~20%; SHEIN nets 4.9% and falling.</w:t>
-      </w:r>
-    </w:p>
-    <w:p>
-      <w:pPr>
-        <w:pStyle w:val="ListBullet"/>
-      </w:pPr>
-      <w:r>
-        <w:rPr>
-          <w:b/>
-        </w:rPr>
-        <w:t>Model</w:t>
-      </w:r>
-      <w:r>
-        <w:t>: PDD is a platform — take-rate, ads, no inventory. SHEIN is a 1P retailer, however clever the supply chain.</w:t>
-      </w:r>
-    </w:p>
-    <w:p>
-      <w:pPr>
-        <w:pStyle w:val="ListBullet"/>
-      </w:pPr>
-      <w:r>
-        <w:rPr>
-          <w:b/>
-        </w:rPr>
-        <w:t>Ceiling</w:t>
-      </w:r>
-      <w:r>
-        <w:t>: PDD is multi-category, so frequency compounds; SHEIN's 4-orders-a-year cap is the whole bear case above.</w:t>
-      </w:r>
-    </w:p>
-    <w:p>
-      <w:pPr>
-        <w:pStyle w:val="ListBullet"/>
-      </w:pPr>
-      <w:r>
-        <w:rPr>
-          <w:b/>
-        </w:rPr>
-        <w:t>Shared discounts</w:t>
-      </w:r>
-      <w:r>
-        <w:t>: both carry the China/tariff/regulatory haircut — that cancels out. But SHEIN then adds three of its own: WVR governance, the made-whole ratchet holders sitting at your entry price, and no southbound access for six months.</w:t>
-      </w:r>
-    </w:p>
-    <w:p>
-      <w:r>
-        <w:t xml:space="preserve">So on merit SHEIN should trade </w:t>
+        <w:t xml:space="preserve">Before the two verdicts, the frame we're using. A multiple is compressed DCF — a business deserves to trade richer than its comp only if at least one of three things is true: </w:t>
       </w:r>
       <w:r>
         <w:rPr>
           <w:b/>
         </w:rPr>
-        <w:t>at a discount to PDD's 9.5x</w:t>
+        <w:t>(1)</w:t>
       </w:r>
       <w:r>
-        <w:t xml:space="preserve"> — yet the deal asks 12.9x, a ~35% premium. The only way to defend that is to argue 2025 earnings are artificially depressed mid-tariff-transition: on BI's 2027 rebound (US$1.67bn, then ~20%/yr) you're paying ~13x “normal” falling to ~10x. In other words, </w:t>
+        <w:t xml:space="preserve"> each revenue dollar converts to more cash (margin/returns); </w:t>
       </w:r>
       <w:r>
         <w:rPr>
           <w:b/>
         </w:rPr>
-        <w:t>the entire premium is a bet on margin recovery</w:t>
+        <w:t>(2)</w:t>
       </w:r>
       <w:r>
-        <w:t>. If it lands, the gap closes by itself; if it doesn't, the stock de-rates to PDD's multiple — roughly US$20bn, ~25% below deal price. The asymmetry runs against you, which is the final reason we skip.</w:t>
+        <w:t xml:space="preserve"> the cash grows faster for longer (duration); </w:t>
+      </w:r>
+      <w:r>
+        <w:rPr>
+          <w:b/>
+        </w:rPr>
+        <w:t>(3)</w:t>
+      </w:r>
+      <w:r>
+        <w:t xml:space="preserve"> the cash is safer (risk). Worse on all three means it must trade at a discount. Everything else is narrative.</w:t>
       </w:r>
     </w:p>
     <w:p>
@@ -2531,29 +2457,121 @@
         <w:pStyle w:val="Heading2"/>
       </w:pPr>
       <w:r>
-        <w:t>Mech-Mind vs Rokae — yes. Parity is actually a relative discount.</w:t>
+        <w:t>SHEIN vs PDD — no premium deserved. Walk the three drivers:</w:t>
       </w:r>
     </w:p>
     <w:p>
+      <w:pPr>
+        <w:pStyle w:val="ListNumber"/>
+      </w:pPr>
       <w:r>
-        <w:t xml:space="preserve">P/S is the wrong lens here, because one company keeps 65 cents of every revenue dollar and the other keeps 22. Switch to </w:t>
+        <w:rPr>
+          <w:b/>
+        </w:rPr>
+        <w:t>Earnings quality — what is a dollar of SHEIN's profit worth versus a dollar of PDD's?</w:t>
+      </w:r>
+      <w:r>
+        <w:t xml:space="preserve"> PDD's dollar is a take-rate on other people's inventory: ~20% net margin, negative working capital, no fulfilment asset at risk. SHEIN's dollar comes from goods it must manufacture and ship across a border: 4.9% net margin — and that margin </w:t>
       </w:r>
       <w:r>
         <w:rPr>
           <w:b/>
         </w:rPr>
-        <w:t>price-to-gross-profit</w:t>
+        <w:t>halved in one year because one customs rule changed</w:t>
       </w:r>
       <w:r>
-        <w:t xml:space="preserve"> — the honest unit when comparing a software-rich model against hardware:</w:t>
+        <w:t>. A profit stream that a single regulatory decision can cut in half is a lower-quality stream. Driver 1: discount.</w:t>
       </w:r>
     </w:p>
     <w:p>
       <w:pPr>
-        <w:pStyle w:val="ListBullet"/>
+        <w:pStyle w:val="ListNumber"/>
       </w:pPr>
       <w:r>
-        <w:t xml:space="preserve">Mech-Mind at 29x sales ÷ 65% margin ≈ </w:t>
+        <w:rPr>
+          <w:b/>
+        </w:rPr>
+        <w:t>Growth — will SHEIN's dollar grow faster?</w:t>
+      </w:r>
+      <w:r>
+        <w:t xml:space="preserve"> PDD compounds ~10% with category breadth working for it. SHEIN went +8% → +1%, and the ceiling logic in section 1 shows all three growth levers (frequency, basket, new users) are exhausted. Worse: the fourth force — ad-auction inflation — is a headwind that </w:t>
+      </w:r>
+      <w:r>
+        <w:rPr>
+          <w:b/>
+        </w:rPr>
+        <w:t>PDD causes and SHEIN suffers</w:t>
+      </w:r>
+      <w:r>
+        <w:t>. Temu's spending is literally why SHEIN paid +48.9% for +8% revenue. Paying a premium here means paying more for the victim than the aggressor. Driver 2: discount.</w:t>
+      </w:r>
+    </w:p>
+    <w:p>
+      <w:pPr>
+        <w:pStyle w:val="ListNumber"/>
+      </w:pPr>
+      <w:r>
+        <w:rPr>
+          <w:b/>
+        </w:rPr>
+        <w:t>Risk — anything offsetting?</w:t>
+      </w:r>
+      <w:r>
+        <w:t xml:space="preserve"> The China/tariff haircut applies to both, so it cancels. SHEIN then adds three risks PDD doesn't carry: WVR (no southbound buyer for six months), the US$3.5bn ratchet leakage, and a register of made-whole sellers sitting exactly at your cost basis. Driver 3: discount.</w:t>
+      </w:r>
+    </w:p>
+    <w:p>
+      <w:pPr>
+        <w:pStyle w:val="ListNumber"/>
+      </w:pPr>
+      <w:r>
+        <w:rPr>
+          <w:b/>
+        </w:rPr>
+        <w:t>So why does the deal still ask 12.9x against PDD's 9.5x?</w:t>
+      </w:r>
+      <w:r>
+        <w:t xml:space="preserve"> Only one honest answer: the denominator. The syndicate wants you to capitalise 2027 *normalised* earnings (BI's US$1.67bn rebound), not the depressed 2025/Q1 prints. Legitimate argument — but see what it implies: </w:t>
+      </w:r>
+      <w:r>
+        <w:rPr>
+          <w:b/>
+        </w:rPr>
+        <w:t>the entire 35% premium IS the recovery bet, with zero margin of safety left over.</w:t>
+      </w:r>
+      <w:r>
+        <w:t xml:space="preserve"> The rule it breaks: don't pay in advance for a normalisation the company hasn't printed, when the anchor comp gives you a structurally better business without needing the bet. If recovery lands, PDD probably re-rates too, so you don't even win relative; if it misses, SHEIN converges to PDD's multiple ≈ US$20bn, about –25%. Heads you roughly tie, tails you lose a quarter.</w:t>
+      </w:r>
+    </w:p>
+    <w:p>
+      <w:pPr>
+        <w:pStyle w:val="Heading2"/>
+      </w:pPr>
+      <w:r>
+        <w:t>Mech-Mind vs Rokae — premium deserved. Same three drivers:</w:t>
+      </w:r>
+    </w:p>
+    <w:p>
+      <w:pPr>
+        <w:pStyle w:val="ListNumber"/>
+      </w:pPr>
+      <w:r>
+        <w:rPr>
+          <w:b/>
+        </w:rPr>
+        <w:t>Fix the unit first.</w:t>
+      </w:r>
+      <w:r>
+        <w:t xml:space="preserve"> P/S assumes every revenue dollar is equal; it isn't. Mech-Mind keeps 65 cents of gross profit per revenue dollar, Rokae keeps 22. If the two ever reach similar opex efficiency, steady-state earnings power per revenue dollar is ~3x higher at Mech-Mind — so the *neutral* condition is equal price-to-</w:t>
+      </w:r>
+      <w:r>
+        <w:rPr>
+          <w:b/>
+        </w:rPr>
+        <w:t>gross-profit</w:t>
+      </w:r>
+      <w:r>
+        <w:t xml:space="preserve">, not equal P/S. At par P/S (29x each): Mech-Mind ≈ </w:t>
       </w:r>
       <w:r>
         <w:rPr>
@@ -2562,46 +2580,53 @@
         <w:t>45x gross profit</w:t>
       </w:r>
       <w:r>
-        <w:t>.</w:t>
-      </w:r>
-    </w:p>
-    <w:p>
-      <w:pPr>
-        <w:pStyle w:val="ListBullet"/>
-      </w:pPr>
-      <w:r>
-        <w:t xml:space="preserve">Rokae at 29x trailing ÷ 22% margin ≈ </w:t>
+        <w:t xml:space="preserve">, Rokae ≈ </w:t>
       </w:r>
       <w:r>
         <w:rPr>
           <w:b/>
         </w:rPr>
-        <w:t>130x gross profit</w:t>
+        <w:t>130x</w:t>
       </w:r>
       <w:r>
-        <w:t xml:space="preserve"> (still ~85x on H1-annualised numbers).</w:t>
+        <w:t xml:space="preserve"> (~85x on H1-annualised). Parity in P/S already embeds a ~65% relative discount for Mech-Mind on the honest unit. Driver 1 doesn't just say premium — it says the premium is arithmetic, not opinion.</w:t>
       </w:r>
     </w:p>
     <w:p>
       <w:pPr>
-        <w:pStyle w:val="ListBullet"/>
+        <w:pStyle w:val="ListNumber"/>
       </w:pPr>
       <w:r>
-        <w:t xml:space="preserve">Per dollar of gross profit, Mech-Mind at issue costs </w:t>
+        <w:rPr>
+          <w:b/>
+        </w:rPr>
+        <w:t>Margin trajectory — who is on the right side of the price war?</w:t>
+      </w:r>
+      <w:r>
+        <w:t xml:space="preserve"> Rokae sells arms: hardware against 300+ Chinese arm makers, embodied segment gross margin 10.7%, price war confirmed by the NDRC and Caixin. Its margin has a hardware ceiling. Mech-Mind sells perception </w:t>
       </w:r>
       <w:r>
         <w:rPr>
           <w:b/>
         </w:rPr>
-        <w:t>one-half to one-third of Rokae</w:t>
+        <w:t>to every arm maker</w:t>
       </w:r>
       <w:r>
-        <w:t>.</w:t>
+        <w:t xml:space="preserve"> — a price war among arm makers increases the volume of eyes sold while squeezing the people selling arms. Its gross margin went 39% → 65% *while the war started*. When a value chain commoditises, the differentiating component captures the value the commodity layer sheds. Driver 2: premium.</w:t>
       </w:r>
     </w:p>
     <w:p>
+      <w:pPr>
+        <w:pStyle w:val="ListNumber"/>
+      </w:pPr>
       <w:r>
-        <w:t xml:space="preserve">The qualitative rows point the same way: #1 </w:t>
+        <w:rPr>
+          <w:b/>
+        </w:rPr>
+        <w:t>Durability — which #1 decays slower?</w:t>
+      </w:r>
+      <w:r>
+        <w:t xml:space="preserve"> Rokae is #1 in a domestic niche (47% of China cobots by volume) but 5.8% in light industrial and only 9% overseas — a local leader in a crowded commodity field. Mech-Mind is #1 </w:t>
       </w:r>
       <w:r>
         <w:rPr>
@@ -2610,21 +2635,44 @@
         <w:t>globally</w:t>
       </w:r>
       <w:r>
-        <w:t xml:space="preserve"> with 27% share versus Rokae's #1-in-a-China-niche (47% of domestic cobots, but 5.8% in light industrial and 9% overseas against Mech-Mind's 50%); and structurally, arms are where the price war is happening — Rokae's embodied segment runs a 10.7% gross margin — while eyes are sold to every arm maker, the picks-and-shovels seat.</w:t>
+        <w:t xml:space="preserve"> (27% of shipments, more than the next four combined), #1 in China, Japan and North America simultaneously, 50% overseas at better margin, 86% repeat revenue, and a 27,000-unit data flywheel a copycat cannot shortcut. Global #1 with data lock-in has longer growth duration than domestic niche #1 in hardware. Driver 3: premium.</w:t>
       </w:r>
     </w:p>
     <w:p>
+      <w:pPr>
+        <w:pStyle w:val="ListNumber"/>
+      </w:pPr>
       <w:r>
-        <w:t xml:space="preserve">What Rokae has that Mech-Mind doesn't is the one thing the market actually pays for: a </w:t>
+        <w:rPr>
+          <w:b/>
+        </w:rPr>
+        <w:t>Then why does Rokae get parity today at all?</w:t>
+      </w:r>
+      <w:r>
+        <w:t xml:space="preserve"> Because it has the one thing markets pay cash for: a </w:t>
       </w:r>
       <w:r>
         <w:rPr>
           <w:b/>
         </w:rPr>
-        <w:t>printed profit inflection</w:t>
+        <w:t>printed</w:t>
       </w:r>
       <w:r>
-        <w:t xml:space="preserve"> (the 30 Jul alert). So the fair statement is: Mech-Mind *deserves* the premium, but only *earns* it at its first accelerating print. That's why the syndicate cleared the deal at parity — and why parity is your margin of safety in relative terms. Both remain expensive in absolute; the relative case is the trade.</w:t>
+        <w:t xml:space="preserve"> inflection — the 30 Jul alert (adjusted profit positive, revenue +127%). Mech-Mind offers a trajectory (adjusted loss 334 → 109 → 33) but no print yet. That proof-premium explains why Rokae *holds* par today; it never justifies Mech-Mind trading below Rokae, and it converts into an explicit Mech-Mind premium the day the first post-listing print confirms the trajectory. The deal at parity therefore hands you the deserved premium for free — payable, or not, at the first print.</w:t>
+      </w:r>
+    </w:p>
+    <w:p>
+      <w:r>
+        <w:t xml:space="preserve">Honesty check a PM would demand: this is a </w:t>
+      </w:r>
+      <w:r>
+        <w:rPr>
+          <w:b/>
+        </w:rPr>
+        <w:t>relative</w:t>
+      </w:r>
+      <w:r>
+        <w:t xml:space="preserve"> call. Rokae's own 29x is partly a 6%-float artifact — if Rokae de-rates to 20x, “deserves a premium to Rokae” still means Mech-Mind falls in absolute. Deserving a premium and being cheap are different claims; we are making the first.</w:t>
       </w:r>
     </w:p>
     <w:p>

</xml_diff>

<commit_message>
IPO note v5: cornerstone reads (SHEIN 21% insiders-and-friends vs Mech-Mind 64% cross-style validation) + 15% greenshoes on both, with the different roles they play (stabilisation ammo vs float top-up)
Co-Authored-By: Claude Fable 5 <noreply@anthropic.com>
</commit_message>
<xml_diff>
--- a/SHEIN_MechMind_HK_IPO_Note.docx
+++ b/SHEIN_MechMind_HK_IPO_Note.docx
@@ -91,6 +91,61 @@
       </w:r>
       <w:r>
         <w:t xml:space="preserve"> now. When a deal gets marked down twice inside its own bookbuild, the bookrunners are telling you where real demand actually is.</w:t>
+      </w:r>
+    </w:p>
+    <w:p>
+      <w:pPr>
+        <w:pStyle w:val="ListBullet"/>
+      </w:pPr>
+      <w:r>
+        <w:rPr>
+          <w:b/>
+        </w:rPr>
+        <w:t>Cornerstones — supportive, not validating.</w:t>
+      </w:r>
+      <w:r>
+        <w:t xml:space="preserve"> Seven names, ~US$383m ≈ </w:t>
+      </w:r>
+      <w:r>
+        <w:rPr>
+          <w:b/>
+        </w:rPr>
+        <w:t>21% of the deal</w:t>
+      </w:r>
+      <w:r>
+        <w:t xml:space="preserve">: Boyu US$150m, Tiger Global US$53m, General Atlantic US$50m, Tencent US$50m, plus Greenwoods, Taikang and UBS AM. Look at who they are: GA and Tiger are </w:t>
+      </w:r>
+      <w:r>
+        <w:rPr>
+          <w:b/>
+        </w:rPr>
+        <w:t>existing shareholders topping up</w:t>
+      </w:r>
+      <w:r>
+        <w:t xml:space="preserve"> — the same names collecting the ratchet payments — and Boyu/Tencent read as China-establishment support for a politically important listing. That is insiders and friends steadying the deal, not new outside money fighting for allocation. And 21% coverage is low by 2026 HK standards (hot deals run 40–60%+), so the book leans on outside demand it hasn't demonstrated.</w:t>
+      </w:r>
+    </w:p>
+    <w:p>
+      <w:pPr>
+        <w:pStyle w:val="ListBullet"/>
+      </w:pPr>
+      <w:r>
+        <w:rPr>
+          <w:b/>
+        </w:rPr>
+        <w:t>Greenshoe: standard 15%</w:t>
+      </w:r>
+      <w:r>
+        <w:t xml:space="preserve"> (~42m extra B shares; full exercise at the top = ~HK$13.9bn / US$1.8bn — which reconciles the HK$13.1bn vs 13.9bn press confusion: base vs with-shoe). Given the tepid book, think of the shoe here as </w:t>
+      </w:r>
+      <w:r>
+        <w:rPr>
+          <w:b/>
+        </w:rPr>
+        <w:t>stabilisation ammunition</w:t>
+      </w:r>
+      <w:r>
+        <w:t>: if the stock trades below issue, the stabilising agent buys back through it. It's downside cushioning, not an upside signal.</w:t>
       </w:r>
     </w:p>
     <w:p>
@@ -1283,34 +1338,107 @@
         <w:pStyle w:val="ListBullet"/>
       </w:pPr>
       <w:r>
-        <w:t xml:space="preserve">Cornerstones take </w:t>
+        <w:rPr>
+          <w:b/>
+        </w:rPr>
+        <w:t>The cornerstone book is genuinely strong — arguably the best of any 2026 HK deal this size.</w:t>
+      </w:r>
+      <w:r>
+        <w:t xml:space="preserve"> Nine names, US$186m ≈ </w:t>
       </w:r>
       <w:r>
         <w:rPr>
           <w:b/>
         </w:rPr>
-        <w:t>64% of the deal</w:t>
+        <w:t>64% of the base deal</w:t>
       </w:r>
       <w:r>
-        <w:t xml:space="preserve"> — Baillie Gifford leads with US$60m, alongside Taikang, Jane Street, E Fund and a </w:t>
+        <w:t xml:space="preserve">, and the quality matters more than the size: </w:t>
       </w:r>
       <w:r>
         <w:rPr>
           <w:b/>
         </w:rPr>
-        <w:t>BYD subsidiary</w:t>
+        <w:t>Baillie Gifford</w:t>
       </w:r>
       <w:r>
-        <w:t xml:space="preserve"> (a customer putting money in the book, which is worth more than any broker note). After cornerstones, free float is roughly </w:t>
+        <w:t xml:space="preserve"> (US$60m — a top global long-only growth house that rarely anchors sub-US$2bn HK deals), </w:t>
       </w:r>
       <w:r>
         <w:rPr>
           <w:b/>
         </w:rPr>
-        <w:t>7% of market cap</w:t>
+        <w:t>Jane Street</w:t>
       </w:r>
       <w:r>
-        <w:t>.</w:t>
+        <w:t xml:space="preserve"> (a prop firm putting its own balance sheet in), </w:t>
+      </w:r>
+      <w:r>
+        <w:rPr>
+          <w:b/>
+        </w:rPr>
+        <w:t>E Fund</w:t>
+      </w:r>
+      <w:r>
+        <w:t xml:space="preserve"> (China's largest mutual-fund house), </w:t>
+      </w:r>
+      <w:r>
+        <w:rPr>
+          <w:b/>
+        </w:rPr>
+        <w:t>Taikang</w:t>
+      </w:r>
+      <w:r>
+        <w:t xml:space="preserve"> (insurance money), </w:t>
+      </w:r>
+      <w:r>
+        <w:rPr>
+          <w:b/>
+        </w:rPr>
+        <w:t>NGS Super</w:t>
+      </w:r>
+      <w:r>
+        <w:t xml:space="preserve"> (an Australian pension), and </w:t>
+      </w:r>
+      <w:r>
+        <w:rPr>
+          <w:b/>
+        </w:rPr>
+        <w:t>BYD's Golden Link</w:t>
+      </w:r>
+      <w:r>
+        <w:t xml:space="preserve"> (a customer paying to be in the book — worth more than any broker note). That is validation across every buyer type — global growth, prop, domestic institutional, pension, strategic — not one friendly anchor writing a big cheque.</w:t>
+      </w:r>
+    </w:p>
+    <w:p>
+      <w:pPr>
+        <w:pStyle w:val="ListBullet"/>
+      </w:pPr>
+      <w:r>
+        <w:t xml:space="preserve">The same strength is double-edged: 64% locked up for six months makes the float tiny now (the squeeze) and makes </w:t>
+      </w:r>
+      <w:r>
+        <w:rPr>
+          <w:b/>
+        </w:rPr>
+        <w:t>March 2027</w:t>
+      </w:r>
+      <w:r>
+        <w:t xml:space="preserve"> the supply cliff when it all unlocks at once.</w:t>
+      </w:r>
+    </w:p>
+    <w:p>
+      <w:pPr>
+        <w:pStyle w:val="ListBullet"/>
+      </w:pPr>
+      <w:r>
+        <w:rPr>
+          <w:b/>
+        </w:rPr>
+        <w:t>Greenshoe: 15%</w:t>
+      </w:r>
+      <w:r>
+        <w:t xml:space="preserve"> (3.47m shares; full exercise takes the raise to ~HK$2.7bn). With a 518x book expect it exercised in full — but note it works differently here than at SHEIN: this deal's problem is too little stock, not too little support, so the shoe is a small float top-up rather than a defence mechanism.</w:t>
       </w:r>
     </w:p>
     <w:p>
@@ -1327,7 +1455,16 @@
         <w:t>518x covered</w:t>
       </w:r>
       <w:r>
-        <w:t xml:space="preserve"> with a day still to run.</w:t>
+        <w:t xml:space="preserve"> with a day still to run. After cornerstones, free float is roughly </w:t>
+      </w:r>
+      <w:r>
+        <w:rPr>
+          <w:b/>
+        </w:rPr>
+        <w:t>7% of market cap</w:t>
+      </w:r>
+      <w:r>
+        <w:t>.</w:t>
       </w:r>
     </w:p>
     <w:p>

</xml_diff>

<commit_message>
IPO note v6: Ingenic (3223 HK) section — 927x-book-no-pop deduction (anchor x float x leverage), cycle-inflection fundamentals (H1 +431-531%), A/H valuation tables, cornerstone composition beats size, greenshoe safety net to 19 Sep, H-discount-is-information verdict
Co-Authored-By: Claude Fable 5 <noreply@anthropic.com>
</commit_message>
<xml_diff>
--- a/SHEIN_MechMind_HK_IPO_Note.docx
+++ b/SHEIN_MechMind_HK_IPO_Note.docx
@@ -2554,39 +2554,7 @@
         <w:pStyle w:val="Heading1"/>
       </w:pPr>
       <w:r>
-        <w:t>3. The head-to-head: does either deserve a premium to its anchor?</w:t>
-      </w:r>
-    </w:p>
-    <w:p>
-      <w:r>
-        <w:t xml:space="preserve">Before the two verdicts, the frame we're using. A multiple is compressed DCF — a business deserves to trade richer than its comp only if at least one of three things is true: </w:t>
-      </w:r>
-      <w:r>
-        <w:rPr>
-          <w:b/>
-        </w:rPr>
-        <w:t>(1)</w:t>
-      </w:r>
-      <w:r>
-        <w:t xml:space="preserve"> each revenue dollar converts to more cash (margin/returns); </w:t>
-      </w:r>
-      <w:r>
-        <w:rPr>
-          <w:b/>
-        </w:rPr>
-        <w:t>(2)</w:t>
-      </w:r>
-      <w:r>
-        <w:t xml:space="preserve"> the cash grows faster for longer (duration); </w:t>
-      </w:r>
-      <w:r>
-        <w:rPr>
-          <w:b/>
-        </w:rPr>
-        <w:t>(3)</w:t>
-      </w:r>
-      <w:r>
-        <w:t xml:space="preserve"> the cash is safer (risk). Worse on all three means it must trade at a discount. Everything else is narrative.</w:t>
+        <w:t>3. Ingenic Semiconductor (3223 HK / A: 300223.SZ) — the one that already listed, and the lesson in it</w:t>
       </w:r>
     </w:p>
     <w:p>
@@ -2594,7 +2562,93 @@
         <w:pStyle w:val="Heading2"/>
       </w:pPr>
       <w:r>
-        <w:t>SHEIN vs PDD — no premium deserved. Walk the three drivers:</w:t>
+        <w:t>The deal — and what actually happened</w:t>
+      </w:r>
+    </w:p>
+    <w:p>
+      <w:pPr>
+        <w:pStyle w:val="ListBullet"/>
+      </w:pPr>
+      <w:r>
+        <w:t xml:space="preserve">A+H listing: Beijing chip designer (memory + compute + analog), A-share on ChiNext since 2011. H tranche: 31.29m shares, </w:t>
+      </w:r>
+      <w:r>
+        <w:rPr>
+          <w:b/>
+        </w:rPr>
+        <w:t>priced HK$100.00 on 21 Aug — below the HK$102.80 max, the first tell</w:t>
+      </w:r>
+      <w:r>
+        <w:t xml:space="preserve"> — raising ~HK$3.13bn net. 10% public / 90% international, fixed split, no clawback. Entry ticket a chunky HK$10,384/lot. Sole sponsor Guotai Junan.</w:t>
+      </w:r>
+    </w:p>
+    <w:p>
+      <w:pPr>
+        <w:pStyle w:val="ListBullet"/>
+      </w:pPr>
+      <w:r>
+        <w:t xml:space="preserve">Demand looked enormous on paper: margin book HK$222bn = </w:t>
+      </w:r>
+      <w:r>
+        <w:rPr>
+          <w:b/>
+        </w:rPr>
+        <w:t>689x</w:t>
+      </w:r>
+      <w:r>
+        <w:t xml:space="preserve">, final public subscription </w:t>
+      </w:r>
+      <w:r>
+        <w:rPr>
+          <w:b/>
+        </w:rPr>
+        <w:t>~927x</w:t>
+      </w:r>
+      <w:r>
+        <w:t>, one-lot hit rate 0.27%.</w:t>
+      </w:r>
+    </w:p>
+    <w:p>
+      <w:pPr>
+        <w:pStyle w:val="ListBullet"/>
+      </w:pPr>
+      <w:r>
+        <w:t xml:space="preserve">And then: grey market closed </w:t>
+      </w:r>
+      <w:r>
+        <w:rPr>
+          <w:b/>
+        </w:rPr>
+        <w:t>below issue</w:t>
+      </w:r>
+      <w:r>
+        <w:t xml:space="preserve"> (HK$99.50–99.75). Day 1 (25 Aug) opened flat, traded down to 97.10, and closed at </w:t>
+      </w:r>
+      <w:r>
+        <w:rPr>
+          <w:b/>
+        </w:rPr>
+        <w:t>exactly HK$100.00</w:t>
+      </w:r>
+      <w:r>
+        <w:t xml:space="preserve"> on HK$582m turnover — a close pinned precisely at issue on ~19% of the deal changing hands is the classic stabilisation-agent footprint (never announced; the window runs to ~19 Sep). Day 2 it was let go: </w:t>
+      </w:r>
+      <w:r>
+        <w:rPr>
+          <w:b/>
+        </w:rPr>
+        <w:t>95.30, –4.7% below issue</w:t>
+      </w:r>
+      <w:r>
+        <w:t>. Day 3 (today) it closed 101.10, +1.1% vs offer — but only because the whole memory complex ripped (its A-share +6.4%, Montage +10% the same day). Sector beta, not deal aftermarket.</w:t>
+      </w:r>
+    </w:p>
+    <w:p>
+      <w:pPr>
+        <w:pStyle w:val="Heading2"/>
+      </w:pPr>
+      <w:r>
+        <w:t>Why a 927x book produced no pop — the deduction that matters for Mech-Mind</w:t>
       </w:r>
     </w:p>
     <w:p>
@@ -2605,19 +2659,10 @@
         <w:rPr>
           <w:b/>
         </w:rPr>
-        <w:t>Earnings quality — what is a dollar of SHEIN's profit worth versus a dollar of PDD's?</w:t>
-      </w:r>
-      <w:r>
-        <w:t xml:space="preserve"> PDD's dollar is a take-rate on other people's inventory: ~20% net margin, negative working capital, no fulfilment asset at risk. SHEIN's dollar comes from goods it must manufacture and ship across a border: 4.9% net margin — and that margin </w:t>
-      </w:r>
-      <w:r>
-        <w:rPr>
-          <w:b/>
-        </w:rPr>
-        <w:t>halved in one year because one customs rule changed</w:t>
-      </w:r>
-      <w:r>
-        <w:t>. A profit stream that a single regulatory decision can cut in half is a lower-quality stream. Driver 1: discount.</w:t>
+        <w:t>A 927x subscription is demand for allocation, not demand for the stock at HK$100+.</w:t>
+      </w:r>
+      <w:r>
+        <w:t xml:space="preserve"> The book was margin-financed flippers paying ~1.5% financing for a week — everyone was there for the pop, so at the open everyone is a seller. Subscription multiples measure how many people want free money, not where the clearing price is.</w:t>
       </w:r>
     </w:p>
     <w:p>
@@ -2628,19 +2673,10 @@
         <w:rPr>
           <w:b/>
         </w:rPr>
-        <w:t>Growth — will SHEIN's dollar grow faster?</w:t>
-      </w:r>
-      <w:r>
-        <w:t xml:space="preserve"> PDD compounds ~10% with category breadth working for it. SHEIN went +8% → +1%, and the ceiling logic in section 1 shows all three growth levers (frequency, basket, new users) are exhausted. Worse: the fourth force — ad-auction inflation — is a headwind that </w:t>
-      </w:r>
-      <w:r>
-        <w:rPr>
-          <w:b/>
-        </w:rPr>
-        <w:t>PDD causes and SHEIN suffers</w:t>
-      </w:r>
-      <w:r>
-        <w:t>. Temu's spending is literally why SHEIN paid +48.9% for +8% revenue. Paying a premium here means paying more for the victim than the aggressor. Driver 2: discount.</w:t>
+        <w:t>There was a visible fair-value anchor.</w:t>
+      </w:r>
+      <w:r>
+        <w:t xml:space="preserve"> The A-share trades every day; the H priced at a ~38% discount to it, which is where comparable A/H semis already sat. Nobody chases an H-share above its customary discount when the anchor is on the screen — arbitrage logic caps the upside in a way that simply doesn't exist for Mech-Mind, where nothing tells anyone what it's worth.</w:t>
       </w:r>
     </w:p>
     <w:p>
@@ -2651,10 +2687,10 @@
         <w:rPr>
           <w:b/>
         </w:rPr>
-        <w:t>Risk — anything offsetting?</w:t>
-      </w:r>
-      <w:r>
-        <w:t xml:space="preserve"> The China/tariff haircut applies to both, so it cancels. SHEIN then adds three risks PDD doesn't carry: WVR (no southbound buyer for six months), the US$3.5bn ratchet leakage, and a register of made-whole sellers sitting exactly at your cost basis. Driver 3: discount.</w:t>
+        <w:t>And there was real float.</w:t>
+      </w:r>
+      <w:r>
+        <w:t xml:space="preserve"> Cornerstones took 46.7%, leaving ~HK$1.7bn of stock loose — versus Mech-Mind's ~HK$120m public tranche. Supply met the flippers at the open.</w:t>
       </w:r>
     </w:p>
     <w:p>
@@ -2665,19 +2701,10 @@
         <w:rPr>
           <w:b/>
         </w:rPr>
-        <w:t>So why does the deal still ask 12.9x against PDD's 9.5x?</w:t>
-      </w:r>
-      <w:r>
-        <w:t xml:space="preserve"> Only one honest answer: the denominator. The syndicate wants you to capitalise 2027 *normalised* earnings (BI's US$1.67bn rebound), not the depressed 2025/Q1 prints. Legitimate argument — but see what it implies: </w:t>
-      </w:r>
-      <w:r>
-        <w:rPr>
-          <w:b/>
-        </w:rPr>
-        <w:t>the entire 35% premium IS the recovery bet, with zero margin of safety left over.</w:t>
-      </w:r>
-      <w:r>
-        <w:t xml:space="preserve"> The rule it breaks: don't pay in advance for a normalisation the company hasn't printed, when the anchor comp gives you a structurally better business without needing the bet. If recovery lands, PDD probably re-rates too, so you don't even win relative; if it misses, SHEIN converges to PDD's multiple ≈ US$20bn, about –25%. Heads you roughly tie, tails you lose a quarter.</w:t>
+        <w:t>The rule this proves: pop = (no anchor) × (no float) × (leveraged demand).</w:t>
+      </w:r>
+      <w:r>
+        <w:t xml:space="preserve"> Ingenic had the third but neither of the first two. Mech-Mind has all three. Same 500–900x headline, opposite mechanics.</w:t>
       </w:r>
     </w:p>
     <w:p>
@@ -2685,7 +2712,1064 @@
         <w:pStyle w:val="Heading2"/>
       </w:pPr>
       <w:r>
-        <w:t>Mech-Mind vs Rokae — premium deserved. Same three drivers:</w:t>
+        <w:t>Fundamentals — a cyclical caught at its inflection</w:t>
+      </w:r>
+    </w:p>
+    <w:p>
+      <w:pPr>
+        <w:pStyle w:val="ListBullet"/>
+      </w:pPr>
+      <w:r>
+        <w:t xml:space="preserve">Three segments (2025): </w:t>
+      </w:r>
+      <w:r>
+        <w:rPr>
+          <w:b/>
+        </w:rPr>
+        <w:t>memory 61%</w:t>
+      </w:r>
+      <w:r>
+        <w:t xml:space="preserve"> (via the 2020 ISSI acquisition — auto/industrial SRAM, niche DRAM, NOR flash), </w:t>
+      </w:r>
+      <w:r>
+        <w:rPr>
+          <w:b/>
+        </w:rPr>
+        <w:t>computing 27%</w:t>
+      </w:r>
+      <w:r>
+        <w:t xml:space="preserve"> (IP-camera SoCs, XBurst MPUs), </w:t>
+      </w:r>
+      <w:r>
+        <w:rPr>
+          <w:b/>
+        </w:rPr>
+        <w:t>analog 11%</w:t>
+      </w:r>
+      <w:r>
+        <w:t xml:space="preserve"> (LED drivers). End-markets: consumer 35%, automotive 34%, industrial/other 31%.</w:t>
+      </w:r>
+    </w:p>
+    <w:p>
+      <w:pPr>
+        <w:pStyle w:val="ListBullet"/>
+      </w:pPr>
+      <w:r>
+        <w:t>The pre-IPO record was a downcycle: revenue fell 2023–24, net profit RMB 516m → 364m → 375m, gross margin sliding to ~33%. The H-listing was marketed straight into the turn:</w:t>
+      </w:r>
+    </w:p>
+    <w:p>
+      <w:pPr>
+        <w:pStyle w:val="ListBullet"/>
+      </w:pPr>
+      <w:r>
+        <w:rPr>
+          <w:b/>
+        </w:rPr>
+        <w:t>Q1 2026: revenue +47%, net profit +332%, gross margin 43% — a ten-year high. H1 2026: revenue ~RMB 4.0bn +77%, net profit guided RMB 1.08–1.28bn, i.e. +431% to +531%</w:t>
+      </w:r>
+      <w:r>
+        <w:t xml:space="preserve"> — roughly three years of profit in one half.</w:t>
+      </w:r>
+    </w:p>
+    <w:p>
+      <w:pPr>
+        <w:pStyle w:val="ListBullet"/>
+      </w:pPr>
+      <w:r>
+        <w:t>The driver is the legacy-memory squeeze: Samsung/Hynix/Micron moved ~93% of DRAM output to HBM/DDR5, legacy DDR4/niche DRAM contract prices rose 80–90% QoQ, and Ingenic — whose price hikes lag the industry, with 323 days of low-cost inventory to sell into rising prices — says Q3 and Q4 hikes are still coming, with gross margin rising every quarter.</w:t>
+      </w:r>
+    </w:p>
+    <w:p>
+      <w:pPr>
+        <w:pStyle w:val="Heading2"/>
+      </w:pPr>
+      <w:r>
+        <w:t>The edge — real niches, but a cycle-taker</w:t>
+      </w:r>
+    </w:p>
+    <w:p>
+      <w:pPr>
+        <w:pStyle w:val="ListBullet"/>
+      </w:pPr>
+      <w:r>
+        <w:t xml:space="preserve">The niches are genuine: </w:t>
+      </w:r>
+      <w:r>
+        <w:rPr>
+          <w:b/>
+        </w:rPr>
+        <w:t>global #1 in automotive SRAM (~60% of that niche), global #2 in SRAM overall, #5 in auto niche DRAM, #2 in IP-camera SoCs.</w:t>
+      </w:r>
+      <w:r>
+        <w:t xml:space="preserve"> Auto-grade memory sockets take years to qualify and are sticky once designed in — that's a real moat within the niche.</w:t>
+      </w:r>
+    </w:p>
+    <w:p>
+      <w:pPr>
+        <w:pStyle w:val="ListBullet"/>
+      </w:pPr>
+      <w:r>
+        <w:t xml:space="preserve">But be clear what this is: a </w:t>
+      </w:r>
+      <w:r>
+        <w:rPr>
+          <w:b/>
+        </w:rPr>
+        <w:t>price-taker riding the majors' exit</w:t>
+      </w:r>
+      <w:r>
+        <w:t xml:space="preserve">, not a price-maker. It doesn't control the cycle that is quadrupling its profits; it says itself that visibility ends around </w:t>
+      </w:r>
+      <w:r>
+        <w:rPr>
+          <w:b/>
+        </w:rPr>
+        <w:t>H2 2027</w:t>
+      </w:r>
+      <w:r>
+        <w:t>, CXMT/Winbond/Nanya are filling the legacy vacuum, consumer (not auto) is now its largest end-market, and the RMB 3.0bn of ISSI goodwill plus 323-day inventory become the risk the day prices roll.</w:t>
+      </w:r>
+    </w:p>
+    <w:p>
+      <w:pPr>
+        <w:pStyle w:val="Heading2"/>
+      </w:pPr>
+      <w:r>
+        <w:t>Valuation — and the A/H question</w:t>
+      </w:r>
+    </w:p>
+    <w:tbl>
+      <w:tblPr>
+        <w:tblStyle w:val="LightGrid-Accent1"/>
+        <w:tblW w:type="auto" w:w="0"/>
+        <w:tblLook w:firstColumn="1" w:firstRow="1" w:lastColumn="0" w:lastRow="0" w:noHBand="0" w:noVBand="1" w:val="04A0"/>
+      </w:tblPr>
+      <w:tblGrid>
+        <w:gridCol w:w="2160"/>
+        <w:gridCol w:w="2160"/>
+        <w:gridCol w:w="2160"/>
+        <w:gridCol w:w="2160"/>
+      </w:tblGrid>
+      <w:tr>
+        <w:tc>
+          <w:tcPr>
+            <w:tcW w:type="dxa" w:w="2736"/>
+          </w:tcPr>
+          <w:p>
+            <w:r/>
+            <w:r>
+              <w:rPr>
+                <w:b/>
+                <w:sz w:val="19"/>
+              </w:rPr>
+            </w:r>
+          </w:p>
+        </w:tc>
+        <w:tc>
+          <w:tcPr>
+            <w:tcW w:type="dxa" w:w="3168"/>
+          </w:tcPr>
+          <w:p>
+            <w:r/>
+            <w:r>
+              <w:rPr>
+                <w:b/>
+                <w:sz w:val="19"/>
+              </w:rPr>
+              <w:t>P/E basis</w:t>
+            </w:r>
+          </w:p>
+        </w:tc>
+        <w:tc>
+          <w:tcPr>
+            <w:tcW w:type="dxa" w:w="2160"/>
+          </w:tcPr>
+          <w:p>
+            <w:r/>
+            <w:r>
+              <w:rPr>
+                <w:b/>
+                <w:sz w:val="19"/>
+              </w:rPr>
+              <w:t>Level</w:t>
+            </w:r>
+          </w:p>
+        </w:tc>
+        <w:tc>
+          <w:tcPr>
+            <w:tcW w:type="dxa" w:w="3312"/>
+          </w:tcPr>
+          <w:p>
+            <w:r/>
+            <w:r>
+              <w:rPr>
+                <w:b/>
+                <w:sz w:val="19"/>
+              </w:rPr>
+              <w:t>Note</w:t>
+            </w:r>
+          </w:p>
+        </w:tc>
+      </w:tr>
+      <w:tr>
+        <w:tc>
+          <w:tcPr>
+            <w:tcW w:type="dxa" w:w="2736"/>
+          </w:tcPr>
+          <w:p>
+            <w:r>
+              <w:rPr>
+                <w:sz w:val="19"/>
+              </w:rPr>
+            </w:r>
+            <w:r>
+              <w:rPr>
+                <w:b/>
+                <w:sz w:val="19"/>
+              </w:rPr>
+              <w:t>Ingenic H @ 101.10</w:t>
+            </w:r>
+          </w:p>
+        </w:tc>
+        <w:tc>
+          <w:tcPr>
+            <w:tcW w:type="dxa" w:w="3168"/>
+          </w:tcPr>
+          <w:p>
+            <w:r>
+              <w:rPr>
+                <w:sz w:val="19"/>
+              </w:rPr>
+            </w:r>
+            <w:r>
+              <w:rPr>
+                <w:sz w:val="19"/>
+              </w:rPr>
+              <w:t>FY2025 trailing / TTM-thru-H1 / 2026E annualised</w:t>
+            </w:r>
+          </w:p>
+        </w:tc>
+        <w:tc>
+          <w:tcPr>
+            <w:tcW w:type="dxa" w:w="2160"/>
+          </w:tcPr>
+          <w:p>
+            <w:r>
+              <w:rPr>
+                <w:sz w:val="19"/>
+              </w:rPr>
+            </w:r>
+            <w:r>
+              <w:rPr>
+                <w:b/>
+                <w:sz w:val="19"/>
+              </w:rPr>
+              <w:t>~119x / ~33x / ~19x</w:t>
+            </w:r>
+          </w:p>
+        </w:tc>
+        <w:tc>
+          <w:tcPr>
+            <w:tcW w:type="dxa" w:w="3312"/>
+          </w:tcPr>
+          <w:p>
+            <w:r>
+              <w:rPr>
+                <w:sz w:val="19"/>
+              </w:rPr>
+            </w:r>
+            <w:r>
+              <w:rPr>
+                <w:sz w:val="19"/>
+              </w:rPr>
+              <w:t>the multiple collapses as the cycle earnings land</w:t>
+            </w:r>
+          </w:p>
+        </w:tc>
+      </w:tr>
+      <w:tr>
+        <w:tc>
+          <w:tcPr>
+            <w:tcW w:type="dxa" w:w="2736"/>
+          </w:tcPr>
+          <w:p>
+            <w:r>
+              <w:rPr>
+                <w:sz w:val="19"/>
+              </w:rPr>
+            </w:r>
+            <w:r>
+              <w:rPr>
+                <w:sz w:val="19"/>
+              </w:rPr>
+              <w:t>Ingenic A @ RMB 140.48</w:t>
+            </w:r>
+          </w:p>
+        </w:tc>
+        <w:tc>
+          <w:tcPr>
+            <w:tcW w:type="dxa" w:w="3168"/>
+          </w:tcPr>
+          <w:p>
+            <w:r>
+              <w:rPr>
+                <w:sz w:val="19"/>
+              </w:rPr>
+            </w:r>
+            <w:r>
+              <w:rPr>
+                <w:sz w:val="19"/>
+              </w:rPr>
+              <w:t>TTM-thru-Q1 / 2026E annualised</w:t>
+            </w:r>
+          </w:p>
+        </w:tc>
+        <w:tc>
+          <w:tcPr>
+            <w:tcW w:type="dxa" w:w="2160"/>
+          </w:tcPr>
+          <w:p>
+            <w:r>
+              <w:rPr>
+                <w:sz w:val="19"/>
+              </w:rPr>
+            </w:r>
+            <w:r>
+              <w:rPr>
+                <w:sz w:val="19"/>
+              </w:rPr>
+              <w:t>116x / ~31x</w:t>
+            </w:r>
+          </w:p>
+        </w:tc>
+        <w:tc>
+          <w:tcPr>
+            <w:tcW w:type="dxa" w:w="3312"/>
+          </w:tcPr>
+          <w:p>
+            <w:r>
+              <w:rPr>
+                <w:sz w:val="19"/>
+              </w:rPr>
+            </w:r>
+            <w:r>
+              <w:rPr>
+                <w:sz w:val="19"/>
+              </w:rPr>
+              <w:t>ChiNext pricing of the same cash flows</w:t>
+            </w:r>
+          </w:p>
+        </w:tc>
+      </w:tr>
+      <w:tr>
+        <w:tc>
+          <w:tcPr>
+            <w:tcW w:type="dxa" w:w="2736"/>
+          </w:tcPr>
+          <w:p>
+            <w:r>
+              <w:rPr>
+                <w:sz w:val="19"/>
+              </w:rPr>
+            </w:r>
+            <w:r>
+              <w:rPr>
+                <w:sz w:val="19"/>
+              </w:rPr>
+              <w:t>GigaDevice (A)</w:t>
+            </w:r>
+          </w:p>
+        </w:tc>
+        <w:tc>
+          <w:tcPr>
+            <w:tcW w:type="dxa" w:w="3168"/>
+          </w:tcPr>
+          <w:p>
+            <w:r>
+              <w:rPr>
+                <w:sz w:val="19"/>
+              </w:rPr>
+            </w:r>
+            <w:r>
+              <w:rPr>
+                <w:sz w:val="19"/>
+              </w:rPr>
+              <w:t>TTM incl. H1 blowout</w:t>
+            </w:r>
+          </w:p>
+        </w:tc>
+        <w:tc>
+          <w:tcPr>
+            <w:tcW w:type="dxa" w:w="2160"/>
+          </w:tcPr>
+          <w:p>
+            <w:r>
+              <w:rPr>
+                <w:sz w:val="19"/>
+              </w:rPr>
+            </w:r>
+            <w:r>
+              <w:rPr>
+                <w:sz w:val="19"/>
+              </w:rPr>
+              <w:t>36x</w:t>
+            </w:r>
+          </w:p>
+        </w:tc>
+        <w:tc>
+          <w:tcPr>
+            <w:tcW w:type="dxa" w:w="3312"/>
+          </w:tcPr>
+          <w:p>
+            <w:r>
+              <w:rPr>
+                <w:sz w:val="19"/>
+              </w:rPr>
+            </w:r>
+            <w:r>
+              <w:rPr>
+                <w:sz w:val="19"/>
+              </w:rPr>
+              <w:t>H1'26 profit +1,092% — same cycle</w:t>
+            </w:r>
+          </w:p>
+        </w:tc>
+      </w:tr>
+      <w:tr>
+        <w:tc>
+          <w:tcPr>
+            <w:tcW w:type="dxa" w:w="2736"/>
+          </w:tcPr>
+          <w:p>
+            <w:r>
+              <w:rPr>
+                <w:sz w:val="19"/>
+              </w:rPr>
+            </w:r>
+            <w:r>
+              <w:rPr>
+                <w:sz w:val="19"/>
+              </w:rPr>
+              <w:t>Rockchip (A)</w:t>
+            </w:r>
+          </w:p>
+        </w:tc>
+        <w:tc>
+          <w:tcPr>
+            <w:tcW w:type="dxa" w:w="3168"/>
+          </w:tcPr>
+          <w:p>
+            <w:r>
+              <w:rPr>
+                <w:sz w:val="19"/>
+              </w:rPr>
+            </w:r>
+            <w:r>
+              <w:rPr>
+                <w:sz w:val="19"/>
+              </w:rPr>
+              <w:t>TTM</w:t>
+            </w:r>
+          </w:p>
+        </w:tc>
+        <w:tc>
+          <w:tcPr>
+            <w:tcW w:type="dxa" w:w="2160"/>
+          </w:tcPr>
+          <w:p>
+            <w:r>
+              <w:rPr>
+                <w:sz w:val="19"/>
+              </w:rPr>
+            </w:r>
+            <w:r>
+              <w:rPr>
+                <w:sz w:val="19"/>
+              </w:rPr>
+              <w:t>56x</w:t>
+            </w:r>
+          </w:p>
+        </w:tc>
+        <w:tc>
+          <w:tcPr>
+            <w:tcW w:type="dxa" w:w="3312"/>
+          </w:tcPr>
+          <w:p>
+            <w:r>
+              <w:rPr>
+                <w:sz w:val="19"/>
+              </w:rPr>
+            </w:r>
+          </w:p>
+        </w:tc>
+      </w:tr>
+      <w:tr>
+        <w:tc>
+          <w:tcPr>
+            <w:tcW w:type="dxa" w:w="2736"/>
+          </w:tcPr>
+          <w:p>
+            <w:r>
+              <w:rPr>
+                <w:sz w:val="19"/>
+              </w:rPr>
+            </w:r>
+            <w:r>
+              <w:rPr>
+                <w:sz w:val="19"/>
+              </w:rPr>
+              <w:t>Montage (A)</w:t>
+            </w:r>
+          </w:p>
+        </w:tc>
+        <w:tc>
+          <w:tcPr>
+            <w:tcW w:type="dxa" w:w="3168"/>
+          </w:tcPr>
+          <w:p>
+            <w:r>
+              <w:rPr>
+                <w:sz w:val="19"/>
+              </w:rPr>
+            </w:r>
+            <w:r>
+              <w:rPr>
+                <w:sz w:val="19"/>
+              </w:rPr>
+              <w:t>TTM</w:t>
+            </w:r>
+          </w:p>
+        </w:tc>
+        <w:tc>
+          <w:tcPr>
+            <w:tcW w:type="dxa" w:w="2160"/>
+          </w:tcPr>
+          <w:p>
+            <w:r>
+              <w:rPr>
+                <w:sz w:val="19"/>
+              </w:rPr>
+            </w:r>
+            <w:r>
+              <w:rPr>
+                <w:sz w:val="19"/>
+              </w:rPr>
+              <w:t>106x</w:t>
+            </w:r>
+          </w:p>
+        </w:tc>
+        <w:tc>
+          <w:tcPr>
+            <w:tcW w:type="dxa" w:w="3312"/>
+          </w:tcPr>
+          <w:p>
+            <w:r>
+              <w:rPr>
+                <w:sz w:val="19"/>
+              </w:rPr>
+            </w:r>
+          </w:p>
+        </w:tc>
+      </w:tr>
+      <w:tr>
+        <w:tc>
+          <w:tcPr>
+            <w:tcW w:type="dxa" w:w="2736"/>
+          </w:tcPr>
+          <w:p>
+            <w:r>
+              <w:rPr>
+                <w:sz w:val="19"/>
+              </w:rPr>
+            </w:r>
+            <w:r>
+              <w:rPr>
+                <w:sz w:val="19"/>
+              </w:rPr>
+              <w:t>SG Micro (A)</w:t>
+            </w:r>
+          </w:p>
+        </w:tc>
+        <w:tc>
+          <w:tcPr>
+            <w:tcW w:type="dxa" w:w="3168"/>
+          </w:tcPr>
+          <w:p>
+            <w:r>
+              <w:rPr>
+                <w:sz w:val="19"/>
+              </w:rPr>
+            </w:r>
+            <w:r>
+              <w:rPr>
+                <w:sz w:val="19"/>
+              </w:rPr>
+              <w:t>TTM</w:t>
+            </w:r>
+          </w:p>
+        </w:tc>
+        <w:tc>
+          <w:tcPr>
+            <w:tcW w:type="dxa" w:w="2160"/>
+          </w:tcPr>
+          <w:p>
+            <w:r>
+              <w:rPr>
+                <w:sz w:val="19"/>
+              </w:rPr>
+            </w:r>
+            <w:r>
+              <w:rPr>
+                <w:sz w:val="19"/>
+              </w:rPr>
+              <w:t>131x</w:t>
+            </w:r>
+          </w:p>
+        </w:tc>
+        <w:tc>
+          <w:tcPr>
+            <w:tcW w:type="dxa" w:w="3312"/>
+          </w:tcPr>
+          <w:p>
+            <w:r>
+              <w:rPr>
+                <w:sz w:val="19"/>
+              </w:rPr>
+            </w:r>
+          </w:p>
+        </w:tc>
+      </w:tr>
+      <w:tr>
+        <w:tc>
+          <w:tcPr>
+            <w:tcW w:type="dxa" w:w="2736"/>
+          </w:tcPr>
+          <w:p>
+            <w:r>
+              <w:rPr>
+                <w:sz w:val="19"/>
+              </w:rPr>
+            </w:r>
+            <w:r>
+              <w:rPr>
+                <w:sz w:val="19"/>
+              </w:rPr>
+              <w:t>Fudan Micro (A)</w:t>
+            </w:r>
+          </w:p>
+        </w:tc>
+        <w:tc>
+          <w:tcPr>
+            <w:tcW w:type="dxa" w:w="3168"/>
+          </w:tcPr>
+          <w:p>
+            <w:r>
+              <w:rPr>
+                <w:sz w:val="19"/>
+              </w:rPr>
+            </w:r>
+            <w:r>
+              <w:rPr>
+                <w:sz w:val="19"/>
+              </w:rPr>
+              <w:t>TTM</w:t>
+            </w:r>
+          </w:p>
+        </w:tc>
+        <w:tc>
+          <w:tcPr>
+            <w:tcW w:type="dxa" w:w="2160"/>
+          </w:tcPr>
+          <w:p>
+            <w:r>
+              <w:rPr>
+                <w:sz w:val="19"/>
+              </w:rPr>
+            </w:r>
+            <w:r>
+              <w:rPr>
+                <w:sz w:val="19"/>
+              </w:rPr>
+              <w:t>51x</w:t>
+            </w:r>
+          </w:p>
+        </w:tc>
+        <w:tc>
+          <w:tcPr>
+            <w:tcW w:type="dxa" w:w="3312"/>
+          </w:tcPr>
+          <w:p>
+            <w:r>
+              <w:rPr>
+                <w:sz w:val="19"/>
+              </w:rPr>
+            </w:r>
+          </w:p>
+        </w:tc>
+      </w:tr>
+    </w:tbl>
+    <w:p/>
+    <w:tbl>
+      <w:tblPr>
+        <w:tblStyle w:val="LightGrid-Accent1"/>
+        <w:tblW w:type="auto" w:w="0"/>
+        <w:tblLook w:firstColumn="1" w:firstRow="1" w:lastColumn="0" w:lastRow="0" w:noHBand="0" w:noVBand="1" w:val="04A0"/>
+      </w:tblPr>
+      <w:tblGrid>
+        <w:gridCol w:w="4320"/>
+        <w:gridCol w:w="4320"/>
+      </w:tblGrid>
+      <w:tr>
+        <w:tc>
+          <w:tcPr>
+            <w:tcW w:type="dxa" w:w="4608"/>
+          </w:tcPr>
+          <w:p>
+            <w:r/>
+            <w:r>
+              <w:rPr>
+                <w:b/>
+                <w:sz w:val="19"/>
+              </w:rPr>
+              <w:t>A+H semi pair</w:t>
+            </w:r>
+          </w:p>
+        </w:tc>
+        <w:tc>
+          <w:tcPr>
+            <w:tcW w:type="dxa" w:w="4608"/>
+          </w:tcPr>
+          <w:p>
+            <w:r/>
+            <w:r>
+              <w:rPr>
+                <w:b/>
+                <w:sz w:val="19"/>
+              </w:rPr>
+              <w:t>H discount to A (27 Aug)</w:t>
+            </w:r>
+          </w:p>
+        </w:tc>
+      </w:tr>
+      <w:tr>
+        <w:tc>
+          <w:tcPr>
+            <w:tcW w:type="dxa" w:w="4608"/>
+          </w:tcPr>
+          <w:p>
+            <w:r>
+              <w:rPr>
+                <w:sz w:val="19"/>
+              </w:rPr>
+            </w:r>
+            <w:r>
+              <w:rPr>
+                <w:sz w:val="19"/>
+              </w:rPr>
+              <w:t>Fudan Micro</w:t>
+            </w:r>
+          </w:p>
+        </w:tc>
+        <w:tc>
+          <w:tcPr>
+            <w:tcW w:type="dxa" w:w="4608"/>
+          </w:tcPr>
+          <w:p>
+            <w:r>
+              <w:rPr>
+                <w:sz w:val="19"/>
+              </w:rPr>
+            </w:r>
+            <w:r>
+              <w:rPr>
+                <w:sz w:val="19"/>
+              </w:rPr>
+              <w:t>58%</w:t>
+            </w:r>
+          </w:p>
+        </w:tc>
+      </w:tr>
+      <w:tr>
+        <w:tc>
+          <w:tcPr>
+            <w:tcW w:type="dxa" w:w="4608"/>
+          </w:tcPr>
+          <w:p>
+            <w:r>
+              <w:rPr>
+                <w:sz w:val="19"/>
+              </w:rPr>
+            </w:r>
+            <w:r>
+              <w:rPr>
+                <w:sz w:val="19"/>
+              </w:rPr>
+              <w:t>SMIC</w:t>
+            </w:r>
+          </w:p>
+        </w:tc>
+        <w:tc>
+          <w:tcPr>
+            <w:tcW w:type="dxa" w:w="4608"/>
+          </w:tcPr>
+          <w:p>
+            <w:r>
+              <w:rPr>
+                <w:sz w:val="19"/>
+              </w:rPr>
+            </w:r>
+            <w:r>
+              <w:rPr>
+                <w:sz w:val="19"/>
+              </w:rPr>
+              <w:t>52%</w:t>
+            </w:r>
+          </w:p>
+        </w:tc>
+      </w:tr>
+      <w:tr>
+        <w:tc>
+          <w:tcPr>
+            <w:tcW w:type="dxa" w:w="4608"/>
+          </w:tcPr>
+          <w:p>
+            <w:r>
+              <w:rPr>
+                <w:sz w:val="19"/>
+              </w:rPr>
+            </w:r>
+            <w:r>
+              <w:rPr>
+                <w:sz w:val="19"/>
+              </w:rPr>
+              <w:t>Novosense (listed Dec '25)</w:t>
+            </w:r>
+          </w:p>
+        </w:tc>
+        <w:tc>
+          <w:tcPr>
+            <w:tcW w:type="dxa" w:w="4608"/>
+          </w:tcPr>
+          <w:p>
+            <w:r>
+              <w:rPr>
+                <w:sz w:val="19"/>
+              </w:rPr>
+            </w:r>
+            <w:r>
+              <w:rPr>
+                <w:sz w:val="19"/>
+              </w:rPr>
+              <w:t>43%</w:t>
+            </w:r>
+          </w:p>
+        </w:tc>
+      </w:tr>
+      <w:tr>
+        <w:tc>
+          <w:tcPr>
+            <w:tcW w:type="dxa" w:w="4608"/>
+          </w:tcPr>
+          <w:p>
+            <w:r>
+              <w:rPr>
+                <w:sz w:val="19"/>
+              </w:rPr>
+            </w:r>
+            <w:r>
+              <w:rPr>
+                <w:b/>
+                <w:sz w:val="19"/>
+              </w:rPr>
+              <w:t>Ingenic</w:t>
+            </w:r>
+          </w:p>
+        </w:tc>
+        <w:tc>
+          <w:tcPr>
+            <w:tcW w:type="dxa" w:w="4608"/>
+          </w:tcPr>
+          <w:p>
+            <w:r>
+              <w:rPr>
+                <w:sz w:val="19"/>
+              </w:rPr>
+            </w:r>
+            <w:r>
+              <w:rPr>
+                <w:b/>
+                <w:sz w:val="19"/>
+              </w:rPr>
+              <w:t>38% — already the tightest of the set</w:t>
+            </w:r>
+          </w:p>
+        </w:tc>
+      </w:tr>
+    </w:tbl>
+    <w:p/>
+    <w:p>
+      <w:r>
+        <w:t xml:space="preserve">Reading it: the H at 101.10 is </w:t>
+      </w:r>
+      <w:r>
+        <w:rPr>
+          <w:b/>
+        </w:rPr>
+        <w:t>~19x annualised 2026 earnings</w:t>
+      </w:r>
+      <w:r>
+        <w:t xml:space="preserve"> — for a company guiding further price hikes into Q4, that is objectively cheap *if the cycle holds*. But two things stop us calling it mispriced. First, the “38% discount to A” pitch is backwards: the discount isn't the H being cheap, it's </w:t>
+      </w:r>
+      <w:r>
+        <w:rPr>
+          <w:b/>
+        </w:rPr>
+        <w:t>the A being expensive</w:t>
+      </w:r>
+      <w:r>
+        <w:t xml:space="preserve"> — 116x trailing is ChiNext speculative pricing that international money simply won't pay, which is exactly why the H debuted flat. Second, within the A/H semi set the 38% discount is already the </w:t>
+      </w:r>
+      <w:r>
+        <w:rPr>
+          <w:b/>
+        </w:rPr>
+        <w:t>tightest</w:t>
+      </w:r>
+      <w:r>
+        <w:t xml:space="preserve"> — tighter than Novosense, far tighter than SMIC's 52% which has sat there for years. There is no free convergence trade here.</w:t>
+      </w:r>
+    </w:p>
+    <w:p>
+      <w:pPr>
+        <w:pStyle w:val="Heading2"/>
+      </w:pPr>
+      <w:r>
+        <w:t>Cornerstones and greenshoe</w:t>
+      </w:r>
+    </w:p>
+    <w:p>
+      <w:pPr>
+        <w:pStyle w:val="ListBullet"/>
+      </w:pPr>
+      <w:r>
+        <w:rPr>
+          <w:b/>
+        </w:rPr>
+        <w:t>Cornerstones: big but one-flavoured.</w:t>
+      </w:r>
+      <w:r>
+        <w:t xml:space="preserve"> US$192m ≈ 46.7% of the deal across 13 names — GF Fund, ICBC Wealth, China Universal, Gaoyi, Perseverance, Huaqin — all China-domestic institutional money. No Baillie Gifford-type global long-only in sight. That matches the trading outcome: a deal underwritten by the China bid stays priced in the China-discount bucket. Compare Mech-Mind's cross-style book — cornerstone *composition* predicted both debuts better than cornerstone *size*.</w:t>
+      </w:r>
+    </w:p>
+    <w:p>
+      <w:pPr>
+        <w:pStyle w:val="ListBullet"/>
+      </w:pPr>
+      <w:r>
+        <w:rPr>
+          <w:b/>
+        </w:rPr>
+        <w:t>Greenshoe: 15%</w:t>
+      </w:r>
+      <w:r>
+        <w:t xml:space="preserve"> (4.69m shares), </w:t>
+      </w:r>
+      <w:r>
+        <w:rPr>
+          <w:b/>
+        </w:rPr>
+        <w:t>not exercised as of 27 Aug</w:t>
+      </w:r>
+      <w:r>
+        <w:t xml:space="preserve"> — and here it's playing the SHEIN role, not the Mech-Mind role: with the stock having already broken issue on day 2, the stabilising agent has likely been covering its short by buying in the market (the day-1 pin at exactly 100.00). If the stock holds above HK$100, expect partial/full exercise by ~19 Sep; if it slips back under, the shoe dies unexercised and the support ends with the window — </w:t>
+      </w:r>
+      <w:r>
+        <w:rPr>
+          <w:b/>
+        </w:rPr>
+        <w:t>a real date to watch: after 19 Sep the safety net is gone.</w:t>
+      </w:r>
+    </w:p>
+    <w:p>
+      <w:pPr>
+        <w:pStyle w:val="Heading2"/>
+      </w:pPr>
+      <w:r>
+        <w:t>View</w:t>
+      </w:r>
+    </w:p>
+    <w:p>
+      <w:pPr>
+        <w:pStyle w:val="ListBullet"/>
+      </w:pPr>
+      <w:r>
+        <w:t xml:space="preserve">This is a </w:t>
+      </w:r>
+      <w:r>
+        <w:rPr>
+          <w:b/>
+        </w:rPr>
+        <w:t>memory-cycle trade wearing an A/H-arbitrage costume</w:t>
+      </w:r>
+      <w:r>
+        <w:t>. Don't own it for the discount closing — SMIC proves discounts can sit for years. Own it only if you want leveraged legacy-DRAM exposure at ~19x 2026E versus GigaDevice at 36x — and size it knowing the company itself can't see past mid-2027, and that 323 days of inventory flips from windfall to writedown when prices roll.</w:t>
+      </w:r>
+    </w:p>
+    <w:p>
+      <w:pPr>
+        <w:pStyle w:val="ListBullet"/>
+      </w:pPr>
+      <w:r>
+        <w:t>Catalysts that could re-rate the H specifically: the actual H1 interim print (the +431–531% guide becoming a number), continued Q3/Q4 hike announcements, possible southbound/HSCI inclusion at the next review (the Novosense-style tightener), and greenshoe/stabilisation resolution by 19 Sep.</w:t>
+      </w:r>
+    </w:p>
+    <w:p>
+      <w:pPr>
+        <w:pStyle w:val="Heading1"/>
+      </w:pPr>
+      <w:r>
+        <w:t>4. The head-to-head: does each deserve its premium (or discount) to its anchor?</w:t>
+      </w:r>
+    </w:p>
+    <w:p>
+      <w:r>
+        <w:t xml:space="preserve">Before the two verdicts, the frame we're using. A multiple is compressed DCF — a business deserves to trade richer than its comp only if at least one of three things is true: </w:t>
+      </w:r>
+      <w:r>
+        <w:rPr>
+          <w:b/>
+        </w:rPr>
+        <w:t>(1)</w:t>
+      </w:r>
+      <w:r>
+        <w:t xml:space="preserve"> each revenue dollar converts to more cash (margin/returns); </w:t>
+      </w:r>
+      <w:r>
+        <w:rPr>
+          <w:b/>
+        </w:rPr>
+        <w:t>(2)</w:t>
+      </w:r>
+      <w:r>
+        <w:t xml:space="preserve"> the cash grows faster for longer (duration); </w:t>
+      </w:r>
+      <w:r>
+        <w:rPr>
+          <w:b/>
+        </w:rPr>
+        <w:t>(3)</w:t>
+      </w:r>
+      <w:r>
+        <w:t xml:space="preserve"> the cash is safer (risk). Worse on all three means it must trade at a discount. Everything else is narrative.</w:t>
+      </w:r>
+    </w:p>
+    <w:p>
+      <w:pPr>
+        <w:pStyle w:val="Heading2"/>
+      </w:pPr>
+      <w:r>
+        <w:t>SHEIN vs PDD — no premium deserved. Walk the three drivers:</w:t>
       </w:r>
     </w:p>
     <w:p>
@@ -2696,37 +3780,19 @@
         <w:rPr>
           <w:b/>
         </w:rPr>
-        <w:t>Fix the unit first.</w:t>
-      </w:r>
-      <w:r>
-        <w:t xml:space="preserve"> P/S assumes every revenue dollar is equal; it isn't. Mech-Mind keeps 65 cents of gross profit per revenue dollar, Rokae keeps 22. If the two ever reach similar opex efficiency, steady-state earnings power per revenue dollar is ~3x higher at Mech-Mind — so the *neutral* condition is equal price-to-</w:t>
+        <w:t>Earnings quality — what is a dollar of SHEIN's profit worth versus a dollar of PDD's?</w:t>
+      </w:r>
+      <w:r>
+        <w:t xml:space="preserve"> PDD's dollar is a take-rate on other people's inventory: ~20% net margin, negative working capital, no fulfilment asset at risk. SHEIN's dollar comes from goods it must manufacture and ship across a border: 4.9% net margin — and that margin </w:t>
       </w:r>
       <w:r>
         <w:rPr>
           <w:b/>
         </w:rPr>
-        <w:t>gross-profit</w:t>
-      </w:r>
-      <w:r>
-        <w:t xml:space="preserve">, not equal P/S. At par P/S (29x each): Mech-Mind ≈ </w:t>
-      </w:r>
-      <w:r>
-        <w:rPr>
-          <w:b/>
-        </w:rPr>
-        <w:t>45x gross profit</w:t>
-      </w:r>
-      <w:r>
-        <w:t xml:space="preserve">, Rokae ≈ </w:t>
-      </w:r>
-      <w:r>
-        <w:rPr>
-          <w:b/>
-        </w:rPr>
-        <w:t>130x</w:t>
-      </w:r>
-      <w:r>
-        <w:t xml:space="preserve"> (~85x on H1-annualised). Parity in P/S already embeds a ~65% relative discount for Mech-Mind on the honest unit. Driver 1 doesn't just say premium — it says the premium is arithmetic, not opinion.</w:t>
+        <w:t>halved in one year because one customs rule changed</w:t>
+      </w:r>
+      <w:r>
+        <w:t>. A profit stream that a single regulatory decision can cut in half is a lower-quality stream. Driver 1: discount.</w:t>
       </w:r>
     </w:p>
     <w:p>
@@ -2737,19 +3803,19 @@
         <w:rPr>
           <w:b/>
         </w:rPr>
-        <w:t>Margin trajectory — who is on the right side of the price war?</w:t>
-      </w:r>
-      <w:r>
-        <w:t xml:space="preserve"> Rokae sells arms: hardware against 300+ Chinese arm makers, embodied segment gross margin 10.7%, price war confirmed by the NDRC and Caixin. Its margin has a hardware ceiling. Mech-Mind sells perception </w:t>
+        <w:t>Growth — will SHEIN's dollar grow faster?</w:t>
+      </w:r>
+      <w:r>
+        <w:t xml:space="preserve"> PDD compounds ~10% with category breadth working for it. SHEIN went +8% → +1%, and the ceiling logic in section 1 shows all three growth levers (frequency, basket, new users) are exhausted. Worse: the fourth force — ad-auction inflation — is a headwind that </w:t>
       </w:r>
       <w:r>
         <w:rPr>
           <w:b/>
         </w:rPr>
-        <w:t>to every arm maker</w:t>
-      </w:r>
-      <w:r>
-        <w:t xml:space="preserve"> — a price war among arm makers increases the volume of eyes sold while squeezing the people selling arms. Its gross margin went 39% → 65% *while the war started*. When a value chain commoditises, the differentiating component captures the value the commodity layer sheds. Driver 2: premium.</w:t>
+        <w:t>PDD causes and SHEIN suffers</w:t>
+      </w:r>
+      <w:r>
+        <w:t>. Temu's spending is literally why SHEIN paid +48.9% for +8% revenue. Paying a premium here means paying more for the victim than the aggressor. Driver 2: discount.</w:t>
       </w:r>
     </w:p>
     <w:p>
@@ -2760,19 +3826,10 @@
         <w:rPr>
           <w:b/>
         </w:rPr>
-        <w:t>Durability — which #1 decays slower?</w:t>
-      </w:r>
-      <w:r>
-        <w:t xml:space="preserve"> Rokae is #1 in a domestic niche (47% of China cobots by volume) but 5.8% in light industrial and only 9% overseas — a local leader in a crowded commodity field. Mech-Mind is #1 </w:t>
-      </w:r>
-      <w:r>
-        <w:rPr>
-          <w:b/>
-        </w:rPr>
-        <w:t>globally</w:t>
-      </w:r>
-      <w:r>
-        <w:t xml:space="preserve"> (27% of shipments, more than the next four combined), #1 in China, Japan and North America simultaneously, 50% overseas at better margin, 86% repeat revenue, and a 27,000-unit data flywheel a copycat cannot shortcut. Global #1 with data lock-in has longer growth duration than domestic niche #1 in hardware. Driver 3: premium.</w:t>
+        <w:t>Risk — anything offsetting?</w:t>
+      </w:r>
+      <w:r>
+        <w:t xml:space="preserve"> The China/tariff haircut applies to both, so it cancels. SHEIN then adds three risks PDD doesn't carry: WVR (no southbound buyer for six months), the US$3.5bn ratchet leakage, and a register of made-whole sellers sitting exactly at your cost basis. Driver 3: discount.</w:t>
       </w:r>
     </w:p>
     <w:p>
@@ -2783,6 +3840,124 @@
         <w:rPr>
           <w:b/>
         </w:rPr>
+        <w:t>So why does the deal still ask 12.9x against PDD's 9.5x?</w:t>
+      </w:r>
+      <w:r>
+        <w:t xml:space="preserve"> Only one honest answer: the denominator. The syndicate wants you to capitalise 2027 *normalised* earnings (BI's US$1.67bn rebound), not the depressed 2025/Q1 prints. Legitimate argument — but see what it implies: </w:t>
+      </w:r>
+      <w:r>
+        <w:rPr>
+          <w:b/>
+        </w:rPr>
+        <w:t>the entire 35% premium IS the recovery bet, with zero margin of safety left over.</w:t>
+      </w:r>
+      <w:r>
+        <w:t xml:space="preserve"> The rule it breaks: don't pay in advance for a normalisation the company hasn't printed, when the anchor comp gives you a structurally better business without needing the bet. If recovery lands, PDD probably re-rates too, so you don't even win relative; if it misses, SHEIN converges to PDD's multiple ≈ US$20bn, about –25%. Heads you roughly tie, tails you lose a quarter.</w:t>
+      </w:r>
+    </w:p>
+    <w:p>
+      <w:pPr>
+        <w:pStyle w:val="Heading2"/>
+      </w:pPr>
+      <w:r>
+        <w:t>Mech-Mind vs Rokae — premium deserved. Same three drivers:</w:t>
+      </w:r>
+    </w:p>
+    <w:p>
+      <w:pPr>
+        <w:pStyle w:val="ListNumber"/>
+      </w:pPr>
+      <w:r>
+        <w:rPr>
+          <w:b/>
+        </w:rPr>
+        <w:t>Fix the unit first.</w:t>
+      </w:r>
+      <w:r>
+        <w:t xml:space="preserve"> P/S assumes every revenue dollar is equal; it isn't. Mech-Mind keeps 65 cents of gross profit per revenue dollar, Rokae keeps 22. If the two ever reach similar opex efficiency, steady-state earnings power per revenue dollar is ~3x higher at Mech-Mind — so the *neutral* condition is equal price-to-</w:t>
+      </w:r>
+      <w:r>
+        <w:rPr>
+          <w:b/>
+        </w:rPr>
+        <w:t>gross-profit</w:t>
+      </w:r>
+      <w:r>
+        <w:t xml:space="preserve">, not equal P/S. At par P/S (29x each): Mech-Mind ≈ </w:t>
+      </w:r>
+      <w:r>
+        <w:rPr>
+          <w:b/>
+        </w:rPr>
+        <w:t>45x gross profit</w:t>
+      </w:r>
+      <w:r>
+        <w:t xml:space="preserve">, Rokae ≈ </w:t>
+      </w:r>
+      <w:r>
+        <w:rPr>
+          <w:b/>
+        </w:rPr>
+        <w:t>130x</w:t>
+      </w:r>
+      <w:r>
+        <w:t xml:space="preserve"> (~85x on H1-annualised). Parity in P/S already embeds a ~65% relative discount for Mech-Mind on the honest unit. Driver 1 doesn't just say premium — it says the premium is arithmetic, not opinion.</w:t>
+      </w:r>
+    </w:p>
+    <w:p>
+      <w:pPr>
+        <w:pStyle w:val="ListNumber"/>
+      </w:pPr>
+      <w:r>
+        <w:rPr>
+          <w:b/>
+        </w:rPr>
+        <w:t>Margin trajectory — who is on the right side of the price war?</w:t>
+      </w:r>
+      <w:r>
+        <w:t xml:space="preserve"> Rokae sells arms: hardware against 300+ Chinese arm makers, embodied segment gross margin 10.7%, price war confirmed by the NDRC and Caixin. Its margin has a hardware ceiling. Mech-Mind sells perception </w:t>
+      </w:r>
+      <w:r>
+        <w:rPr>
+          <w:b/>
+        </w:rPr>
+        <w:t>to every arm maker</w:t>
+      </w:r>
+      <w:r>
+        <w:t xml:space="preserve"> — a price war among arm makers increases the volume of eyes sold while squeezing the people selling arms. Its gross margin went 39% → 65% *while the war started*. When a value chain commoditises, the differentiating component captures the value the commodity layer sheds. Driver 2: premium.</w:t>
+      </w:r>
+    </w:p>
+    <w:p>
+      <w:pPr>
+        <w:pStyle w:val="ListNumber"/>
+      </w:pPr>
+      <w:r>
+        <w:rPr>
+          <w:b/>
+        </w:rPr>
+        <w:t>Durability — which #1 decays slower?</w:t>
+      </w:r>
+      <w:r>
+        <w:t xml:space="preserve"> Rokae is #1 in a domestic niche (47% of China cobots by volume) but 5.8% in light industrial and only 9% overseas — a local leader in a crowded commodity field. Mech-Mind is #1 </w:t>
+      </w:r>
+      <w:r>
+        <w:rPr>
+          <w:b/>
+        </w:rPr>
+        <w:t>globally</w:t>
+      </w:r>
+      <w:r>
+        <w:t xml:space="preserve"> (27% of shipments, more than the next four combined), #1 in China, Japan and North America simultaneously, 50% overseas at better margin, 86% repeat revenue, and a 27,000-unit data flywheel a copycat cannot shortcut. Global #1 with data lock-in has longer growth duration than domestic niche #1 in hardware. Driver 3: premium.</w:t>
+      </w:r>
+    </w:p>
+    <w:p>
+      <w:pPr>
+        <w:pStyle w:val="ListNumber"/>
+      </w:pPr>
+      <w:r>
+        <w:rPr>
+          <w:b/>
+        </w:rPr>
         <w:t>Then why does Rokae get parity today at all?</w:t>
       </w:r>
       <w:r>
@@ -2810,6 +3985,79 @@
       </w:r>
       <w:r>
         <w:t xml:space="preserve"> call. Rokae's own 29x is partly a 6%-float artifact — if Rokae de-rates to 20x, “deserves a premium to Rokae” still means Mech-Mind falls in absolute. Deserving a premium and being cheap are different claims; we are making the first.</w:t>
+      </w:r>
+    </w:p>
+    <w:p>
+      <w:pPr>
+        <w:pStyle w:val="Heading2"/>
+      </w:pPr>
+      <w:r>
+        <w:t>Ingenic H vs its own A-share — the discount is deserved; the H is the honest price.</w:t>
+      </w:r>
+    </w:p>
+    <w:p>
+      <w:pPr>
+        <w:pStyle w:val="ListNumber"/>
+      </w:pPr>
+      <w:r>
+        <w:rPr>
+          <w:b/>
+        </w:rPr>
+        <w:t>Same cash flows, same claim — so any A/H gap is about the investors, not the company.</w:t>
+      </w:r>
+      <w:r>
+        <w:t xml:space="preserve"> An H-share discount persists for exactly three reasons: different discount rates across the two investor bases, no fungibility (you can't convert H into A), and float/liquidity. It is a market-regime variable, not a fundamentals one — which is why it can sit unchanged for years (SMIC: 50%+, permanently).</w:t>
+      </w:r>
+    </w:p>
+    <w:p>
+      <w:pPr>
+        <w:pStyle w:val="ListNumber"/>
+      </w:pPr>
+      <w:r>
+        <w:rPr>
+          <w:b/>
+        </w:rPr>
+        <w:t>The 2026 regime split the A+H universe in two.</w:t>
+      </w:r>
+      <w:r>
+        <w:t xml:space="preserve"> Global-scarcity leaders that international money must own — CATL, Zhongji Innolight, GigaDevice, Montage — have seen their H-shares flip to trading </w:t>
+      </w:r>
+      <w:r>
+        <w:rPr>
+          <w:b/>
+        </w:rPr>
+        <w:t>above</w:t>
+      </w:r>
+      <w:r>
+        <w:t xml:space="preserve"> A. Ordinary A+H names stay at 40–60% discounts. The whole trade question for any new A+H listing is which bucket it lands in.</w:t>
+      </w:r>
+    </w:p>
+    <w:p>
+      <w:pPr>
+        <w:pStyle w:val="ListNumber"/>
+      </w:pPr>
+      <w:r>
+        <w:rPr>
+          <w:b/>
+        </w:rPr>
+        <w:t>The market has already voted Ingenic into the ordinary bucket, and the vote is defensible.</w:t>
+      </w:r>
+      <w:r>
+        <w:t xml:space="preserve"> A niche-memory cyclical whose A-share trades at 116x trailing is not a must-own for global funds — the A-multiple is ChiNext speculation, and the flat debut plus the 38% discount is international money refusing to pay it. The H at ~19x annualised 2026 earnings is the *honest* price for these cash flows; the A at ~31x is the exuberant one.</w:t>
+      </w:r>
+    </w:p>
+    <w:p>
+      <w:pPr>
+        <w:pStyle w:val="ListNumber"/>
+      </w:pPr>
+      <w:r>
+        <w:rPr>
+          <w:b/>
+        </w:rPr>
+        <w:t>So the verdict inverts versus the other two deals: the H doesn't deserve a premium, and its discount isn't opportunity — it's information.</w:t>
+      </w:r>
+      <w:r>
+        <w:t xml:space="preserve"> If anything closes the gap it will be a flow event (southbound inclusion, à la Novosense at 43%) or the A de-rating toward the H — not the H re-rating to ChiNext levels. Buy 3223 for the memory cycle at 19x if you want that trade; never for “the discount must close.”</w:t>
       </w:r>
     </w:p>
     <w:p>
@@ -2817,7 +4065,7 @@
         <w:pStyle w:val="Heading1"/>
       </w:pPr>
       <w:r>
-        <w:t>4. Bottom line</w:t>
+        <w:t>5. Bottom line</w:t>
       </w:r>
     </w:p>
     <w:p>
@@ -2858,6 +4106,20 @@
     </w:p>
     <w:p>
       <w:pPr>
+        <w:pStyle w:val="ListBullet"/>
+      </w:pPr>
+      <w:r>
+        <w:rPr>
+          <w:b/>
+        </w:rPr>
+        <w:t>Ingenic</w:t>
+      </w:r>
+      <w:r>
+        <w:t xml:space="preserve"> — the live control experiment for both: 927x subscribed, no pop, because it had a visible anchor (its own A-share) and real float. A memory-cycle trade at ~19x 2026E, not an A/H convergence trade. And a warning for Monday: subscription multiples predict nothing by themselves — anchor and float do.</w:t>
+      </w:r>
+    </w:p>
+    <w:p>
+      <w:pPr>
         <w:pStyle w:val="Heading2"/>
       </w:pPr>
       <w:r>
@@ -2869,7 +4131,16 @@
         <w:pStyle w:val="ListBullet"/>
       </w:pPr>
       <w:r>
-        <w:t>28 Aug noon — Mech-Mind final price · 31 Aug — SHEIN formal price, allotments, grey market 16:15–18:30 · 1 Sep — debuts · ~mid-Sep — SHEIN HSCI fast entry · H2-26 earnings prints · Mar 2027 — Mech-Mind unlock + both names' southbound windows.</w:t>
+        <w:t xml:space="preserve">28 Aug noon — Mech-Mind final price · 31 Aug — SHEIN formal price, allotments, grey market 16:15–18:30 · 1 Sep — debuts · ~mid-Sep — SHEIN HSCI fast entry · </w:t>
+      </w:r>
+      <w:r>
+        <w:rPr>
+          <w:b/>
+        </w:rPr>
+        <w:t>~19 Sep — Ingenic stabilisation window ends (greenshoe resolved; the safety net comes off)</w:t>
+      </w:r>
+      <w:r>
+        <w:t xml:space="preserve"> · Ingenic H1 interim print · H2-26 robotics prints · Mar 2027 — Mech-Mind unlock + southbound windows.</w:t>
       </w:r>
     </w:p>
     <w:sectPr>

</xml_diff>

<commit_message>
IPO note v7: Ingenic cut to fundamentals + valuation with Sat 29 Aug interim preview (whisper top-of-range, forecast RMB 1.20-1.25bn H1 / 46-48% Q2 GM, GigaDevice relief-rally template); Mech-Mind GM claim sourced (64.6 vs 21.9 filed, BOM-vs-software causal chain); AI-ish Driver tags rewritten natural
Co-Authored-By: Claude Fable 5 <noreply@anthropic.com>
</commit_message>
<xml_diff>
--- a/SHEIN_MechMind_HK_IPO_Note.docx
+++ b/SHEIN_MechMind_HK_IPO_Note.docx
@@ -1503,10 +1503,10 @@
         <w:rPr>
           <w:b/>
         </w:rPr>
-        <w:t>65%</w:t>
-      </w:r>
-      <w:r>
-        <w:t xml:space="preserve"> — software economics, where the hardware robot names run 20–40%.</w:t>
+        <w:t>64.6%</w:t>
+      </w:r>
+      <w:r>
+        <w:t xml:space="preserve"> in 2025, and the path there matters: 39.1% → 51.1% → 64.6%, holding at 64.8% in Q1'26 (all filed in the PHIP). For scale, Rokae runs ~22% blended — 34.8% on cobots, 21.6% on industrial arms, just 10.7% on its embodied arms. The gap isn't branding and it isn't 'AI' as a slogan. An arm's selling price is mostly its bill of materials — reducers, servos, castings — sold into a price war among dozens of makers. A vision system's price is mostly software, sold by the company holding 27% global share. Margin is simply what pricing power looks like once it hits the accounts.</w:t>
       </w:r>
     </w:p>
     <w:p>
@@ -2452,16 +2452,16 @@
         <w:t>Rokae at ~29x</w:t>
       </w:r>
       <w:r>
-        <w:t xml:space="preserve"> — listed seven weeks ago at 17x, ran +69% on a July profit alert, now trades at exactly Mech-Mind's asking multiple. Against that live benchmark, Mech-Mind at the same 29x with </w:t>
+        <w:t xml:space="preserve"> — listed seven weeks ago at 17x, ran +69% on a July profit alert, now trades at exactly Mech-Mind's asking multiple. Against that live benchmark, Mech-Mind at the same 29x with three times Rokae's gross margin (</w:t>
       </w:r>
       <w:r>
         <w:rPr>
           <w:b/>
         </w:rPr>
-        <w:t>triple Rokae's gross margin</w:t>
-      </w:r>
-      <w:r>
-        <w:t xml:space="preserve"> screens relatively cheap — and that relative-cheapness is what the momentum crowd will buy. (Rokae, to be clear, is a peer but a complement, not a competitor: it builds the arms, Mech-Mind builds the vision that guides them. Same wave, different layer — which is why the read-across works for pricing but not for market-share worries.)</w:t>
+        <w:t>64.6% vs 21.9%</w:t>
+      </w:r>
+      <w:r>
+        <w:t>, both prospectus-filed) screens relatively cheap — and that relative-cheapness is what the momentum crowd will buy. (Rokae, to be clear, is a peer but a complement, not a competitor: it builds the arms, Mech-Mind builds the vision that guides them. Same wave, different layer — which is why the read-across works for pricing but not for market-share worries.)</w:t>
       </w:r>
     </w:p>
     <w:p>
@@ -2554,7 +2554,7 @@
         <w:pStyle w:val="Heading1"/>
       </w:pPr>
       <w:r>
-        <w:t>3. Ingenic Semiconductor (3223 HK / A: 300223.SZ) — the one that already listed, and the lesson in it</w:t>
+        <w:t>3. Ingenic (3223 HK / A: 300223.SZ) — fundamentals, and Saturday's earnings</w:t>
       </w:r>
     </w:p>
     <w:p>
@@ -2562,7 +2562,21 @@
         <w:pStyle w:val="Heading2"/>
       </w:pPr>
       <w:r>
-        <w:t>The deal — and what actually happened</w:t>
+        <w:t>What this company actually is</w:t>
+      </w:r>
+    </w:p>
+    <w:p>
+      <w:r>
+        <w:t xml:space="preserve">Beijing chip designer, on ChiNext since 2011, added the H-share line on Aug 25. The business most people miss: this isn't really a CPU company anymore. </w:t>
+      </w:r>
+      <w:r>
+        <w:rPr>
+          <w:b/>
+        </w:rPr>
+        <w:t>Memory is 61% of revenue</w:t>
+      </w:r>
+      <w:r>
+        <w:t xml:space="preserve"> — the ISSI business it bought in 2020, selling automotive and industrial SRAM, niche DRAM and NOR flash. Computing chips (IP-camera SoCs, the XBurst MPUs) are 27%, analog the last 11%. By end market it's consumer 35%, auto 34%, industrial and the rest 31%.</w:t>
       </w:r>
     </w:p>
     <w:p>
@@ -2570,16 +2584,7 @@
         <w:pStyle w:val="ListBullet"/>
       </w:pPr>
       <w:r>
-        <w:t xml:space="preserve">A+H listing: Beijing chip designer (memory + compute + analog), A-share on ChiNext since 2011. H tranche: 31.29m shares, </w:t>
-      </w:r>
-      <w:r>
-        <w:rPr>
-          <w:b/>
-        </w:rPr>
-        <w:t>priced HK$100.00 on 21 Aug — below the HK$102.80 max, the first tell</w:t>
-      </w:r>
-      <w:r>
-        <w:t xml:space="preserve"> — raising ~HK$3.13bn net. 10% public / 90% international, fixed split, no clawback. Entry ticket a chunky HK$10,384/lot. Sole sponsor Guotai Junan.</w:t>
+        <w:t>The niches are real. Global #1 in automotive SRAM — roughly 60% of that pocket — #2 in SRAM overall, #5 in auto niche DRAM, #2 in IP-camera SoCs. Auto-grade memory takes years to qualify, and once you're designed into a car platform you stay there. Small ponds, but it owns them.</w:t>
       </w:r>
     </w:p>
     <w:p>
@@ -2587,25 +2592,7 @@
         <w:pStyle w:val="ListBullet"/>
       </w:pPr>
       <w:r>
-        <w:t xml:space="preserve">Demand looked enormous on paper: margin book HK$222bn = </w:t>
-      </w:r>
-      <w:r>
-        <w:rPr>
-          <w:b/>
-        </w:rPr>
-        <w:t>689x</w:t>
-      </w:r>
-      <w:r>
-        <w:t xml:space="preserve">, final public subscription </w:t>
-      </w:r>
-      <w:r>
-        <w:rPr>
-          <w:b/>
-        </w:rPr>
-        <w:t>~927x</w:t>
-      </w:r>
-      <w:r>
-        <w:t>, one-lot hit rate 0.27%.</w:t>
+        <w:t>The last three years were a grind: revenue RMB 4.53bn → 4.21bn → 4.74bn, profit 516m → 364m → 375m, gross margin drifting down to ~33%. Nothing wrong with the company — memory prices just fell for three years.</w:t>
       </w:r>
     </w:p>
     <w:p>
@@ -2613,34 +2600,33 @@
         <w:pStyle w:val="ListBullet"/>
       </w:pPr>
       <w:r>
-        <w:t xml:space="preserve">And then: grey market closed </w:t>
+        <w:t xml:space="preserve">Then the cycle turned, hard. Samsung, Hynix and Micron moved ~93% of DRAM output to HBM and DDR5, and legacy DDR4/niche DRAM — exactly what Ingenic sells — went into shortage. Spot DDR4 rose another 17% in July alone and is printing all-time highs. And Ingenic walked into this holding </w:t>
       </w:r>
       <w:r>
         <w:rPr>
           <w:b/>
         </w:rPr>
-        <w:t>below issue</w:t>
-      </w:r>
-      <w:r>
-        <w:t xml:space="preserve"> (HK$99.50–99.75). Day 1 (25 Aug) opened flat, traded down to 97.10, and closed at </w:t>
+        <w:t>323 days of inventory bought at old prices</w:t>
+      </w:r>
+      <w:r>
+        <w:t>, repricing quarterly with a lag. While prices rise, that combination is a margin machine.</w:t>
+      </w:r>
+    </w:p>
+    <w:p>
+      <w:pPr>
+        <w:pStyle w:val="ListBullet"/>
+      </w:pPr>
+      <w:r>
+        <w:t xml:space="preserve">The result so far: Q1 revenue +47%, profit +332% (RMB 319m), gross margin 43% — a ten-year high. Segment level: memory 38.9%, compute 51.9%, analog 50.9%. H1 is pre-announced: revenue RMB 3.99bn, +77% (disclosed Aug 10), profit guided </w:t>
       </w:r>
       <w:r>
         <w:rPr>
           <w:b/>
         </w:rPr>
-        <w:t>exactly HK$100.00</w:t>
-      </w:r>
-      <w:r>
-        <w:t xml:space="preserve"> on HK$582m turnover — a close pinned precisely at issue on ~19% of the deal changing hands is the classic stabilisation-agent footprint (never announced; the window runs to ~19 Sep). Day 2 it was let go: </w:t>
-      </w:r>
-      <w:r>
-        <w:rPr>
-          <w:b/>
-        </w:rPr>
-        <w:t>95.30, –4.7% below issue</w:t>
-      </w:r>
-      <w:r>
-        <w:t>. Day 3 (today) it closed 101.10, +1.1% vs offer — but only because the whole memory complex ripped (its A-share +6.4%, Montage +10% the same day). Sector beta, not deal aftermarket.</w:t>
+        <w:t>RMB 1.08–1.28bn, up 431–531%</w:t>
+      </w:r>
+      <w:r>
+        <w:t>. Do the subtraction and Q2 alone is RMB 760–963m — two-and-a-half to three times Q1, in one quarter.</w:t>
       </w:r>
     </w:p>
     <w:p>
@@ -2648,7 +2634,26 @@
         <w:pStyle w:val="Heading2"/>
       </w:pPr>
       <w:r>
-        <w:t>Why a 927x book produced no pop — the deduction that matters for Mech-Mind</w:t>
+        <w:t>Saturday's print — what's actually new, what the whisper is, and our forecast</w:t>
+      </w:r>
+    </w:p>
+    <w:p>
+      <w:r>
+        <w:t xml:space="preserve">First, the date: the interim is </w:t>
+      </w:r>
+      <w:r>
+        <w:rPr>
+          <w:b/>
+        </w:rPr>
+        <w:t>scheduled for Saturday Aug 29</w:t>
+      </w:r>
+      <w:r>
+        <w:t xml:space="preserve"> (exchange appointment calendar; nothing filed as of Wednesday night — the 'Aug 27' on some data sites is a stale estimate). So the A-share reacts Monday Aug 31; the H trades Friday and could move first if the report lands Friday evening.</w:t>
+      </w:r>
+    </w:p>
+    <w:p>
+      <w:r>
+        <w:t>Second, what's genuinely news. Revenue and the profit range are already public — the report can't surprise on those. It settles three things:</w:t>
       </w:r>
     </w:p>
     <w:p>
@@ -2659,10 +2664,10 @@
         <w:rPr>
           <w:b/>
         </w:rPr>
-        <w:t>A 927x subscription is demand for allocation, not demand for the stock at HK$100+.</w:t>
-      </w:r>
-      <w:r>
-        <w:t xml:space="preserve"> The book was margin-financed flippers paying ~1.5% financing for a week — everyone was there for the pop, so at the open everyone is a seller. Subscription multiples measure how many people want free money, not where the clearing price is.</w:t>
+        <w:t>Q2 gross margin.</w:t>
+      </w:r>
+      <w:r>
+        <w:t xml:space="preserve"> This is the number. Memory GM was 38.9% in Q1; the hikes landed through Q2 while old-cost inventory was still flowing through COGS. Nanya just printed 79.5% in the same trade, so the market knows what's theoretically possible. Anything in the mid-40s for memory reads as confirmation the machine is working; stuck near 40 and the story wobbles.</w:t>
       </w:r>
     </w:p>
     <w:p>
@@ -2673,10 +2678,10 @@
         <w:rPr>
           <w:b/>
         </w:rPr>
-        <w:t>There was a visible fair-value anchor.</w:t>
-      </w:r>
-      <w:r>
-        <w:t xml:space="preserve"> The A-share trades every day; the H priced at a ~38% discount to it, which is where comparable A/H semis already sat. Nobody chases an H-share above its customary discount when the anchor is on the screen — arbitrage logic caps the upside in a way that simply doesn't exist for Mech-Mind, where nothing tells anyone what it's worth.</w:t>
+        <w:t>Inventory.</w:t>
+      </w:r>
+      <w:r>
+        <w:t xml:space="preserve"> 323 days was a windfall on the way up. The report shows whether it's being sold down into strength or still building — the Shanghai Securities News is already running 'the B-side of the memory beats' pieces about exactly this across the sector.</w:t>
       </w:r>
     </w:p>
     <w:p>
@@ -2687,24 +2692,44 @@
         <w:rPr>
           <w:b/>
         </w:rPr>
-        <w:t>And there was real float.</w:t>
-      </w:r>
-      <w:r>
-        <w:t xml:space="preserve"> Cornerstones took 46.7%, leaving ~HK$1.7bn of stock loose — versus Mech-Mind's ~HK$120m public tranche. Supply met the flippers at the open.</w:t>
+        <w:t>The Q3/Q4 language.</w:t>
+      </w:r>
+      <w:r>
+        <w:t xml:space="preserve"> Management said in July that its hikes lag the industry and there's room left in Q3, possibly Q4. Taiwan is already whispering about a Q4 'margin defence war' as the low-cost-inventory benefit fades. Whichever tone this report takes probably sets the stock's next month.</w:t>
       </w:r>
     </w:p>
     <w:p>
-      <w:pPr>
-        <w:pStyle w:val="ListNumber"/>
-      </w:pPr>
+      <w:r>
+        <w:t>Third, positioning — and this is the interesting part, because it's not a crowded long anymore. The A-share is ~36% below its mid-July peak (~RMB 220). Margin balances got flushed from RMB 4.8bn to ~3.3bn. Two pre-IPO funds cut more than RMB 1bn of stock. And when the +77% revenue number dropped on Aug 10, the stock *fell* 3.9% on heavy volume — the good news was sold. Retail boards tonight are openly in 'great print = sell the fact' mode. Meanwhile sell-side consensus is stale to the point of useless: the terminal still shows FY2026 at RMB 1.43bn when H1 alone could be 1.28bn; the one post-guidance note we found models RMB 3.8bn for the year.</w:t>
+      </w:r>
+    </w:p>
+    <w:p>
       <w:r>
         <w:rPr>
           <w:b/>
         </w:rPr>
-        <w:t>The rule this proves: pop = (no anchor) × (no float) × (leveraged demand).</w:t>
-      </w:r>
-      <w:r>
-        <w:t xml:space="preserve"> Ingenic had the third but neither of the first two. Mech-Mind has all three. Same 500–900x headline, opposite mechanics.</w:t>
+        <w:t>Our forecast</w:t>
+      </w:r>
+      <w:r>
+        <w:t xml:space="preserve">: H1 profit near the top of the range — call it </w:t>
+      </w:r>
+      <w:r>
+        <w:rPr>
+          <w:b/>
+        </w:rPr>
+        <w:t>RMB 1.20–1.25bn</w:t>
+      </w:r>
+      <w:r>
+        <w:t xml:space="preserve"> (Q2 ~880–930m). The range was set on Jul 13; DDR4 spot rose another ~17% *after* that, and the lag-repricing-plus-old-inventory setup means late-quarter sales carry the fattest margins. Q2 blended GM </w:t>
+      </w:r>
+      <w:r>
+        <w:rPr>
+          <w:b/>
+        </w:rPr>
+        <w:t>~46–48%</w:t>
+      </w:r>
+      <w:r>
+        <w:t>, memory into the mid-40s. On the reaction: with this much de-risking already done, the setup echoes GigaDevice — which fell seven straight days into its print and then went limit-up on the actual numbers. Top-of-range profit plus confident Q3 language and that script runs again; mid-range profit with memory GM stuck near 40 and the sell-the-fact crowd wins. We'd lean slightly positive into Monday, knowing the bar is the whisper (top of range), not the printed consensus.</w:t>
       </w:r>
     </w:p>
     <w:p>
@@ -2712,131 +2737,7 @@
         <w:pStyle w:val="Heading2"/>
       </w:pPr>
       <w:r>
-        <w:t>Fundamentals — a cyclical caught at its inflection</w:t>
-      </w:r>
-    </w:p>
-    <w:p>
-      <w:pPr>
-        <w:pStyle w:val="ListBullet"/>
-      </w:pPr>
-      <w:r>
-        <w:t xml:space="preserve">Three segments (2025): </w:t>
-      </w:r>
-      <w:r>
-        <w:rPr>
-          <w:b/>
-        </w:rPr>
-        <w:t>memory 61%</w:t>
-      </w:r>
-      <w:r>
-        <w:t xml:space="preserve"> (via the 2020 ISSI acquisition — auto/industrial SRAM, niche DRAM, NOR flash), </w:t>
-      </w:r>
-      <w:r>
-        <w:rPr>
-          <w:b/>
-        </w:rPr>
-        <w:t>computing 27%</w:t>
-      </w:r>
-      <w:r>
-        <w:t xml:space="preserve"> (IP-camera SoCs, XBurst MPUs), </w:t>
-      </w:r>
-      <w:r>
-        <w:rPr>
-          <w:b/>
-        </w:rPr>
-        <w:t>analog 11%</w:t>
-      </w:r>
-      <w:r>
-        <w:t xml:space="preserve"> (LED drivers). End-markets: consumer 35%, automotive 34%, industrial/other 31%.</w:t>
-      </w:r>
-    </w:p>
-    <w:p>
-      <w:pPr>
-        <w:pStyle w:val="ListBullet"/>
-      </w:pPr>
-      <w:r>
-        <w:t>The pre-IPO record was a downcycle: revenue fell 2023–24, net profit RMB 516m → 364m → 375m, gross margin sliding to ~33%. The H-listing was marketed straight into the turn:</w:t>
-      </w:r>
-    </w:p>
-    <w:p>
-      <w:pPr>
-        <w:pStyle w:val="ListBullet"/>
-      </w:pPr>
-      <w:r>
-        <w:rPr>
-          <w:b/>
-        </w:rPr>
-        <w:t>Q1 2026: revenue +47%, net profit +332%, gross margin 43% — a ten-year high. H1 2026: revenue ~RMB 4.0bn +77%, net profit guided RMB 1.08–1.28bn, i.e. +431% to +531%</w:t>
-      </w:r>
-      <w:r>
-        <w:t xml:space="preserve"> — roughly three years of profit in one half.</w:t>
-      </w:r>
-    </w:p>
-    <w:p>
-      <w:pPr>
-        <w:pStyle w:val="ListBullet"/>
-      </w:pPr>
-      <w:r>
-        <w:t>The driver is the legacy-memory squeeze: Samsung/Hynix/Micron moved ~93% of DRAM output to HBM/DDR5, legacy DDR4/niche DRAM contract prices rose 80–90% QoQ, and Ingenic — whose price hikes lag the industry, with 323 days of low-cost inventory to sell into rising prices — says Q3 and Q4 hikes are still coming, with gross margin rising every quarter.</w:t>
-      </w:r>
-    </w:p>
-    <w:p>
-      <w:pPr>
-        <w:pStyle w:val="Heading2"/>
-      </w:pPr>
-      <w:r>
-        <w:t>The edge — real niches, but a cycle-taker</w:t>
-      </w:r>
-    </w:p>
-    <w:p>
-      <w:pPr>
-        <w:pStyle w:val="ListBullet"/>
-      </w:pPr>
-      <w:r>
-        <w:t xml:space="preserve">The niches are genuine: </w:t>
-      </w:r>
-      <w:r>
-        <w:rPr>
-          <w:b/>
-        </w:rPr>
-        <w:t>global #1 in automotive SRAM (~60% of that niche), global #2 in SRAM overall, #5 in auto niche DRAM, #2 in IP-camera SoCs.</w:t>
-      </w:r>
-      <w:r>
-        <w:t xml:space="preserve"> Auto-grade memory sockets take years to qualify and are sticky once designed in — that's a real moat within the niche.</w:t>
-      </w:r>
-    </w:p>
-    <w:p>
-      <w:pPr>
-        <w:pStyle w:val="ListBullet"/>
-      </w:pPr>
-      <w:r>
-        <w:t xml:space="preserve">But be clear what this is: a </w:t>
-      </w:r>
-      <w:r>
-        <w:rPr>
-          <w:b/>
-        </w:rPr>
-        <w:t>price-taker riding the majors' exit</w:t>
-      </w:r>
-      <w:r>
-        <w:t xml:space="preserve">, not a price-maker. It doesn't control the cycle that is quadrupling its profits; it says itself that visibility ends around </w:t>
-      </w:r>
-      <w:r>
-        <w:rPr>
-          <w:b/>
-        </w:rPr>
-        <w:t>H2 2027</w:t>
-      </w:r>
-      <w:r>
-        <w:t>, CXMT/Winbond/Nanya are filling the legacy vacuum, consumer (not auto) is now its largest end-market, and the RMB 3.0bn of ISSI goodwill plus 323-day inventory become the risk the day prices roll.</w:t>
-      </w:r>
-    </w:p>
-    <w:p>
-      <w:pPr>
-        <w:pStyle w:val="Heading2"/>
-      </w:pPr>
-      <w:r>
-        <w:t>Valuation — and the A/H question</w:t>
+        <w:t>Valuation</w:t>
       </w:r>
     </w:p>
     <w:tbl>
@@ -3610,16 +3511,24 @@
     <w:p/>
     <w:p>
       <w:r>
-        <w:t xml:space="preserve">Reading it: the H at 101.10 is </w:t>
+        <w:t xml:space="preserve">How we read this, step by step. Start with what you're paying: the H at 101.10 works out to roughly </w:t>
       </w:r>
       <w:r>
         <w:rPr>
           <w:b/>
         </w:rPr>
-        <w:t>~19x annualised 2026 earnings</w:t>
-      </w:r>
-      <w:r>
-        <w:t xml:space="preserve"> — for a company guiding further price hikes into Q4, that is objectively cheap *if the cycle holds*. But two things stop us calling it mispriced. First, the “38% discount to A” pitch is backwards: the discount isn't the H being cheap, it's </w:t>
+        <w:t>19x annualised 2026 earnings</w:t>
+      </w:r>
+      <w:r>
+        <w:t xml:space="preserve"> — for a company still guiding price hikes into Q4, that looks cheap on its face. But walk through why it's priced there before calling it a bargain.</w:t>
+      </w:r>
+    </w:p>
+    <w:p>
+      <w:pPr>
+        <w:pStyle w:val="ListNumber"/>
+      </w:pPr>
+      <w:r>
+        <w:t xml:space="preserve">The '38% discount to A' pitch is backwards. The discount isn't the H being cheap — it's </w:t>
       </w:r>
       <w:r>
         <w:rPr>
@@ -3628,7 +3537,15 @@
         <w:t>the A being expensive</w:t>
       </w:r>
       <w:r>
-        <w:t xml:space="preserve"> — 116x trailing is ChiNext speculative pricing that international money simply won't pay, which is exactly why the H debuted flat. Second, within the A/H semi set the 38% discount is already the </w:t>
+        <w:t>. 116x trailing is ChiNext speculative pricing, and international investors simply won't pay it. The flat H debut despite a 927x-subscribed book was global money telling you exactly that. The H is the honest price for these cash flows; the A is the exuberant one.</w:t>
+      </w:r>
+    </w:p>
+    <w:p>
+      <w:pPr>
+        <w:pStyle w:val="ListNumber"/>
+      </w:pPr>
+      <w:r>
+        <w:t xml:space="preserve">Nor is there a convergence trade hiding here. Within the A/H semi set, Ingenic's 38% is already the </w:t>
       </w:r>
       <w:r>
         <w:rPr>
@@ -3637,7 +3554,72 @@
         <w:t>tightest</w:t>
       </w:r>
       <w:r>
-        <w:t xml:space="preserve"> — tighter than Novosense, far tighter than SMIC's 52% which has sat there for years. There is no free convergence trade here.</w:t>
+        <w:t xml:space="preserve"> discount — tighter than Novosense at 43%, far tighter than SMIC's 52%, which has sat there for years without closing. If the gap ever narrows it'll be a flow event (southbound inclusion, the way Novosense tightened) or the A coming down — not the H re-rating to ChiNext levels.</w:t>
+      </w:r>
+    </w:p>
+    <w:p>
+      <w:pPr>
+        <w:pStyle w:val="ListNumber"/>
+      </w:pPr>
+      <w:r>
+        <w:t>And there's no absolute-value case from global anchors either: Micron and Winbond trade around 20x forward in the same cycle. What supports the H is China-semis cohort pricing (GigaDevice 36x, Montage 106x), nothing more.</w:t>
+      </w:r>
+    </w:p>
+    <w:p>
+      <w:pPr>
+        <w:pStyle w:val="ListNumber"/>
+      </w:pPr>
+      <w:r>
+        <w:t xml:space="preserve">So what you actually own at 19x is a </w:t>
+      </w:r>
+      <w:r>
+        <w:rPr>
+          <w:b/>
+        </w:rPr>
+        <w:t>memory-cycle position, not a valuation anomaly</w:t>
+      </w:r>
+      <w:r>
+        <w:t>. It works if legacy-DRAM pricing holds into 2027 — and the company itself says visibility ends around H2 2027, CXMT/Winbond/Nanya are filling the vacuum, and the same 323 days of inventory that's a windfall today becomes the writedown when prices roll. Buy it for the cycle at 19x versus GigaDevice's 36x if that's the trade you want. Never for 'the discount must close.'</w:t>
+      </w:r>
+    </w:p>
+    <w:p>
+      <w:pPr>
+        <w:pStyle w:val="Heading1"/>
+      </w:pPr>
+      <w:r>
+        <w:t>4. The head-to-head: does either deserve a premium to its anchor?</w:t>
+      </w:r>
+    </w:p>
+    <w:p>
+      <w:r>
+        <w:t xml:space="preserve">Before the two verdicts, the frame we're using. A multiple is compressed DCF — a business deserves to trade richer than its comp only if at least one of three things is true: </w:t>
+      </w:r>
+      <w:r>
+        <w:rPr>
+          <w:b/>
+        </w:rPr>
+        <w:t>(1)</w:t>
+      </w:r>
+      <w:r>
+        <w:t xml:space="preserve"> each revenue dollar converts to more cash (margin/returns); </w:t>
+      </w:r>
+      <w:r>
+        <w:rPr>
+          <w:b/>
+        </w:rPr>
+        <w:t>(2)</w:t>
+      </w:r>
+      <w:r>
+        <w:t xml:space="preserve"> the cash grows faster for longer (duration); </w:t>
+      </w:r>
+      <w:r>
+        <w:rPr>
+          <w:b/>
+        </w:rPr>
+        <w:t>(3)</w:t>
+      </w:r>
+      <w:r>
+        <w:t xml:space="preserve"> the cash is safer (risk). Worse on all three means it must trade at a discount. Everything else is narrative.</w:t>
       </w:r>
     </w:p>
     <w:p>
@@ -3645,7 +3627,230 @@
         <w:pStyle w:val="Heading2"/>
       </w:pPr>
       <w:r>
-        <w:t>Cornerstones and greenshoe</w:t>
+        <w:t>SHEIN vs PDD — no premium deserved. Walk the three drivers:</w:t>
+      </w:r>
+    </w:p>
+    <w:p>
+      <w:pPr>
+        <w:pStyle w:val="ListNumber"/>
+      </w:pPr>
+      <w:r>
+        <w:rPr>
+          <w:b/>
+        </w:rPr>
+        <w:t>Earnings quality — what is a dollar of SHEIN's profit worth versus a dollar of PDD's?</w:t>
+      </w:r>
+      <w:r>
+        <w:t xml:space="preserve"> PDD's dollar is a take-rate on other people's inventory: ~20% net margin, negative working capital, no fulfilment asset at risk. SHEIN's dollar comes from goods it must manufacture and ship across a border: 4.9% net margin — and that margin </w:t>
+      </w:r>
+      <w:r>
+        <w:rPr>
+          <w:b/>
+        </w:rPr>
+        <w:t>halved in one year because one customs rule changed</w:t>
+      </w:r>
+      <w:r>
+        <w:t>. A profit stream that one regulatory decision can cut in half is worth less per dollar, full stop.</w:t>
+      </w:r>
+    </w:p>
+    <w:p>
+      <w:pPr>
+        <w:pStyle w:val="ListNumber"/>
+      </w:pPr>
+      <w:r>
+        <w:rPr>
+          <w:b/>
+        </w:rPr>
+        <w:t>Growth — will SHEIN's dollar grow faster?</w:t>
+      </w:r>
+      <w:r>
+        <w:t xml:space="preserve"> PDD compounds ~10% with category breadth working for it. SHEIN went +8% → +1%, and the ceiling logic in section 1 shows all three growth levers (frequency, basket, new users) are exhausted. Worse: the fourth force — ad-auction inflation — is a headwind that </w:t>
+      </w:r>
+      <w:r>
+        <w:rPr>
+          <w:b/>
+        </w:rPr>
+        <w:t>PDD causes and SHEIN suffers</w:t>
+      </w:r>
+      <w:r>
+        <w:t>. Temu's spending is literally why SHEIN paid +48.9% for +8% revenue. Paying a premium here means paying more for the victim than the aggressor.</w:t>
+      </w:r>
+    </w:p>
+    <w:p>
+      <w:pPr>
+        <w:pStyle w:val="ListNumber"/>
+      </w:pPr>
+      <w:r>
+        <w:rPr>
+          <w:b/>
+        </w:rPr>
+        <w:t>Risk — anything offsetting?</w:t>
+      </w:r>
+      <w:r>
+        <w:t xml:space="preserve"> The China/tariff haircut applies to both, so it cancels. SHEIN then adds three risks PDD doesn't carry: WVR (no southbound buyer for six months), the US$3.5bn ratchet leakage, and a register of made-whole sellers sitting exactly at your cost basis. Strike three.</w:t>
+      </w:r>
+    </w:p>
+    <w:p>
+      <w:pPr>
+        <w:pStyle w:val="ListNumber"/>
+      </w:pPr>
+      <w:r>
+        <w:rPr>
+          <w:b/>
+        </w:rPr>
+        <w:t>So why does the deal still ask 12.9x against PDD's 9.5x?</w:t>
+      </w:r>
+      <w:r>
+        <w:t xml:space="preserve"> Only one honest answer: the denominator. The syndicate wants you to capitalise 2027 *normalised* earnings (BI's US$1.67bn rebound), not the depressed 2025/Q1 prints. Legitimate argument — but see what it implies: </w:t>
+      </w:r>
+      <w:r>
+        <w:rPr>
+          <w:b/>
+        </w:rPr>
+        <w:t>the entire 35% premium IS the recovery bet, with zero margin of safety left over.</w:t>
+      </w:r>
+      <w:r>
+        <w:t xml:space="preserve"> The rule it breaks: don't pay in advance for a normalisation the company hasn't printed, when the anchor comp gives you a structurally better business without needing the bet. If recovery lands, PDD probably re-rates too, so you don't even win relative; if it misses, SHEIN converges to PDD's multiple ≈ US$20bn, about –25%. Heads you roughly tie, tails you lose a quarter.</w:t>
+      </w:r>
+    </w:p>
+    <w:p>
+      <w:pPr>
+        <w:pStyle w:val="Heading2"/>
+      </w:pPr>
+      <w:r>
+        <w:t>Mech-Mind vs Rokae — premium deserved. Same three drivers:</w:t>
+      </w:r>
+    </w:p>
+    <w:p>
+      <w:pPr>
+        <w:pStyle w:val="ListNumber"/>
+      </w:pPr>
+      <w:r>
+        <w:rPr>
+          <w:b/>
+        </w:rPr>
+        <w:t>Fix the unit first.</w:t>
+      </w:r>
+      <w:r>
+        <w:t xml:space="preserve"> P/S assumes every revenue dollar is equal; it isn't. Mech-Mind keeps 65 cents of gross profit per revenue dollar, Rokae keeps 22. If the two ever reach similar opex efficiency, steady-state earnings power per revenue dollar is ~3x higher at Mech-Mind — so the *neutral* condition is equal price-to-</w:t>
+      </w:r>
+      <w:r>
+        <w:rPr>
+          <w:b/>
+        </w:rPr>
+        <w:t>gross-profit</w:t>
+      </w:r>
+      <w:r>
+        <w:t xml:space="preserve">, not equal P/S. At par P/S (29x each): Mech-Mind ≈ </w:t>
+      </w:r>
+      <w:r>
+        <w:rPr>
+          <w:b/>
+        </w:rPr>
+        <w:t>45x gross profit</w:t>
+      </w:r>
+      <w:r>
+        <w:t xml:space="preserve">, Rokae ≈ </w:t>
+      </w:r>
+      <w:r>
+        <w:rPr>
+          <w:b/>
+        </w:rPr>
+        <w:t>130x</w:t>
+      </w:r>
+      <w:r>
+        <w:t xml:space="preserve"> (~85x on H1-annualised). So parity in P/S already hands Mech-Mind a ~65% relative discount on the honest unit — the premium case starts as arithmetic, not opinion.</w:t>
+      </w:r>
+    </w:p>
+    <w:p>
+      <w:pPr>
+        <w:pStyle w:val="ListNumber"/>
+      </w:pPr>
+      <w:r>
+        <w:rPr>
+          <w:b/>
+        </w:rPr>
+        <w:t>Margin trajectory — who is on the right side of the price war?</w:t>
+      </w:r>
+      <w:r>
+        <w:t xml:space="preserve"> Rokae sells arms: hardware against 300+ Chinese arm makers, embodied segment gross margin 10.7%, price war confirmed by the NDRC and Caixin. Its margin has a hardware ceiling. Mech-Mind sells perception </w:t>
+      </w:r>
+      <w:r>
+        <w:rPr>
+          <w:b/>
+        </w:rPr>
+        <w:t>to every arm maker</w:t>
+      </w:r>
+      <w:r>
+        <w:t xml:space="preserve"> — a price war among arm makers increases the volume of eyes sold while squeezing the people selling arms. Its gross margin went 39% → 65% *while the war started*. When a value chain commoditises, whoever owns the differentiating component collects what the commodity layer gives up.</w:t>
+      </w:r>
+    </w:p>
+    <w:p>
+      <w:pPr>
+        <w:pStyle w:val="ListNumber"/>
+      </w:pPr>
+      <w:r>
+        <w:rPr>
+          <w:b/>
+        </w:rPr>
+        <w:t>Durability — which #1 decays slower?</w:t>
+      </w:r>
+      <w:r>
+        <w:t xml:space="preserve"> Rokae is #1 in a domestic niche (47% of China cobots by volume) but 5.8% in light industrial and only 9% overseas — a local leader in a crowded commodity field. Mech-Mind is #1 </w:t>
+      </w:r>
+      <w:r>
+        <w:rPr>
+          <w:b/>
+        </w:rPr>
+        <w:t>globally</w:t>
+      </w:r>
+      <w:r>
+        <w:t xml:space="preserve"> (27% of shipments, more than the next four combined), #1 in China, Japan and North America simultaneously, 50% overseas at better margin, 86% repeat revenue, and a 27,000-unit data flywheel a copycat cannot shortcut. A global #1 with data lock-in fades a lot slower than a domestic niche #1 in commodity hardware.</w:t>
+      </w:r>
+    </w:p>
+    <w:p>
+      <w:pPr>
+        <w:pStyle w:val="ListNumber"/>
+      </w:pPr>
+      <w:r>
+        <w:rPr>
+          <w:b/>
+        </w:rPr>
+        <w:t>Then why does Rokae get parity today at all?</w:t>
+      </w:r>
+      <w:r>
+        <w:t xml:space="preserve"> Because it has the one thing markets pay cash for: a </w:t>
+      </w:r>
+      <w:r>
+        <w:rPr>
+          <w:b/>
+        </w:rPr>
+        <w:t>printed</w:t>
+      </w:r>
+      <w:r>
+        <w:t xml:space="preserve"> inflection — the 30 Jul alert (adjusted profit positive, revenue +127%). Mech-Mind offers a trajectory (adjusted loss 334 → 109 → 33) but no print yet. That proof-premium explains why Rokae *holds* par today; it never justifies Mech-Mind trading below Rokae, and it converts into an explicit Mech-Mind premium the day the first post-listing print confirms the trajectory. The deal at parity therefore hands you the deserved premium for free — payable, or not, at the first print.</w:t>
+      </w:r>
+    </w:p>
+    <w:p>
+      <w:r>
+        <w:t xml:space="preserve">Honesty check a PM would demand: this is a </w:t>
+      </w:r>
+      <w:r>
+        <w:rPr>
+          <w:b/>
+        </w:rPr>
+        <w:t>relative</w:t>
+      </w:r>
+      <w:r>
+        <w:t xml:space="preserve"> call. Rokae's own 29x is partly a 6%-float artifact — if Rokae de-rates to 20x, “deserves a premium to Rokae” still means Mech-Mind falls in absolute. Deserving a premium and being cheap are different claims; we are making the first.</w:t>
+      </w:r>
+    </w:p>
+    <w:p>
+      <w:pPr>
+        <w:pStyle w:val="Heading1"/>
+      </w:pPr>
+      <w:r>
+        <w:t>5. Bottom line</w:t>
       </w:r>
     </w:p>
     <w:p>
@@ -3656,10 +3861,10 @@
         <w:rPr>
           <w:b/>
         </w:rPr>
-        <w:t>Cornerstones: big but one-flavoured.</w:t>
-      </w:r>
-      <w:r>
-        <w:t xml:space="preserve"> US$192m ≈ 46.7% of the deal across 13 names — GF Fund, ICBC Wealth, China Universal, Gaoyi, Perseverance, Huaqin — all China-domestic institutional money. No Baillie Gifford-type global long-only in sight. That matches the trading outcome: a deal underwritten by the China bid stays priced in the China-discount bucket. Compare Mech-Mind's cross-style book — cornerstone *composition* predicted both debuts better than cornerstone *size*.</w:t>
+        <w:t>SHEIN</w:t>
+      </w:r>
+      <w:r>
+        <w:t xml:space="preserve"> — priced at the top of its fair band, cold book, capped model, US$3.5bn out the door to old investors, and the southbound bid locked out until March. Skip the debut; express the theme through PDD.</w:t>
       </w:r>
     </w:p>
     <w:p>
@@ -3670,25 +3875,32 @@
         <w:rPr>
           <w:b/>
         </w:rPr>
-        <w:t>Greenshoe: 15%</w:t>
-      </w:r>
-      <w:r>
-        <w:t xml:space="preserve"> (4.69m shares), </w:t>
-      </w:r>
+        <w:t>Mech-Mind</w:t>
+      </w:r>
+      <w:r>
+        <w:t xml:space="preserve"> — rich on fundamentals but priced at par with the live benchmark, with the mechanics of a squeeze. Take the debut, sell into strength, stay only if you believe the Q1 acceleration is real.</w:t>
+      </w:r>
+    </w:p>
+    <w:p>
+      <w:pPr>
+        <w:pStyle w:val="ListBullet"/>
+      </w:pPr>
+      <w:r>
+        <w:t>Same-day listings will split liquidity, and the contrast should be visible by lunch: the cheap one flat, the expensive one flying.</w:t>
+      </w:r>
+    </w:p>
+    <w:p>
+      <w:pPr>
+        <w:pStyle w:val="ListBullet"/>
+      </w:pPr>
       <w:r>
         <w:rPr>
           <w:b/>
         </w:rPr>
-        <w:t>not exercised as of 27 Aug</w:t>
-      </w:r>
-      <w:r>
-        <w:t xml:space="preserve"> — and here it's playing the SHEIN role, not the Mech-Mind role: with the stock having already broken issue on day 2, the stabilising agent has likely been covering its short by buying in the market (the day-1 pin at exactly 100.00). If the stock holds above HK$100, expect partial/full exercise by ~19 Sep; if it slips back under, the shoe dies unexercised and the support ends with the window — </w:t>
-      </w:r>
-      <w:r>
-        <w:rPr>
-          <w:b/>
-        </w:rPr>
-        <w:t>a real date to watch: after 19 Sep the safety net is gone.</w:t>
+        <w:t>Ingenic</w:t>
+      </w:r>
+      <w:r>
+        <w:t xml:space="preserve"> — a memory-cycle trade at ~19x annualised 2026 earnings, not an A/H convergence trade. Saturday's interim only settles Q2 gross margin, inventory and the Q3 language; positioning is washed out, whisper is top-of-range, we lean slightly positive into Monday.</w:t>
       </w:r>
     </w:p>
     <w:p>
@@ -3696,7 +3908,7 @@
         <w:pStyle w:val="Heading2"/>
       </w:pPr>
       <w:r>
-        <w:t>View</w:t>
+        <w:t>Dates to watch</w:t>
       </w:r>
     </w:p>
     <w:p>
@@ -3704,443 +3916,16 @@
         <w:pStyle w:val="ListBullet"/>
       </w:pPr>
       <w:r>
-        <w:t xml:space="preserve">This is a </w:t>
+        <w:t xml:space="preserve">28 Aug noon — Mech-Mind final price · </w:t>
       </w:r>
       <w:r>
         <w:rPr>
           <w:b/>
         </w:rPr>
-        <w:t>memory-cycle trade wearing an A/H-arbitrage costume</w:t>
-      </w:r>
-      <w:r>
-        <w:t>. Don't own it for the discount closing — SMIC proves discounts can sit for years. Own it only if you want leveraged legacy-DRAM exposure at ~19x 2026E versus GigaDevice at 36x — and size it knowing the company itself can't see past mid-2027, and that 323 days of inventory flips from windfall to writedown when prices roll.</w:t>
-      </w:r>
-    </w:p>
-    <w:p>
-      <w:pPr>
-        <w:pStyle w:val="ListBullet"/>
-      </w:pPr>
-      <w:r>
-        <w:t>Catalysts that could re-rate the H specifically: the actual H1 interim print (the +431–531% guide becoming a number), continued Q3/Q4 hike announcements, possible southbound/HSCI inclusion at the next review (the Novosense-style tightener), and greenshoe/stabilisation resolution by 19 Sep.</w:t>
-      </w:r>
-    </w:p>
-    <w:p>
-      <w:pPr>
-        <w:pStyle w:val="Heading1"/>
-      </w:pPr>
-      <w:r>
-        <w:t>4. The head-to-head: does each deserve its premium (or discount) to its anchor?</w:t>
-      </w:r>
-    </w:p>
-    <w:p>
-      <w:r>
-        <w:t xml:space="preserve">Before the two verdicts, the frame we're using. A multiple is compressed DCF — a business deserves to trade richer than its comp only if at least one of three things is true: </w:t>
-      </w:r>
-      <w:r>
-        <w:rPr>
-          <w:b/>
-        </w:rPr>
-        <w:t>(1)</w:t>
-      </w:r>
-      <w:r>
-        <w:t xml:space="preserve"> each revenue dollar converts to more cash (margin/returns); </w:t>
-      </w:r>
-      <w:r>
-        <w:rPr>
-          <w:b/>
-        </w:rPr>
-        <w:t>(2)</w:t>
-      </w:r>
-      <w:r>
-        <w:t xml:space="preserve"> the cash grows faster for longer (duration); </w:t>
-      </w:r>
-      <w:r>
-        <w:rPr>
-          <w:b/>
-        </w:rPr>
-        <w:t>(3)</w:t>
-      </w:r>
-      <w:r>
-        <w:t xml:space="preserve"> the cash is safer (risk). Worse on all three means it must trade at a discount. Everything else is narrative.</w:t>
-      </w:r>
-    </w:p>
-    <w:p>
-      <w:pPr>
-        <w:pStyle w:val="Heading2"/>
-      </w:pPr>
-      <w:r>
-        <w:t>SHEIN vs PDD — no premium deserved. Walk the three drivers:</w:t>
-      </w:r>
-    </w:p>
-    <w:p>
-      <w:pPr>
-        <w:pStyle w:val="ListNumber"/>
-      </w:pPr>
-      <w:r>
-        <w:rPr>
-          <w:b/>
-        </w:rPr>
-        <w:t>Earnings quality — what is a dollar of SHEIN's profit worth versus a dollar of PDD's?</w:t>
-      </w:r>
-      <w:r>
-        <w:t xml:space="preserve"> PDD's dollar is a take-rate on other people's inventory: ~20% net margin, negative working capital, no fulfilment asset at risk. SHEIN's dollar comes from goods it must manufacture and ship across a border: 4.9% net margin — and that margin </w:t>
-      </w:r>
-      <w:r>
-        <w:rPr>
-          <w:b/>
-        </w:rPr>
-        <w:t>halved in one year because one customs rule changed</w:t>
-      </w:r>
-      <w:r>
-        <w:t>. A profit stream that a single regulatory decision can cut in half is a lower-quality stream. Driver 1: discount.</w:t>
-      </w:r>
-    </w:p>
-    <w:p>
-      <w:pPr>
-        <w:pStyle w:val="ListNumber"/>
-      </w:pPr>
-      <w:r>
-        <w:rPr>
-          <w:b/>
-        </w:rPr>
-        <w:t>Growth — will SHEIN's dollar grow faster?</w:t>
-      </w:r>
-      <w:r>
-        <w:t xml:space="preserve"> PDD compounds ~10% with category breadth working for it. SHEIN went +8% → +1%, and the ceiling logic in section 1 shows all three growth levers (frequency, basket, new users) are exhausted. Worse: the fourth force — ad-auction inflation — is a headwind that </w:t>
-      </w:r>
-      <w:r>
-        <w:rPr>
-          <w:b/>
-        </w:rPr>
-        <w:t>PDD causes and SHEIN suffers</w:t>
-      </w:r>
-      <w:r>
-        <w:t>. Temu's spending is literally why SHEIN paid +48.9% for +8% revenue. Paying a premium here means paying more for the victim than the aggressor. Driver 2: discount.</w:t>
-      </w:r>
-    </w:p>
-    <w:p>
-      <w:pPr>
-        <w:pStyle w:val="ListNumber"/>
-      </w:pPr>
-      <w:r>
-        <w:rPr>
-          <w:b/>
-        </w:rPr>
-        <w:t>Risk — anything offsetting?</w:t>
-      </w:r>
-      <w:r>
-        <w:t xml:space="preserve"> The China/tariff haircut applies to both, so it cancels. SHEIN then adds three risks PDD doesn't carry: WVR (no southbound buyer for six months), the US$3.5bn ratchet leakage, and a register of made-whole sellers sitting exactly at your cost basis. Driver 3: discount.</w:t>
-      </w:r>
-    </w:p>
-    <w:p>
-      <w:pPr>
-        <w:pStyle w:val="ListNumber"/>
-      </w:pPr>
-      <w:r>
-        <w:rPr>
-          <w:b/>
-        </w:rPr>
-        <w:t>So why does the deal still ask 12.9x against PDD's 9.5x?</w:t>
-      </w:r>
-      <w:r>
-        <w:t xml:space="preserve"> Only one honest answer: the denominator. The syndicate wants you to capitalise 2027 *normalised* earnings (BI's US$1.67bn rebound), not the depressed 2025/Q1 prints. Legitimate argument — but see what it implies: </w:t>
-      </w:r>
-      <w:r>
-        <w:rPr>
-          <w:b/>
-        </w:rPr>
-        <w:t>the entire 35% premium IS the recovery bet, with zero margin of safety left over.</w:t>
-      </w:r>
-      <w:r>
-        <w:t xml:space="preserve"> The rule it breaks: don't pay in advance for a normalisation the company hasn't printed, when the anchor comp gives you a structurally better business without needing the bet. If recovery lands, PDD probably re-rates too, so you don't even win relative; if it misses, SHEIN converges to PDD's multiple ≈ US$20bn, about –25%. Heads you roughly tie, tails you lose a quarter.</w:t>
-      </w:r>
-    </w:p>
-    <w:p>
-      <w:pPr>
-        <w:pStyle w:val="Heading2"/>
-      </w:pPr>
-      <w:r>
-        <w:t>Mech-Mind vs Rokae — premium deserved. Same three drivers:</w:t>
-      </w:r>
-    </w:p>
-    <w:p>
-      <w:pPr>
-        <w:pStyle w:val="ListNumber"/>
-      </w:pPr>
-      <w:r>
-        <w:rPr>
-          <w:b/>
-        </w:rPr>
-        <w:t>Fix the unit first.</w:t>
-      </w:r>
-      <w:r>
-        <w:t xml:space="preserve"> P/S assumes every revenue dollar is equal; it isn't. Mech-Mind keeps 65 cents of gross profit per revenue dollar, Rokae keeps 22. If the two ever reach similar opex efficiency, steady-state earnings power per revenue dollar is ~3x higher at Mech-Mind — so the *neutral* condition is equal price-to-</w:t>
-      </w:r>
-      <w:r>
-        <w:rPr>
-          <w:b/>
-        </w:rPr>
-        <w:t>gross-profit</w:t>
-      </w:r>
-      <w:r>
-        <w:t xml:space="preserve">, not equal P/S. At par P/S (29x each): Mech-Mind ≈ </w:t>
-      </w:r>
-      <w:r>
-        <w:rPr>
-          <w:b/>
-        </w:rPr>
-        <w:t>45x gross profit</w:t>
-      </w:r>
-      <w:r>
-        <w:t xml:space="preserve">, Rokae ≈ </w:t>
-      </w:r>
-      <w:r>
-        <w:rPr>
-          <w:b/>
-        </w:rPr>
-        <w:t>130x</w:t>
-      </w:r>
-      <w:r>
-        <w:t xml:space="preserve"> (~85x on H1-annualised). Parity in P/S already embeds a ~65% relative discount for Mech-Mind on the honest unit. Driver 1 doesn't just say premium — it says the premium is arithmetic, not opinion.</w:t>
-      </w:r>
-    </w:p>
-    <w:p>
-      <w:pPr>
-        <w:pStyle w:val="ListNumber"/>
-      </w:pPr>
-      <w:r>
-        <w:rPr>
-          <w:b/>
-        </w:rPr>
-        <w:t>Margin trajectory — who is on the right side of the price war?</w:t>
-      </w:r>
-      <w:r>
-        <w:t xml:space="preserve"> Rokae sells arms: hardware against 300+ Chinese arm makers, embodied segment gross margin 10.7%, price war confirmed by the NDRC and Caixin. Its margin has a hardware ceiling. Mech-Mind sells perception </w:t>
-      </w:r>
-      <w:r>
-        <w:rPr>
-          <w:b/>
-        </w:rPr>
-        <w:t>to every arm maker</w:t>
-      </w:r>
-      <w:r>
-        <w:t xml:space="preserve"> — a price war among arm makers increases the volume of eyes sold while squeezing the people selling arms. Its gross margin went 39% → 65% *while the war started*. When a value chain commoditises, the differentiating component captures the value the commodity layer sheds. Driver 2: premium.</w:t>
-      </w:r>
-    </w:p>
-    <w:p>
-      <w:pPr>
-        <w:pStyle w:val="ListNumber"/>
-      </w:pPr>
-      <w:r>
-        <w:rPr>
-          <w:b/>
-        </w:rPr>
-        <w:t>Durability — which #1 decays slower?</w:t>
-      </w:r>
-      <w:r>
-        <w:t xml:space="preserve"> Rokae is #1 in a domestic niche (47% of China cobots by volume) but 5.8% in light industrial and only 9% overseas — a local leader in a crowded commodity field. Mech-Mind is #1 </w:t>
-      </w:r>
-      <w:r>
-        <w:rPr>
-          <w:b/>
-        </w:rPr>
-        <w:t>globally</w:t>
-      </w:r>
-      <w:r>
-        <w:t xml:space="preserve"> (27% of shipments, more than the next four combined), #1 in China, Japan and North America simultaneously, 50% overseas at better margin, 86% repeat revenue, and a 27,000-unit data flywheel a copycat cannot shortcut. Global #1 with data lock-in has longer growth duration than domestic niche #1 in hardware. Driver 3: premium.</w:t>
-      </w:r>
-    </w:p>
-    <w:p>
-      <w:pPr>
-        <w:pStyle w:val="ListNumber"/>
-      </w:pPr>
-      <w:r>
-        <w:rPr>
-          <w:b/>
-        </w:rPr>
-        <w:t>Then why does Rokae get parity today at all?</w:t>
-      </w:r>
-      <w:r>
-        <w:t xml:space="preserve"> Because it has the one thing markets pay cash for: a </w:t>
-      </w:r>
-      <w:r>
-        <w:rPr>
-          <w:b/>
-        </w:rPr>
-        <w:t>printed</w:t>
-      </w:r>
-      <w:r>
-        <w:t xml:space="preserve"> inflection — the 30 Jul alert (adjusted profit positive, revenue +127%). Mech-Mind offers a trajectory (adjusted loss 334 → 109 → 33) but no print yet. That proof-premium explains why Rokae *holds* par today; it never justifies Mech-Mind trading below Rokae, and it converts into an explicit Mech-Mind premium the day the first post-listing print confirms the trajectory. The deal at parity therefore hands you the deserved premium for free — payable, or not, at the first print.</w:t>
-      </w:r>
-    </w:p>
-    <w:p>
-      <w:r>
-        <w:t xml:space="preserve">Honesty check a PM would demand: this is a </w:t>
-      </w:r>
-      <w:r>
-        <w:rPr>
-          <w:b/>
-        </w:rPr>
-        <w:t>relative</w:t>
-      </w:r>
-      <w:r>
-        <w:t xml:space="preserve"> call. Rokae's own 29x is partly a 6%-float artifact — if Rokae de-rates to 20x, “deserves a premium to Rokae” still means Mech-Mind falls in absolute. Deserving a premium and being cheap are different claims; we are making the first.</w:t>
-      </w:r>
-    </w:p>
-    <w:p>
-      <w:pPr>
-        <w:pStyle w:val="Heading2"/>
-      </w:pPr>
-      <w:r>
-        <w:t>Ingenic H vs its own A-share — the discount is deserved; the H is the honest price.</w:t>
-      </w:r>
-    </w:p>
-    <w:p>
-      <w:pPr>
-        <w:pStyle w:val="ListNumber"/>
-      </w:pPr>
-      <w:r>
-        <w:rPr>
-          <w:b/>
-        </w:rPr>
-        <w:t>Same cash flows, same claim — so any A/H gap is about the investors, not the company.</w:t>
-      </w:r>
-      <w:r>
-        <w:t xml:space="preserve"> An H-share discount persists for exactly three reasons: different discount rates across the two investor bases, no fungibility (you can't convert H into A), and float/liquidity. It is a market-regime variable, not a fundamentals one — which is why it can sit unchanged for years (SMIC: 50%+, permanently).</w:t>
-      </w:r>
-    </w:p>
-    <w:p>
-      <w:pPr>
-        <w:pStyle w:val="ListNumber"/>
-      </w:pPr>
-      <w:r>
-        <w:rPr>
-          <w:b/>
-        </w:rPr>
-        <w:t>The 2026 regime split the A+H universe in two.</w:t>
-      </w:r>
-      <w:r>
-        <w:t xml:space="preserve"> Global-scarcity leaders that international money must own — CATL, Zhongji Innolight, GigaDevice, Montage — have seen their H-shares flip to trading </w:t>
-      </w:r>
-      <w:r>
-        <w:rPr>
-          <w:b/>
-        </w:rPr>
-        <w:t>above</w:t>
-      </w:r>
-      <w:r>
-        <w:t xml:space="preserve"> A. Ordinary A+H names stay at 40–60% discounts. The whole trade question for any new A+H listing is which bucket it lands in.</w:t>
-      </w:r>
-    </w:p>
-    <w:p>
-      <w:pPr>
-        <w:pStyle w:val="ListNumber"/>
-      </w:pPr>
-      <w:r>
-        <w:rPr>
-          <w:b/>
-        </w:rPr>
-        <w:t>The market has already voted Ingenic into the ordinary bucket, and the vote is defensible.</w:t>
-      </w:r>
-      <w:r>
-        <w:t xml:space="preserve"> A niche-memory cyclical whose A-share trades at 116x trailing is not a must-own for global funds — the A-multiple is ChiNext speculation, and the flat debut plus the 38% discount is international money refusing to pay it. The H at ~19x annualised 2026 earnings is the *honest* price for these cash flows; the A at ~31x is the exuberant one.</w:t>
-      </w:r>
-    </w:p>
-    <w:p>
-      <w:pPr>
-        <w:pStyle w:val="ListNumber"/>
-      </w:pPr>
-      <w:r>
-        <w:rPr>
-          <w:b/>
-        </w:rPr>
-        <w:t>So the verdict inverts versus the other two deals: the H doesn't deserve a premium, and its discount isn't opportunity — it's information.</w:t>
-      </w:r>
-      <w:r>
-        <w:t xml:space="preserve"> If anything closes the gap it will be a flow event (southbound inclusion, à la Novosense at 43%) or the A de-rating toward the H — not the H re-rating to ChiNext levels. Buy 3223 for the memory cycle at 19x if you want that trade; never for “the discount must close.”</w:t>
-      </w:r>
-    </w:p>
-    <w:p>
-      <w:pPr>
-        <w:pStyle w:val="Heading1"/>
-      </w:pPr>
-      <w:r>
-        <w:t>5. Bottom line</w:t>
-      </w:r>
-    </w:p>
-    <w:p>
-      <w:pPr>
-        <w:pStyle w:val="ListBullet"/>
-      </w:pPr>
-      <w:r>
-        <w:rPr>
-          <w:b/>
-        </w:rPr>
-        <w:t>SHEIN</w:t>
-      </w:r>
-      <w:r>
-        <w:t xml:space="preserve"> — priced at the top of its fair band, cold book, capped model, US$3.5bn out the door to old investors, and the southbound bid locked out until March. Skip the debut; express the theme through PDD.</w:t>
-      </w:r>
-    </w:p>
-    <w:p>
-      <w:pPr>
-        <w:pStyle w:val="ListBullet"/>
-      </w:pPr>
-      <w:r>
-        <w:rPr>
-          <w:b/>
-        </w:rPr>
-        <w:t>Mech-Mind</w:t>
-      </w:r>
-      <w:r>
-        <w:t xml:space="preserve"> — rich on fundamentals but priced at par with the live benchmark, with the mechanics of a squeeze. Take the debut, sell into strength, stay only if you believe the Q1 acceleration is real.</w:t>
-      </w:r>
-    </w:p>
-    <w:p>
-      <w:pPr>
-        <w:pStyle w:val="ListBullet"/>
-      </w:pPr>
-      <w:r>
-        <w:t>Same-day listings will split liquidity, and the contrast should be visible by lunch: the cheap one flat, the expensive one flying.</w:t>
-      </w:r>
-    </w:p>
-    <w:p>
-      <w:pPr>
-        <w:pStyle w:val="ListBullet"/>
-      </w:pPr>
-      <w:r>
-        <w:rPr>
-          <w:b/>
-        </w:rPr>
-        <w:t>Ingenic</w:t>
-      </w:r>
-      <w:r>
-        <w:t xml:space="preserve"> — the live control experiment for both: 927x subscribed, no pop, because it had a visible anchor (its own A-share) and real float. A memory-cycle trade at ~19x 2026E, not an A/H convergence trade. And a warning for Monday: subscription multiples predict nothing by themselves — anchor and float do.</w:t>
-      </w:r>
-    </w:p>
-    <w:p>
-      <w:pPr>
-        <w:pStyle w:val="Heading2"/>
-      </w:pPr>
-      <w:r>
-        <w:t>Dates to watch</w:t>
-      </w:r>
-    </w:p>
-    <w:p>
-      <w:pPr>
-        <w:pStyle w:val="ListBullet"/>
-      </w:pPr>
-      <w:r>
-        <w:t xml:space="preserve">28 Aug noon — Mech-Mind final price · 31 Aug — SHEIN formal price, allotments, grey market 16:15–18:30 · 1 Sep — debuts · ~mid-Sep — SHEIN HSCI fast entry · </w:t>
-      </w:r>
-      <w:r>
-        <w:rPr>
-          <w:b/>
-        </w:rPr>
-        <w:t>~19 Sep — Ingenic stabilisation window ends (greenshoe resolved; the safety net comes off)</w:t>
-      </w:r>
-      <w:r>
-        <w:t xml:space="preserve"> · Ingenic H1 interim print · H2-26 robotics prints · Mar 2027 — Mech-Mind unlock + southbound windows.</w:t>
+        <w:t>29 Aug — Ingenic interim (A-share reacts Mon 31)</w:t>
+      </w:r>
+      <w:r>
+        <w:t xml:space="preserve"> · 31 Aug — SHEIN formal price, allotments, grey market 16:15–18:30 · 1 Sep — debuts · ~mid-Sep — SHEIN HSCI fast entry · H2-26 robotics prints · Mar 2027 — Mech-Mind unlock + southbound windows.</w:t>
       </w:r>
     </w:p>
     <w:sectPr>

</xml_diff>

<commit_message>
IPO note v8: Ingenic rewritten as short trader update (buyside expects top of range ~1.25bn, mid-range reads as miss; GM/inventory/Q3-language the only news; no A-share talk), head-to-head section deleted with PDD and Rokae verdicts folded into each valuation, email tone throughout
Co-Authored-By: Claude Fable 5 <noreply@anthropic.com>
</commit_message>
<xml_diff>
--- a/SHEIN_MechMind_HK_IPO_Note.docx
+++ b/SHEIN_MechMind_HK_IPO_Note.docx
@@ -22,7 +22,7 @@
     </w:p>
     <w:p>
       <w:r>
-        <w:t>Short version up front: SHEIN is the cheap-looking deal with no buyers and a real ceiling — skip the debut. Mech-Mind is the expensive deal with a 518x retail book and a 7% float — it will pop; the only question is whether you stay for the second act. Detail below.</w:t>
+        <w:t>Short version up front: SHEIN is the cheap-looking deal with no buyers and a real ceiling — skip the debut. Mech-Mind is the expensive deal with a 518x retail book and a 7% float — it will pop; the only question is whether you stay for the second act. Plus a quick one on Ingenic, which prints interims Saturday. Detail below.</w:t>
       </w:r>
     </w:p>
     <w:p>
@@ -1180,7 +1180,7 @@
         <w:t>not cheap; it's a premium to its best comp</w:t>
       </w:r>
       <w:r>
-        <w:t xml:space="preserve">. It clearly should not get H&amp;M's 22x either: H&amp;M has no growth ceiling being freshly discovered, no WVR governance discount, no ratchet overhang, and pays a dividend. So the deserved band is between the two — call it </w:t>
+        <w:t xml:space="preserve">. And think about what each profit dollar actually is: PDD's is a platform take-rate at ~20% net margin; SHEIN's is 1P retail at 4.9% — and it halved the moment one customs rule changed. Lower-quality earnings shouldn't cost more. It clearly should not get H&amp;M's 22x either: H&amp;M has no growth ceiling being freshly discovered, no WVR governance discount, no ratchet overhang, and pays a dividend. So the deserved band is between the two — call it </w:t>
       </w:r>
       <w:r>
         <w:rPr>
@@ -2461,7 +2461,16 @@
         <w:t>64.6% vs 21.9%</w:t>
       </w:r>
       <w:r>
-        <w:t>, both prospectus-filed) screens relatively cheap — and that relative-cheapness is what the momentum crowd will buy. (Rokae, to be clear, is a peer but a complement, not a competitor: it builds the arms, Mech-Mind builds the vision that guides them. Same wave, different layer — which is why the read-across works for pricing but not for market-share worries.)</w:t>
+        <w:t xml:space="preserve">, both prospectus-filed) screens relatively cheap. Run it in gross-profit terms and the point is stark: at the same P/S you're paying roughly </w:t>
+      </w:r>
+      <w:r>
+        <w:rPr>
+          <w:b/>
+        </w:rPr>
+        <w:t>45x gross profit for Mech-Mind versus ~130x for Rokae</w:t>
+      </w:r>
+      <w:r>
+        <w:t xml:space="preserve"> — three times more per dollar of gross profit for the hardware name. That relative cheapness is what the momentum crowd will buy. (Rokae, to be clear, is a peer but a complement, not a competitor: it builds the arms, Mech-Mind builds the vision that guides them. Same wave, different layer — which is why the read-across works for pricing but not for market-share worries.)</w:t>
       </w:r>
     </w:p>
     <w:p>
@@ -2554,7 +2563,12 @@
         <w:pStyle w:val="Heading1"/>
       </w:pPr>
       <w:r>
-        <w:t>3. Ingenic (3223 HK / A: 300223.SZ) — fundamentals, and Saturday's earnings</w:t>
+        <w:t>3. Ingenic (3223 HK) — quick one ahead of Saturday's results</w:t>
+      </w:r>
+    </w:p>
+    <w:p>
+      <w:r>
+        <w:t>New H-listing from Monday, results out Saturday — so keeping this short and practical.</w:t>
       </w:r>
     </w:p>
     <w:p>
@@ -2562,21 +2576,7 @@
         <w:pStyle w:val="Heading2"/>
       </w:pPr>
       <w:r>
-        <w:t>What this company actually is</w:t>
-      </w:r>
-    </w:p>
-    <w:p>
-      <w:r>
-        <w:t xml:space="preserve">Beijing chip designer, on ChiNext since 2011, added the H-share line on Aug 25. The business most people miss: this isn't really a CPU company anymore. </w:t>
-      </w:r>
-      <w:r>
-        <w:rPr>
-          <w:b/>
-        </w:rPr>
-        <w:t>Memory is 61% of revenue</w:t>
-      </w:r>
-      <w:r>
-        <w:t xml:space="preserve"> — the ISSI business it bought in 2020, selling automotive and industrial SRAM, niche DRAM and NOR flash. Computing chips (IP-camera SoCs, the XBurst MPUs) are 27%, analog the last 11%. By end market it's consumer 35%, auto 34%, industrial and the rest 31%.</w:t>
+        <w:t>What you need to know</w:t>
       </w:r>
     </w:p>
     <w:p>
@@ -2584,7 +2584,16 @@
         <w:pStyle w:val="ListBullet"/>
       </w:pPr>
       <w:r>
-        <w:t>The niches are real. Global #1 in automotive SRAM — roughly 60% of that pocket — #2 in SRAM overall, #5 in auto niche DRAM, #2 in IP-camera SoCs. Auto-grade memory takes years to qualify, and once you're designed into a car platform you stay there. Small ponds, but it owns them.</w:t>
+        <w:t xml:space="preserve">Despite the CPU history, this is a </w:t>
+      </w:r>
+      <w:r>
+        <w:rPr>
+          <w:b/>
+        </w:rPr>
+        <w:t>memory company</w:t>
+      </w:r>
+      <w:r>
+        <w:t>: 61% of revenue is auto/industrial SRAM (global #1 in auto SRAM), niche DRAM and NOR flash, with camera SoCs and some analog around it. Treat it as a leveraged play on legacy memory pricing.</w:t>
       </w:r>
     </w:p>
     <w:p>
@@ -2592,7 +2601,24 @@
         <w:pStyle w:val="ListBullet"/>
       </w:pPr>
       <w:r>
-        <w:t>The last three years were a grind: revenue RMB 4.53bn → 4.21bn → 4.74bn, profit 516m → 364m → 375m, gross margin drifting down to ~33%. Nothing wrong with the company — memory prices just fell for three years.</w:t>
+        <w:t xml:space="preserve">And legacy memory is on fire. Samsung, Hynix and Micron walked away from DDR4 to build HBM, the stuff went into shortage, spot rose another 17% in July. Ingenic reprices quarterly with a lag and is sitting on roughly a year of old-cost inventory — so while prices rise, every quarter's margin beats the last. Q1 profit was +332%; H1 is guided </w:t>
+      </w:r>
+      <w:r>
+        <w:rPr>
+          <w:b/>
+        </w:rPr>
+        <w:t>+431–531% (RMB 1.08–1.28bn — versus 375m for all of last year)</w:t>
+      </w:r>
+      <w:r>
+        <w:t>.</w:t>
+      </w:r>
+    </w:p>
+    <w:p>
+      <w:pPr>
+        <w:pStyle w:val="Heading2"/>
+      </w:pPr>
+      <w:r>
+        <w:t>Saturday's print — what the buyside is watching</w:t>
       </w:r>
     </w:p>
     <w:p>
@@ -2600,16 +2626,34 @@
         <w:pStyle w:val="ListBullet"/>
       </w:pPr>
       <w:r>
-        <w:t xml:space="preserve">Then the cycle turned, hard. Samsung, Hynix and Micron moved ~93% of DRAM output to HBM and DDR5, and legacy DDR4/niche DRAM — exactly what Ingenic sells — went into shortage. Spot DDR4 rose another 17% in July alone and is printing all-time highs. And Ingenic walked into this holding </w:t>
+        <w:t xml:space="preserve">Revenue (+77%) and the profit range are already public, so the print itself is about three things: </w:t>
       </w:r>
       <w:r>
         <w:rPr>
           <w:b/>
         </w:rPr>
-        <w:t>323 days of inventory bought at old prices</w:t>
+        <w:t>Q2 gross margin</w:t>
       </w:r>
       <w:r>
-        <w:t>, repricing quarterly with a lag. While prices rise, that combination is a margin machine.</w:t>
+        <w:t xml:space="preserve"> (Q1 was 43% blended, memory 39% — the street wants memory in the mid-40s), </w:t>
+      </w:r>
+      <w:r>
+        <w:rPr>
+          <w:b/>
+        </w:rPr>
+        <w:t>inventory</w:t>
+      </w:r>
+      <w:r>
+        <w:t xml:space="preserve"> (drawing down into strength, or still building), and whether management repeats that </w:t>
+      </w:r>
+      <w:r>
+        <w:rPr>
+          <w:b/>
+        </w:rPr>
+        <w:t>Q3/Q4 hikes are still coming</w:t>
+      </w:r>
+      <w:r>
+        <w:t>.</w:t>
       </w:r>
     </w:p>
     <w:p>
@@ -2617,119 +2661,35 @@
         <w:pStyle w:val="ListBullet"/>
       </w:pPr>
       <w:r>
-        <w:t xml:space="preserve">The result so far: Q1 revenue +47%, profit +332% (RMB 319m), gross margin 43% — a ten-year high. Segment level: memory 38.9%, compute 51.9%, analog 50.9%. H1 is pre-announced: revenue RMB 3.99bn, +77% (disclosed Aug 10), profit guided </w:t>
-      </w:r>
-      <w:r>
         <w:rPr>
           <w:b/>
         </w:rPr>
-        <w:t>RMB 1.08–1.28bn, up 431–531%</w:t>
+        <w:t>Buyside expectation is top of the guided range, ~RMB 1.25bn</w:t>
       </w:r>
       <w:r>
-        <w:t>. Do the subtraction and Q2 alone is RMB 760–963m — two-and-a-half to three times Q1, in one quarter.</w:t>
+        <w:t xml:space="preserve"> — the range was set 13 Jul and spot kept climbing after that, so mid-range would actually read as a miss. Screen consensus is stale (still shows less for the full year than H1 alone could print) — ignore it, the whisper is the bar.</w:t>
       </w:r>
     </w:p>
     <w:p>
       <w:pPr>
-        <w:pStyle w:val="Heading2"/>
+        <w:pStyle w:val="ListBullet"/>
       </w:pPr>
       <w:r>
-        <w:t>Saturday's print — what's actually new, what the whisper is, and our forecast</w:t>
-      </w:r>
-    </w:p>
-    <w:p>
-      <w:r>
-        <w:t xml:space="preserve">First, the date: the interim is </w:t>
-      </w:r>
-      <w:r>
-        <w:rPr>
-          <w:b/>
-        </w:rPr>
-        <w:t>scheduled for Saturday Aug 29</w:t>
-      </w:r>
-      <w:r>
-        <w:t xml:space="preserve"> (exchange appointment calendar; nothing filed as of Wednesday night — the 'Aug 27' on some data sites is a stale estimate). So the A-share reacts Monday Aug 31; the H trades Friday and could move first if the report lands Friday evening.</w:t>
-      </w:r>
-    </w:p>
-    <w:p>
-      <w:r>
-        <w:t>Second, what's genuinely news. Revenue and the profit range are already public — the report can't surprise on those. It settles three things:</w:t>
+        <w:t>Positioning is cleaner than you'd guess: the stock is ~35% off its July high, margin longs got flushed, and the +77% revenue disclosure was *sold* on the day. The fast money already left. That's the GigaDevice setup — it fell seven straight days into its print, then went limit-up on the actual numbers.</w:t>
       </w:r>
     </w:p>
     <w:p>
       <w:pPr>
-        <w:pStyle w:val="ListNumber"/>
+        <w:pStyle w:val="ListBullet"/>
       </w:pPr>
       <w:r>
         <w:rPr>
           <w:b/>
         </w:rPr>
-        <w:t>Q2 gross margin.</w:t>
+        <w:t>Our number: H1 ~1.20–1.25bn, Q2 gross margin 46–48%. Slight positive lean into Monday.</w:t>
       </w:r>
       <w:r>
-        <w:t xml:space="preserve"> This is the number. Memory GM was 38.9% in Q1; the hikes landed through Q2 while old-cost inventory was still flowing through COGS. Nanya just printed 79.5% in the same trade, so the market knows what's theoretically possible. Anything in the mid-40s for memory reads as confirmation the machine is working; stuck near 40 and the story wobbles.</w:t>
-      </w:r>
-    </w:p>
-    <w:p>
-      <w:pPr>
-        <w:pStyle w:val="ListNumber"/>
-      </w:pPr>
-      <w:r>
-        <w:rPr>
-          <w:b/>
-        </w:rPr>
-        <w:t>Inventory.</w:t>
-      </w:r>
-      <w:r>
-        <w:t xml:space="preserve"> 323 days was a windfall on the way up. The report shows whether it's being sold down into strength or still building — the Shanghai Securities News is already running 'the B-side of the memory beats' pieces about exactly this across the sector.</w:t>
-      </w:r>
-    </w:p>
-    <w:p>
-      <w:pPr>
-        <w:pStyle w:val="ListNumber"/>
-      </w:pPr>
-      <w:r>
-        <w:rPr>
-          <w:b/>
-        </w:rPr>
-        <w:t>The Q3/Q4 language.</w:t>
-      </w:r>
-      <w:r>
-        <w:t xml:space="preserve"> Management said in July that its hikes lag the industry and there's room left in Q3, possibly Q4. Taiwan is already whispering about a Q4 'margin defence war' as the low-cost-inventory benefit fades. Whichever tone this report takes probably sets the stock's next month.</w:t>
-      </w:r>
-    </w:p>
-    <w:p>
-      <w:r>
-        <w:t>Third, positioning — and this is the interesting part, because it's not a crowded long anymore. The A-share is ~36% below its mid-July peak (~RMB 220). Margin balances got flushed from RMB 4.8bn to ~3.3bn. Two pre-IPO funds cut more than RMB 1bn of stock. And when the +77% revenue number dropped on Aug 10, the stock *fell* 3.9% on heavy volume — the good news was sold. Retail boards tonight are openly in 'great print = sell the fact' mode. Meanwhile sell-side consensus is stale to the point of useless: the terminal still shows FY2026 at RMB 1.43bn when H1 alone could be 1.28bn; the one post-guidance note we found models RMB 3.8bn for the year.</w:t>
-      </w:r>
-    </w:p>
-    <w:p>
-      <w:r>
-        <w:rPr>
-          <w:b/>
-        </w:rPr>
-        <w:t>Our forecast</w:t>
-      </w:r>
-      <w:r>
-        <w:t xml:space="preserve">: H1 profit near the top of the range — call it </w:t>
-      </w:r>
-      <w:r>
-        <w:rPr>
-          <w:b/>
-        </w:rPr>
-        <w:t>RMB 1.20–1.25bn</w:t>
-      </w:r>
-      <w:r>
-        <w:t xml:space="preserve"> (Q2 ~880–930m). The range was set on Jul 13; DDR4 spot rose another ~17% *after* that, and the lag-repricing-plus-old-inventory setup means late-quarter sales carry the fattest margins. Q2 blended GM </w:t>
-      </w:r>
-      <w:r>
-        <w:rPr>
-          <w:b/>
-        </w:rPr>
-        <w:t>~46–48%</w:t>
-      </w:r>
-      <w:r>
-        <w:t>, memory into the mid-40s. On the reaction: with this much de-risking already done, the setup echoes GigaDevice — which fell seven straight days into its print and then went limit-up on the actual numbers. Top-of-range profit plus confident Q3 language and that script runs again; mid-range profit with memory GM stuck near 40 and the sell-the-fact crowd wins. We'd lean slightly positive into Monday, knowing the bar is the whisper (top of range), not the printed consensus.</w:t>
+        <w:t xml:space="preserve"> The risk case is mid-range profit with memory margin stuck near 40 — then sell-the-fact wins the day.</w:t>
       </w:r>
     </w:p>
     <w:p>
@@ -2740,846 +2700,38 @@
         <w:t>Valuation</w:t>
       </w:r>
     </w:p>
-    <w:tbl>
-      <w:tblPr>
-        <w:tblStyle w:val="LightGrid-Accent1"/>
-        <w:tblW w:type="auto" w:w="0"/>
-        <w:tblLook w:firstColumn="1" w:firstRow="1" w:lastColumn="0" w:lastRow="0" w:noHBand="0" w:noVBand="1" w:val="04A0"/>
-      </w:tblPr>
-      <w:tblGrid>
-        <w:gridCol w:w="2160"/>
-        <w:gridCol w:w="2160"/>
-        <w:gridCol w:w="2160"/>
-        <w:gridCol w:w="2160"/>
-      </w:tblGrid>
-      <w:tr>
-        <w:tc>
-          <w:tcPr>
-            <w:tcW w:type="dxa" w:w="2736"/>
-          </w:tcPr>
-          <w:p>
-            <w:r/>
-            <w:r>
-              <w:rPr>
-                <w:b/>
-                <w:sz w:val="19"/>
-              </w:rPr>
-            </w:r>
-          </w:p>
-        </w:tc>
-        <w:tc>
-          <w:tcPr>
-            <w:tcW w:type="dxa" w:w="3168"/>
-          </w:tcPr>
-          <w:p>
-            <w:r/>
-            <w:r>
-              <w:rPr>
-                <w:b/>
-                <w:sz w:val="19"/>
-              </w:rPr>
-              <w:t>P/E basis</w:t>
-            </w:r>
-          </w:p>
-        </w:tc>
-        <w:tc>
-          <w:tcPr>
-            <w:tcW w:type="dxa" w:w="2160"/>
-          </w:tcPr>
-          <w:p>
-            <w:r/>
-            <w:r>
-              <w:rPr>
-                <w:b/>
-                <w:sz w:val="19"/>
-              </w:rPr>
-              <w:t>Level</w:t>
-            </w:r>
-          </w:p>
-        </w:tc>
-        <w:tc>
-          <w:tcPr>
-            <w:tcW w:type="dxa" w:w="3312"/>
-          </w:tcPr>
-          <w:p>
-            <w:r/>
-            <w:r>
-              <w:rPr>
-                <w:b/>
-                <w:sz w:val="19"/>
-              </w:rPr>
-              <w:t>Note</w:t>
-            </w:r>
-          </w:p>
-        </w:tc>
-      </w:tr>
-      <w:tr>
-        <w:tc>
-          <w:tcPr>
-            <w:tcW w:type="dxa" w:w="2736"/>
-          </w:tcPr>
-          <w:p>
-            <w:r>
-              <w:rPr>
-                <w:sz w:val="19"/>
-              </w:rPr>
-            </w:r>
-            <w:r>
-              <w:rPr>
-                <w:b/>
-                <w:sz w:val="19"/>
-              </w:rPr>
-              <w:t>Ingenic H @ 101.10</w:t>
-            </w:r>
-          </w:p>
-        </w:tc>
-        <w:tc>
-          <w:tcPr>
-            <w:tcW w:type="dxa" w:w="3168"/>
-          </w:tcPr>
-          <w:p>
-            <w:r>
-              <w:rPr>
-                <w:sz w:val="19"/>
-              </w:rPr>
-            </w:r>
-            <w:r>
-              <w:rPr>
-                <w:sz w:val="19"/>
-              </w:rPr>
-              <w:t>FY2025 trailing / TTM-thru-H1 / 2026E annualised</w:t>
-            </w:r>
-          </w:p>
-        </w:tc>
-        <w:tc>
-          <w:tcPr>
-            <w:tcW w:type="dxa" w:w="2160"/>
-          </w:tcPr>
-          <w:p>
-            <w:r>
-              <w:rPr>
-                <w:sz w:val="19"/>
-              </w:rPr>
-            </w:r>
-            <w:r>
-              <w:rPr>
-                <w:b/>
-                <w:sz w:val="19"/>
-              </w:rPr>
-              <w:t>~119x / ~33x / ~19x</w:t>
-            </w:r>
-          </w:p>
-        </w:tc>
-        <w:tc>
-          <w:tcPr>
-            <w:tcW w:type="dxa" w:w="3312"/>
-          </w:tcPr>
-          <w:p>
-            <w:r>
-              <w:rPr>
-                <w:sz w:val="19"/>
-              </w:rPr>
-            </w:r>
-            <w:r>
-              <w:rPr>
-                <w:sz w:val="19"/>
-              </w:rPr>
-              <w:t>the multiple collapses as the cycle earnings land</w:t>
-            </w:r>
-          </w:p>
-        </w:tc>
-      </w:tr>
-      <w:tr>
-        <w:tc>
-          <w:tcPr>
-            <w:tcW w:type="dxa" w:w="2736"/>
-          </w:tcPr>
-          <w:p>
-            <w:r>
-              <w:rPr>
-                <w:sz w:val="19"/>
-              </w:rPr>
-            </w:r>
-            <w:r>
-              <w:rPr>
-                <w:sz w:val="19"/>
-              </w:rPr>
-              <w:t>Ingenic A @ RMB 140.48</w:t>
-            </w:r>
-          </w:p>
-        </w:tc>
-        <w:tc>
-          <w:tcPr>
-            <w:tcW w:type="dxa" w:w="3168"/>
-          </w:tcPr>
-          <w:p>
-            <w:r>
-              <w:rPr>
-                <w:sz w:val="19"/>
-              </w:rPr>
-            </w:r>
-            <w:r>
-              <w:rPr>
-                <w:sz w:val="19"/>
-              </w:rPr>
-              <w:t>TTM-thru-Q1 / 2026E annualised</w:t>
-            </w:r>
-          </w:p>
-        </w:tc>
-        <w:tc>
-          <w:tcPr>
-            <w:tcW w:type="dxa" w:w="2160"/>
-          </w:tcPr>
-          <w:p>
-            <w:r>
-              <w:rPr>
-                <w:sz w:val="19"/>
-              </w:rPr>
-            </w:r>
-            <w:r>
-              <w:rPr>
-                <w:sz w:val="19"/>
-              </w:rPr>
-              <w:t>116x / ~31x</w:t>
-            </w:r>
-          </w:p>
-        </w:tc>
-        <w:tc>
-          <w:tcPr>
-            <w:tcW w:type="dxa" w:w="3312"/>
-          </w:tcPr>
-          <w:p>
-            <w:r>
-              <w:rPr>
-                <w:sz w:val="19"/>
-              </w:rPr>
-            </w:r>
-            <w:r>
-              <w:rPr>
-                <w:sz w:val="19"/>
-              </w:rPr>
-              <w:t>ChiNext pricing of the same cash flows</w:t>
-            </w:r>
-          </w:p>
-        </w:tc>
-      </w:tr>
-      <w:tr>
-        <w:tc>
-          <w:tcPr>
-            <w:tcW w:type="dxa" w:w="2736"/>
-          </w:tcPr>
-          <w:p>
-            <w:r>
-              <w:rPr>
-                <w:sz w:val="19"/>
-              </w:rPr>
-            </w:r>
-            <w:r>
-              <w:rPr>
-                <w:sz w:val="19"/>
-              </w:rPr>
-              <w:t>GigaDevice (A)</w:t>
-            </w:r>
-          </w:p>
-        </w:tc>
-        <w:tc>
-          <w:tcPr>
-            <w:tcW w:type="dxa" w:w="3168"/>
-          </w:tcPr>
-          <w:p>
-            <w:r>
-              <w:rPr>
-                <w:sz w:val="19"/>
-              </w:rPr>
-            </w:r>
-            <w:r>
-              <w:rPr>
-                <w:sz w:val="19"/>
-              </w:rPr>
-              <w:t>TTM incl. H1 blowout</w:t>
-            </w:r>
-          </w:p>
-        </w:tc>
-        <w:tc>
-          <w:tcPr>
-            <w:tcW w:type="dxa" w:w="2160"/>
-          </w:tcPr>
-          <w:p>
-            <w:r>
-              <w:rPr>
-                <w:sz w:val="19"/>
-              </w:rPr>
-            </w:r>
-            <w:r>
-              <w:rPr>
-                <w:sz w:val="19"/>
-              </w:rPr>
-              <w:t>36x</w:t>
-            </w:r>
-          </w:p>
-        </w:tc>
-        <w:tc>
-          <w:tcPr>
-            <w:tcW w:type="dxa" w:w="3312"/>
-          </w:tcPr>
-          <w:p>
-            <w:r>
-              <w:rPr>
-                <w:sz w:val="19"/>
-              </w:rPr>
-            </w:r>
-            <w:r>
-              <w:rPr>
-                <w:sz w:val="19"/>
-              </w:rPr>
-              <w:t>H1'26 profit +1,092% — same cycle</w:t>
-            </w:r>
-          </w:p>
-        </w:tc>
-      </w:tr>
-      <w:tr>
-        <w:tc>
-          <w:tcPr>
-            <w:tcW w:type="dxa" w:w="2736"/>
-          </w:tcPr>
-          <w:p>
-            <w:r>
-              <w:rPr>
-                <w:sz w:val="19"/>
-              </w:rPr>
-            </w:r>
-            <w:r>
-              <w:rPr>
-                <w:sz w:val="19"/>
-              </w:rPr>
-              <w:t>Rockchip (A)</w:t>
-            </w:r>
-          </w:p>
-        </w:tc>
-        <w:tc>
-          <w:tcPr>
-            <w:tcW w:type="dxa" w:w="3168"/>
-          </w:tcPr>
-          <w:p>
-            <w:r>
-              <w:rPr>
-                <w:sz w:val="19"/>
-              </w:rPr>
-            </w:r>
-            <w:r>
-              <w:rPr>
-                <w:sz w:val="19"/>
-              </w:rPr>
-              <w:t>TTM</w:t>
-            </w:r>
-          </w:p>
-        </w:tc>
-        <w:tc>
-          <w:tcPr>
-            <w:tcW w:type="dxa" w:w="2160"/>
-          </w:tcPr>
-          <w:p>
-            <w:r>
-              <w:rPr>
-                <w:sz w:val="19"/>
-              </w:rPr>
-            </w:r>
-            <w:r>
-              <w:rPr>
-                <w:sz w:val="19"/>
-              </w:rPr>
-              <w:t>56x</w:t>
-            </w:r>
-          </w:p>
-        </w:tc>
-        <w:tc>
-          <w:tcPr>
-            <w:tcW w:type="dxa" w:w="3312"/>
-          </w:tcPr>
-          <w:p>
-            <w:r>
-              <w:rPr>
-                <w:sz w:val="19"/>
-              </w:rPr>
-            </w:r>
-          </w:p>
-        </w:tc>
-      </w:tr>
-      <w:tr>
-        <w:tc>
-          <w:tcPr>
-            <w:tcW w:type="dxa" w:w="2736"/>
-          </w:tcPr>
-          <w:p>
-            <w:r>
-              <w:rPr>
-                <w:sz w:val="19"/>
-              </w:rPr>
-            </w:r>
-            <w:r>
-              <w:rPr>
-                <w:sz w:val="19"/>
-              </w:rPr>
-              <w:t>Montage (A)</w:t>
-            </w:r>
-          </w:p>
-        </w:tc>
-        <w:tc>
-          <w:tcPr>
-            <w:tcW w:type="dxa" w:w="3168"/>
-          </w:tcPr>
-          <w:p>
-            <w:r>
-              <w:rPr>
-                <w:sz w:val="19"/>
-              </w:rPr>
-            </w:r>
-            <w:r>
-              <w:rPr>
-                <w:sz w:val="19"/>
-              </w:rPr>
-              <w:t>TTM</w:t>
-            </w:r>
-          </w:p>
-        </w:tc>
-        <w:tc>
-          <w:tcPr>
-            <w:tcW w:type="dxa" w:w="2160"/>
-          </w:tcPr>
-          <w:p>
-            <w:r>
-              <w:rPr>
-                <w:sz w:val="19"/>
-              </w:rPr>
-            </w:r>
-            <w:r>
-              <w:rPr>
-                <w:sz w:val="19"/>
-              </w:rPr>
-              <w:t>106x</w:t>
-            </w:r>
-          </w:p>
-        </w:tc>
-        <w:tc>
-          <w:tcPr>
-            <w:tcW w:type="dxa" w:w="3312"/>
-          </w:tcPr>
-          <w:p>
-            <w:r>
-              <w:rPr>
-                <w:sz w:val="19"/>
-              </w:rPr>
-            </w:r>
-          </w:p>
-        </w:tc>
-      </w:tr>
-      <w:tr>
-        <w:tc>
-          <w:tcPr>
-            <w:tcW w:type="dxa" w:w="2736"/>
-          </w:tcPr>
-          <w:p>
-            <w:r>
-              <w:rPr>
-                <w:sz w:val="19"/>
-              </w:rPr>
-            </w:r>
-            <w:r>
-              <w:rPr>
-                <w:sz w:val="19"/>
-              </w:rPr>
-              <w:t>SG Micro (A)</w:t>
-            </w:r>
-          </w:p>
-        </w:tc>
-        <w:tc>
-          <w:tcPr>
-            <w:tcW w:type="dxa" w:w="3168"/>
-          </w:tcPr>
-          <w:p>
-            <w:r>
-              <w:rPr>
-                <w:sz w:val="19"/>
-              </w:rPr>
-            </w:r>
-            <w:r>
-              <w:rPr>
-                <w:sz w:val="19"/>
-              </w:rPr>
-              <w:t>TTM</w:t>
-            </w:r>
-          </w:p>
-        </w:tc>
-        <w:tc>
-          <w:tcPr>
-            <w:tcW w:type="dxa" w:w="2160"/>
-          </w:tcPr>
-          <w:p>
-            <w:r>
-              <w:rPr>
-                <w:sz w:val="19"/>
-              </w:rPr>
-            </w:r>
-            <w:r>
-              <w:rPr>
-                <w:sz w:val="19"/>
-              </w:rPr>
-              <w:t>131x</w:t>
-            </w:r>
-          </w:p>
-        </w:tc>
-        <w:tc>
-          <w:tcPr>
-            <w:tcW w:type="dxa" w:w="3312"/>
-          </w:tcPr>
-          <w:p>
-            <w:r>
-              <w:rPr>
-                <w:sz w:val="19"/>
-              </w:rPr>
-            </w:r>
-          </w:p>
-        </w:tc>
-      </w:tr>
-      <w:tr>
-        <w:tc>
-          <w:tcPr>
-            <w:tcW w:type="dxa" w:w="2736"/>
-          </w:tcPr>
-          <w:p>
-            <w:r>
-              <w:rPr>
-                <w:sz w:val="19"/>
-              </w:rPr>
-            </w:r>
-            <w:r>
-              <w:rPr>
-                <w:sz w:val="19"/>
-              </w:rPr>
-              <w:t>Fudan Micro (A)</w:t>
-            </w:r>
-          </w:p>
-        </w:tc>
-        <w:tc>
-          <w:tcPr>
-            <w:tcW w:type="dxa" w:w="3168"/>
-          </w:tcPr>
-          <w:p>
-            <w:r>
-              <w:rPr>
-                <w:sz w:val="19"/>
-              </w:rPr>
-            </w:r>
-            <w:r>
-              <w:rPr>
-                <w:sz w:val="19"/>
-              </w:rPr>
-              <w:t>TTM</w:t>
-            </w:r>
-          </w:p>
-        </w:tc>
-        <w:tc>
-          <w:tcPr>
-            <w:tcW w:type="dxa" w:w="2160"/>
-          </w:tcPr>
-          <w:p>
-            <w:r>
-              <w:rPr>
-                <w:sz w:val="19"/>
-              </w:rPr>
-            </w:r>
-            <w:r>
-              <w:rPr>
-                <w:sz w:val="19"/>
-              </w:rPr>
-              <w:t>51x</w:t>
-            </w:r>
-          </w:p>
-        </w:tc>
-        <w:tc>
-          <w:tcPr>
-            <w:tcW w:type="dxa" w:w="3312"/>
-          </w:tcPr>
-          <w:p>
-            <w:r>
-              <w:rPr>
-                <w:sz w:val="19"/>
-              </w:rPr>
-            </w:r>
-          </w:p>
-        </w:tc>
-      </w:tr>
-    </w:tbl>
-    <w:p/>
-    <w:tbl>
-      <w:tblPr>
-        <w:tblStyle w:val="LightGrid-Accent1"/>
-        <w:tblW w:type="auto" w:w="0"/>
-        <w:tblLook w:firstColumn="1" w:firstRow="1" w:lastColumn="0" w:lastRow="0" w:noHBand="0" w:noVBand="1" w:val="04A0"/>
-      </w:tblPr>
-      <w:tblGrid>
-        <w:gridCol w:w="4320"/>
-        <w:gridCol w:w="4320"/>
-      </w:tblGrid>
-      <w:tr>
-        <w:tc>
-          <w:tcPr>
-            <w:tcW w:type="dxa" w:w="4608"/>
-          </w:tcPr>
-          <w:p>
-            <w:r/>
-            <w:r>
-              <w:rPr>
-                <w:b/>
-                <w:sz w:val="19"/>
-              </w:rPr>
-              <w:t>A+H semi pair</w:t>
-            </w:r>
-          </w:p>
-        </w:tc>
-        <w:tc>
-          <w:tcPr>
-            <w:tcW w:type="dxa" w:w="4608"/>
-          </w:tcPr>
-          <w:p>
-            <w:r/>
-            <w:r>
-              <w:rPr>
-                <w:b/>
-                <w:sz w:val="19"/>
-              </w:rPr>
-              <w:t>H discount to A (27 Aug)</w:t>
-            </w:r>
-          </w:p>
-        </w:tc>
-      </w:tr>
-      <w:tr>
-        <w:tc>
-          <w:tcPr>
-            <w:tcW w:type="dxa" w:w="4608"/>
-          </w:tcPr>
-          <w:p>
-            <w:r>
-              <w:rPr>
-                <w:sz w:val="19"/>
-              </w:rPr>
-            </w:r>
-            <w:r>
-              <w:rPr>
-                <w:sz w:val="19"/>
-              </w:rPr>
-              <w:t>Fudan Micro</w:t>
-            </w:r>
-          </w:p>
-        </w:tc>
-        <w:tc>
-          <w:tcPr>
-            <w:tcW w:type="dxa" w:w="4608"/>
-          </w:tcPr>
-          <w:p>
-            <w:r>
-              <w:rPr>
-                <w:sz w:val="19"/>
-              </w:rPr>
-            </w:r>
-            <w:r>
-              <w:rPr>
-                <w:sz w:val="19"/>
-              </w:rPr>
-              <w:t>58%</w:t>
-            </w:r>
-          </w:p>
-        </w:tc>
-      </w:tr>
-      <w:tr>
-        <w:tc>
-          <w:tcPr>
-            <w:tcW w:type="dxa" w:w="4608"/>
-          </w:tcPr>
-          <w:p>
-            <w:r>
-              <w:rPr>
-                <w:sz w:val="19"/>
-              </w:rPr>
-            </w:r>
-            <w:r>
-              <w:rPr>
-                <w:sz w:val="19"/>
-              </w:rPr>
-              <w:t>SMIC</w:t>
-            </w:r>
-          </w:p>
-        </w:tc>
-        <w:tc>
-          <w:tcPr>
-            <w:tcW w:type="dxa" w:w="4608"/>
-          </w:tcPr>
-          <w:p>
-            <w:r>
-              <w:rPr>
-                <w:sz w:val="19"/>
-              </w:rPr>
-            </w:r>
-            <w:r>
-              <w:rPr>
-                <w:sz w:val="19"/>
-              </w:rPr>
-              <w:t>52%</w:t>
-            </w:r>
-          </w:p>
-        </w:tc>
-      </w:tr>
-      <w:tr>
-        <w:tc>
-          <w:tcPr>
-            <w:tcW w:type="dxa" w:w="4608"/>
-          </w:tcPr>
-          <w:p>
-            <w:r>
-              <w:rPr>
-                <w:sz w:val="19"/>
-              </w:rPr>
-            </w:r>
-            <w:r>
-              <w:rPr>
-                <w:sz w:val="19"/>
-              </w:rPr>
-              <w:t>Novosense (listed Dec '25)</w:t>
-            </w:r>
-          </w:p>
-        </w:tc>
-        <w:tc>
-          <w:tcPr>
-            <w:tcW w:type="dxa" w:w="4608"/>
-          </w:tcPr>
-          <w:p>
-            <w:r>
-              <w:rPr>
-                <w:sz w:val="19"/>
-              </w:rPr>
-            </w:r>
-            <w:r>
-              <w:rPr>
-                <w:sz w:val="19"/>
-              </w:rPr>
-              <w:t>43%</w:t>
-            </w:r>
-          </w:p>
-        </w:tc>
-      </w:tr>
-      <w:tr>
-        <w:tc>
-          <w:tcPr>
-            <w:tcW w:type="dxa" w:w="4608"/>
-          </w:tcPr>
-          <w:p>
-            <w:r>
-              <w:rPr>
-                <w:sz w:val="19"/>
-              </w:rPr>
-            </w:r>
-            <w:r>
-              <w:rPr>
-                <w:b/>
-                <w:sz w:val="19"/>
-              </w:rPr>
-              <w:t>Ingenic</w:t>
-            </w:r>
-          </w:p>
-        </w:tc>
-        <w:tc>
-          <w:tcPr>
-            <w:tcW w:type="dxa" w:w="4608"/>
-          </w:tcPr>
-          <w:p>
-            <w:r>
-              <w:rPr>
-                <w:sz w:val="19"/>
-              </w:rPr>
-            </w:r>
-            <w:r>
-              <w:rPr>
-                <w:b/>
-                <w:sz w:val="19"/>
-              </w:rPr>
-              <w:t>38% — already the tightest of the set</w:t>
-            </w:r>
-          </w:p>
-        </w:tc>
-      </w:tr>
-    </w:tbl>
-    <w:p/>
     <w:p>
+      <w:pPr>
+        <w:pStyle w:val="ListBullet"/>
+      </w:pPr>
       <w:r>
-        <w:t xml:space="preserve">How we read this, step by step. Start with what you're paying: the H at 101.10 works out to roughly </w:t>
+        <w:t xml:space="preserve">At ~HK$101 the H costs about </w:t>
       </w:r>
       <w:r>
         <w:rPr>
           <w:b/>
         </w:rPr>
-        <w:t>19x annualised 2026 earnings</w:t>
+        <w:t>19x this year's annualised earnings</w:t>
       </w:r>
       <w:r>
-        <w:t xml:space="preserve"> — for a company still guiding price hikes into Q4, that looks cheap on its face. But walk through why it's priced there before calling it a bargain.</w:t>
+        <w:t>. GigaDevice — same cycle, just printed H1 +1,092% — trades at 36x. Montage is over 100x. Global memory (Micron, Winbond) sits around 20x forward. So: not expensive against the China cohort, in line with global.</w:t>
       </w:r>
     </w:p>
     <w:p>
       <w:pPr>
-        <w:pStyle w:val="ListNumber"/>
+        <w:pStyle w:val="ListBullet"/>
       </w:pPr>
       <w:r>
-        <w:t xml:space="preserve">The '38% discount to A' pitch is backwards. The discount isn't the H being cheap — it's </w:t>
+        <w:t xml:space="preserve">Just be clear what you own at 19x: </w:t>
       </w:r>
       <w:r>
         <w:rPr>
           <w:b/>
         </w:rPr>
-        <w:t>the A being expensive</w:t>
+        <w:t>a cycle position, not a value stock</w:t>
       </w:r>
       <w:r>
-        <w:t>. 116x trailing is ChiNext speculative pricing, and international investors simply won't pay it. The flat H debut despite a 927x-subscribed book was global money telling you exactly that. The H is the honest price for these cash flows; the A is the exuberant one.</w:t>
-      </w:r>
-    </w:p>
-    <w:p>
-      <w:pPr>
-        <w:pStyle w:val="ListNumber"/>
-      </w:pPr>
-      <w:r>
-        <w:t xml:space="preserve">Nor is there a convergence trade hiding here. Within the A/H semi set, Ingenic's 38% is already the </w:t>
-      </w:r>
-      <w:r>
-        <w:rPr>
-          <w:b/>
-        </w:rPr>
-        <w:t>tightest</w:t>
-      </w:r>
-      <w:r>
-        <w:t xml:space="preserve"> discount — tighter than Novosense at 43%, far tighter than SMIC's 52%, which has sat there for years without closing. If the gap ever narrows it'll be a flow event (southbound inclusion, the way Novosense tightened) or the A coming down — not the H re-rating to ChiNext levels.</w:t>
-      </w:r>
-    </w:p>
-    <w:p>
-      <w:pPr>
-        <w:pStyle w:val="ListNumber"/>
-      </w:pPr>
-      <w:r>
-        <w:t>And there's no absolute-value case from global anchors either: Micron and Winbond trade around 20x forward in the same cycle. What supports the H is China-semis cohort pricing (GigaDevice 36x, Montage 106x), nothing more.</w:t>
-      </w:r>
-    </w:p>
-    <w:p>
-      <w:pPr>
-        <w:pStyle w:val="ListNumber"/>
-      </w:pPr>
-      <w:r>
-        <w:t xml:space="preserve">So what you actually own at 19x is a </w:t>
-      </w:r>
-      <w:r>
-        <w:rPr>
-          <w:b/>
-        </w:rPr>
-        <w:t>memory-cycle position, not a valuation anomaly</w:t>
-      </w:r>
-      <w:r>
-        <w:t>. It works if legacy-DRAM pricing holds into 2027 — and the company itself says visibility ends around H2 2027, CXMT/Winbond/Nanya are filling the vacuum, and the same 323 days of inventory that's a windfall today becomes the writedown when prices roll. Buy it for the cycle at 19x versus GigaDevice's 36x if that's the trade you want. Never for 'the discount must close.'</w:t>
+        <w:t>. The company itself says it can't see past mid-2027, Taiwan is already muttering about a Q4 margin-defence war, and the same year of cheap inventory driving the beats becomes the writedown when prices roll. Trade the print and the hikes; don't marry it.</w:t>
       </w:r>
     </w:p>
     <w:p>
@@ -3587,270 +2739,7 @@
         <w:pStyle w:val="Heading1"/>
       </w:pPr>
       <w:r>
-        <w:t>4. The head-to-head: does either deserve a premium to its anchor?</w:t>
-      </w:r>
-    </w:p>
-    <w:p>
-      <w:r>
-        <w:t xml:space="preserve">Before the two verdicts, the frame we're using. A multiple is compressed DCF — a business deserves to trade richer than its comp only if at least one of three things is true: </w:t>
-      </w:r>
-      <w:r>
-        <w:rPr>
-          <w:b/>
-        </w:rPr>
-        <w:t>(1)</w:t>
-      </w:r>
-      <w:r>
-        <w:t xml:space="preserve"> each revenue dollar converts to more cash (margin/returns); </w:t>
-      </w:r>
-      <w:r>
-        <w:rPr>
-          <w:b/>
-        </w:rPr>
-        <w:t>(2)</w:t>
-      </w:r>
-      <w:r>
-        <w:t xml:space="preserve"> the cash grows faster for longer (duration); </w:t>
-      </w:r>
-      <w:r>
-        <w:rPr>
-          <w:b/>
-        </w:rPr>
-        <w:t>(3)</w:t>
-      </w:r>
-      <w:r>
-        <w:t xml:space="preserve"> the cash is safer (risk). Worse on all three means it must trade at a discount. Everything else is narrative.</w:t>
-      </w:r>
-    </w:p>
-    <w:p>
-      <w:pPr>
-        <w:pStyle w:val="Heading2"/>
-      </w:pPr>
-      <w:r>
-        <w:t>SHEIN vs PDD — no premium deserved. Walk the three drivers:</w:t>
-      </w:r>
-    </w:p>
-    <w:p>
-      <w:pPr>
-        <w:pStyle w:val="ListNumber"/>
-      </w:pPr>
-      <w:r>
-        <w:rPr>
-          <w:b/>
-        </w:rPr>
-        <w:t>Earnings quality — what is a dollar of SHEIN's profit worth versus a dollar of PDD's?</w:t>
-      </w:r>
-      <w:r>
-        <w:t xml:space="preserve"> PDD's dollar is a take-rate on other people's inventory: ~20% net margin, negative working capital, no fulfilment asset at risk. SHEIN's dollar comes from goods it must manufacture and ship across a border: 4.9% net margin — and that margin </w:t>
-      </w:r>
-      <w:r>
-        <w:rPr>
-          <w:b/>
-        </w:rPr>
-        <w:t>halved in one year because one customs rule changed</w:t>
-      </w:r>
-      <w:r>
-        <w:t>. A profit stream that one regulatory decision can cut in half is worth less per dollar, full stop.</w:t>
-      </w:r>
-    </w:p>
-    <w:p>
-      <w:pPr>
-        <w:pStyle w:val="ListNumber"/>
-      </w:pPr>
-      <w:r>
-        <w:rPr>
-          <w:b/>
-        </w:rPr>
-        <w:t>Growth — will SHEIN's dollar grow faster?</w:t>
-      </w:r>
-      <w:r>
-        <w:t xml:space="preserve"> PDD compounds ~10% with category breadth working for it. SHEIN went +8% → +1%, and the ceiling logic in section 1 shows all three growth levers (frequency, basket, new users) are exhausted. Worse: the fourth force — ad-auction inflation — is a headwind that </w:t>
-      </w:r>
-      <w:r>
-        <w:rPr>
-          <w:b/>
-        </w:rPr>
-        <w:t>PDD causes and SHEIN suffers</w:t>
-      </w:r>
-      <w:r>
-        <w:t>. Temu's spending is literally why SHEIN paid +48.9% for +8% revenue. Paying a premium here means paying more for the victim than the aggressor.</w:t>
-      </w:r>
-    </w:p>
-    <w:p>
-      <w:pPr>
-        <w:pStyle w:val="ListNumber"/>
-      </w:pPr>
-      <w:r>
-        <w:rPr>
-          <w:b/>
-        </w:rPr>
-        <w:t>Risk — anything offsetting?</w:t>
-      </w:r>
-      <w:r>
-        <w:t xml:space="preserve"> The China/tariff haircut applies to both, so it cancels. SHEIN then adds three risks PDD doesn't carry: WVR (no southbound buyer for six months), the US$3.5bn ratchet leakage, and a register of made-whole sellers sitting exactly at your cost basis. Strike three.</w:t>
-      </w:r>
-    </w:p>
-    <w:p>
-      <w:pPr>
-        <w:pStyle w:val="ListNumber"/>
-      </w:pPr>
-      <w:r>
-        <w:rPr>
-          <w:b/>
-        </w:rPr>
-        <w:t>So why does the deal still ask 12.9x against PDD's 9.5x?</w:t>
-      </w:r>
-      <w:r>
-        <w:t xml:space="preserve"> Only one honest answer: the denominator. The syndicate wants you to capitalise 2027 *normalised* earnings (BI's US$1.67bn rebound), not the depressed 2025/Q1 prints. Legitimate argument — but see what it implies: </w:t>
-      </w:r>
-      <w:r>
-        <w:rPr>
-          <w:b/>
-        </w:rPr>
-        <w:t>the entire 35% premium IS the recovery bet, with zero margin of safety left over.</w:t>
-      </w:r>
-      <w:r>
-        <w:t xml:space="preserve"> The rule it breaks: don't pay in advance for a normalisation the company hasn't printed, when the anchor comp gives you a structurally better business without needing the bet. If recovery lands, PDD probably re-rates too, so you don't even win relative; if it misses, SHEIN converges to PDD's multiple ≈ US$20bn, about –25%. Heads you roughly tie, tails you lose a quarter.</w:t>
-      </w:r>
-    </w:p>
-    <w:p>
-      <w:pPr>
-        <w:pStyle w:val="Heading2"/>
-      </w:pPr>
-      <w:r>
-        <w:t>Mech-Mind vs Rokae — premium deserved. Same three drivers:</w:t>
-      </w:r>
-    </w:p>
-    <w:p>
-      <w:pPr>
-        <w:pStyle w:val="ListNumber"/>
-      </w:pPr>
-      <w:r>
-        <w:rPr>
-          <w:b/>
-        </w:rPr>
-        <w:t>Fix the unit first.</w:t>
-      </w:r>
-      <w:r>
-        <w:t xml:space="preserve"> P/S assumes every revenue dollar is equal; it isn't. Mech-Mind keeps 65 cents of gross profit per revenue dollar, Rokae keeps 22. If the two ever reach similar opex efficiency, steady-state earnings power per revenue dollar is ~3x higher at Mech-Mind — so the *neutral* condition is equal price-to-</w:t>
-      </w:r>
-      <w:r>
-        <w:rPr>
-          <w:b/>
-        </w:rPr>
-        <w:t>gross-profit</w:t>
-      </w:r>
-      <w:r>
-        <w:t xml:space="preserve">, not equal P/S. At par P/S (29x each): Mech-Mind ≈ </w:t>
-      </w:r>
-      <w:r>
-        <w:rPr>
-          <w:b/>
-        </w:rPr>
-        <w:t>45x gross profit</w:t>
-      </w:r>
-      <w:r>
-        <w:t xml:space="preserve">, Rokae ≈ </w:t>
-      </w:r>
-      <w:r>
-        <w:rPr>
-          <w:b/>
-        </w:rPr>
-        <w:t>130x</w:t>
-      </w:r>
-      <w:r>
-        <w:t xml:space="preserve"> (~85x on H1-annualised). So parity in P/S already hands Mech-Mind a ~65% relative discount on the honest unit — the premium case starts as arithmetic, not opinion.</w:t>
-      </w:r>
-    </w:p>
-    <w:p>
-      <w:pPr>
-        <w:pStyle w:val="ListNumber"/>
-      </w:pPr>
-      <w:r>
-        <w:rPr>
-          <w:b/>
-        </w:rPr>
-        <w:t>Margin trajectory — who is on the right side of the price war?</w:t>
-      </w:r>
-      <w:r>
-        <w:t xml:space="preserve"> Rokae sells arms: hardware against 300+ Chinese arm makers, embodied segment gross margin 10.7%, price war confirmed by the NDRC and Caixin. Its margin has a hardware ceiling. Mech-Mind sells perception </w:t>
-      </w:r>
-      <w:r>
-        <w:rPr>
-          <w:b/>
-        </w:rPr>
-        <w:t>to every arm maker</w:t>
-      </w:r>
-      <w:r>
-        <w:t xml:space="preserve"> — a price war among arm makers increases the volume of eyes sold while squeezing the people selling arms. Its gross margin went 39% → 65% *while the war started*. When a value chain commoditises, whoever owns the differentiating component collects what the commodity layer gives up.</w:t>
-      </w:r>
-    </w:p>
-    <w:p>
-      <w:pPr>
-        <w:pStyle w:val="ListNumber"/>
-      </w:pPr>
-      <w:r>
-        <w:rPr>
-          <w:b/>
-        </w:rPr>
-        <w:t>Durability — which #1 decays slower?</w:t>
-      </w:r>
-      <w:r>
-        <w:t xml:space="preserve"> Rokae is #1 in a domestic niche (47% of China cobots by volume) but 5.8% in light industrial and only 9% overseas — a local leader in a crowded commodity field. Mech-Mind is #1 </w:t>
-      </w:r>
-      <w:r>
-        <w:rPr>
-          <w:b/>
-        </w:rPr>
-        <w:t>globally</w:t>
-      </w:r>
-      <w:r>
-        <w:t xml:space="preserve"> (27% of shipments, more than the next four combined), #1 in China, Japan and North America simultaneously, 50% overseas at better margin, 86% repeat revenue, and a 27,000-unit data flywheel a copycat cannot shortcut. A global #1 with data lock-in fades a lot slower than a domestic niche #1 in commodity hardware.</w:t>
-      </w:r>
-    </w:p>
-    <w:p>
-      <w:pPr>
-        <w:pStyle w:val="ListNumber"/>
-      </w:pPr>
-      <w:r>
-        <w:rPr>
-          <w:b/>
-        </w:rPr>
-        <w:t>Then why does Rokae get parity today at all?</w:t>
-      </w:r>
-      <w:r>
-        <w:t xml:space="preserve"> Because it has the one thing markets pay cash for: a </w:t>
-      </w:r>
-      <w:r>
-        <w:rPr>
-          <w:b/>
-        </w:rPr>
-        <w:t>printed</w:t>
-      </w:r>
-      <w:r>
-        <w:t xml:space="preserve"> inflection — the 30 Jul alert (adjusted profit positive, revenue +127%). Mech-Mind offers a trajectory (adjusted loss 334 → 109 → 33) but no print yet. That proof-premium explains why Rokae *holds* par today; it never justifies Mech-Mind trading below Rokae, and it converts into an explicit Mech-Mind premium the day the first post-listing print confirms the trajectory. The deal at parity therefore hands you the deserved premium for free — payable, or not, at the first print.</w:t>
-      </w:r>
-    </w:p>
-    <w:p>
-      <w:r>
-        <w:t xml:space="preserve">Honesty check a PM would demand: this is a </w:t>
-      </w:r>
-      <w:r>
-        <w:rPr>
-          <w:b/>
-        </w:rPr>
-        <w:t>relative</w:t>
-      </w:r>
-      <w:r>
-        <w:t xml:space="preserve"> call. Rokae's own 29x is partly a 6%-float artifact — if Rokae de-rates to 20x, “deserves a premium to Rokae” still means Mech-Mind falls in absolute. Deserving a premium and being cheap are different claims; we are making the first.</w:t>
-      </w:r>
-    </w:p>
-    <w:p>
-      <w:pPr>
-        <w:pStyle w:val="Heading1"/>
-      </w:pPr>
-      <w:r>
-        <w:t>5. Bottom line</w:t>
+        <w:t>4. Bottom line</w:t>
       </w:r>
     </w:p>
     <w:p>
@@ -3900,7 +2789,7 @@
         <w:t>Ingenic</w:t>
       </w:r>
       <w:r>
-        <w:t xml:space="preserve"> — a memory-cycle trade at ~19x annualised 2026 earnings, not an A/H convergence trade. Saturday's interim only settles Q2 gross margin, inventory and the Q3 language; positioning is washed out, whisper is top-of-range, we lean slightly positive into Monday.</w:t>
+        <w:t xml:space="preserve"> — legacy-memory cycle play at ~19x this year's earnings. Results Saturday; whisper is top of the guided range and positioning is already washed out. Slight positive lean into Monday.</w:t>
       </w:r>
     </w:p>
     <w:p>

</xml_diff>

<commit_message>
IPO note v9: Medcaptain (2041 HK) added as short trader section — mini-Mindray roll-up at 153x/55x-adjusted vs Mindray 25x, goodwill half of net assets, Q1 back to loss, no-cornerstone/no-shoe/no-stabiliser structure with 7x book reads as placed-not-fought-over; verdict pass, grey 4 Sep
Co-Authored-By: Claude Fable 5 <noreply@anthropic.com>
</commit_message>
<xml_diff>
--- a/SHEIN_MechMind_HK_IPO_Note.docx
+++ b/SHEIN_MechMind_HK_IPO_Note.docx
@@ -17,12 +17,12 @@
           <w:color w:val="606060"/>
           <w:sz w:val="19"/>
         </w:rPr>
-        <w:t>Both list Monday 1 Sep 2026  ·  Written 27 Aug 2026  ·  Returns vs offer price unless stated</w:t>
+        <w:t>Written 27 Aug 2026, Medcaptain added 30 Aug  ·  SHEIN &amp; Mech-Mind list Mon 1 Sep  ·  Returns vs offer price unless stated</w:t>
       </w:r>
     </w:p>
     <w:p>
       <w:r>
-        <w:t>Short version up front: SHEIN is the cheap-looking deal with no buyers and a real ceiling — skip the debut. Mech-Mind is the expensive deal with a 518x retail book and a 7% float — it will pop; the only question is whether you stay for the second act. Plus a quick one on Ingenic, which prints interims Saturday. Detail below.</w:t>
+        <w:t>Short version up front: SHEIN is the cheap-looking deal with no buyers and a real ceiling — skip the debut. Mech-Mind is the expensive deal with a 518x retail book and a 7% float — it will pop; the only question is whether you stay for the second act. Plus quick ones on Ingenic (interims Saturday) and Medcaptain, a new medtech deal open now — we'd pass on it. Detail below.</w:t>
       </w:r>
     </w:p>
     <w:p>
@@ -2739,7 +2739,152 @@
         <w:pStyle w:val="Heading1"/>
       </w:pPr>
       <w:r>
-        <w:t>4. Bottom line</w:t>
+        <w:t>4. Medcaptain (2041 HK) — new deal, book open now</w:t>
+      </w:r>
+    </w:p>
+    <w:p>
+      <w:r>
+        <w:t>Medtech deal launched Friday: closes Wed 2 Sep, grey market 4 Sep, lists Mon 7 Sep. Fixed price HK$15.42 (no range), ~HK$600m raise, ~HK$8.3bn market cap, Morgan Stanley and Huatai running it. Entry ticket is small, HK$1,558 a lot.</w:t>
+      </w:r>
+    </w:p>
+    <w:p>
+      <w:pPr>
+        <w:pStyle w:val="Heading2"/>
+      </w:pPr>
+      <w:r>
+        <w:t>What you need to know</w:t>
+      </w:r>
+    </w:p>
+    <w:p>
+      <w:pPr>
+        <w:pStyle w:val="ListBullet"/>
+      </w:pPr>
+      <w:r>
+        <w:t>The pitch is 'mini-Mindray': the chairman is Mindray's ex-CFO/COO, five of seven senior managers are ex-Mindray, and Hillhouse owns 21% pre-IPO. It's China #1 in infusion workstations (every year since 2018), ~90% of top-tier hospitals as customers, nearly half of revenue overseas, 54% gross margin.</w:t>
+      </w:r>
+    </w:p>
+    <w:p>
+      <w:pPr>
+        <w:pStyle w:val="ListBullet"/>
+      </w:pPr>
+      <w:r>
+        <w:t xml:space="preserve">But the shape of the business is an M&amp;A roll-up, and it shows. Half of revenue is GI endoscopy consumables that came with one acquisition — and the goodwill on the balance sheet equals </w:t>
+      </w:r>
+      <w:r>
+        <w:rPr>
+          <w:b/>
+        </w:rPr>
+        <w:t>half of net assets</w:t>
+      </w:r>
+      <w:r>
+        <w:t>, mostly booked against that same unit. The UK anaesthesia business (Penlon) is shrinking. 83% of sales go through distributors.</w:t>
+      </w:r>
+    </w:p>
+    <w:p>
+      <w:pPr>
+        <w:pStyle w:val="ListBullet"/>
+      </w:pPr>
+      <w:r>
+        <w:t xml:space="preserve">Earnings are barely there: first-ever profit in 2025 (RMB 51m on RMB 1.62bn revenue — a 3% margin; RMB 129m on the adjusted basis), and </w:t>
+      </w:r>
+      <w:r>
+        <w:rPr>
+          <w:b/>
+        </w:rPr>
+        <w:t>Q1 2026 already slipped back to a small loss</w:t>
+      </w:r>
+      <w:r>
+        <w:t>. Revenue growth is mid-teens, not the 39% CAGR in the marketing material — that figure is adjusted EBITDA, read the footnote.</w:t>
+      </w:r>
+    </w:p>
+    <w:p>
+      <w:pPr>
+        <w:pStyle w:val="ListBullet"/>
+      </w:pPr>
+      <w:r>
+        <w:t xml:space="preserve">And the deal structure is bare: </w:t>
+      </w:r>
+      <w:r>
+        <w:rPr>
+          <w:b/>
+        </w:rPr>
+        <w:t>no cornerstones, no greenshoe, no stabilising agent</w:t>
+      </w:r>
+      <w:r>
+        <w:t xml:space="preserve"> — on a fixed price. The book reflects it: day-1 margin cover was ~7x, against the hundreds-to-thousands recent hot deals have printed. This one is being placed, not fought over.</w:t>
+      </w:r>
+    </w:p>
+    <w:p>
+      <w:pPr>
+        <w:pStyle w:val="Heading2"/>
+      </w:pPr>
+      <w:r>
+        <w:t>Valuation</w:t>
+      </w:r>
+    </w:p>
+    <w:p>
+      <w:pPr>
+        <w:pStyle w:val="ListBullet"/>
+      </w:pPr>
+      <w:r>
+        <w:t xml:space="preserve">At HK$15.42 you're paying </w:t>
+      </w:r>
+      <w:r>
+        <w:rPr>
+          <w:b/>
+        </w:rPr>
+        <w:t>~153x trailing earnings, ~55x adjusted, ~4.4x sales</w:t>
+      </w:r>
+      <w:r>
+        <w:t xml:space="preserve">. Now look at the shelf: Weigao — profitable, distributor-model, same channel economics — is 8x. AK Medical 13x. Kangji ~18x. Mindray itself, the actual thing this is a mini version of, is </w:t>
+      </w:r>
+      <w:r>
+        <w:rPr>
+          <w:b/>
+        </w:rPr>
+        <w:t>25x with a 23% net margin</w:t>
+      </w:r>
+      <w:r>
+        <w:t xml:space="preserve"> (and just had its first down year in eight). Only the genuine growth stories (United Imaging, MicroPort) get 38–52x, and this isn't one — 15% top line, 3% margin.</w:t>
+      </w:r>
+    </w:p>
+    <w:p>
+      <w:pPr>
+        <w:pStyle w:val="ListBullet"/>
+      </w:pPr>
+      <w:r>
+        <w:t xml:space="preserve">Be generous — give it 25–30x adjusted for the GI-consumables growth and the overseas mix — and you land at roughly </w:t>
+      </w:r>
+      <w:r>
+        <w:rPr>
+          <w:b/>
+        </w:rPr>
+        <w:t>half the asking price</w:t>
+      </w:r>
+      <w:r>
+        <w:t>. The tell is in the deal itself: priced below the 2023 private round, no anchor wanted their name on it, and nobody was hired to defend it in the aftermarket. When a Morgan Stanley deal ships with no cornerstone, no shoe and no stabiliser, the syndicate is telling you what the institutional bid looked like.</w:t>
+      </w:r>
+    </w:p>
+    <w:p>
+      <w:pPr>
+        <w:pStyle w:val="ListBullet"/>
+      </w:pPr>
+      <w:r>
+        <w:rPr>
+          <w:b/>
+        </w:rPr>
+        <w:t>Pass.</w:t>
+      </w:r>
+      <w:r>
+        <w:t xml:space="preserve"> Small float and a cheap ticket can still produce a grey-market bounce — 4 Sep tells you — but if this breaks issue on day one there is no net under it, by design. Nothing here you need to own before it reports a clean profitable half.</w:t>
+      </w:r>
+    </w:p>
+    <w:p>
+      <w:pPr>
+        <w:pStyle w:val="Heading1"/>
+      </w:pPr>
+      <w:r>
+        <w:t>5. Bottom line</w:t>
       </w:r>
     </w:p>
     <w:p>
@@ -2794,6 +2939,20 @@
     </w:p>
     <w:p>
       <w:pPr>
+        <w:pStyle w:val="ListBullet"/>
+      </w:pPr>
+      <w:r>
+        <w:rPr>
+          <w:b/>
+        </w:rPr>
+        <w:t>Medcaptain</w:t>
+      </w:r>
+      <w:r>
+        <w:t xml:space="preserve"> — mini-Mindray story at roughly double a defensible price (55x adjusted vs Mindray at 25x), sold with no cornerstone, no greenshoe and no stabiliser into a lukewarm book. Pass; let the 4 Sep grey market and a clean profitable half change our mind.</w:t>
+      </w:r>
+    </w:p>
+    <w:p>
+      <w:pPr>
         <w:pStyle w:val="Heading2"/>
       </w:pPr>
       <w:r>
@@ -2814,7 +2973,7 @@
         <w:t>29 Aug — Ingenic interim (A-share reacts Mon 31)</w:t>
       </w:r>
       <w:r>
-        <w:t xml:space="preserve"> · 31 Aug — SHEIN formal price, allotments, grey market 16:15–18:30 · 1 Sep — debuts · ~mid-Sep — SHEIN HSCI fast entry · H2-26 robotics prints · Mar 2027 — Mech-Mind unlock + southbound windows.</w:t>
+        <w:t xml:space="preserve"> · 31 Aug — SHEIN formal price, allotments, grey market 16:15–18:30 · 1 Sep — debuts · 2 Sep — Medcaptain book closes (grey 4 Sep, lists 7 Sep) · ~mid-Sep — SHEIN HSCI fast entry · H2-26 robotics prints · Mar 2027 — Mech-Mind unlock + southbound windows.</w:t>
       </w:r>
     </w:p>
     <w:sectPr>

</xml_diff>

<commit_message>
IPO note v10: Longsys vs Ingenic (inventory-windfall vs pricing-power, OCF -3.15bn vs +959m, own-vs-rent verdict), Medcaptain deep pass (Micro-Tech comp table, SOTP 35-40% below ask, 53x weekend book = float game), Excelland 3231 identified + peer walk (YunJi/OneRobotics round-trips, avoid), Broadcom Sep 2 pre-earnings brief (whisper bars, 8-print reaction pattern), Ingenic interim close-out
Co-Authored-By: Claude Fable 5 <noreply@anthropic.com>
</commit_message>
<xml_diff>
--- a/SHEIN_MechMind_HK_IPO_Note.docx
+++ b/SHEIN_MechMind_HK_IPO_Note.docx
@@ -2563,7 +2563,7 @@
         <w:pStyle w:val="Heading1"/>
       </w:pPr>
       <w:r>
-        <w:t>3. Ingenic (3223 HK) — quick one ahead of Saturday's results</w:t>
+        <w:t>3. Ingenic (3223 HK) — the print landed, close-out</w:t>
       </w:r>
     </w:p>
     <w:p>
@@ -2697,7 +2697,7 @@
         <w:pStyle w:val="Heading2"/>
       </w:pPr>
       <w:r>
-        <w:t>Valuation</w:t>
+        <w:t>Update — results are in (1 Sep)</w:t>
       </w:r>
     </w:p>
     <w:p>
@@ -2705,16 +2705,25 @@
         <w:pStyle w:val="ListBullet"/>
       </w:pPr>
       <w:r>
-        <w:t xml:space="preserve">At ~HK$101 the H costs about </w:t>
+        <w:t xml:space="preserve">H1 profit printed </w:t>
       </w:r>
       <w:r>
         <w:rPr>
           <w:b/>
         </w:rPr>
-        <w:t>19x this year's annualised earnings</w:t>
-      </w:r>
-      <w:r>
-        <w:t>. GigaDevice — same cycle, just printed H1 +1,092% — trades at 36x. Montage is over 100x. Global memory (Micron, Winbond) sits around 20x forward. So: not expensive against the China cohort, in line with global.</w:t>
+        <w:t>RMB 1,198m, +490%</w:t>
+      </w:r>
+      <w:r>
+        <w:t xml:space="preserve"> — mid-upper of the guided range, a touch under the top-of-range whisper (and a hair below our 1.20–1.25bn call). But the quality was there: revenue +76%, and </w:t>
+      </w:r>
+      <w:r>
+        <w:rPr>
+          <w:b/>
+        </w:rPr>
+        <w:t>operating cash flow positive at RMB 959m</w:t>
+      </w:r>
+      <w:r>
+        <w:t xml:space="preserve"> — the margins are real and the cash confirms it. No sell-the-fact: Monday the A closed +3.1%, the H +2.6% at HK$101.50, still holding just above the HK$100 issue price.</w:t>
       </w:r>
     </w:p>
     <w:p>
@@ -2722,6 +2731,39 @@
         <w:pStyle w:val="ListBullet"/>
       </w:pPr>
       <w:r>
+        <w:t>Nothing changes in the view: it's the cycle trade at ~19x, and the next thing that matters is Q3 hike confirmation. Worth keeping on because of Longsys below — Ingenic is now the control case for what a *good* memory business looks like in this cycle.</w:t>
+      </w:r>
+    </w:p>
+    <w:p>
+      <w:pPr>
+        <w:pStyle w:val="Heading2"/>
+      </w:pPr>
+      <w:r>
+        <w:t>Valuation</w:t>
+      </w:r>
+    </w:p>
+    <w:p>
+      <w:pPr>
+        <w:pStyle w:val="ListBullet"/>
+      </w:pPr>
+      <w:r>
+        <w:t xml:space="preserve">At ~HK$101 the H costs about </w:t>
+      </w:r>
+      <w:r>
+        <w:rPr>
+          <w:b/>
+        </w:rPr>
+        <w:t>19x this year's annualised earnings</w:t>
+      </w:r>
+      <w:r>
+        <w:t>. GigaDevice — same cycle, just printed H1 +1,092% — trades at 36x. Montage is over 100x. Global memory (Micron, Winbond) sits around 20x forward. So: not expensive against the China cohort, in line with global.</w:t>
+      </w:r>
+    </w:p>
+    <w:p>
+      <w:pPr>
+        <w:pStyle w:val="ListBullet"/>
+      </w:pPr>
+      <w:r>
         <w:t xml:space="preserve">Just be clear what you own at 19x: </w:t>
       </w:r>
       <w:r>
@@ -2811,7 +2853,59 @@
         <w:t>no cornerstones, no greenshoe, no stabilising agent</w:t>
       </w:r>
       <w:r>
-        <w:t xml:space="preserve"> — on a fixed price. The book reflects it: day-1 margin cover was ~7x, against the hundreds-to-thousands recent hot deals have printed. This one is being placed, not fought over.</w:t>
+        <w:t xml:space="preserve"> — on a fixed price. Day one the book looked tepid (~7x margin cover). Then the weekend happened: </w:t>
+      </w:r>
+      <w:r>
+        <w:rPr>
+          <w:b/>
+        </w:rPr>
+        <w:t>~53x by Sunday midday and climbing</w:t>
+      </w:r>
+      <w:r>
+        <w:t>. With free float at just 7.2% of the company and the public tranche capped at 15% even on a monster book, the debut mechanics now look like the micro-float medtech squeezes (Tianxing +116% day 1, Truehealth +217%) rather than the cold deal Friday suggested.</w:t>
+      </w:r>
+    </w:p>
+    <w:p>
+      <w:pPr>
+        <w:pStyle w:val="ListBullet"/>
+      </w:pPr>
+      <w:r>
+        <w:t xml:space="preserve">Three things from the deeper dig that sharpen the picture. First, </w:t>
+      </w:r>
+      <w:r>
+        <w:rPr>
+          <w:b/>
+        </w:rPr>
+        <w:t>VBP isn't a hypothetical here</w:t>
+      </w:r>
+      <w:r>
+        <w:t xml:space="preserve"> — the GI segment's hemostatic clips already went through the Beijing-Tianjin-Hebei alliance tender in April 2024 (its unit won, at prices ~25% lower), and segment growth promptly halved from +23% (2024) to +13% (2025). Second, </w:t>
+      </w:r>
+      <w:r>
+        <w:rPr>
+          <w:b/>
+        </w:rPr>
+        <w:t>Penlon is genuinely struggling</w:t>
+      </w:r>
+      <w:r>
+        <w:t>: revenue −16% last year, Q1 gross margin 18.4% against the group's 54%. Third, the goodwill story is worse up close: they paid RMB 1.7bn for the GI business — ~22% above a valuation the CSRC had blocked a year earlier — and the goodwill sitting on it equals ~18x that unit's annual profit.</w:t>
+      </w:r>
+    </w:p>
+    <w:p>
+      <w:pPr>
+        <w:pStyle w:val="ListBullet"/>
+      </w:pPr>
+      <w:r>
+        <w:t xml:space="preserve">On the plus side: 2025 was the first year of </w:t>
+      </w:r>
+      <w:r>
+        <w:rPr>
+          <w:b/>
+        </w:rPr>
+        <w:t>positive operating cash flow (+RMB 204m)</w:t>
+      </w:r>
+      <w:r>
+        <w:t>, Q1's adjusted net margin was 7.9% (the IFRS loss is share-based comp plus listing costs), and the H1 interim — due shortly after the Sep 7 listing — is the first catalyst either way.</w:t>
       </w:r>
     </w:p>
     <w:p>
@@ -2822,30 +2916,1027 @@
         <w:t>Valuation</w:t>
       </w:r>
     </w:p>
+    <w:tbl>
+      <w:tblPr>
+        <w:tblStyle w:val="LightGrid-Accent1"/>
+        <w:tblW w:type="auto" w:w="0"/>
+        <w:tblLook w:firstColumn="1" w:firstRow="1" w:lastColumn="0" w:lastRow="0" w:noHBand="0" w:noVBand="1" w:val="04A0"/>
+      </w:tblPr>
+      <w:tblGrid>
+        <w:gridCol w:w="1440"/>
+        <w:gridCol w:w="1440"/>
+        <w:gridCol w:w="1440"/>
+        <w:gridCol w:w="1440"/>
+        <w:gridCol w:w="1440"/>
+        <w:gridCol w:w="1440"/>
+      </w:tblGrid>
+      <w:tr>
+        <w:tc>
+          <w:tcPr>
+            <w:tcW w:type="dxa" w:w="3024"/>
+          </w:tcPr>
+          <w:p>
+            <w:r/>
+            <w:r>
+              <w:rPr>
+                <w:b/>
+                <w:sz w:val="19"/>
+              </w:rPr>
+            </w:r>
+          </w:p>
+        </w:tc>
+        <w:tc>
+          <w:tcPr>
+            <w:tcW w:type="dxa" w:w="2160"/>
+          </w:tcPr>
+          <w:p>
+            <w:r/>
+            <w:r>
+              <w:rPr>
+                <w:b/>
+                <w:sz w:val="19"/>
+              </w:rPr>
+              <w:t>Trail P/E</w:t>
+            </w:r>
+          </w:p>
+        </w:tc>
+        <w:tc>
+          <w:tcPr>
+            <w:tcW w:type="dxa" w:w="1296"/>
+          </w:tcPr>
+          <w:p>
+            <w:r/>
+            <w:r>
+              <w:rPr>
+                <w:b/>
+                <w:sz w:val="19"/>
+              </w:rPr>
+              <w:t>Fwd P/E</w:t>
+            </w:r>
+          </w:p>
+        </w:tc>
+        <w:tc>
+          <w:tcPr>
+            <w:tcW w:type="dxa" w:w="1152"/>
+          </w:tcPr>
+          <w:p>
+            <w:r/>
+            <w:r>
+              <w:rPr>
+                <w:b/>
+                <w:sz w:val="19"/>
+              </w:rPr>
+              <w:t>P/S</w:t>
+            </w:r>
+          </w:p>
+        </w:tc>
+        <w:tc>
+          <w:tcPr>
+            <w:tcW w:type="dxa" w:w="1440"/>
+          </w:tcPr>
+          <w:p>
+            <w:r/>
+            <w:r>
+              <w:rPr>
+                <w:b/>
+                <w:sz w:val="19"/>
+              </w:rPr>
+              <w:t>Rev growth</w:t>
+            </w:r>
+          </w:p>
+        </w:tc>
+        <w:tc>
+          <w:tcPr>
+            <w:tcW w:type="dxa" w:w="1584"/>
+          </w:tcPr>
+          <w:p>
+            <w:r/>
+            <w:r>
+              <w:rPr>
+                <w:b/>
+                <w:sz w:val="19"/>
+              </w:rPr>
+              <w:t>Net margin</w:t>
+            </w:r>
+          </w:p>
+        </w:tc>
+      </w:tr>
+      <w:tr>
+        <w:tc>
+          <w:tcPr>
+            <w:tcW w:type="dxa" w:w="3024"/>
+          </w:tcPr>
+          <w:p>
+            <w:r>
+              <w:rPr>
+                <w:sz w:val="19"/>
+              </w:rPr>
+            </w:r>
+            <w:r>
+              <w:rPr>
+                <w:b/>
+                <w:sz w:val="19"/>
+              </w:rPr>
+              <w:t>Medcaptain @ HK$15.42</w:t>
+            </w:r>
+          </w:p>
+        </w:tc>
+        <w:tc>
+          <w:tcPr>
+            <w:tcW w:type="dxa" w:w="2160"/>
+          </w:tcPr>
+          <w:p>
+            <w:r>
+              <w:rPr>
+                <w:sz w:val="19"/>
+              </w:rPr>
+            </w:r>
+            <w:r>
+              <w:rPr>
+                <w:b/>
+                <w:sz w:val="19"/>
+              </w:rPr>
+              <w:t>~150x IFRS / ~59x adjusted</w:t>
+            </w:r>
+          </w:p>
+        </w:tc>
+        <w:tc>
+          <w:tcPr>
+            <w:tcW w:type="dxa" w:w="1296"/>
+          </w:tcPr>
+          <w:p>
+            <w:r>
+              <w:rPr>
+                <w:sz w:val="19"/>
+              </w:rPr>
+            </w:r>
+            <w:r>
+              <w:rPr>
+                <w:sz w:val="19"/>
+              </w:rPr>
+              <w:t>—</w:t>
+            </w:r>
+          </w:p>
+        </w:tc>
+        <w:tc>
+          <w:tcPr>
+            <w:tcW w:type="dxa" w:w="1152"/>
+          </w:tcPr>
+          <w:p>
+            <w:r>
+              <w:rPr>
+                <w:sz w:val="19"/>
+              </w:rPr>
+            </w:r>
+            <w:r>
+              <w:rPr>
+                <w:b/>
+                <w:sz w:val="19"/>
+              </w:rPr>
+              <w:t>4.7x</w:t>
+            </w:r>
+          </w:p>
+        </w:tc>
+        <w:tc>
+          <w:tcPr>
+            <w:tcW w:type="dxa" w:w="1440"/>
+          </w:tcPr>
+          <w:p>
+            <w:r>
+              <w:rPr>
+                <w:sz w:val="19"/>
+              </w:rPr>
+            </w:r>
+            <w:r>
+              <w:rPr>
+                <w:sz w:val="19"/>
+              </w:rPr>
+              <w:t>+16%</w:t>
+            </w:r>
+          </w:p>
+        </w:tc>
+        <w:tc>
+          <w:tcPr>
+            <w:tcW w:type="dxa" w:w="1584"/>
+          </w:tcPr>
+          <w:p>
+            <w:r>
+              <w:rPr>
+                <w:sz w:val="19"/>
+              </w:rPr>
+            </w:r>
+            <w:r>
+              <w:rPr>
+                <w:sz w:val="19"/>
+              </w:rPr>
+              <w:t>3% (8% adj.)</w:t>
+            </w:r>
+          </w:p>
+        </w:tc>
+      </w:tr>
+      <w:tr>
+        <w:tc>
+          <w:tcPr>
+            <w:tcW w:type="dxa" w:w="3024"/>
+          </w:tcPr>
+          <w:p>
+            <w:r>
+              <w:rPr>
+                <w:sz w:val="19"/>
+              </w:rPr>
+            </w:r>
+            <w:r>
+              <w:rPr>
+                <w:b/>
+                <w:sz w:val="19"/>
+              </w:rPr>
+              <w:t>Micro-Tech 南微 (the direct comp)</w:t>
+            </w:r>
+          </w:p>
+        </w:tc>
+        <w:tc>
+          <w:tcPr>
+            <w:tcW w:type="dxa" w:w="2160"/>
+          </w:tcPr>
+          <w:p>
+            <w:r>
+              <w:rPr>
+                <w:sz w:val="19"/>
+              </w:rPr>
+            </w:r>
+            <w:r>
+              <w:rPr>
+                <w:sz w:val="19"/>
+              </w:rPr>
+              <w:t>28.5x</w:t>
+            </w:r>
+          </w:p>
+        </w:tc>
+        <w:tc>
+          <w:tcPr>
+            <w:tcW w:type="dxa" w:w="1296"/>
+          </w:tcPr>
+          <w:p>
+            <w:r>
+              <w:rPr>
+                <w:sz w:val="19"/>
+              </w:rPr>
+            </w:r>
+            <w:r>
+              <w:rPr>
+                <w:sz w:val="19"/>
+              </w:rPr>
+              <w:t>25.1x</w:t>
+            </w:r>
+          </w:p>
+        </w:tc>
+        <w:tc>
+          <w:tcPr>
+            <w:tcW w:type="dxa" w:w="1152"/>
+          </w:tcPr>
+          <w:p>
+            <w:r>
+              <w:rPr>
+                <w:sz w:val="19"/>
+              </w:rPr>
+            </w:r>
+            <w:r>
+              <w:rPr>
+                <w:sz w:val="19"/>
+              </w:rPr>
+              <w:t>4.3x</w:t>
+            </w:r>
+          </w:p>
+        </w:tc>
+        <w:tc>
+          <w:tcPr>
+            <w:tcW w:type="dxa" w:w="1440"/>
+          </w:tcPr>
+          <w:p>
+            <w:r>
+              <w:rPr>
+                <w:sz w:val="19"/>
+              </w:rPr>
+            </w:r>
+            <w:r>
+              <w:rPr>
+                <w:sz w:val="19"/>
+              </w:rPr>
+              <w:t>+12%</w:t>
+            </w:r>
+          </w:p>
+        </w:tc>
+        <w:tc>
+          <w:tcPr>
+            <w:tcW w:type="dxa" w:w="1584"/>
+          </w:tcPr>
+          <w:p>
+            <w:r>
+              <w:rPr>
+                <w:sz w:val="19"/>
+              </w:rPr>
+            </w:r>
+            <w:r>
+              <w:rPr>
+                <w:sz w:val="19"/>
+              </w:rPr>
+              <w:t>15%</w:t>
+            </w:r>
+          </w:p>
+        </w:tc>
+      </w:tr>
+      <w:tr>
+        <w:tc>
+          <w:tcPr>
+            <w:tcW w:type="dxa" w:w="3024"/>
+          </w:tcPr>
+          <w:p>
+            <w:r>
+              <w:rPr>
+                <w:sz w:val="19"/>
+              </w:rPr>
+            </w:r>
+            <w:r>
+              <w:rPr>
+                <w:sz w:val="19"/>
+              </w:rPr>
+              <w:t>Mindray 300760</w:t>
+            </w:r>
+          </w:p>
+        </w:tc>
+        <w:tc>
+          <w:tcPr>
+            <w:tcW w:type="dxa" w:w="2160"/>
+          </w:tcPr>
+          <w:p>
+            <w:r>
+              <w:rPr>
+                <w:sz w:val="19"/>
+              </w:rPr>
+            </w:r>
+            <w:r>
+              <w:rPr>
+                <w:sz w:val="19"/>
+              </w:rPr>
+              <w:t>25.5x</w:t>
+            </w:r>
+          </w:p>
+        </w:tc>
+        <w:tc>
+          <w:tcPr>
+            <w:tcW w:type="dxa" w:w="1296"/>
+          </w:tcPr>
+          <w:p>
+            <w:r>
+              <w:rPr>
+                <w:sz w:val="19"/>
+              </w:rPr>
+            </w:r>
+            <w:r>
+              <w:rPr>
+                <w:sz w:val="19"/>
+              </w:rPr>
+              <w:t>22.4x</w:t>
+            </w:r>
+          </w:p>
+        </w:tc>
+        <w:tc>
+          <w:tcPr>
+            <w:tcW w:type="dxa" w:w="1152"/>
+          </w:tcPr>
+          <w:p>
+            <w:r>
+              <w:rPr>
+                <w:sz w:val="19"/>
+              </w:rPr>
+            </w:r>
+            <w:r>
+              <w:rPr>
+                <w:sz w:val="19"/>
+              </w:rPr>
+              <w:t>5.8x</w:t>
+            </w:r>
+          </w:p>
+        </w:tc>
+        <w:tc>
+          <w:tcPr>
+            <w:tcW w:type="dxa" w:w="1440"/>
+          </w:tcPr>
+          <w:p>
+            <w:r>
+              <w:rPr>
+                <w:sz w:val="19"/>
+              </w:rPr>
+            </w:r>
+            <w:r>
+              <w:rPr>
+                <w:sz w:val="19"/>
+              </w:rPr>
+              <w:t>+4%</w:t>
+            </w:r>
+          </w:p>
+        </w:tc>
+        <w:tc>
+          <w:tcPr>
+            <w:tcW w:type="dxa" w:w="1584"/>
+          </w:tcPr>
+          <w:p>
+            <w:r>
+              <w:rPr>
+                <w:sz w:val="19"/>
+              </w:rPr>
+            </w:r>
+            <w:r>
+              <w:rPr>
+                <w:sz w:val="19"/>
+              </w:rPr>
+              <w:t>23%</w:t>
+            </w:r>
+          </w:p>
+        </w:tc>
+      </w:tr>
+      <w:tr>
+        <w:tc>
+          <w:tcPr>
+            <w:tcW w:type="dxa" w:w="3024"/>
+          </w:tcPr>
+          <w:p>
+            <w:r>
+              <w:rPr>
+                <w:sz w:val="19"/>
+              </w:rPr>
+            </w:r>
+            <w:r>
+              <w:rPr>
+                <w:sz w:val="19"/>
+              </w:rPr>
+              <w:t>United Imaging 688271</w:t>
+            </w:r>
+          </w:p>
+        </w:tc>
+        <w:tc>
+          <w:tcPr>
+            <w:tcW w:type="dxa" w:w="2160"/>
+          </w:tcPr>
+          <w:p>
+            <w:r>
+              <w:rPr>
+                <w:sz w:val="19"/>
+              </w:rPr>
+            </w:r>
+            <w:r>
+              <w:rPr>
+                <w:sz w:val="19"/>
+              </w:rPr>
+              <w:t>48x</w:t>
+            </w:r>
+          </w:p>
+        </w:tc>
+        <w:tc>
+          <w:tcPr>
+            <w:tcW w:type="dxa" w:w="1296"/>
+          </w:tcPr>
+          <w:p>
+            <w:r>
+              <w:rPr>
+                <w:sz w:val="19"/>
+              </w:rPr>
+            </w:r>
+            <w:r>
+              <w:rPr>
+                <w:sz w:val="19"/>
+              </w:rPr>
+              <w:t>36x</w:t>
+            </w:r>
+          </w:p>
+        </w:tc>
+        <w:tc>
+          <w:tcPr>
+            <w:tcW w:type="dxa" w:w="1152"/>
+          </w:tcPr>
+          <w:p>
+            <w:r>
+              <w:rPr>
+                <w:sz w:val="19"/>
+              </w:rPr>
+            </w:r>
+            <w:r>
+              <w:rPr>
+                <w:sz w:val="19"/>
+              </w:rPr>
+              <w:t>5.8x</w:t>
+            </w:r>
+          </w:p>
+        </w:tc>
+        <w:tc>
+          <w:tcPr>
+            <w:tcW w:type="dxa" w:w="1440"/>
+          </w:tcPr>
+          <w:p>
+            <w:r>
+              <w:rPr>
+                <w:sz w:val="19"/>
+              </w:rPr>
+            </w:r>
+            <w:r>
+              <w:rPr>
+                <w:sz w:val="19"/>
+              </w:rPr>
+              <w:t>+35%</w:t>
+            </w:r>
+          </w:p>
+        </w:tc>
+        <w:tc>
+          <w:tcPr>
+            <w:tcW w:type="dxa" w:w="1584"/>
+          </w:tcPr>
+          <w:p>
+            <w:r>
+              <w:rPr>
+                <w:sz w:val="19"/>
+              </w:rPr>
+            </w:r>
+            <w:r>
+              <w:rPr>
+                <w:sz w:val="19"/>
+              </w:rPr>
+              <w:t>12%</w:t>
+            </w:r>
+          </w:p>
+        </w:tc>
+      </w:tr>
+      <w:tr>
+        <w:tc>
+          <w:tcPr>
+            <w:tcW w:type="dxa" w:w="3024"/>
+          </w:tcPr>
+          <w:p>
+            <w:r>
+              <w:rPr>
+                <w:sz w:val="19"/>
+              </w:rPr>
+            </w:r>
+            <w:r>
+              <w:rPr>
+                <w:sz w:val="19"/>
+              </w:rPr>
+              <w:t>AK Medical 1789</w:t>
+            </w:r>
+          </w:p>
+        </w:tc>
+        <w:tc>
+          <w:tcPr>
+            <w:tcW w:type="dxa" w:w="2160"/>
+          </w:tcPr>
+          <w:p>
+            <w:r>
+              <w:rPr>
+                <w:sz w:val="19"/>
+              </w:rPr>
+            </w:r>
+            <w:r>
+              <w:rPr>
+                <w:sz w:val="19"/>
+              </w:rPr>
+              <w:t>13.2x</w:t>
+            </w:r>
+          </w:p>
+        </w:tc>
+        <w:tc>
+          <w:tcPr>
+            <w:tcW w:type="dxa" w:w="1296"/>
+          </w:tcPr>
+          <w:p>
+            <w:r>
+              <w:rPr>
+                <w:sz w:val="19"/>
+              </w:rPr>
+            </w:r>
+            <w:r>
+              <w:rPr>
+                <w:sz w:val="19"/>
+              </w:rPr>
+              <w:t>11.2x</w:t>
+            </w:r>
+          </w:p>
+        </w:tc>
+        <w:tc>
+          <w:tcPr>
+            <w:tcW w:type="dxa" w:w="1152"/>
+          </w:tcPr>
+          <w:p>
+            <w:r>
+              <w:rPr>
+                <w:sz w:val="19"/>
+              </w:rPr>
+            </w:r>
+            <w:r>
+              <w:rPr>
+                <w:sz w:val="19"/>
+              </w:rPr>
+              <w:t>3.1x</w:t>
+            </w:r>
+          </w:p>
+        </w:tc>
+        <w:tc>
+          <w:tcPr>
+            <w:tcW w:type="dxa" w:w="1440"/>
+          </w:tcPr>
+          <w:p>
+            <w:r>
+              <w:rPr>
+                <w:sz w:val="19"/>
+              </w:rPr>
+            </w:r>
+            <w:r>
+              <w:rPr>
+                <w:sz w:val="19"/>
+              </w:rPr>
+              <w:t>+12%</w:t>
+            </w:r>
+          </w:p>
+        </w:tc>
+        <w:tc>
+          <w:tcPr>
+            <w:tcW w:type="dxa" w:w="1584"/>
+          </w:tcPr>
+          <w:p>
+            <w:r>
+              <w:rPr>
+                <w:sz w:val="19"/>
+              </w:rPr>
+            </w:r>
+            <w:r>
+              <w:rPr>
+                <w:sz w:val="19"/>
+              </w:rPr>
+              <w:t>24%</w:t>
+            </w:r>
+          </w:p>
+        </w:tc>
+      </w:tr>
+      <w:tr>
+        <w:tc>
+          <w:tcPr>
+            <w:tcW w:type="dxa" w:w="3024"/>
+          </w:tcPr>
+          <w:p>
+            <w:r>
+              <w:rPr>
+                <w:sz w:val="19"/>
+              </w:rPr>
+            </w:r>
+            <w:r>
+              <w:rPr>
+                <w:sz w:val="19"/>
+              </w:rPr>
+              <w:t>MicroPort 853</w:t>
+            </w:r>
+          </w:p>
+        </w:tc>
+        <w:tc>
+          <w:tcPr>
+            <w:tcW w:type="dxa" w:w="2160"/>
+          </w:tcPr>
+          <w:p>
+            <w:r>
+              <w:rPr>
+                <w:sz w:val="19"/>
+              </w:rPr>
+            </w:r>
+            <w:r>
+              <w:rPr>
+                <w:sz w:val="19"/>
+              </w:rPr>
+              <w:t>31.7x</w:t>
+            </w:r>
+          </w:p>
+        </w:tc>
+        <w:tc>
+          <w:tcPr>
+            <w:tcW w:type="dxa" w:w="1296"/>
+          </w:tcPr>
+          <w:p>
+            <w:r>
+              <w:rPr>
+                <w:sz w:val="19"/>
+              </w:rPr>
+            </w:r>
+            <w:r>
+              <w:rPr>
+                <w:sz w:val="19"/>
+              </w:rPr>
+              <w:t>17.5x</w:t>
+            </w:r>
+          </w:p>
+        </w:tc>
+        <w:tc>
+          <w:tcPr>
+            <w:tcW w:type="dxa" w:w="1152"/>
+          </w:tcPr>
+          <w:p>
+            <w:r>
+              <w:rPr>
+                <w:sz w:val="19"/>
+              </w:rPr>
+            </w:r>
+            <w:r>
+              <w:rPr>
+                <w:sz w:val="19"/>
+              </w:rPr>
+              <w:t>1.4x</w:t>
+            </w:r>
+          </w:p>
+        </w:tc>
+        <w:tc>
+          <w:tcPr>
+            <w:tcW w:type="dxa" w:w="1440"/>
+          </w:tcPr>
+          <w:p>
+            <w:r>
+              <w:rPr>
+                <w:sz w:val="19"/>
+              </w:rPr>
+            </w:r>
+            <w:r>
+              <w:rPr>
+                <w:sz w:val="19"/>
+              </w:rPr>
+              <w:t>+7%</w:t>
+            </w:r>
+          </w:p>
+        </w:tc>
+        <w:tc>
+          <w:tcPr>
+            <w:tcW w:type="dxa" w:w="1584"/>
+          </w:tcPr>
+          <w:p>
+            <w:r>
+              <w:rPr>
+                <w:sz w:val="19"/>
+              </w:rPr>
+            </w:r>
+            <w:r>
+              <w:rPr>
+                <w:sz w:val="19"/>
+              </w:rPr>
+              <w:t>4%</w:t>
+            </w:r>
+          </w:p>
+        </w:tc>
+      </w:tr>
+      <w:tr>
+        <w:tc>
+          <w:tcPr>
+            <w:tcW w:type="dxa" w:w="3024"/>
+          </w:tcPr>
+          <w:p>
+            <w:r>
+              <w:rPr>
+                <w:sz w:val="19"/>
+              </w:rPr>
+            </w:r>
+            <w:r>
+              <w:rPr>
+                <w:sz w:val="19"/>
+              </w:rPr>
+              <w:t>Weigao 1066</w:t>
+            </w:r>
+          </w:p>
+        </w:tc>
+        <w:tc>
+          <w:tcPr>
+            <w:tcW w:type="dxa" w:w="2160"/>
+          </w:tcPr>
+          <w:p>
+            <w:r>
+              <w:rPr>
+                <w:sz w:val="19"/>
+              </w:rPr>
+            </w:r>
+            <w:r>
+              <w:rPr>
+                <w:sz w:val="19"/>
+              </w:rPr>
+              <w:t>9.5x</w:t>
+            </w:r>
+          </w:p>
+        </w:tc>
+        <w:tc>
+          <w:tcPr>
+            <w:tcW w:type="dxa" w:w="1296"/>
+          </w:tcPr>
+          <w:p>
+            <w:r>
+              <w:rPr>
+                <w:sz w:val="19"/>
+              </w:rPr>
+            </w:r>
+            <w:r>
+              <w:rPr>
+                <w:sz w:val="19"/>
+              </w:rPr>
+              <w:t>7.3x</w:t>
+            </w:r>
+          </w:p>
+        </w:tc>
+        <w:tc>
+          <w:tcPr>
+            <w:tcW w:type="dxa" w:w="1152"/>
+          </w:tcPr>
+          <w:p>
+            <w:r>
+              <w:rPr>
+                <w:sz w:val="19"/>
+              </w:rPr>
+            </w:r>
+            <w:r>
+              <w:rPr>
+                <w:sz w:val="19"/>
+              </w:rPr>
+              <w:t>~1.0x</w:t>
+            </w:r>
+          </w:p>
+        </w:tc>
+        <w:tc>
+          <w:tcPr>
+            <w:tcW w:type="dxa" w:w="1440"/>
+          </w:tcPr>
+          <w:p>
+            <w:r>
+              <w:rPr>
+                <w:sz w:val="19"/>
+              </w:rPr>
+            </w:r>
+            <w:r>
+              <w:rPr>
+                <w:sz w:val="19"/>
+              </w:rPr>
+              <w:t>+4%</w:t>
+            </w:r>
+          </w:p>
+        </w:tc>
+        <w:tc>
+          <w:tcPr>
+            <w:tcW w:type="dxa" w:w="1584"/>
+          </w:tcPr>
+          <w:p>
+            <w:r>
+              <w:rPr>
+                <w:sz w:val="19"/>
+              </w:rPr>
+            </w:r>
+            <w:r>
+              <w:rPr>
+                <w:sz w:val="19"/>
+              </w:rPr>
+              <w:t>10%</w:t>
+            </w:r>
+          </w:p>
+        </w:tc>
+      </w:tr>
+      <w:tr>
+        <w:tc>
+          <w:tcPr>
+            <w:tcW w:type="dxa" w:w="3024"/>
+          </w:tcPr>
+          <w:p>
+            <w:r>
+              <w:rPr>
+                <w:sz w:val="19"/>
+              </w:rPr>
+            </w:r>
+            <w:r>
+              <w:rPr>
+                <w:sz w:val="19"/>
+              </w:rPr>
+              <w:t>Boston Scientific (global GI anchor)</w:t>
+            </w:r>
+          </w:p>
+        </w:tc>
+        <w:tc>
+          <w:tcPr>
+            <w:tcW w:type="dxa" w:w="2160"/>
+          </w:tcPr>
+          <w:p>
+            <w:r>
+              <w:rPr>
+                <w:sz w:val="19"/>
+              </w:rPr>
+            </w:r>
+            <w:r>
+              <w:rPr>
+                <w:sz w:val="19"/>
+              </w:rPr>
+              <w:t>19x</w:t>
+            </w:r>
+          </w:p>
+        </w:tc>
+        <w:tc>
+          <w:tcPr>
+            <w:tcW w:type="dxa" w:w="1296"/>
+          </w:tcPr>
+          <w:p>
+            <w:r>
+              <w:rPr>
+                <w:sz w:val="19"/>
+              </w:rPr>
+            </w:r>
+            <w:r>
+              <w:rPr>
+                <w:sz w:val="19"/>
+              </w:rPr>
+              <w:t>14.2x</w:t>
+            </w:r>
+          </w:p>
+        </w:tc>
+        <w:tc>
+          <w:tcPr>
+            <w:tcW w:type="dxa" w:w="1152"/>
+          </w:tcPr>
+          <w:p>
+            <w:r>
+              <w:rPr>
+                <w:sz w:val="19"/>
+              </w:rPr>
+            </w:r>
+            <w:r>
+              <w:rPr>
+                <w:sz w:val="19"/>
+              </w:rPr>
+              <w:t>3.2x</w:t>
+            </w:r>
+          </w:p>
+        </w:tc>
+        <w:tc>
+          <w:tcPr>
+            <w:tcW w:type="dxa" w:w="1440"/>
+          </w:tcPr>
+          <w:p>
+            <w:r>
+              <w:rPr>
+                <w:sz w:val="19"/>
+              </w:rPr>
+            </w:r>
+            <w:r>
+              <w:rPr>
+                <w:sz w:val="19"/>
+              </w:rPr>
+              <w:t>+13%</w:t>
+            </w:r>
+          </w:p>
+        </w:tc>
+        <w:tc>
+          <w:tcPr>
+            <w:tcW w:type="dxa" w:w="1584"/>
+          </w:tcPr>
+          <w:p>
+            <w:r>
+              <w:rPr>
+                <w:sz w:val="19"/>
+              </w:rPr>
+            </w:r>
+            <w:r>
+              <w:rPr>
+                <w:sz w:val="19"/>
+              </w:rPr>
+              <w:t>17%</w:t>
+            </w:r>
+          </w:p>
+        </w:tc>
+      </w:tr>
+    </w:tbl>
+    <w:p/>
     <w:p>
-      <w:pPr>
-        <w:pStyle w:val="ListBullet"/>
-      </w:pPr>
-      <w:r>
-        <w:t xml:space="preserve">At HK$15.42 you're paying </w:t>
+      <w:r>
+        <w:t xml:space="preserve">The comp that matters is </w:t>
       </w:r>
       <w:r>
         <w:rPr>
           <w:b/>
         </w:rPr>
-        <w:t>~153x trailing earnings, ~55x adjusted, ~4.4x sales</w:t>
-      </w:r>
-      <w:r>
-        <w:t xml:space="preserve">. Now look at the shelf: Weigao — profitable, distributor-model, same channel economics — is 8x. AK Medical 13x. Kangji ~18x. Mindray itself, the actual thing this is a mini version of, is </w:t>
+        <w:t>Micro-Tech Nanjing</w:t>
+      </w:r>
+      <w:r>
+        <w:t xml:space="preserve"> — same GI-consumables business, already living the same VBP, with double Medcaptain's net margin — at </w:t>
       </w:r>
       <w:r>
         <w:rPr>
           <w:b/>
         </w:rPr>
-        <w:t>25x with a 23% net margin</w:t>
-      </w:r>
-      <w:r>
-        <w:t xml:space="preserve"> (and just had its first down year in eight). Only the genuine growth stories (United Imaging, MicroPort) get 38–52x, and this isn't one — 15% top line, 3% margin.</w:t>
+        <w:t>28.5x</w:t>
+      </w:r>
+      <w:r>
+        <w:t xml:space="preserve">. Medcaptain asks 59x adjusted and a higher P/S. Sum the parts on peer multiples (GI at Micro-Tech's 4.3x sales, life support at 1.5–2x given Penlon, IVD at ~2x) and you get roughly </w:t>
+      </w:r>
+      <w:r>
+        <w:rPr>
+          <w:b/>
+        </w:rPr>
+        <w:t>RMB 4.8–5.1bn against the RMB 7.6bn ask — the deal is ~35–40% above what the pieces support</w:t>
+      </w:r>
+      <w:r>
+        <w:t>. What fills the gap is the ex-Mindray team, Hillhouse's 21%, and the float math. Useful floor datapoint: Kangji — profitable HK MI-consumables — was taken private last December at a mid-teens trailing multiple.</w:t>
       </w:r>
     </w:p>
     <w:p>
@@ -2853,16 +3944,7 @@
         <w:pStyle w:val="ListBullet"/>
       </w:pPr>
       <w:r>
-        <w:t xml:space="preserve">Be generous — give it 25–30x adjusted for the GI-consumables growth and the overseas mix — and you land at roughly </w:t>
-      </w:r>
-      <w:r>
-        <w:rPr>
-          <w:b/>
-        </w:rPr>
-        <w:t>half the asking price</w:t>
-      </w:r>
-      <w:r>
-        <w:t>. The tell is in the deal itself: priced below the 2023 private round, no anchor wanted their name on it, and nobody was hired to defend it in the aftermarket. When a Morgan Stanley deal ships with no cornerstone, no shoe and no stabiliser, the syndicate is telling you what the institutional bid looked like.</w:t>
+        <w:t>The deal tells you the same thing the comps do: priced below the 2023 private round, no anchor wanted their name on it, nobody hired to defend it in the aftermarket. When a Morgan Stanley deal ships bare, the syndicate is telling you what the institutional bid looked like.</w:t>
       </w:r>
     </w:p>
     <w:p>
@@ -2873,10 +3955,10 @@
         <w:rPr>
           <w:b/>
         </w:rPr>
-        <w:t>Pass.</w:t>
-      </w:r>
-      <w:r>
-        <w:t xml:space="preserve"> Small float and a cheap ticket can still produce a grey-market bounce — 4 Sep tells you — but if this breaks issue on day one there is no net under it, by design. Nothing here you need to own before it reports a clean profitable half.</w:t>
+        <w:t>Verdict unchanged as an investment: pass — it needs growth, margin AND multiple to all come through to justify the price.</w:t>
+      </w:r>
+      <w:r>
+        <w:t xml:space="preserve"> But separate the trade: the weekend book turned this into a pure float game, and the 4 Sep grey market will likely print hot. If you play it, you are playing scarcity, not value — sell into the open, and remember that below issue there is no stabiliser, no shoe, no net. By design.</w:t>
       </w:r>
     </w:p>
     <w:p>
@@ -2884,7 +3966,38 @@
         <w:pStyle w:val="Heading1"/>
       </w:pPr>
       <w:r>
-        <w:t>5. Bottom line</w:t>
+        <w:t>5. Longsys (9976 HK) — open now; your inventory concern is the whole story</w:t>
+      </w:r>
+    </w:p>
+    <w:p>
+      <w:r>
+        <w:t xml:space="preserve">The memory module maker (Lexar brand) launched Monday morning: closes Wed 3 Sep noon, lists Mon 8 Sep. Max price HK$240.60 (final can strike lower), raising ~HK$6.3bn — up to US$1.06bn with the upsize and shoe — at an implied ~HK$110bn market cap, a </w:t>
+      </w:r>
+      <w:r>
+        <w:rPr>
+          <w:b/>
+        </w:rPr>
+        <w:t>44–45% discount to its A-share</w:t>
+      </w:r>
+      <w:r>
+        <w:t xml:space="preserve">. CITIC/CLSA and Citi running it, CLSA stabilising until 3 Oct. Cornerstones US$151m ≈ 19% of the deal — and the roster is customers and channel: Transsion, Lenovo, Lens Tech, Colorful, Phison-affiliated HXY… plus, notably, </w:t>
+      </w:r>
+      <w:r>
+        <w:rPr>
+          <w:b/>
+        </w:rPr>
+        <w:t>Ingenic's own HK vehicle</w:t>
+      </w:r>
+      <w:r>
+        <w:t>. Entry ticket is chunky at HK$12,151 a lot.</w:t>
+      </w:r>
+    </w:p>
+    <w:p>
+      <w:pPr>
+        <w:pStyle w:val="Heading2"/>
+      </w:pPr>
+      <w:r>
+        <w:t>The business — and why your concern is exactly right</w:t>
       </w:r>
     </w:p>
     <w:p>
@@ -2892,13 +4005,16 @@
         <w:pStyle w:val="ListBullet"/>
       </w:pPr>
       <w:r>
+        <w:t xml:space="preserve">What it is: the #2 independent memory module house globally. It buys NAND and DRAM wafers from Samsung, Hynix and Micron — </w:t>
+      </w:r>
+      <w:r>
         <w:rPr>
           <w:b/>
         </w:rPr>
-        <w:t>SHEIN</w:t>
-      </w:r>
-      <w:r>
-        <w:t xml:space="preserve"> — priced at the top of its fair band, cold book, capped model, US$3.5bn out the door to old investors, and the southbound bid locked out until March. Skip the debut; express the theme through PDD.</w:t>
+        <w:t>wafers are 88% of its cost of goods</w:t>
+      </w:r>
+      <w:r>
+        <w:t xml:space="preserve"> — and packages them into eMMC/UFS, SSDs and Lexar cards. Real scale (H1 revenue RMB 24.1bn, +136%), real brands (Lexar, Zilia in Brazil), and a genuinely fast-growing enterprise line (+209%).</w:t>
       </w:r>
     </w:p>
     <w:p>
@@ -2906,13 +4022,16 @@
         <w:pStyle w:val="ListBullet"/>
       </w:pPr>
       <w:r>
+        <w:t xml:space="preserve">But look at the margin through one full cycle and you see the model naked: gross margin </w:t>
+      </w:r>
+      <w:r>
         <w:rPr>
           <w:b/>
         </w:rPr>
-        <w:t>Mech-Mind</w:t>
-      </w:r>
-      <w:r>
-        <w:t xml:space="preserve"> — rich on fundamentals but priced at par with the live benchmark, with the mechanics of a squeeze. Take the debut, sell into strength, stay only if you believe the Q1 acceleration is real.</w:t>
+        <w:t>10.4% (2022) → 4.7% (2023 trough) → 18% (2025) → 59% (H1 2026)</w:t>
+      </w:r>
+      <w:r>
+        <w:t>. In the downcycle, embedded ASPs fell 68% and sub-segments went gross-negative — that is what zero pricing power looks like. In the upcycle, the margin explodes — not because it can raise prices, but because it is sitting on inventory bought cheap.</w:t>
       </w:r>
     </w:p>
     <w:p>
@@ -2920,7 +4039,25 @@
         <w:pStyle w:val="ListBullet"/>
       </w:pPr>
       <w:r>
-        <w:t>Same-day listings will split liquidity, and the contrast should be visible by lunch: the cheap one flat, the expensive one flying.</w:t>
+        <w:t xml:space="preserve">The filings confirm your 5-buys-to-50 deduction line by line. Operating cash flow: </w:t>
+      </w:r>
+      <w:r>
+        <w:rPr>
+          <w:b/>
+        </w:rPr>
+        <w:t>−2.8bn, −1.2bn, −1.2bn (2023–25) — then −3.15bn in H1 2026 alone. The boom made the burn worse.</w:t>
+      </w:r>
+      <w:r>
+        <w:t xml:space="preserve"> Inventory went 11.7bn → </w:t>
+      </w:r>
+      <w:r>
+        <w:rPr>
+          <w:b/>
+        </w:rPr>
+        <w:t>25.8bn in six months — 60% of total assets</w:t>
+      </w:r>
+      <w:r>
+        <w:t xml:space="preserve"> — with ~70% of it bought at trough prices and prepayments to wafer suppliers up 440%. The P&amp;L books the windfall while the cash goes straight back out to buy the same wafers at the new price. Debt 16.7bn against 3.1bn cash, quick ratio 0.39. Bear analysts (eastmoney/10jqka, and a Zhongyuan Securities periodicity warning) put the cheap-inventory runway at ~Q4 2026, normal gross margin at 15–25%, and normal earnings at RMB 6–10bn — versus the 21bn run-rate being marketed.</w:t>
       </w:r>
     </w:p>
     <w:p>
@@ -2928,13 +4065,487 @@
         <w:pStyle w:val="ListBullet"/>
       </w:pPr>
       <w:r>
+        <w:t>And watch what insiders do, not what the deal says: ~</w:t>
+      </w:r>
+      <w:r>
         <w:rPr>
           <w:b/>
         </w:rPr>
-        <w:t>Ingenic</w:t>
-      </w:r>
-      <w:r>
-        <w:t xml:space="preserve"> — legacy-memory cycle play at ~19x this year's earnings. Results Saturday; whisper is top of the guided range and positioning is already washed out. Slight positive lean into Monday.</w:t>
+        <w:t>RMB 4bn of insider selling</w:t>
+      </w:r>
+      <w:r>
+        <w:t xml:space="preserve"> on the way up, an A-share placement done at RMB 560 in early August that is already ~32% underwater, and now ~RMB 10bn being raised across two markets in one month. The people who know the inventory position best are sellers and raisers at these levels.</w:t>
+      </w:r>
+    </w:p>
+    <w:p>
+      <w:pPr>
+        <w:pStyle w:val="Heading2"/>
+      </w:pPr>
+      <w:r>
+        <w:t>Longsys vs Ingenic — same cycle, different machines</w:t>
+      </w:r>
+    </w:p>
+    <w:tbl>
+      <w:tblPr>
+        <w:tblStyle w:val="LightGrid-Accent1"/>
+        <w:tblW w:type="auto" w:w="0"/>
+        <w:tblLook w:firstColumn="1" w:firstRow="1" w:lastColumn="0" w:lastRow="0" w:noHBand="0" w:noVBand="1" w:val="04A0"/>
+      </w:tblPr>
+      <w:tblGrid>
+        <w:gridCol w:w="2880"/>
+        <w:gridCol w:w="2880"/>
+        <w:gridCol w:w="2880"/>
+      </w:tblGrid>
+      <w:tr>
+        <w:tc>
+          <w:tcPr>
+            <w:tcW w:type="dxa" w:w="2016"/>
+          </w:tcPr>
+          <w:p>
+            <w:r/>
+            <w:r>
+              <w:rPr>
+                <w:b/>
+                <w:sz w:val="19"/>
+              </w:rPr>
+            </w:r>
+          </w:p>
+        </w:tc>
+        <w:tc>
+          <w:tcPr>
+            <w:tcW w:type="dxa" w:w="4032"/>
+          </w:tcPr>
+          <w:p>
+            <w:r/>
+            <w:r>
+              <w:rPr>
+                <w:b/>
+                <w:sz w:val="19"/>
+              </w:rPr>
+              <w:t>Longsys (9976)</w:t>
+            </w:r>
+          </w:p>
+        </w:tc>
+        <w:tc>
+          <w:tcPr>
+            <w:tcW w:type="dxa" w:w="4032"/>
+          </w:tcPr>
+          <w:p>
+            <w:r/>
+            <w:r>
+              <w:rPr>
+                <w:b/>
+                <w:sz w:val="19"/>
+              </w:rPr>
+              <w:t>Ingenic (3223)</w:t>
+            </w:r>
+          </w:p>
+        </w:tc>
+      </w:tr>
+      <w:tr>
+        <w:tc>
+          <w:tcPr>
+            <w:tcW w:type="dxa" w:w="2016"/>
+          </w:tcPr>
+          <w:p>
+            <w:r>
+              <w:rPr>
+                <w:sz w:val="19"/>
+              </w:rPr>
+            </w:r>
+            <w:r>
+              <w:rPr>
+                <w:sz w:val="19"/>
+              </w:rPr>
+              <w:t>What it is</w:t>
+            </w:r>
+          </w:p>
+        </w:tc>
+        <w:tc>
+          <w:tcPr>
+            <w:tcW w:type="dxa" w:w="4032"/>
+          </w:tcPr>
+          <w:p>
+            <w:r>
+              <w:rPr>
+                <w:sz w:val="19"/>
+              </w:rPr>
+            </w:r>
+            <w:r>
+              <w:rPr>
+                <w:sz w:val="19"/>
+              </w:rPr>
+              <w:t>Assembler: buys wafers (88% of COGS) from the oligopoly, sells modules</w:t>
+            </w:r>
+          </w:p>
+        </w:tc>
+        <w:tc>
+          <w:tcPr>
+            <w:tcW w:type="dxa" w:w="4032"/>
+          </w:tcPr>
+          <w:p>
+            <w:r>
+              <w:rPr>
+                <w:sz w:val="19"/>
+              </w:rPr>
+            </w:r>
+            <w:r>
+              <w:rPr>
+                <w:sz w:val="19"/>
+              </w:rPr>
+              <w:t>Designer: owns the chip, auto-qualified sockets, 60% share in its niche</w:t>
+            </w:r>
+          </w:p>
+        </w:tc>
+      </w:tr>
+      <w:tr>
+        <w:tc>
+          <w:tcPr>
+            <w:tcW w:type="dxa" w:w="2016"/>
+          </w:tcPr>
+          <w:p>
+            <w:r>
+              <w:rPr>
+                <w:sz w:val="19"/>
+              </w:rPr>
+            </w:r>
+            <w:r>
+              <w:rPr>
+                <w:sz w:val="19"/>
+              </w:rPr>
+              <w:t>Downcycle proof (2023)</w:t>
+            </w:r>
+          </w:p>
+        </w:tc>
+        <w:tc>
+          <w:tcPr>
+            <w:tcW w:type="dxa" w:w="4032"/>
+          </w:tcPr>
+          <w:p>
+            <w:r>
+              <w:rPr>
+                <w:sz w:val="19"/>
+              </w:rPr>
+            </w:r>
+            <w:r>
+              <w:rPr>
+                <w:sz w:val="19"/>
+              </w:rPr>
+              <w:t>GM 4.7%, embedded ASP −68%, sub-segments negative</w:t>
+            </w:r>
+          </w:p>
+        </w:tc>
+        <w:tc>
+          <w:tcPr>
+            <w:tcW w:type="dxa" w:w="4032"/>
+          </w:tcPr>
+          <w:p>
+            <w:r>
+              <w:rPr>
+                <w:sz w:val="19"/>
+              </w:rPr>
+            </w:r>
+            <w:r>
+              <w:rPr>
+                <w:sz w:val="19"/>
+              </w:rPr>
+              <w:t>GM held ~32–39% through the same trough</w:t>
+            </w:r>
+          </w:p>
+        </w:tc>
+      </w:tr>
+      <w:tr>
+        <w:tc>
+          <w:tcPr>
+            <w:tcW w:type="dxa" w:w="2016"/>
+          </w:tcPr>
+          <w:p>
+            <w:r>
+              <w:rPr>
+                <w:sz w:val="19"/>
+              </w:rPr>
+            </w:r>
+            <w:r>
+              <w:rPr>
+                <w:sz w:val="19"/>
+              </w:rPr>
+              <w:t>Upcycle GM (H1'26)</w:t>
+            </w:r>
+          </w:p>
+        </w:tc>
+        <w:tc>
+          <w:tcPr>
+            <w:tcW w:type="dxa" w:w="4032"/>
+          </w:tcPr>
+          <w:p>
+            <w:r>
+              <w:rPr>
+                <w:sz w:val="19"/>
+              </w:rPr>
+            </w:r>
+            <w:r>
+              <w:rPr>
+                <w:sz w:val="19"/>
+              </w:rPr>
+              <w:t>59% — mostly old-cost inventory clearing</w:t>
+            </w:r>
+          </w:p>
+        </w:tc>
+        <w:tc>
+          <w:tcPr>
+            <w:tcW w:type="dxa" w:w="4032"/>
+          </w:tcPr>
+          <w:p>
+            <w:r>
+              <w:rPr>
+                <w:sz w:val="19"/>
+              </w:rPr>
+            </w:r>
+            <w:r>
+              <w:rPr>
+                <w:sz w:val="19"/>
+              </w:rPr>
+              <w:t>43–47% — quarterly price hikes it sets itself</w:t>
+            </w:r>
+          </w:p>
+        </w:tc>
+      </w:tr>
+      <w:tr>
+        <w:tc>
+          <w:tcPr>
+            <w:tcW w:type="dxa" w:w="2016"/>
+          </w:tcPr>
+          <w:p>
+            <w:r>
+              <w:rPr>
+                <w:sz w:val="19"/>
+              </w:rPr>
+            </w:r>
+            <w:r>
+              <w:rPr>
+                <w:sz w:val="19"/>
+              </w:rPr>
+              <w:t>Op. cash flow H1'26</w:t>
+            </w:r>
+          </w:p>
+        </w:tc>
+        <w:tc>
+          <w:tcPr>
+            <w:tcW w:type="dxa" w:w="4032"/>
+          </w:tcPr>
+          <w:p>
+            <w:r>
+              <w:rPr>
+                <w:sz w:val="19"/>
+              </w:rPr>
+            </w:r>
+            <w:r>
+              <w:rPr>
+                <w:b/>
+                <w:sz w:val="19"/>
+              </w:rPr>
+              <w:t>−3.15bn</w:t>
+            </w:r>
+          </w:p>
+        </w:tc>
+        <w:tc>
+          <w:tcPr>
+            <w:tcW w:type="dxa" w:w="4032"/>
+          </w:tcPr>
+          <w:p>
+            <w:r>
+              <w:rPr>
+                <w:sz w:val="19"/>
+              </w:rPr>
+            </w:r>
+            <w:r>
+              <w:rPr>
+                <w:b/>
+                <w:sz w:val="19"/>
+              </w:rPr>
+              <w:t>+959m</w:t>
+            </w:r>
+          </w:p>
+        </w:tc>
+      </w:tr>
+      <w:tr>
+        <w:tc>
+          <w:tcPr>
+            <w:tcW w:type="dxa" w:w="2016"/>
+          </w:tcPr>
+          <w:p>
+            <w:r>
+              <w:rPr>
+                <w:sz w:val="19"/>
+              </w:rPr>
+            </w:r>
+            <w:r>
+              <w:rPr>
+                <w:sz w:val="19"/>
+              </w:rPr>
+              <w:t>Inventory</w:t>
+            </w:r>
+          </w:p>
+        </w:tc>
+        <w:tc>
+          <w:tcPr>
+            <w:tcW w:type="dxa" w:w="4032"/>
+          </w:tcPr>
+          <w:p>
+            <w:r>
+              <w:rPr>
+                <w:sz w:val="19"/>
+              </w:rPr>
+            </w:r>
+            <w:r>
+              <w:rPr>
+                <w:sz w:val="19"/>
+              </w:rPr>
+              <w:t>25.8bn = 60% of assets</w:t>
+            </w:r>
+          </w:p>
+        </w:tc>
+        <w:tc>
+          <w:tcPr>
+            <w:tcW w:type="dxa" w:w="4032"/>
+          </w:tcPr>
+          <w:p>
+            <w:r>
+              <w:rPr>
+                <w:sz w:val="19"/>
+              </w:rPr>
+            </w:r>
+            <w:r>
+              <w:rPr>
+                <w:sz w:val="19"/>
+              </w:rPr>
+              <w:t>~1 year, but sold into a 60%-share niche</w:t>
+            </w:r>
+          </w:p>
+        </w:tc>
+      </w:tr>
+      <w:tr>
+        <w:tc>
+          <w:tcPr>
+            <w:tcW w:type="dxa" w:w="2016"/>
+          </w:tcPr>
+          <w:p>
+            <w:r>
+              <w:rPr>
+                <w:sz w:val="19"/>
+              </w:rPr>
+            </w:r>
+            <w:r>
+              <w:rPr>
+                <w:sz w:val="19"/>
+              </w:rPr>
+              <w:t>H-share valuation</w:t>
+            </w:r>
+          </w:p>
+        </w:tc>
+        <w:tc>
+          <w:tcPr>
+            <w:tcW w:type="dxa" w:w="4032"/>
+          </w:tcPr>
+          <w:p>
+            <w:r>
+              <w:rPr>
+                <w:sz w:val="19"/>
+              </w:rPr>
+            </w:r>
+            <w:r>
+              <w:rPr>
+                <w:sz w:val="19"/>
+              </w:rPr>
+              <w:t>~8x trailing / ~5x 2026E annualised</w:t>
+            </w:r>
+          </w:p>
+        </w:tc>
+        <w:tc>
+          <w:tcPr>
+            <w:tcW w:type="dxa" w:w="4032"/>
+          </w:tcPr>
+          <w:p>
+            <w:r>
+              <w:rPr>
+                <w:sz w:val="19"/>
+              </w:rPr>
+            </w:r>
+            <w:r>
+              <w:rPr>
+                <w:sz w:val="19"/>
+              </w:rPr>
+              <w:t>~19x 2026E annualised</w:t>
+            </w:r>
+          </w:p>
+        </w:tc>
+      </w:tr>
+      <w:tr>
+        <w:tc>
+          <w:tcPr>
+            <w:tcW w:type="dxa" w:w="2016"/>
+          </w:tcPr>
+          <w:p>
+            <w:r>
+              <w:rPr>
+                <w:sz w:val="19"/>
+              </w:rPr>
+            </w:r>
+            <w:r>
+              <w:rPr>
+                <w:sz w:val="19"/>
+              </w:rPr>
+              <w:t>A/H discount at pricing</w:t>
+            </w:r>
+          </w:p>
+        </w:tc>
+        <w:tc>
+          <w:tcPr>
+            <w:tcW w:type="dxa" w:w="4032"/>
+          </w:tcPr>
+          <w:p>
+            <w:r>
+              <w:rPr>
+                <w:sz w:val="19"/>
+              </w:rPr>
+            </w:r>
+            <w:r>
+              <w:rPr>
+                <w:sz w:val="19"/>
+              </w:rPr>
+              <w:t>44–45%</w:t>
+            </w:r>
+          </w:p>
+        </w:tc>
+        <w:tc>
+          <w:tcPr>
+            <w:tcW w:type="dxa" w:w="4032"/>
+          </w:tcPr>
+          <w:p>
+            <w:r>
+              <w:rPr>
+                <w:sz w:val="19"/>
+              </w:rPr>
+            </w:r>
+            <w:r>
+              <w:rPr>
+                <w:sz w:val="19"/>
+              </w:rPr>
+              <w:t>38%</w:t>
+            </w:r>
+          </w:p>
+        </w:tc>
+      </w:tr>
+    </w:tbl>
+    <w:p/>
+    <w:p>
+      <w:r>
+        <w:t>The 8x-versus-19x gap is not an anomaly to arbitrage — it's the market telling you which earnings it believes. Longsys's 2026 profit is an inventory gain wearing a P/E; put the bears' normalised RMB 6–10bn under the same market cap and you're at 10–17x for a 15–25%-margin assembler that never converts profit to cash. That's not cheap, that's fairly priced for what it is. Ingenic's 19x sits on earnings backed by positive cash flow and a niche it prices. Same cycle, but one owns a pricing lever and the other owns a warehouse.</w:t>
+      </w:r>
+    </w:p>
+    <w:p>
+      <w:r>
+        <w:t>On the A/H angle you raised — yes, it helps, but only for the debut. A live anchor 44% higher makes it hard to lose much on day one (Ingenic, with identical physics, closed its debut flat and sits +1.5% a week later, discount 38%→34%). It is support for the *listing*, not a convergence trade — these discounts sit for years. And note this deal is HK$6.3bn of real supply with a HK$12k entry ticket: expect an Ingenic-style muted open, not a squeeze.</w:t>
       </w:r>
     </w:p>
     <w:p>
@@ -2945,10 +4556,32 @@
         <w:rPr>
           <w:b/>
         </w:rPr>
-        <w:t>Medcaptain</w:t>
-      </w:r>
-      <w:r>
-        <w:t xml:space="preserve"> — mini-Mindray story at roughly double a defensible price (55x adjusted vs Mindray at 25x), sold with no cornerstone, no greenshoe and no stabiliser into a lukewarm book. Pass; let the 4 Sep grey market and a clean profitable half change our mind.</w:t>
+        <w:t>Verdict: this is the trade your own deduction warns about — buying the top of an inventory-gain cycle from insiders who are selling it to you.</w:t>
+      </w:r>
+      <w:r>
+        <w:t xml:space="preserve"> The anchor and stabiliser make the debut low-risk but also low-fun; the real exposure is the Q4 gross-margin print. Skip, or flip small and be out before the cheap inventory runs dry. If you want this cycle in the book, own Ingenic, rent Longsys — or don't rent it at all.</w:t>
+      </w:r>
+    </w:p>
+    <w:p>
+      <w:pPr>
+        <w:pStyle w:val="Heading1"/>
+      </w:pPr>
+      <w:r>
+        <w:t>6. Excelland Robotics (3231 HK) — the one you asked about, and the weakest deal in this note</w:t>
+      </w:r>
+    </w:p>
+    <w:p>
+      <w:r>
+        <w:t xml:space="preserve">First, the name: the deal marketed around 'Excellent Robotics' is </w:t>
+      </w:r>
+      <w:r>
+        <w:rPr>
+          <w:b/>
+        </w:rPr>
+        <w:t>Excelland Robotics 优地机器人</w:t>
+      </w:r>
+      <w:r>
+        <w:t xml:space="preserve"> — the UTStarcom spin-out making hotel delivery robots (Yomie), cleaning and vending robots, plus a project-based AI-vision side business. 18C listing, range HK$14.45–19.55, market cap HK$6.0–8.1bn, book closes Thu 4 Sep, lists Tue 9 Sep. Entry HK$3,949 a lot.</w:t>
       </w:r>
     </w:p>
     <w:p>
@@ -2956,7 +4589,7 @@
         <w:pStyle w:val="Heading2"/>
       </w:pPr>
       <w:r>
-        <w:t>Dates to watch</w:t>
+        <w:t>What the prospectus actually shows</w:t>
       </w:r>
     </w:p>
     <w:p>
@@ -2964,16 +4597,1225 @@
         <w:pStyle w:val="ListBullet"/>
       </w:pPr>
       <w:r>
-        <w:t xml:space="preserve">28 Aug noon — Mech-Mind final price · </w:t>
+        <w:t xml:space="preserve">Revenue RMB 318m last year, +19%. </w:t>
       </w:r>
       <w:r>
         <w:rPr>
           <w:b/>
         </w:rPr>
-        <w:t>29 Aug — Ingenic interim (A-share reacts Mon 31)</w:t>
-      </w:r>
-      <w:r>
-        <w:t xml:space="preserve"> · 31 Aug — SHEIN formal price, allotments, grey market 16:15–18:30 · 1 Sep — debuts · 2 Sep — Medcaptain book closes (grey 4 Sep, lists 7 Sep) · ~mid-Sep — SHEIN HSCI fast entry · H2-26 robotics prints · Mar 2027 — Mech-Mind unlock + southbound windows.</w:t>
+        <w:t>Gross margin 13.9%</w:t>
+      </w:r>
+      <w:r>
+        <w:t xml:space="preserve"> — against YunJi's ~35% and OneRobotics' ~50%. Its flagship hotel robot's ASP has fallen 45% since 2023 (RMB 20.1k → 11.1k) — the prospectus itself calls it pricing pressure. Net loss RMB 111m, and the Q1 loss is widening again.</w:t>
+      </w:r>
+    </w:p>
+    <w:p>
+      <w:pPr>
+        <w:pStyle w:val="ListBullet"/>
+      </w:pPr>
+      <w:r>
+        <w:t xml:space="preserve">The concentration is the scary part: top-5 customers are </w:t>
+      </w:r>
+      <w:r>
+        <w:rPr>
+          <w:b/>
+        </w:rPr>
+        <w:t>76–83% of revenue</w:t>
+      </w:r>
+      <w:r>
+        <w:t>, and the largest — an AI-vision integrator founded only in 2021 — alone is ~32%. Essentially the whole 'AI vision' line (38% of revenue) is one young customer. There's also a related-party flag worth knowing: RMB 104m — 65% of one year's R&amp;D — went to buy an algorithm from an entity associated with a person who sits inside the company's own ESOP platform and whose associates were also customers.</w:t>
+      </w:r>
+    </w:p>
+    <w:p>
+      <w:pPr>
+        <w:pStyle w:val="ListBullet"/>
+      </w:pPr>
+      <w:r>
+        <w:t xml:space="preserve">And the balance sheet says this IPO is a rescue, not a choice: </w:t>
+      </w:r>
+      <w:r>
+        <w:rPr>
+          <w:b/>
+        </w:rPr>
+        <w:t>RMB 21.8m of cash at end-2025</w:t>
+      </w:r>
+      <w:r>
+        <w:t xml:space="preserve">, gearing 234%, and pre-IPO redemption rights that </w:t>
+      </w:r>
+      <w:r>
+        <w:rPr>
+          <w:b/>
+        </w:rPr>
+        <w:t>automatically resurrect if the listing fails</w:t>
+      </w:r>
+      <w:r>
+        <w:t>. They must list.</w:t>
+      </w:r>
+    </w:p>
+    <w:p>
+      <w:pPr>
+        <w:pStyle w:val="ListBullet"/>
+      </w:pPr>
+      <w:r>
+        <w:t xml:space="preserve">The deal mechanics agree: cornerstones are a token </w:t>
+      </w:r>
+      <w:r>
+        <w:rPr>
+          <w:b/>
+        </w:rPr>
+        <w:t>US$3m</w:t>
+      </w:r>
+      <w:r>
+        <w:t xml:space="preserve"> — and both (SenseTime, 58 Group) are existing shareholders topping up, needing waivers to count at all. No greenshoe. Boutique sole sponsor. Listing costs eat 10% of the raise. Margin book ~</w:t>
+      </w:r>
+      <w:r>
+        <w:rPr>
+          <w:b/>
+        </w:rPr>
+        <w:t>8x</w:t>
+      </w:r>
+      <w:r>
+        <w:t xml:space="preserve"> into day 2 — the same week retail threw 5,126x at LeDong and 110x at Medcaptain. Retail has a menu of robot deals and is visibly choosing other dishes.</w:t>
+      </w:r>
+    </w:p>
+    <w:p>
+      <w:pPr>
+        <w:pStyle w:val="Heading2"/>
+      </w:pPr>
+      <w:r>
+        <w:t>The peers — what their charts teach, and the forecast</w:t>
+      </w:r>
+    </w:p>
+    <w:tbl>
+      <w:tblPr>
+        <w:tblStyle w:val="LightGrid-Accent1"/>
+        <w:tblW w:type="auto" w:w="0"/>
+        <w:tblLook w:firstColumn="1" w:firstRow="1" w:lastColumn="0" w:lastRow="0" w:noHBand="0" w:noVBand="1" w:val="04A0"/>
+      </w:tblPr>
+      <w:tblGrid>
+        <w:gridCol w:w="1440"/>
+        <w:gridCol w:w="1440"/>
+        <w:gridCol w:w="1440"/>
+        <w:gridCol w:w="1440"/>
+        <w:gridCol w:w="1440"/>
+        <w:gridCol w:w="1440"/>
+      </w:tblGrid>
+      <w:tr>
+        <w:tc>
+          <w:tcPr>
+            <w:tcW w:type="dxa" w:w="2736"/>
+          </w:tcPr>
+          <w:p>
+            <w:r/>
+            <w:r>
+              <w:rPr>
+                <w:b/>
+                <w:sz w:val="19"/>
+              </w:rPr>
+            </w:r>
+          </w:p>
+        </w:tc>
+        <w:tc>
+          <w:tcPr>
+            <w:tcW w:type="dxa" w:w="2016"/>
+          </w:tcPr>
+          <w:p>
+            <w:r/>
+            <w:r>
+              <w:rPr>
+                <w:b/>
+                <w:sz w:val="19"/>
+              </w:rPr>
+              <w:t>P/S (FY25 rev)</w:t>
+            </w:r>
+          </w:p>
+        </w:tc>
+        <w:tc>
+          <w:tcPr>
+            <w:tcW w:type="dxa" w:w="1008"/>
+          </w:tcPr>
+          <w:p>
+            <w:r/>
+            <w:r>
+              <w:rPr>
+                <w:b/>
+                <w:sz w:val="19"/>
+              </w:rPr>
+              <w:t>GM</w:t>
+            </w:r>
+          </w:p>
+        </w:tc>
+        <w:tc>
+          <w:tcPr>
+            <w:tcW w:type="dxa" w:w="1584"/>
+          </w:tcPr>
+          <w:p>
+            <w:r/>
+            <w:r>
+              <w:rPr>
+                <w:b/>
+                <w:sz w:val="19"/>
+              </w:rPr>
+              <w:t>Growth</w:t>
+            </w:r>
+          </w:p>
+        </w:tc>
+        <w:tc>
+          <w:tcPr>
+            <w:tcW w:type="dxa" w:w="1872"/>
+          </w:tcPr>
+          <w:p>
+            <w:r/>
+            <w:r>
+              <w:rPr>
+                <w:b/>
+                <w:sz w:val="19"/>
+              </w:rPr>
+              <w:t>vs IPO</w:t>
+            </w:r>
+          </w:p>
+        </w:tc>
+        <w:tc>
+          <w:tcPr>
+            <w:tcW w:type="dxa" w:w="2736"/>
+          </w:tcPr>
+          <w:p>
+            <w:r/>
+            <w:r>
+              <w:rPr>
+                <w:b/>
+                <w:sz w:val="19"/>
+              </w:rPr>
+              <w:t>What moved it</w:t>
+            </w:r>
+          </w:p>
+        </w:tc>
+      </w:tr>
+      <w:tr>
+        <w:tc>
+          <w:tcPr>
+            <w:tcW w:type="dxa" w:w="2736"/>
+          </w:tcPr>
+          <w:p>
+            <w:r>
+              <w:rPr>
+                <w:sz w:val="19"/>
+              </w:rPr>
+            </w:r>
+            <w:r>
+              <w:rPr>
+                <w:b/>
+                <w:sz w:val="19"/>
+              </w:rPr>
+              <w:t>Excelland @ range</w:t>
+            </w:r>
+          </w:p>
+        </w:tc>
+        <w:tc>
+          <w:tcPr>
+            <w:tcW w:type="dxa" w:w="2016"/>
+          </w:tcPr>
+          <w:p>
+            <w:r>
+              <w:rPr>
+                <w:sz w:val="19"/>
+              </w:rPr>
+            </w:r>
+            <w:r>
+              <w:rPr>
+                <w:b/>
+                <w:sz w:val="19"/>
+              </w:rPr>
+              <w:t>17–23x</w:t>
+            </w:r>
+          </w:p>
+        </w:tc>
+        <w:tc>
+          <w:tcPr>
+            <w:tcW w:type="dxa" w:w="1008"/>
+          </w:tcPr>
+          <w:p>
+            <w:r>
+              <w:rPr>
+                <w:sz w:val="19"/>
+              </w:rPr>
+            </w:r>
+            <w:r>
+              <w:rPr>
+                <w:sz w:val="19"/>
+              </w:rPr>
+              <w:t>13.9%</w:t>
+            </w:r>
+          </w:p>
+        </w:tc>
+        <w:tc>
+          <w:tcPr>
+            <w:tcW w:type="dxa" w:w="1584"/>
+          </w:tcPr>
+          <w:p>
+            <w:r>
+              <w:rPr>
+                <w:sz w:val="19"/>
+              </w:rPr>
+            </w:r>
+            <w:r>
+              <w:rPr>
+                <w:sz w:val="19"/>
+              </w:rPr>
+              <w:t>+19%</w:t>
+            </w:r>
+          </w:p>
+        </w:tc>
+        <w:tc>
+          <w:tcPr>
+            <w:tcW w:type="dxa" w:w="1872"/>
+          </w:tcPr>
+          <w:p>
+            <w:r>
+              <w:rPr>
+                <w:sz w:val="19"/>
+              </w:rPr>
+            </w:r>
+            <w:r>
+              <w:rPr>
+                <w:sz w:val="19"/>
+              </w:rPr>
+              <w:t>—</w:t>
+            </w:r>
+          </w:p>
+        </w:tc>
+        <w:tc>
+          <w:tcPr>
+            <w:tcW w:type="dxa" w:w="2736"/>
+          </w:tcPr>
+          <w:p>
+            <w:r>
+              <w:rPr>
+                <w:sz w:val="19"/>
+              </w:rPr>
+            </w:r>
+            <w:r>
+              <w:rPr>
+                <w:sz w:val="19"/>
+              </w:rPr>
+              <w:t>one customer = 32% of revenue</w:t>
+            </w:r>
+          </w:p>
+        </w:tc>
+      </w:tr>
+      <w:tr>
+        <w:tc>
+          <w:tcPr>
+            <w:tcW w:type="dxa" w:w="2736"/>
+          </w:tcPr>
+          <w:p>
+            <w:r>
+              <w:rPr>
+                <w:sz w:val="19"/>
+              </w:rPr>
+            </w:r>
+            <w:r>
+              <w:rPr>
+                <w:sz w:val="19"/>
+              </w:rPr>
+              <w:t>YunJi 2670</w:t>
+            </w:r>
+          </w:p>
+        </w:tc>
+        <w:tc>
+          <w:tcPr>
+            <w:tcW w:type="dxa" w:w="2016"/>
+          </w:tcPr>
+          <w:p>
+            <w:r>
+              <w:rPr>
+                <w:sz w:val="19"/>
+              </w:rPr>
+            </w:r>
+            <w:r>
+              <w:rPr>
+                <w:sz w:val="19"/>
+              </w:rPr>
+              <w:t>26.6x (18.3x TTM)</w:t>
+            </w:r>
+          </w:p>
+        </w:tc>
+        <w:tc>
+          <w:tcPr>
+            <w:tcW w:type="dxa" w:w="1008"/>
+          </w:tcPr>
+          <w:p>
+            <w:r>
+              <w:rPr>
+                <w:sz w:val="19"/>
+              </w:rPr>
+            </w:r>
+            <w:r>
+              <w:rPr>
+                <w:sz w:val="19"/>
+              </w:rPr>
+              <w:t>35%</w:t>
+            </w:r>
+          </w:p>
+        </w:tc>
+        <w:tc>
+          <w:tcPr>
+            <w:tcW w:type="dxa" w:w="1584"/>
+          </w:tcPr>
+          <w:p>
+            <w:r>
+              <w:rPr>
+                <w:sz w:val="19"/>
+              </w:rPr>
+            </w:r>
+            <w:r>
+              <w:rPr>
+                <w:sz w:val="19"/>
+              </w:rPr>
+              <w:t>+72% H1</w:t>
+            </w:r>
+          </w:p>
+        </w:tc>
+        <w:tc>
+          <w:tcPr>
+            <w:tcW w:type="dxa" w:w="1872"/>
+          </w:tcPr>
+          <w:p>
+            <w:r>
+              <w:rPr>
+                <w:sz w:val="19"/>
+              </w:rPr>
+            </w:r>
+            <w:r>
+              <w:rPr>
+                <w:sz w:val="19"/>
+              </w:rPr>
+              <w:t>+32%</w:t>
+            </w:r>
+          </w:p>
+        </w:tc>
+        <w:tc>
+          <w:tcPr>
+            <w:tcW w:type="dxa" w:w="2736"/>
+          </w:tcPr>
+          <w:p>
+            <w:r>
+              <w:rPr>
+                <w:sz w:val="19"/>
+              </w:rPr>
+            </w:r>
+            <w:r>
+              <w:rPr>
+                <w:sz w:val="19"/>
+              </w:rPr>
+              <w:t>float + loss trajectory (below)</w:t>
+            </w:r>
+          </w:p>
+        </w:tc>
+      </w:tr>
+      <w:tr>
+        <w:tc>
+          <w:tcPr>
+            <w:tcW w:type="dxa" w:w="2736"/>
+          </w:tcPr>
+          <w:p>
+            <w:r>
+              <w:rPr>
+                <w:sz w:val="19"/>
+              </w:rPr>
+            </w:r>
+            <w:r>
+              <w:rPr>
+                <w:sz w:val="19"/>
+              </w:rPr>
+              <w:t>OneRobotics 6600</w:t>
+            </w:r>
+          </w:p>
+        </w:tc>
+        <w:tc>
+          <w:tcPr>
+            <w:tcW w:type="dxa" w:w="2016"/>
+          </w:tcPr>
+          <w:p>
+            <w:r>
+              <w:rPr>
+                <w:sz w:val="19"/>
+              </w:rPr>
+            </w:r>
+            <w:r>
+              <w:rPr>
+                <w:sz w:val="19"/>
+              </w:rPr>
+              <w:t>11.5x</w:t>
+            </w:r>
+          </w:p>
+        </w:tc>
+        <w:tc>
+          <w:tcPr>
+            <w:tcW w:type="dxa" w:w="1008"/>
+          </w:tcPr>
+          <w:p>
+            <w:r>
+              <w:rPr>
+                <w:sz w:val="19"/>
+              </w:rPr>
+            </w:r>
+            <w:r>
+              <w:rPr>
+                <w:sz w:val="19"/>
+              </w:rPr>
+              <w:t>50%</w:t>
+            </w:r>
+          </w:p>
+        </w:tc>
+        <w:tc>
+          <w:tcPr>
+            <w:tcW w:type="dxa" w:w="1584"/>
+          </w:tcPr>
+          <w:p>
+            <w:r>
+              <w:rPr>
+                <w:sz w:val="19"/>
+              </w:rPr>
+            </w:r>
+            <w:r>
+              <w:rPr>
+                <w:sz w:val="19"/>
+              </w:rPr>
+              <w:t>+32%, slowing</w:t>
+            </w:r>
+          </w:p>
+        </w:tc>
+        <w:tc>
+          <w:tcPr>
+            <w:tcW w:type="dxa" w:w="1872"/>
+          </w:tcPr>
+          <w:p>
+            <w:r>
+              <w:rPr>
+                <w:sz w:val="19"/>
+              </w:rPr>
+            </w:r>
+            <w:r>
+              <w:rPr>
+                <w:b/>
+                <w:sz w:val="19"/>
+              </w:rPr>
+              <w:t>−31%, at all-time low</w:t>
+            </w:r>
+          </w:p>
+        </w:tc>
+        <w:tc>
+          <w:tcPr>
+            <w:tcW w:type="dxa" w:w="2736"/>
+          </w:tcPr>
+          <w:p>
+            <w:r>
+              <w:rPr>
+                <w:sz w:val="19"/>
+              </w:rPr>
+            </w:r>
+            <w:r>
+              <w:rPr>
+                <w:sz w:val="19"/>
+              </w:rPr>
+              <w:t>unlock + growth deceleration</w:t>
+            </w:r>
+          </w:p>
+        </w:tc>
+      </w:tr>
+      <w:tr>
+        <w:tc>
+          <w:tcPr>
+            <w:tcW w:type="dxa" w:w="2736"/>
+          </w:tcPr>
+          <w:p>
+            <w:r>
+              <w:rPr>
+                <w:sz w:val="19"/>
+              </w:rPr>
+            </w:r>
+            <w:r>
+              <w:rPr>
+                <w:sz w:val="19"/>
+              </w:rPr>
+              <w:t>Ninebot 689009 (profitable ref.)</w:t>
+            </w:r>
+          </w:p>
+        </w:tc>
+        <w:tc>
+          <w:tcPr>
+            <w:tcW w:type="dxa" w:w="2016"/>
+          </w:tcPr>
+          <w:p>
+            <w:r>
+              <w:rPr>
+                <w:sz w:val="19"/>
+              </w:rPr>
+            </w:r>
+            <w:r>
+              <w:rPr>
+                <w:sz w:val="19"/>
+              </w:rPr>
+              <w:t>1.3x TTM</w:t>
+            </w:r>
+          </w:p>
+        </w:tc>
+        <w:tc>
+          <w:tcPr>
+            <w:tcW w:type="dxa" w:w="1008"/>
+          </w:tcPr>
+          <w:p>
+            <w:r>
+              <w:rPr>
+                <w:sz w:val="19"/>
+              </w:rPr>
+            </w:r>
+            <w:r>
+              <w:rPr>
+                <w:sz w:val="19"/>
+              </w:rPr>
+              <w:t>—</w:t>
+            </w:r>
+          </w:p>
+        </w:tc>
+        <w:tc>
+          <w:tcPr>
+            <w:tcW w:type="dxa" w:w="1584"/>
+          </w:tcPr>
+          <w:p>
+            <w:r>
+              <w:rPr>
+                <w:sz w:val="19"/>
+              </w:rPr>
+            </w:r>
+            <w:r>
+              <w:rPr>
+                <w:sz w:val="19"/>
+              </w:rPr>
+              <w:t>—</w:t>
+            </w:r>
+          </w:p>
+        </w:tc>
+        <w:tc>
+          <w:tcPr>
+            <w:tcW w:type="dxa" w:w="1872"/>
+          </w:tcPr>
+          <w:p>
+            <w:r>
+              <w:rPr>
+                <w:sz w:val="19"/>
+              </w:rPr>
+            </w:r>
+            <w:r>
+              <w:rPr>
+                <w:sz w:val="19"/>
+              </w:rPr>
+              <w:t>−42% 1yr</w:t>
+            </w:r>
+          </w:p>
+        </w:tc>
+        <w:tc>
+          <w:tcPr>
+            <w:tcW w:type="dxa" w:w="2736"/>
+          </w:tcPr>
+          <w:p>
+            <w:r>
+              <w:rPr>
+                <w:sz w:val="19"/>
+              </w:rPr>
+            </w:r>
+            <w:r>
+              <w:rPr>
+                <w:sz w:val="19"/>
+              </w:rPr>
+              <w:t>what profitable robots fetch</w:t>
+            </w:r>
+          </w:p>
+        </w:tc>
+      </w:tr>
+      <w:tr>
+        <w:tc>
+          <w:tcPr>
+            <w:tcW w:type="dxa" w:w="2736"/>
+          </w:tcPr>
+          <w:p>
+            <w:r>
+              <w:rPr>
+                <w:sz w:val="19"/>
+              </w:rPr>
+            </w:r>
+            <w:r>
+              <w:rPr>
+                <w:sz w:val="19"/>
+              </w:rPr>
+              <w:t>Mech-Mind 9615 (top of the barrel)</w:t>
+            </w:r>
+          </w:p>
+        </w:tc>
+        <w:tc>
+          <w:tcPr>
+            <w:tcW w:type="dxa" w:w="2016"/>
+          </w:tcPr>
+          <w:p>
+            <w:r>
+              <w:rPr>
+                <w:sz w:val="19"/>
+              </w:rPr>
+            </w:r>
+            <w:r>
+              <w:rPr>
+                <w:sz w:val="19"/>
+              </w:rPr>
+              <w:t>~29x at IPO</w:t>
+            </w:r>
+          </w:p>
+        </w:tc>
+        <w:tc>
+          <w:tcPr>
+            <w:tcW w:type="dxa" w:w="1008"/>
+          </w:tcPr>
+          <w:p>
+            <w:r>
+              <w:rPr>
+                <w:sz w:val="19"/>
+              </w:rPr>
+            </w:r>
+            <w:r>
+              <w:rPr>
+                <w:sz w:val="19"/>
+              </w:rPr>
+              <w:t>65%</w:t>
+            </w:r>
+          </w:p>
+        </w:tc>
+        <w:tc>
+          <w:tcPr>
+            <w:tcW w:type="dxa" w:w="1584"/>
+          </w:tcPr>
+          <w:p>
+            <w:r>
+              <w:rPr>
+                <w:sz w:val="19"/>
+              </w:rPr>
+            </w:r>
+            <w:r>
+              <w:rPr>
+                <w:sz w:val="19"/>
+              </w:rPr>
+              <w:t>+73%</w:t>
+            </w:r>
+          </w:p>
+        </w:tc>
+        <w:tc>
+          <w:tcPr>
+            <w:tcW w:type="dxa" w:w="1872"/>
+          </w:tcPr>
+          <w:p>
+            <w:r>
+              <w:rPr>
+                <w:sz w:val="19"/>
+              </w:rPr>
+            </w:r>
+            <w:r>
+              <w:rPr>
+                <w:sz w:val="19"/>
+              </w:rPr>
+              <w:t>lists today</w:t>
+            </w:r>
+          </w:p>
+        </w:tc>
+        <w:tc>
+          <w:tcPr>
+            <w:tcW w:type="dxa" w:w="2736"/>
+          </w:tcPr>
+          <w:p>
+            <w:r>
+              <w:rPr>
+                <w:sz w:val="19"/>
+              </w:rPr>
+            </w:r>
+            <w:r>
+              <w:rPr>
+                <w:sz w:val="19"/>
+              </w:rPr>
+              <w:t>the contrast case</w:t>
+            </w:r>
+          </w:p>
+        </w:tc>
+      </w:tr>
+    </w:tbl>
+    <w:p/>
+    <w:p>
+      <w:pPr>
+        <w:pStyle w:val="ListBullet"/>
+      </w:pPr>
+      <w:r>
+        <w:rPr>
+          <w:b/>
+        </w:rPr>
+        <w:t>YunJi's round trip is the roadmap.</w:t>
+      </w:r>
+      <w:r>
+        <w:t xml:space="preserve"> 5,657x book, opened +49%, then tripled into June on a thin float and robot mania (peak HK$324). What broke it wasn't the story — revenue grew +72% — it was the *quality and float*: the Aug profit alert showed the operating loss widening (−10% next day), the interim confirmed adjusted losses up +247% with margin falling, the May buyback support went quiet, and full circulation completed 26 Aug expanded the float right into the weakness. Now HK$126, −61% off the peak. Forecast: with the float bigger and losses widening, it grinds toward issue unless H2 shows real operating leverage.</w:t>
+      </w:r>
+    </w:p>
+    <w:p>
+      <w:pPr>
+        <w:pStyle w:val="ListBullet"/>
+      </w:pPr>
+      <w:r>
+        <w:rPr>
+          <w:b/>
+        </w:rPr>
+        <w:t>OneRobotics is the other lesson.</w:t>
+      </w:r>
+      <w:r>
+        <w:t xml:space="preserve"> Flat debut at HK$73.80, tripled to 201 in the Feb–Mar mania, then −71%: the cornerstone unlock in June started it, and the Aug interim (growth decelerating to +32%, margin down, FX swing to loss) put it at an all-time low, 31% below issue. Of the cohort it's now the closest to interesting — ~10x sales for a real overseas consumer franchise with a buyback pending — but it needs a profit swing-back first. Forecast: base-builds here; not a falling knife but no hurry either.</w:t>
+      </w:r>
+    </w:p>
+    <w:p>
+      <w:pPr>
+        <w:pStyle w:val="ListBullet"/>
+      </w:pPr>
+      <w:r>
+        <w:t xml:space="preserve">Put Excelland against that tape and the question answers itself: it's asking </w:t>
+      </w:r>
+      <w:r>
+        <w:rPr>
+          <w:b/>
+        </w:rPr>
+        <w:t>17–23x sales for the worst margin (14%), the worst concentration, and the weakest balance sheet in the cohort</w:t>
+      </w:r>
+      <w:r>
+        <w:t xml:space="preserve"> — above OneRobotics' 11.5x with none of its franchise, and just under YunJi's multiple with a third of its gross margin. The only bull path is the 18C small-float momentum game — 45m-share float, cheap ticket — and the 8x book says even the flippers aren't showing up.</w:t>
+      </w:r>
+    </w:p>
+    <w:p>
+      <w:pPr>
+        <w:pStyle w:val="ListBullet"/>
+      </w:pPr>
+      <w:r>
+        <w:rPr>
+          <w:b/>
+        </w:rPr>
+        <w:t>Verdict: avoid, including the debut.</w:t>
+      </w:r>
+      <w:r>
+        <w:t xml:space="preserve"> This is what the bottom of the robotics-IPO barrel looks like — the same week Mech-Mind shows you the top. If you want service robots at all, OneRobotics below HK$52 is the better-quality, half-the-multiple version; and if you want the momentum game, Mech-Mind's float math is the one with the fuel.</w:t>
+      </w:r>
+    </w:p>
+    <w:p>
+      <w:pPr>
+        <w:pStyle w:val="Heading1"/>
+      </w:pPr>
+      <w:r>
+        <w:t>7. Broadcom (AVGO) — reports Wednesday night; what you need before the print</w:t>
+      </w:r>
+    </w:p>
+    <w:p>
+      <w:r>
+        <w:t xml:space="preserve">Prints </w:t>
+      </w:r>
+      <w:r>
+        <w:rPr>
+          <w:b/>
+        </w:rPr>
+        <w:t>Wed 2 Sep after the US close</w:t>
+      </w:r>
+      <w:r>
+        <w:t xml:space="preserve"> (Thu morning our time), call 5pm ET — landing mid-VMware Explore. Stock $370, market cap $1.76T, </w:t>
+      </w:r>
+      <w:r>
+        <w:rPr>
+          <w:b/>
+        </w:rPr>
+        <w:t>25% below the June all-time high</w:t>
+      </w:r>
+      <w:r>
+        <w:t xml:space="preserve">, and down ~12% over the 60 days into the print. Options imply a </w:t>
+      </w:r>
+      <w:r>
+        <w:rPr>
+          <w:b/>
+        </w:rPr>
+        <w:t>±7–9% move</w:t>
+      </w:r>
+      <w:r>
+        <w:t>.</w:t>
+      </w:r>
+    </w:p>
+    <w:p>
+      <w:pPr>
+        <w:pStyle w:val="Heading2"/>
+      </w:pPr>
+      <w:r>
+        <w:t>The numbers on the table</w:t>
+      </w:r>
+    </w:p>
+    <w:p>
+      <w:pPr>
+        <w:pStyle w:val="ListBullet"/>
+      </w:pPr>
+      <w:r>
+        <w:t xml:space="preserve">Consensus FQ3: revenue ~$29.4bn (+85%), adjusted EPS ~$3.23 — matching the company's own guide. The guide that matters inside it: </w:t>
+      </w:r>
+      <w:r>
+        <w:rPr>
+          <w:b/>
+        </w:rPr>
+        <w:t>AI semis $16.0bn</w:t>
+      </w:r>
+      <w:r>
+        <w:t>, software $8.9bn (+31%, a big step-up that must print), gross margin ~74% (down ~310bp on XPU/rack mix).</w:t>
+      </w:r>
+    </w:p>
+    <w:p>
+      <w:pPr>
+        <w:pStyle w:val="ListBullet"/>
+      </w:pPr>
+      <w:r>
+        <w:t xml:space="preserve">Full-year anchors: FY26 AI reaffirmed at </w:t>
+      </w:r>
+      <w:r>
+        <w:rPr>
+          <w:b/>
+        </w:rPr>
+        <w:t>$56bn (+~180%)</w:t>
+      </w:r>
+      <w:r>
+        <w:t xml:space="preserve">; FY27 AI still only qualified as </w:t>
+      </w:r>
+      <w:r>
+        <w:rPr>
+          <w:b/>
+        </w:rPr>
+        <w:t>"in excess of $100bn."</w:t>
+      </w:r>
+      <w:r>
+        <w:t xml:space="preserve"> Consensus has FY26 revenue $106bn and FY27 $173bn — you're paying ~32x this year's EPS, </w:t>
+      </w:r>
+      <w:r>
+        <w:rPr>
+          <w:b/>
+        </w:rPr>
+        <w:t>19x FY27's</w:t>
+      </w:r>
+      <w:r>
+        <w:t>. Street: 45 of 49 at Buy, average target $526.</w:t>
+      </w:r>
+    </w:p>
+    <w:p>
+      <w:pPr>
+        <w:pStyle w:val="Heading2"/>
+      </w:pPr>
+      <w:r>
+        <w:t>How this stock actually trades on prints — the only pattern that matters</w:t>
+      </w:r>
+    </w:p>
+    <w:p>
+      <w:pPr>
+        <w:pStyle w:val="ListBullet"/>
+      </w:pPr>
+      <w:r>
+        <w:t xml:space="preserve">Eight straight revenue/EPS beats, and the stock ignored every one of them. What moves it is the </w:t>
+      </w:r>
+      <w:r>
+        <w:rPr>
+          <w:b/>
+        </w:rPr>
+        <w:t>AI guide versus the buyside number, and margin language</w:t>
+      </w:r>
+      <w:r>
+        <w:t xml:space="preserve">: in-line AI guide −5% (Jun '25); GM-dilution guide −11% (Dec '25); guide below whisper with no FY27 raise </w:t>
+      </w:r>
+      <w:r>
+        <w:rPr>
+          <w:b/>
+        </w:rPr>
+        <w:t>−12.6% (June — buyside wanted $17.2bn, got $16.0bn)</w:t>
+      </w:r>
+      <w:r>
+        <w:t>. The rips are all the same trade too: new customer or target raise (+24%, +9%, +5%).</w:t>
+      </w:r>
+    </w:p>
+    <w:p>
+      <w:pPr>
+        <w:pStyle w:val="ListBullet"/>
+      </w:pPr>
+      <w:r>
+        <w:t xml:space="preserve">They also sandbag: the AI print has beaten its own guide by $0.1–0.3bn </w:t>
+      </w:r>
+      <w:r>
+        <w:rPr>
+          <w:b/>
+        </w:rPr>
+        <w:t>every quarter this cycle</w:t>
+      </w:r>
+      <w:r>
+        <w:t xml:space="preserve">. So $16.2–16.3bn tomorrow is scripted, not a beat. The real bars: </w:t>
+      </w:r>
+      <w:r>
+        <w:rPr>
+          <w:b/>
+        </w:rPr>
+        <w:t>AI print ≥ ~$16.5bn; FQ4 AI guide ≥ ~$21bn</w:t>
+      </w:r>
+      <w:r>
+        <w:t xml:space="preserve"> (the $56bn path already implies $20.8bn — guiding there is zero news); and above all, </w:t>
+      </w:r>
+      <w:r>
+        <w:rPr>
+          <w:b/>
+        </w:rPr>
+        <w:t>replacing "in excess of $100bn" for FY27 with an actual bigger number.</w:t>
+      </w:r>
+      <w:r>
+        <w:t xml:space="preserve"> That sentence is the whole print.</w:t>
+      </w:r>
+    </w:p>
+    <w:p>
+      <w:pPr>
+        <w:pStyle w:val="Heading2"/>
+      </w:pPr>
+      <w:r>
+        <w:t>What the market wants to hear, in order</w:t>
+      </w:r>
+    </w:p>
+    <w:p>
+      <w:pPr>
+        <w:pStyle w:val="ListBullet"/>
+      </w:pPr>
+      <w:r>
+        <w:rPr>
+          <w:b/>
+        </w:rPr>
+        <w:t>FY27 quantified above $100bn</w:t>
+      </w:r>
+      <w:r>
+        <w:t xml:space="preserve"> — the June sell-off was this exact sentence not upgrading. </w:t>
+      </w:r>
+      <w:r>
+        <w:rPr>
+          <w:b/>
+        </w:rPr>
+        <w:t>OpenAI 10GW shipping confirmation</w:t>
+      </w:r>
+      <w:r>
+        <w:t xml:space="preserve"> — June said production late '26, 1.3GW contractual in '27; the market wants "shipments have started." </w:t>
+      </w:r>
+      <w:r>
+        <w:rPr>
+          <w:b/>
+        </w:rPr>
+        <w:t>A Google answer</w:t>
+      </w:r>
+      <w:r>
+        <w:t xml:space="preserve"> — Google signed an up-to-$120bn custom-silicon framework with Marvell on Aug 19 (milestone warrants, not committed volume, and the teardowns say the headline overstates near-term displacement — but it will be the first analyst question). </w:t>
+      </w:r>
+      <w:r>
+        <w:rPr>
+          <w:b/>
+        </w:rPr>
+        <w:t>A gross-margin floor</w:t>
+      </w:r>
+      <w:r>
+        <w:t xml:space="preserve"> — "74% and stabilising" keeps the bears quiet; below 73% guided for Q4 is the tail risk. Plus any 7th customer or naming of the two $6bn mystery accounts.</w:t>
+      </w:r>
+    </w:p>
+    <w:p>
+      <w:pPr>
+        <w:pStyle w:val="ListBullet"/>
+      </w:pPr>
+      <w:r>
+        <w:t xml:space="preserve">Read-across this week cuts both ways: Nvidia beat and ripped +8% (AI-capex tone fine), but Marvell — the custom-silicon twin — </w:t>
+      </w:r>
+      <w:r>
+        <w:rPr>
+          <w:b/>
+        </w:rPr>
+        <w:t>fell 10% on margin compression in exactly the business AVGO is scaling</w:t>
+      </w:r>
+      <w:r>
+        <w:t>. That's the bear template applied to tomorrow's GM line.</w:t>
+      </w:r>
+    </w:p>
+    <w:p>
+      <w:pPr>
+        <w:pStyle w:val="Heading2"/>
+      </w:pPr>
+      <w:r>
+        <w:t>Our read</w:t>
+      </w:r>
+    </w:p>
+    <w:p>
+      <w:pPr>
+        <w:pStyle w:val="ListBullet"/>
+      </w:pPr>
+      <w:r>
+        <w:t xml:space="preserve">The setup is the mirror image of June: then it walked in +39% over 60 days and got destroyed by an in-line guide; now it walks in −12% with the whisper reset lower. Positioning finally favours the long side, and the sandbagged-beat-plus-$21bn-Q4-guide script is likely delivered. But structurally </w:t>
+      </w:r>
+      <w:r>
+        <w:rPr>
+          <w:b/>
+        </w:rPr>
+        <w:t>this stock does not pay you for in-line — it sells off unless something is raised.</w:t>
+      </w:r>
+      <w:r>
+        <w:t xml:space="preserve"> Base case: scripted beat, FQ4 guide ~$21bn, FY27 repeated-but-not-quantified → flat to modestly down. Rip case (needs FY27 number &gt;$110bn, or OpenAI early, or a name on the mystery customers): +8–10%. Tail: GM guided sub-73% or cautious Google language → −8% or worse.</w:t>
+      </w:r>
+    </w:p>
+    <w:p>
+      <w:pPr>
+        <w:pStyle w:val="ListBullet"/>
+      </w:pPr>
+      <w:r>
+        <w:rPr>
+          <w:b/>
+        </w:rPr>
+        <w:t>If forced to a position: small long into it, sized for the ±8% either way</w:t>
+      </w:r>
+      <w:r>
+        <w:t xml:space="preserve"> — the run-in asymmetry is worth something — but the June lesson is the durable one: this name pays you for buying the guide-driven flush, not for gambling on the print. Implied-move levels off $370: ~$343 / ~$397.</w:t>
+      </w:r>
+    </w:p>
+    <w:p>
+      <w:pPr>
+        <w:pStyle w:val="Heading1"/>
+      </w:pPr>
+      <w:r>
+        <w:t>8. Bottom line</w:t>
+      </w:r>
+    </w:p>
+    <w:p>
+      <w:pPr>
+        <w:pStyle w:val="ListBullet"/>
+      </w:pPr>
+      <w:r>
+        <w:rPr>
+          <w:b/>
+        </w:rPr>
+        <w:t>SHEIN</w:t>
+      </w:r>
+      <w:r>
+        <w:t xml:space="preserve"> — priced at the top of its fair band, cold book, capped model, US$3.5bn out the door to old investors, and the southbound bid locked out until March. Skip the debut; express the theme through PDD.</w:t>
+      </w:r>
+    </w:p>
+    <w:p>
+      <w:pPr>
+        <w:pStyle w:val="ListBullet"/>
+      </w:pPr>
+      <w:r>
+        <w:rPr>
+          <w:b/>
+        </w:rPr>
+        <w:t>Mech-Mind</w:t>
+      </w:r>
+      <w:r>
+        <w:t xml:space="preserve"> — rich on fundamentals but priced at par with the live benchmark, with the mechanics of a squeeze. Take the debut, sell into strength, stay only if you believe the Q1 acceleration is real.</w:t>
+      </w:r>
+    </w:p>
+    <w:p>
+      <w:pPr>
+        <w:pStyle w:val="ListBullet"/>
+      </w:pPr>
+      <w:r>
+        <w:t>Same-day listings will split liquidity, and the contrast should be visible by lunch: the cheap one flat, the expensive one flying.</w:t>
+      </w:r>
+    </w:p>
+    <w:p>
+      <w:pPr>
+        <w:pStyle w:val="ListBullet"/>
+      </w:pPr>
+      <w:r>
+        <w:rPr>
+          <w:b/>
+        </w:rPr>
+        <w:t>Ingenic</w:t>
+      </w:r>
+      <w:r>
+        <w:t xml:space="preserve"> — legacy-memory cycle play at ~19x this year's earnings. Results Saturday; whisper is top of the guided range and positioning is already washed out. Slight positive lean into Monday.</w:t>
+      </w:r>
+    </w:p>
+    <w:p>
+      <w:pPr>
+        <w:pStyle w:val="ListBullet"/>
+      </w:pPr>
+      <w:r>
+        <w:rPr>
+          <w:b/>
+        </w:rPr>
+        <w:t>Medcaptain</w:t>
+      </w:r>
+      <w:r>
+        <w:t xml:space="preserve"> — still double a defensible price on the comps (59x adjusted vs Micro-Tech at 28.5x), but the weekend book (53x+) turned the debut into a float game. Investment: pass. Trade: grey market 4 Sep, sell into the open, no stabiliser below you.</w:t>
+      </w:r>
+    </w:p>
+    <w:p>
+      <w:pPr>
+        <w:pStyle w:val="ListBullet"/>
+      </w:pPr>
+      <w:r>
+        <w:rPr>
+          <w:b/>
+        </w:rPr>
+        <w:t>Longsys</w:t>
+      </w:r>
+      <w:r>
+        <w:t xml:space="preserve"> — your inventory-cycle concern is the whole story: −3.15bn operating cash flow in the best half in its history, 60% of assets in inventory, insiders selling. The 44% A/H discount protects the debut, not the holding. Own Ingenic for this cycle, rent Longsys at most.</w:t>
+      </w:r>
+    </w:p>
+    <w:p>
+      <w:pPr>
+        <w:pStyle w:val="ListBullet"/>
+      </w:pPr>
+      <w:r>
+        <w:rPr>
+          <w:b/>
+        </w:rPr>
+        <w:t>Excelland</w:t>
+      </w:r>
+      <w:r>
+        <w:t xml:space="preserve"> — weakest deal of the note: 14% GM, one customer a third of revenue, rescue financing dressed as an 18C listing, cold book. Avoid entirely; OneRobotics at the lows is the better way into service robots.</w:t>
+      </w:r>
+    </w:p>
+    <w:p>
+      <w:pPr>
+        <w:pStyle w:val="ListBullet"/>
+      </w:pPr>
+      <w:r>
+        <w:rPr>
+          <w:b/>
+        </w:rPr>
+        <w:t>Broadcom</w:t>
+      </w:r>
+      <w:r>
+        <w:t xml:space="preserve"> — prints Wed night US. Scripted beat likely; the stock only pays on a raise (FY27 quantified above $100bn, OpenAI shipping early, or a new name). Positioning finally favours longs (−12% run-in vs +39% into June), but base case is flat-to-down on an as-scripted print. Trade the flush, not the print.</w:t>
+      </w:r>
+    </w:p>
+    <w:p>
+      <w:pPr>
+        <w:pStyle w:val="Heading2"/>
+      </w:pPr>
+      <w:r>
+        <w:t>Dates to watch</w:t>
+      </w:r>
+    </w:p>
+    <w:p>
+      <w:pPr>
+        <w:pStyle w:val="ListBullet"/>
+      </w:pPr>
+      <w:r>
+        <w:t xml:space="preserve">2 Sep — Medcaptain closes · </w:t>
+      </w:r>
+      <w:r>
+        <w:rPr>
+          <w:b/>
+        </w:rPr>
+        <w:t>2 Sep US close — Broadcom prints</w:t>
+      </w:r>
+      <w:r>
+        <w:t xml:space="preserve"> · 3 Sep noon — Longsys closes · 4 Sep — Medcaptain grey market; Excelland closes · 7 Sep — Medcaptain lists; Longsys prices · 8 Sep — Longsys lists · 9 Sep — Excelland lists · ~mid-Sep — SHEIN HSCI fast entry · Q4 — Longsys cheap-inventory runway ends · Mar 2027 — Mech-Mind unlock.</w:t>
       </w:r>
     </w:p>
     <w:sectPr>

</xml_diff>

<commit_message>
IPO note v11: reference-shelf valuation tables — Medcaptain vs 13-name medtech shelf (float-freak tier vs real-money tier, Cofoe -17% as the cautionary row), Excelland vs 13-name robot shelf (median 13x P/S, 6 of 10 below offer, Rokae -18.5% on Mech-Mind debut), Longsys vs A+H hardware shelf (Lingyi -38% = the pass-through punishment, Anker/Innolight = what gets paid); prose loosened
Co-Authored-By: Claude Fable 5 <noreply@anthropic.com>
</commit_message>
<xml_diff>
--- a/SHEIN_MechMind_HK_IPO_Note.docx
+++ b/SHEIN_MechMind_HK_IPO_Note.docx
@@ -2933,7 +2933,7 @@
       <w:tr>
         <w:tc>
           <w:tcPr>
-            <w:tcW w:type="dxa" w:w="3024"/>
+            <w:tcW w:type="dxa" w:w="2880"/>
           </w:tcPr>
           <w:p>
             <w:r/>
@@ -2962,6 +2962,21 @@
         </w:tc>
         <w:tc>
           <w:tcPr>
+            <w:tcW w:type="dxa" w:w="1440"/>
+          </w:tcPr>
+          <w:p>
+            <w:r/>
+            <w:r>
+              <w:rPr>
+                <w:b/>
+                <w:sz w:val="19"/>
+              </w:rPr>
+              <w:t>P/S</w:t>
+            </w:r>
+          </w:p>
+        </w:tc>
+        <w:tc>
+          <w:tcPr>
             <w:tcW w:type="dxa" w:w="1296"/>
           </w:tcPr>
           <w:p>
@@ -2971,13 +2986,13 @@
                 <w:b/>
                 <w:sz w:val="19"/>
               </w:rPr>
-              <w:t>Fwd P/E</w:t>
+              <w:t>Rev growth</w:t>
             </w:r>
           </w:p>
         </w:tc>
         <w:tc>
           <w:tcPr>
-            <w:tcW w:type="dxa" w:w="1152"/>
+            <w:tcW w:type="dxa" w:w="1296"/>
           </w:tcPr>
           <w:p>
             <w:r/>
@@ -2986,7 +3001,62 @@
                 <w:b/>
                 <w:sz w:val="19"/>
               </w:rPr>
-              <w:t>P/S</w:t>
+              <w:t>vs IPO</w:t>
+            </w:r>
+          </w:p>
+        </w:tc>
+        <w:tc>
+          <w:tcPr>
+            <w:tcW w:type="dxa" w:w="2448"/>
+          </w:tcPr>
+          <w:p>
+            <w:r/>
+            <w:r>
+              <w:rPr>
+                <w:b/>
+                <w:sz w:val="19"/>
+              </w:rPr>
+              <w:t>Note</w:t>
+            </w:r>
+          </w:p>
+        </w:tc>
+      </w:tr>
+      <w:tr>
+        <w:tc>
+          <w:tcPr>
+            <w:tcW w:type="dxa" w:w="2880"/>
+          </w:tcPr>
+          <w:p>
+            <w:r>
+              <w:rPr>
+                <w:sz w:val="19"/>
+              </w:rPr>
+            </w:r>
+            <w:r>
+              <w:rPr>
+                <w:b/>
+                <w:sz w:val="19"/>
+              </w:rPr>
+              <w:t>Medcaptain @ HK$15.42</w:t>
+            </w:r>
+          </w:p>
+        </w:tc>
+        <w:tc>
+          <w:tcPr>
+            <w:tcW w:type="dxa" w:w="2160"/>
+          </w:tcPr>
+          <w:p>
+            <w:r>
+              <w:rPr>
+                <w:sz w:val="19"/>
+              </w:rPr>
+            </w:r>
+            <w:r>
+              <w:rPr>
+                <w:b/>
+                <w:sz w:val="19"/>
+              </w:rPr>
+              <w:t>~150x IFRS / ~59x adj.</w:t>
             </w:r>
           </w:p>
         </w:tc>
@@ -2995,28 +3065,71 @@
             <w:tcW w:type="dxa" w:w="1440"/>
           </w:tcPr>
           <w:p>
-            <w:r/>
+            <w:r>
+              <w:rPr>
+                <w:sz w:val="19"/>
+              </w:rPr>
+            </w:r>
             <w:r>
               <w:rPr>
                 <w:b/>
                 <w:sz w:val="19"/>
               </w:rPr>
-              <w:t>Rev growth</w:t>
+              <w:t>4.7x</w:t>
             </w:r>
           </w:p>
         </w:tc>
         <w:tc>
           <w:tcPr>
-            <w:tcW w:type="dxa" w:w="1584"/>
+            <w:tcW w:type="dxa" w:w="1296"/>
           </w:tcPr>
           <w:p>
-            <w:r/>
-            <w:r>
-              <w:rPr>
-                <w:b/>
-                <w:sz w:val="19"/>
-              </w:rPr>
-              <w:t>Net margin</w:t>
+            <w:r>
+              <w:rPr>
+                <w:sz w:val="19"/>
+              </w:rPr>
+            </w:r>
+            <w:r>
+              <w:rPr>
+                <w:sz w:val="19"/>
+              </w:rPr>
+              <w:t>+16%</w:t>
+            </w:r>
+          </w:p>
+        </w:tc>
+        <w:tc>
+          <w:tcPr>
+            <w:tcW w:type="dxa" w:w="1296"/>
+          </w:tcPr>
+          <w:p>
+            <w:r>
+              <w:rPr>
+                <w:sz w:val="19"/>
+              </w:rPr>
+            </w:r>
+            <w:r>
+              <w:rPr>
+                <w:sz w:val="19"/>
+              </w:rPr>
+              <w:t>—</w:t>
+            </w:r>
+          </w:p>
+        </w:tc>
+        <w:tc>
+          <w:tcPr>
+            <w:tcW w:type="dxa" w:w="2448"/>
+          </w:tcPr>
+          <w:p>
+            <w:r>
+              <w:rPr>
+                <w:sz w:val="19"/>
+              </w:rPr>
+            </w:r>
+            <w:r>
+              <w:rPr>
+                <w:sz w:val="19"/>
+              </w:rPr>
+              <w:t>3% net margin (8% adj.)</w:t>
             </w:r>
           </w:p>
         </w:tc>
@@ -3024,7 +3137,7 @@
       <w:tr>
         <w:tc>
           <w:tcPr>
-            <w:tcW w:type="dxa" w:w="3024"/>
+            <w:tcW w:type="dxa" w:w="2880"/>
           </w:tcPr>
           <w:p>
             <w:r>
@@ -3037,7 +3150,7 @@
                 <w:b/>
                 <w:sz w:val="19"/>
               </w:rPr>
-              <w:t>Medcaptain @ HK$15.42</w:t>
+              <w:t>Micro-Tech 南微 (direct comp)</w:t>
             </w:r>
           </w:p>
         </w:tc>
@@ -3053,10 +3166,27 @@
             </w:r>
             <w:r>
               <w:rPr>
-                <w:b/>
-                <w:sz w:val="19"/>
-              </w:rPr>
-              <w:t>~150x IFRS / ~59x adjusted</w:t>
+                <w:sz w:val="19"/>
+              </w:rPr>
+              <w:t>28.5x</w:t>
+            </w:r>
+          </w:p>
+        </w:tc>
+        <w:tc>
+          <w:tcPr>
+            <w:tcW w:type="dxa" w:w="1440"/>
+          </w:tcPr>
+          <w:p>
+            <w:r>
+              <w:rPr>
+                <w:sz w:val="19"/>
+              </w:rPr>
+            </w:r>
+            <w:r>
+              <w:rPr>
+                <w:sz w:val="19"/>
+              </w:rPr>
+              <w:t>4.3x</w:t>
             </w:r>
           </w:p>
         </w:tc>
@@ -3074,13 +3204,13 @@
               <w:rPr>
                 <w:sz w:val="19"/>
               </w:rPr>
-              <w:t>—</w:t>
+              <w:t>+12%</w:t>
             </w:r>
           </w:p>
         </w:tc>
         <w:tc>
           <w:tcPr>
-            <w:tcW w:type="dxa" w:w="1152"/>
+            <w:tcW w:type="dxa" w:w="1296"/>
           </w:tcPr>
           <w:p>
             <w:r>
@@ -3090,10 +3220,65 @@
             </w:r>
             <w:r>
               <w:rPr>
-                <w:b/>
-                <w:sz w:val="19"/>
-              </w:rPr>
-              <w:t>4.7x</w:t>
+                <w:sz w:val="19"/>
+              </w:rPr>
+              <w:t>—</w:t>
+            </w:r>
+          </w:p>
+        </w:tc>
+        <w:tc>
+          <w:tcPr>
+            <w:tcW w:type="dxa" w:w="2448"/>
+          </w:tcPr>
+          <w:p>
+            <w:r>
+              <w:rPr>
+                <w:sz w:val="19"/>
+              </w:rPr>
+            </w:r>
+            <w:r>
+              <w:rPr>
+                <w:sz w:val="19"/>
+              </w:rPr>
+              <w:t>15% margin, same VBP</w:t>
+            </w:r>
+          </w:p>
+        </w:tc>
+      </w:tr>
+      <w:tr>
+        <w:tc>
+          <w:tcPr>
+            <w:tcW w:type="dxa" w:w="2880"/>
+          </w:tcPr>
+          <w:p>
+            <w:r>
+              <w:rPr>
+                <w:sz w:val="19"/>
+              </w:rPr>
+            </w:r>
+            <w:r>
+              <w:rPr>
+                <w:sz w:val="19"/>
+              </w:rPr>
+              <w:t>Mindray 300760</w:t>
+            </w:r>
+          </w:p>
+        </w:tc>
+        <w:tc>
+          <w:tcPr>
+            <w:tcW w:type="dxa" w:w="2160"/>
+          </w:tcPr>
+          <w:p>
+            <w:r>
+              <w:rPr>
+                <w:sz w:val="19"/>
+              </w:rPr>
+            </w:r>
+            <w:r>
+              <w:rPr>
+                <w:sz w:val="19"/>
+              </w:rPr>
+              <w:t>25.5x</w:t>
             </w:r>
           </w:p>
         </w:tc>
@@ -3111,13 +3296,13 @@
               <w:rPr>
                 <w:sz w:val="19"/>
               </w:rPr>
-              <w:t>+16%</w:t>
+              <w:t>5.8x</w:t>
             </w:r>
           </w:p>
         </w:tc>
         <w:tc>
           <w:tcPr>
-            <w:tcW w:type="dxa" w:w="1584"/>
+            <w:tcW w:type="dxa" w:w="1296"/>
           </w:tcPr>
           <w:p>
             <w:r>
@@ -3129,7 +3314,43 @@
               <w:rPr>
                 <w:sz w:val="19"/>
               </w:rPr>
-              <w:t>3% (8% adj.)</w:t>
+              <w:t>+4%</w:t>
+            </w:r>
+          </w:p>
+        </w:tc>
+        <w:tc>
+          <w:tcPr>
+            <w:tcW w:type="dxa" w:w="1296"/>
+          </w:tcPr>
+          <w:p>
+            <w:r>
+              <w:rPr>
+                <w:sz w:val="19"/>
+              </w:rPr>
+            </w:r>
+            <w:r>
+              <w:rPr>
+                <w:sz w:val="19"/>
+              </w:rPr>
+              <w:t>—</w:t>
+            </w:r>
+          </w:p>
+        </w:tc>
+        <w:tc>
+          <w:tcPr>
+            <w:tcW w:type="dxa" w:w="2448"/>
+          </w:tcPr>
+          <w:p>
+            <w:r>
+              <w:rPr>
+                <w:sz w:val="19"/>
+              </w:rPr>
+            </w:r>
+            <w:r>
+              <w:rPr>
+                <w:sz w:val="19"/>
+              </w:rPr>
+              <w:t>the quality anchor</w:t>
             </w:r>
           </w:p>
         </w:tc>
@@ -3137,7 +3358,7 @@
       <w:tr>
         <w:tc>
           <w:tcPr>
-            <w:tcW w:type="dxa" w:w="3024"/>
+            <w:tcW w:type="dxa" w:w="2880"/>
           </w:tcPr>
           <w:p>
             <w:r>
@@ -3147,10 +3368,9 @@
             </w:r>
             <w:r>
               <w:rPr>
-                <w:b/>
-                <w:sz w:val="19"/>
-              </w:rPr>
-              <w:t>Micro-Tech 南微 (the direct comp)</w:t>
+                <w:sz w:val="19"/>
+              </w:rPr>
+              <w:t>AK Medical 1789</w:t>
             </w:r>
           </w:p>
         </w:tc>
@@ -3168,7 +3388,25 @@
               <w:rPr>
                 <w:sz w:val="19"/>
               </w:rPr>
-              <w:t>28.5x</w:t>
+              <w:t>13.2x</w:t>
+            </w:r>
+          </w:p>
+        </w:tc>
+        <w:tc>
+          <w:tcPr>
+            <w:tcW w:type="dxa" w:w="1440"/>
+          </w:tcPr>
+          <w:p>
+            <w:r>
+              <w:rPr>
+                <w:sz w:val="19"/>
+              </w:rPr>
+            </w:r>
+            <w:r>
+              <w:rPr>
+                <w:sz w:val="19"/>
+              </w:rPr>
+              <w:t>3.1x</w:t>
             </w:r>
           </w:p>
         </w:tc>
@@ -3186,13 +3424,13 @@
               <w:rPr>
                 <w:sz w:val="19"/>
               </w:rPr>
-              <w:t>25.1x</w:t>
+              <w:t>+12%</w:t>
             </w:r>
           </w:p>
         </w:tc>
         <w:tc>
           <w:tcPr>
-            <w:tcW w:type="dxa" w:w="1152"/>
+            <w:tcW w:type="dxa" w:w="1296"/>
           </w:tcPr>
           <w:p>
             <w:r>
@@ -3204,7 +3442,57 @@
               <w:rPr>
                 <w:sz w:val="19"/>
               </w:rPr>
-              <w:t>4.3x</w:t>
+              <w:t>—</w:t>
+            </w:r>
+          </w:p>
+        </w:tc>
+        <w:tc>
+          <w:tcPr>
+            <w:tcW w:type="dxa" w:w="2448"/>
+          </w:tcPr>
+          <w:p>
+            <w:r>
+              <w:rPr>
+                <w:sz w:val="19"/>
+              </w:rPr>
+            </w:r>
+          </w:p>
+        </w:tc>
+      </w:tr>
+      <w:tr>
+        <w:tc>
+          <w:tcPr>
+            <w:tcW w:type="dxa" w:w="2880"/>
+          </w:tcPr>
+          <w:p>
+            <w:r>
+              <w:rPr>
+                <w:sz w:val="19"/>
+              </w:rPr>
+            </w:r>
+            <w:r>
+              <w:rPr>
+                <w:sz w:val="19"/>
+              </w:rPr>
+              <w:t>Weigao 1066</w:t>
+            </w:r>
+          </w:p>
+        </w:tc>
+        <w:tc>
+          <w:tcPr>
+            <w:tcW w:type="dxa" w:w="2160"/>
+          </w:tcPr>
+          <w:p>
+            <w:r>
+              <w:rPr>
+                <w:sz w:val="19"/>
+              </w:rPr>
+            </w:r>
+            <w:r>
+              <w:rPr>
+                <w:sz w:val="19"/>
+              </w:rPr>
+              <w:t>9.5x</w:t>
             </w:r>
           </w:p>
         </w:tc>
@@ -3222,13 +3510,13 @@
               <w:rPr>
                 <w:sz w:val="19"/>
               </w:rPr>
-              <w:t>+12%</w:t>
+              <w:t>~1.0x</w:t>
             </w:r>
           </w:p>
         </w:tc>
         <w:tc>
           <w:tcPr>
-            <w:tcW w:type="dxa" w:w="1584"/>
+            <w:tcW w:type="dxa" w:w="1296"/>
           </w:tcPr>
           <w:p>
             <w:r>
@@ -3240,7 +3528,43 @@
               <w:rPr>
                 <w:sz w:val="19"/>
               </w:rPr>
-              <w:t>15%</w:t>
+              <w:t>+4%</w:t>
+            </w:r>
+          </w:p>
+        </w:tc>
+        <w:tc>
+          <w:tcPr>
+            <w:tcW w:type="dxa" w:w="1296"/>
+          </w:tcPr>
+          <w:p>
+            <w:r>
+              <w:rPr>
+                <w:sz w:val="19"/>
+              </w:rPr>
+            </w:r>
+            <w:r>
+              <w:rPr>
+                <w:sz w:val="19"/>
+              </w:rPr>
+              <w:t>—</w:t>
+            </w:r>
+          </w:p>
+        </w:tc>
+        <w:tc>
+          <w:tcPr>
+            <w:tcW w:type="dxa" w:w="2448"/>
+          </w:tcPr>
+          <w:p>
+            <w:r>
+              <w:rPr>
+                <w:sz w:val="19"/>
+              </w:rPr>
+            </w:r>
+            <w:r>
+              <w:rPr>
+                <w:sz w:val="19"/>
+              </w:rPr>
+              <w:t>distributor model, like-for-like channel</w:t>
             </w:r>
           </w:p>
         </w:tc>
@@ -3248,7 +3572,7 @@
       <w:tr>
         <w:tc>
           <w:tcPr>
-            <w:tcW w:type="dxa" w:w="3024"/>
+            <w:tcW w:type="dxa" w:w="2880"/>
           </w:tcPr>
           <w:p>
             <w:r>
@@ -3260,7 +3584,7 @@
               <w:rPr>
                 <w:sz w:val="19"/>
               </w:rPr>
-              <w:t>Mindray 300760</w:t>
+              <w:t>Boston Scientific</w:t>
             </w:r>
           </w:p>
         </w:tc>
@@ -3278,7 +3602,25 @@
               <w:rPr>
                 <w:sz w:val="19"/>
               </w:rPr>
-              <w:t>25.5x</w:t>
+              <w:t>19x</w:t>
+            </w:r>
+          </w:p>
+        </w:tc>
+        <w:tc>
+          <w:tcPr>
+            <w:tcW w:type="dxa" w:w="1440"/>
+          </w:tcPr>
+          <w:p>
+            <w:r>
+              <w:rPr>
+                <w:sz w:val="19"/>
+              </w:rPr>
+            </w:r>
+            <w:r>
+              <w:rPr>
+                <w:sz w:val="19"/>
+              </w:rPr>
+              <w:t>3.2x</w:t>
             </w:r>
           </w:p>
         </w:tc>
@@ -3296,13 +3638,13 @@
               <w:rPr>
                 <w:sz w:val="19"/>
               </w:rPr>
-              <w:t>22.4x</w:t>
+              <w:t>+13%</w:t>
             </w:r>
           </w:p>
         </w:tc>
         <w:tc>
           <w:tcPr>
-            <w:tcW w:type="dxa" w:w="1152"/>
+            <w:tcW w:type="dxa" w:w="1296"/>
           </w:tcPr>
           <w:p>
             <w:r>
@@ -3314,7 +3656,57 @@
               <w:rPr>
                 <w:sz w:val="19"/>
               </w:rPr>
-              <w:t>5.8x</w:t>
+              <w:t>—</w:t>
+            </w:r>
+          </w:p>
+        </w:tc>
+        <w:tc>
+          <w:tcPr>
+            <w:tcW w:type="dxa" w:w="2448"/>
+          </w:tcPr>
+          <w:p>
+            <w:r>
+              <w:rPr>
+                <w:sz w:val="19"/>
+              </w:rPr>
+            </w:r>
+            <w:r>
+              <w:rPr>
+                <w:sz w:val="19"/>
+              </w:rPr>
+              <w:t>global GI anchor</w:t>
+            </w:r>
+          </w:p>
+        </w:tc>
+      </w:tr>
+      <w:tr>
+        <w:tc>
+          <w:tcPr>
+            <w:tcW w:type="dxa" w:w="2880"/>
+          </w:tcPr>
+          <w:p>
+            <w:r>
+              <w:rPr>
+                <w:sz w:val="19"/>
+              </w:rPr>
+            </w:r>
+            <w:r>
+              <w:rPr>
+                <w:sz w:val="19"/>
+              </w:rPr>
+              <w:t>— the recently listed HK shelf —</w:t>
+            </w:r>
+          </w:p>
+        </w:tc>
+        <w:tc>
+          <w:tcPr>
+            <w:tcW w:type="dxa" w:w="2160"/>
+          </w:tcPr>
+          <w:p>
+            <w:r>
+              <w:rPr>
+                <w:sz w:val="19"/>
+              </w:rPr>
             </w:r>
           </w:p>
         </w:tc>
@@ -3328,17 +3720,11 @@
                 <w:sz w:val="19"/>
               </w:rPr>
             </w:r>
-            <w:r>
-              <w:rPr>
-                <w:sz w:val="19"/>
-              </w:rPr>
-              <w:t>+4%</w:t>
-            </w:r>
           </w:p>
         </w:tc>
         <w:tc>
           <w:tcPr>
-            <w:tcW w:type="dxa" w:w="1584"/>
+            <w:tcW w:type="dxa" w:w="1296"/>
           </w:tcPr>
           <w:p>
             <w:r>
@@ -3346,11 +3732,29 @@
                 <w:sz w:val="19"/>
               </w:rPr>
             </w:r>
-            <w:r>
-              <w:rPr>
-                <w:sz w:val="19"/>
-              </w:rPr>
-              <w:t>23%</w:t>
+          </w:p>
+        </w:tc>
+        <w:tc>
+          <w:tcPr>
+            <w:tcW w:type="dxa" w:w="1296"/>
+          </w:tcPr>
+          <w:p>
+            <w:r>
+              <w:rPr>
+                <w:sz w:val="19"/>
+              </w:rPr>
+            </w:r>
+          </w:p>
+        </w:tc>
+        <w:tc>
+          <w:tcPr>
+            <w:tcW w:type="dxa" w:w="2448"/>
+          </w:tcPr>
+          <w:p>
+            <w:r>
+              <w:rPr>
+                <w:sz w:val="19"/>
+              </w:rPr>
             </w:r>
           </w:p>
         </w:tc>
@@ -3358,7 +3762,7 @@
       <w:tr>
         <w:tc>
           <w:tcPr>
-            <w:tcW w:type="dxa" w:w="3024"/>
+            <w:tcW w:type="dxa" w:w="2880"/>
           </w:tcPr>
           <w:p>
             <w:r>
@@ -3370,7 +3774,7 @@
               <w:rPr>
                 <w:sz w:val="19"/>
               </w:rPr>
-              <w:t>United Imaging 688271</w:t>
+              <w:t>Star Sports Med 1609</w:t>
             </w:r>
           </w:p>
         </w:tc>
@@ -3388,7 +3792,25 @@
               <w:rPr>
                 <w:sz w:val="19"/>
               </w:rPr>
-              <w:t>48x</w:t>
+              <w:t>70.9x</w:t>
+            </w:r>
+          </w:p>
+        </w:tc>
+        <w:tc>
+          <w:tcPr>
+            <w:tcW w:type="dxa" w:w="1440"/>
+          </w:tcPr>
+          <w:p>
+            <w:r>
+              <w:rPr>
+                <w:sz w:val="19"/>
+              </w:rPr>
+            </w:r>
+            <w:r>
+              <w:rPr>
+                <w:sz w:val="19"/>
+              </w:rPr>
+              <w:t>20.9x</w:t>
             </w:r>
           </w:p>
         </w:tc>
@@ -3406,13 +3828,13 @@
               <w:rPr>
                 <w:sz w:val="19"/>
               </w:rPr>
-              <w:t>36x</w:t>
+              <w:t>+22%</w:t>
             </w:r>
           </w:p>
         </w:tc>
         <w:tc>
           <w:tcPr>
-            <w:tcW w:type="dxa" w:w="1152"/>
+            <w:tcW w:type="dxa" w:w="1296"/>
           </w:tcPr>
           <w:p>
             <w:r>
@@ -3422,9 +3844,66 @@
             </w:r>
             <w:r>
               <w:rPr>
-                <w:sz w:val="19"/>
-              </w:rPr>
-              <w:t>5.8x</w:t>
+                <w:b/>
+                <w:sz w:val="19"/>
+              </w:rPr>
+              <w:t>+67%</w:t>
+            </w:r>
+          </w:p>
+        </w:tc>
+        <w:tc>
+          <w:tcPr>
+            <w:tcW w:type="dxa" w:w="2448"/>
+          </w:tcPr>
+          <w:p>
+            <w:r>
+              <w:rPr>
+                <w:sz w:val="19"/>
+              </w:rPr>
+            </w:r>
+            <w:r>
+              <w:rPr>
+                <w:sz w:val="19"/>
+              </w:rPr>
+              <w:t>profitable niche #1, tiny float</w:t>
+            </w:r>
+          </w:p>
+        </w:tc>
+      </w:tr>
+      <w:tr>
+        <w:tc>
+          <w:tcPr>
+            <w:tcW w:type="dxa" w:w="2880"/>
+          </w:tcPr>
+          <w:p>
+            <w:r>
+              <w:rPr>
+                <w:sz w:val="19"/>
+              </w:rPr>
+            </w:r>
+            <w:r>
+              <w:rPr>
+                <w:sz w:val="19"/>
+              </w:rPr>
+              <w:t>Cofoe 可孚 1187 (A+H)</w:t>
+            </w:r>
+          </w:p>
+        </w:tc>
+        <w:tc>
+          <w:tcPr>
+            <w:tcW w:type="dxa" w:w="2160"/>
+          </w:tcPr>
+          <w:p>
+            <w:r>
+              <w:rPr>
+                <w:sz w:val="19"/>
+              </w:rPr>
+            </w:r>
+            <w:r>
+              <w:rPr>
+                <w:sz w:val="19"/>
+              </w:rPr>
+              <w:t>19.0x</w:t>
             </w:r>
           </w:p>
         </w:tc>
@@ -3442,13 +3921,13 @@
               <w:rPr>
                 <w:sz w:val="19"/>
               </w:rPr>
-              <w:t>+35%</w:t>
+              <w:t>2.0x</w:t>
             </w:r>
           </w:p>
         </w:tc>
         <w:tc>
           <w:tcPr>
-            <w:tcW w:type="dxa" w:w="1584"/>
+            <w:tcW w:type="dxa" w:w="1296"/>
           </w:tcPr>
           <w:p>
             <w:r>
@@ -3460,7 +3939,44 @@
               <w:rPr>
                 <w:sz w:val="19"/>
               </w:rPr>
-              <w:t>12%</w:t>
+              <w:t>+39%</w:t>
+            </w:r>
+          </w:p>
+        </w:tc>
+        <w:tc>
+          <w:tcPr>
+            <w:tcW w:type="dxa" w:w="1296"/>
+          </w:tcPr>
+          <w:p>
+            <w:r>
+              <w:rPr>
+                <w:sz w:val="19"/>
+              </w:rPr>
+            </w:r>
+            <w:r>
+              <w:rPr>
+                <w:b/>
+                <w:sz w:val="19"/>
+              </w:rPr>
+              <w:t>−17%</w:t>
+            </w:r>
+          </w:p>
+        </w:tc>
+        <w:tc>
+          <w:tcPr>
+            <w:tcW w:type="dxa" w:w="2448"/>
+          </w:tcPr>
+          <w:p>
+            <w:r>
+              <w:rPr>
+                <w:sz w:val="19"/>
+              </w:rPr>
+            </w:r>
+            <w:r>
+              <w:rPr>
+                <w:sz w:val="19"/>
+              </w:rPr>
+              <w:t>profitable, growing — and below offer</w:t>
             </w:r>
           </w:p>
         </w:tc>
@@ -3468,7 +3984,7 @@
       <w:tr>
         <w:tc>
           <w:tcPr>
-            <w:tcW w:type="dxa" w:w="3024"/>
+            <w:tcW w:type="dxa" w:w="2880"/>
           </w:tcPr>
           <w:p>
             <w:r>
@@ -3480,7 +3996,7 @@
               <w:rPr>
                 <w:sz w:val="19"/>
               </w:rPr>
-              <w:t>AK Medical 1789</w:t>
+              <w:t>Edge Medical 2675</w:t>
             </w:r>
           </w:p>
         </w:tc>
@@ -3498,7 +4014,25 @@
               <w:rPr>
                 <w:sz w:val="19"/>
               </w:rPr>
-              <w:t>13.2x</w:t>
+              <w:t>n/m</w:t>
+            </w:r>
+          </w:p>
+        </w:tc>
+        <w:tc>
+          <w:tcPr>
+            <w:tcW w:type="dxa" w:w="1440"/>
+          </w:tcPr>
+          <w:p>
+            <w:r>
+              <w:rPr>
+                <w:sz w:val="19"/>
+              </w:rPr>
+            </w:r>
+            <w:r>
+              <w:rPr>
+                <w:sz w:val="19"/>
+              </w:rPr>
+              <w:t>21.2x</w:t>
             </w:r>
           </w:p>
         </w:tc>
@@ -3516,13 +4050,13 @@
               <w:rPr>
                 <w:sz w:val="19"/>
               </w:rPr>
-              <w:t>11.2x</w:t>
+              <w:t>+114%</w:t>
             </w:r>
           </w:p>
         </w:tc>
         <w:tc>
           <w:tcPr>
-            <w:tcW w:type="dxa" w:w="1152"/>
+            <w:tcW w:type="dxa" w:w="1296"/>
           </w:tcPr>
           <w:p>
             <w:r>
@@ -3534,7 +4068,63 @@
               <w:rPr>
                 <w:sz w:val="19"/>
               </w:rPr>
-              <w:t>3.1x</w:t>
+              <w:t>−21%</w:t>
+            </w:r>
+          </w:p>
+        </w:tc>
+        <w:tc>
+          <w:tcPr>
+            <w:tcW w:type="dxa" w:w="2448"/>
+          </w:tcPr>
+          <w:p>
+            <w:r>
+              <w:rPr>
+                <w:sz w:val="19"/>
+              </w:rPr>
+            </w:r>
+            <w:r>
+              <w:rPr>
+                <w:sz w:val="19"/>
+              </w:rPr>
+              <w:t>surgical robots</w:t>
+            </w:r>
+          </w:p>
+        </w:tc>
+      </w:tr>
+      <w:tr>
+        <w:tc>
+          <w:tcPr>
+            <w:tcW w:type="dxa" w:w="2880"/>
+          </w:tcPr>
+          <w:p>
+            <w:r>
+              <w:rPr>
+                <w:sz w:val="19"/>
+              </w:rPr>
+            </w:r>
+            <w:r>
+              <w:rPr>
+                <w:sz w:val="19"/>
+              </w:rPr>
+              <w:t>Lepu ScienTech 2291</w:t>
+            </w:r>
+          </w:p>
+        </w:tc>
+        <w:tc>
+          <w:tcPr>
+            <w:tcW w:type="dxa" w:w="2160"/>
+          </w:tcPr>
+          <w:p>
+            <w:r>
+              <w:rPr>
+                <w:sz w:val="19"/>
+              </w:rPr>
+            </w:r>
+            <w:r>
+              <w:rPr>
+                <w:sz w:val="19"/>
+              </w:rPr>
+              <w:t>21.7x</w:t>
             </w:r>
           </w:p>
         </w:tc>
@@ -3552,13 +4142,13 @@
               <w:rPr>
                 <w:sz w:val="19"/>
               </w:rPr>
-              <w:t>+12%</w:t>
+              <w:t>8.7x</w:t>
             </w:r>
           </w:p>
         </w:tc>
         <w:tc>
           <w:tcPr>
-            <w:tcW w:type="dxa" w:w="1584"/>
+            <w:tcW w:type="dxa" w:w="1296"/>
           </w:tcPr>
           <w:p>
             <w:r>
@@ -3570,7 +4160,37 @@
               <w:rPr>
                 <w:sz w:val="19"/>
               </w:rPr>
-              <w:t>24%</w:t>
+              <w:t>−6%</w:t>
+            </w:r>
+          </w:p>
+        </w:tc>
+        <w:tc>
+          <w:tcPr>
+            <w:tcW w:type="dxa" w:w="1296"/>
+          </w:tcPr>
+          <w:p>
+            <w:r>
+              <w:rPr>
+                <w:sz w:val="19"/>
+              </w:rPr>
+            </w:r>
+            <w:r>
+              <w:rPr>
+                <w:sz w:val="19"/>
+              </w:rPr>
+              <w:t>—</w:t>
+            </w:r>
+          </w:p>
+        </w:tc>
+        <w:tc>
+          <w:tcPr>
+            <w:tcW w:type="dxa" w:w="2448"/>
+          </w:tcPr>
+          <w:p>
+            <w:r>
+              <w:rPr>
+                <w:sz w:val="19"/>
+              </w:rPr>
             </w:r>
           </w:p>
         </w:tc>
@@ -3578,7 +4198,7 @@
       <w:tr>
         <w:tc>
           <w:tcPr>
-            <w:tcW w:type="dxa" w:w="3024"/>
+            <w:tcW w:type="dxa" w:w="2880"/>
           </w:tcPr>
           <w:p>
             <w:r>
@@ -3590,7 +4210,7 @@
               <w:rPr>
                 <w:sz w:val="19"/>
               </w:rPr>
-              <w:t>MicroPort 853</w:t>
+              <w:t>AngelAlign 6699</w:t>
             </w:r>
           </w:p>
         </w:tc>
@@ -3608,7 +4228,25 @@
               <w:rPr>
                 <w:sz w:val="19"/>
               </w:rPr>
-              <w:t>31.7x</w:t>
+              <w:t>58.8x</w:t>
+            </w:r>
+          </w:p>
+        </w:tc>
+        <w:tc>
+          <w:tcPr>
+            <w:tcW w:type="dxa" w:w="1440"/>
+          </w:tcPr>
+          <w:p>
+            <w:r>
+              <w:rPr>
+                <w:sz w:val="19"/>
+              </w:rPr>
+            </w:r>
+            <w:r>
+              <w:rPr>
+                <w:sz w:val="19"/>
+              </w:rPr>
+              <w:t>5.5x</w:t>
             </w:r>
           </w:p>
         </w:tc>
@@ -3626,13 +4264,13 @@
               <w:rPr>
                 <w:sz w:val="19"/>
               </w:rPr>
-              <w:t>17.5x</w:t>
+              <w:t>+43%</w:t>
             </w:r>
           </w:p>
         </w:tc>
         <w:tc>
           <w:tcPr>
-            <w:tcW w:type="dxa" w:w="1152"/>
+            <w:tcW w:type="dxa" w:w="1296"/>
           </w:tcPr>
           <w:p>
             <w:r>
@@ -3644,7 +4282,57 @@
               <w:rPr>
                 <w:sz w:val="19"/>
               </w:rPr>
-              <w:t>1.4x</w:t>
+              <w:t>—</w:t>
+            </w:r>
+          </w:p>
+        </w:tc>
+        <w:tc>
+          <w:tcPr>
+            <w:tcW w:type="dxa" w:w="2448"/>
+          </w:tcPr>
+          <w:p>
+            <w:r>
+              <w:rPr>
+                <w:sz w:val="19"/>
+              </w:rPr>
+            </w:r>
+          </w:p>
+        </w:tc>
+      </w:tr>
+      <w:tr>
+        <w:tc>
+          <w:tcPr>
+            <w:tcW w:type="dxa" w:w="2880"/>
+          </w:tcPr>
+          <w:p>
+            <w:r>
+              <w:rPr>
+                <w:sz w:val="19"/>
+              </w:rPr>
+            </w:r>
+            <w:r>
+              <w:rPr>
+                <w:sz w:val="19"/>
+              </w:rPr>
+              <w:t>True Health 2697 / Diagens 2526</w:t>
+            </w:r>
+          </w:p>
+        </w:tc>
+        <w:tc>
+          <w:tcPr>
+            <w:tcW w:type="dxa" w:w="2160"/>
+          </w:tcPr>
+          <w:p>
+            <w:r>
+              <w:rPr>
+                <w:sz w:val="19"/>
+              </w:rPr>
+            </w:r>
+            <w:r>
+              <w:rPr>
+                <w:sz w:val="19"/>
+              </w:rPr>
+              <w:t>n/m</w:t>
             </w:r>
           </w:p>
         </w:tc>
@@ -3662,63 +4350,7 @@
               <w:rPr>
                 <w:sz w:val="19"/>
               </w:rPr>
-              <w:t>+7%</w:t>
-            </w:r>
-          </w:p>
-        </w:tc>
-        <w:tc>
-          <w:tcPr>
-            <w:tcW w:type="dxa" w:w="1584"/>
-          </w:tcPr>
-          <w:p>
-            <w:r>
-              <w:rPr>
-                <w:sz w:val="19"/>
-              </w:rPr>
-            </w:r>
-            <w:r>
-              <w:rPr>
-                <w:sz w:val="19"/>
-              </w:rPr>
-              <w:t>4%</w:t>
-            </w:r>
-          </w:p>
-        </w:tc>
-      </w:tr>
-      <w:tr>
-        <w:tc>
-          <w:tcPr>
-            <w:tcW w:type="dxa" w:w="3024"/>
-          </w:tcPr>
-          <w:p>
-            <w:r>
-              <w:rPr>
-                <w:sz w:val="19"/>
-              </w:rPr>
-            </w:r>
-            <w:r>
-              <w:rPr>
-                <w:sz w:val="19"/>
-              </w:rPr>
-              <w:t>Weigao 1066</w:t>
-            </w:r>
-          </w:p>
-        </w:tc>
-        <w:tc>
-          <w:tcPr>
-            <w:tcW w:type="dxa" w:w="2160"/>
-          </w:tcPr>
-          <w:p>
-            <w:r>
-              <w:rPr>
-                <w:sz w:val="19"/>
-              </w:rPr>
-            </w:r>
-            <w:r>
-              <w:rPr>
-                <w:sz w:val="19"/>
-              </w:rPr>
-              <w:t>9.5x</w:t>
+              <w:t>~1,280x / 252x</w:t>
             </w:r>
           </w:p>
         </w:tc>
@@ -3736,99 +4368,7 @@
               <w:rPr>
                 <w:sz w:val="19"/>
               </w:rPr>
-              <w:t>7.3x</w:t>
-            </w:r>
-          </w:p>
-        </w:tc>
-        <w:tc>
-          <w:tcPr>
-            <w:tcW w:type="dxa" w:w="1152"/>
-          </w:tcPr>
-          <w:p>
-            <w:r>
-              <w:rPr>
-                <w:sz w:val="19"/>
-              </w:rPr>
-            </w:r>
-            <w:r>
-              <w:rPr>
-                <w:sz w:val="19"/>
-              </w:rPr>
-              <w:t>~1.0x</w:t>
-            </w:r>
-          </w:p>
-        </w:tc>
-        <w:tc>
-          <w:tcPr>
-            <w:tcW w:type="dxa" w:w="1440"/>
-          </w:tcPr>
-          <w:p>
-            <w:r>
-              <w:rPr>
-                <w:sz w:val="19"/>
-              </w:rPr>
-            </w:r>
-            <w:r>
-              <w:rPr>
-                <w:sz w:val="19"/>
-              </w:rPr>
-              <w:t>+4%</w:t>
-            </w:r>
-          </w:p>
-        </w:tc>
-        <w:tc>
-          <w:tcPr>
-            <w:tcW w:type="dxa" w:w="1584"/>
-          </w:tcPr>
-          <w:p>
-            <w:r>
-              <w:rPr>
-                <w:sz w:val="19"/>
-              </w:rPr>
-            </w:r>
-            <w:r>
-              <w:rPr>
-                <w:sz w:val="19"/>
-              </w:rPr>
-              <w:t>10%</w:t>
-            </w:r>
-          </w:p>
-        </w:tc>
-      </w:tr>
-      <w:tr>
-        <w:tc>
-          <w:tcPr>
-            <w:tcW w:type="dxa" w:w="3024"/>
-          </w:tcPr>
-          <w:p>
-            <w:r>
-              <w:rPr>
-                <w:sz w:val="19"/>
-              </w:rPr>
-            </w:r>
-            <w:r>
-              <w:rPr>
-                <w:sz w:val="19"/>
-              </w:rPr>
-              <w:t>Boston Scientific (global GI anchor)</w:t>
-            </w:r>
-          </w:p>
-        </w:tc>
-        <w:tc>
-          <w:tcPr>
-            <w:tcW w:type="dxa" w:w="2160"/>
-          </w:tcPr>
-          <w:p>
-            <w:r>
-              <w:rPr>
-                <w:sz w:val="19"/>
-              </w:rPr>
-            </w:r>
-            <w:r>
-              <w:rPr>
-                <w:sz w:val="19"/>
-              </w:rPr>
-              <w:t>19x</w:t>
+              <w:t>n/m</w:t>
             </w:r>
           </w:p>
         </w:tc>
@@ -3846,13 +4386,13 @@
               <w:rPr>
                 <w:sz w:val="19"/>
               </w:rPr>
-              <w:t>14.2x</w:t>
+              <w:t>+404% / +425%</w:t>
             </w:r>
           </w:p>
         </w:tc>
         <w:tc>
           <w:tcPr>
-            <w:tcW w:type="dxa" w:w="1152"/>
+            <w:tcW w:type="dxa" w:w="2448"/>
           </w:tcPr>
           <w:p>
             <w:r>
@@ -3864,43 +4404,7 @@
               <w:rPr>
                 <w:sz w:val="19"/>
               </w:rPr>
-              <w:t>3.2x</w:t>
-            </w:r>
-          </w:p>
-        </w:tc>
-        <w:tc>
-          <w:tcPr>
-            <w:tcW w:type="dxa" w:w="1440"/>
-          </w:tcPr>
-          <w:p>
-            <w:r>
-              <w:rPr>
-                <w:sz w:val="19"/>
-              </w:rPr>
-            </w:r>
-            <w:r>
-              <w:rPr>
-                <w:sz w:val="19"/>
-              </w:rPr>
-              <w:t>+13%</w:t>
-            </w:r>
-          </w:p>
-        </w:tc>
-        <w:tc>
-          <w:tcPr>
-            <w:tcW w:type="dxa" w:w="1584"/>
-          </w:tcPr>
-          <w:p>
-            <w:r>
-              <w:rPr>
-                <w:sz w:val="19"/>
-              </w:rPr>
-            </w:r>
-            <w:r>
-              <w:rPr>
-                <w:sz w:val="19"/>
-              </w:rPr>
-              <w:t>17%</w:t>
+              <w:t>micro-float squeezes — not valuations</w:t>
             </w:r>
           </w:p>
         </w:tc>
@@ -3909,34 +4413,25 @@
     <w:p/>
     <w:p>
       <w:r>
-        <w:t xml:space="preserve">The comp that matters is </w:t>
+        <w:t xml:space="preserve">Here's how we read the full shelf. It splits cleanly in two. The float freaks — True Health, Diagens, and honestly Star Sports Med too — trade on scarcity, and their multiples tell you nothing about what a business is worth. The real-money tier — Micro-Tech at 28.5x, Cofoe at 19x, ScienTech at 22x, AK at 13x — is where profitable device companies actually clear. Medcaptain at 59x adjusted sits far above every profitable name on the list, and the only tier that 'supports' its price is the float-freak one. Which is the point: </w:t>
       </w:r>
       <w:r>
         <w:rPr>
           <w:b/>
         </w:rPr>
-        <w:t>Micro-Tech Nanjing</w:t>
-      </w:r>
-      <w:r>
-        <w:t xml:space="preserve"> — same GI-consumables business, already living the same VBP, with double Medcaptain's net margin — at </w:t>
+        <w:t>this deal is priced as a float trade, not as a company.</w:t>
+      </w:r>
+      <w:r>
+        <w:t xml:space="preserve"> Cofoe is the cautionary row — profitable, +39% growth, A+H, and still 17% below its May offer. Sum-of-parts on real-money multiples still lands around </w:t>
       </w:r>
       <w:r>
         <w:rPr>
           <w:b/>
         </w:rPr>
-        <w:t>28.5x</w:t>
-      </w:r>
-      <w:r>
-        <w:t xml:space="preserve">. Medcaptain asks 59x adjusted and a higher P/S. Sum the parts on peer multiples (GI at Micro-Tech's 4.3x sales, life support at 1.5–2x given Penlon, IVD at ~2x) and you get roughly </w:t>
-      </w:r>
-      <w:r>
-        <w:rPr>
-          <w:b/>
-        </w:rPr>
-        <w:t>RMB 4.8–5.1bn against the RMB 7.6bn ask — the deal is ~35–40% above what the pieces support</w:t>
-      </w:r>
-      <w:r>
-        <w:t>. What fills the gap is the ex-Mindray team, Hillhouse's 21%, and the float math. Useful floor datapoint: Kangji — profitable HK MI-consumables — was taken private last December at a mid-teens trailing multiple.</w:t>
+        <w:t>RMB 4.8–5.1bn against the 7.6bn ask</w:t>
+      </w:r>
+      <w:r>
+        <w:t>. And Kangji — profitable HK MI-consumables — went private last December at a mid-teens multiple. That's the floor when the music stops.</w:t>
       </w:r>
     </w:p>
     <w:p>
@@ -4546,6 +5041,854 @@
     <w:p>
       <w:r>
         <w:t>On the A/H angle you raised — yes, it helps, but only for the debut. A live anchor 44% higher makes it hard to lose much on day one (Ingenic, with identical physics, closed its debut flat and sits +1.5% a week later, discount 38%→34%). It is support for the *listing*, not a convergence trade — these discounts sit for years. And note this deal is HK$6.3bn of real supply with a HK$12k entry ticket: expect an Ingenic-style muted open, not a squeeze.</w:t>
+      </w:r>
+    </w:p>
+    <w:p>
+      <w:r>
+        <w:t>One more sanity check — the 2026 A+H hardware shelf, since Longsys joins it next week. Same H-share, same season, very different receptions:</w:t>
+      </w:r>
+    </w:p>
+    <w:tbl>
+      <w:tblPr>
+        <w:tblStyle w:val="LightGrid-Accent1"/>
+        <w:tblW w:type="auto" w:w="0"/>
+        <w:tblLook w:firstColumn="1" w:firstRow="1" w:lastColumn="0" w:lastRow="0" w:noHBand="0" w:noVBand="1" w:val="04A0"/>
+      </w:tblPr>
+      <w:tblGrid>
+        <w:gridCol w:w="1728"/>
+        <w:gridCol w:w="1728"/>
+        <w:gridCol w:w="1728"/>
+        <w:gridCol w:w="1728"/>
+        <w:gridCol w:w="1728"/>
+      </w:tblGrid>
+      <w:tr>
+        <w:tc>
+          <w:tcPr>
+            <w:tcW w:type="dxa" w:w="2592"/>
+          </w:tcPr>
+          <w:p>
+            <w:r/>
+            <w:r>
+              <w:rPr>
+                <w:b/>
+                <w:sz w:val="19"/>
+              </w:rPr>
+            </w:r>
+          </w:p>
+        </w:tc>
+        <w:tc>
+          <w:tcPr>
+            <w:tcW w:type="dxa" w:w="2304"/>
+          </w:tcPr>
+          <w:p>
+            <w:r/>
+            <w:r>
+              <w:rPr>
+                <w:b/>
+                <w:sz w:val="19"/>
+              </w:rPr>
+              <w:t>Trail P/E</w:t>
+            </w:r>
+          </w:p>
+        </w:tc>
+        <w:tc>
+          <w:tcPr>
+            <w:tcW w:type="dxa" w:w="1152"/>
+          </w:tcPr>
+          <w:p>
+            <w:r/>
+            <w:r>
+              <w:rPr>
+                <w:b/>
+                <w:sz w:val="19"/>
+              </w:rPr>
+              <w:t>P/S</w:t>
+            </w:r>
+          </w:p>
+        </w:tc>
+        <w:tc>
+          <w:tcPr>
+            <w:tcW w:type="dxa" w:w="1584"/>
+          </w:tcPr>
+          <w:p>
+            <w:r/>
+            <w:r>
+              <w:rPr>
+                <w:b/>
+                <w:sz w:val="19"/>
+              </w:rPr>
+              <w:t>H1-26 growth</w:t>
+            </w:r>
+          </w:p>
+        </w:tc>
+        <w:tc>
+          <w:tcPr>
+            <w:tcW w:type="dxa" w:w="2448"/>
+          </w:tcPr>
+          <w:p>
+            <w:r/>
+            <w:r>
+              <w:rPr>
+                <w:b/>
+                <w:sz w:val="19"/>
+              </w:rPr>
+              <w:t>vs HK offer</w:t>
+            </w:r>
+          </w:p>
+        </w:tc>
+      </w:tr>
+      <w:tr>
+        <w:tc>
+          <w:tcPr>
+            <w:tcW w:type="dxa" w:w="2592"/>
+          </w:tcPr>
+          <w:p>
+            <w:r>
+              <w:rPr>
+                <w:sz w:val="19"/>
+              </w:rPr>
+            </w:r>
+            <w:r>
+              <w:rPr>
+                <w:b/>
+                <w:sz w:val="19"/>
+              </w:rPr>
+              <w:t>Longsys H @ max</w:t>
+            </w:r>
+          </w:p>
+        </w:tc>
+        <w:tc>
+          <w:tcPr>
+            <w:tcW w:type="dxa" w:w="2304"/>
+          </w:tcPr>
+          <w:p>
+            <w:r>
+              <w:rPr>
+                <w:sz w:val="19"/>
+              </w:rPr>
+            </w:r>
+            <w:r>
+              <w:rPr>
+                <w:b/>
+                <w:sz w:val="19"/>
+              </w:rPr>
+              <w:t>~8x</w:t>
+            </w:r>
+            <w:r>
+              <w:rPr>
+                <w:sz w:val="19"/>
+              </w:rPr>
+              <w:t xml:space="preserve"> (windfall E)</w:t>
+            </w:r>
+          </w:p>
+        </w:tc>
+        <w:tc>
+          <w:tcPr>
+            <w:tcW w:type="dxa" w:w="1152"/>
+          </w:tcPr>
+          <w:p>
+            <w:r>
+              <w:rPr>
+                <w:sz w:val="19"/>
+              </w:rPr>
+            </w:r>
+            <w:r>
+              <w:rPr>
+                <w:sz w:val="19"/>
+              </w:rPr>
+              <w:t>~2x</w:t>
+            </w:r>
+          </w:p>
+        </w:tc>
+        <w:tc>
+          <w:tcPr>
+            <w:tcW w:type="dxa" w:w="1584"/>
+          </w:tcPr>
+          <w:p>
+            <w:r>
+              <w:rPr>
+                <w:sz w:val="19"/>
+              </w:rPr>
+            </w:r>
+            <w:r>
+              <w:rPr>
+                <w:sz w:val="19"/>
+              </w:rPr>
+              <w:t>+136%</w:t>
+            </w:r>
+          </w:p>
+        </w:tc>
+        <w:tc>
+          <w:tcPr>
+            <w:tcW w:type="dxa" w:w="2448"/>
+          </w:tcPr>
+          <w:p>
+            <w:r>
+              <w:rPr>
+                <w:sz w:val="19"/>
+              </w:rPr>
+            </w:r>
+            <w:r>
+              <w:rPr>
+                <w:sz w:val="19"/>
+              </w:rPr>
+              <w:t>—</w:t>
+            </w:r>
+          </w:p>
+        </w:tc>
+      </w:tr>
+      <w:tr>
+        <w:tc>
+          <w:tcPr>
+            <w:tcW w:type="dxa" w:w="2592"/>
+          </w:tcPr>
+          <w:p>
+            <w:r>
+              <w:rPr>
+                <w:sz w:val="19"/>
+              </w:rPr>
+            </w:r>
+            <w:r>
+              <w:rPr>
+                <w:sz w:val="19"/>
+              </w:rPr>
+              <w:t>Innolight 中际旭创 3308</w:t>
+            </w:r>
+          </w:p>
+        </w:tc>
+        <w:tc>
+          <w:tcPr>
+            <w:tcW w:type="dxa" w:w="2304"/>
+          </w:tcPr>
+          <w:p>
+            <w:r>
+              <w:rPr>
+                <w:sz w:val="19"/>
+              </w:rPr>
+            </w:r>
+            <w:r>
+              <w:rPr>
+                <w:sz w:val="19"/>
+              </w:rPr>
+              <w:t>49.3x</w:t>
+            </w:r>
+          </w:p>
+        </w:tc>
+        <w:tc>
+          <w:tcPr>
+            <w:tcW w:type="dxa" w:w="1152"/>
+          </w:tcPr>
+          <w:p>
+            <w:r>
+              <w:rPr>
+                <w:sz w:val="19"/>
+              </w:rPr>
+            </w:r>
+            <w:r>
+              <w:rPr>
+                <w:sz w:val="19"/>
+              </w:rPr>
+              <w:t>15.4x</w:t>
+            </w:r>
+          </w:p>
+        </w:tc>
+        <w:tc>
+          <w:tcPr>
+            <w:tcW w:type="dxa" w:w="1584"/>
+          </w:tcPr>
+          <w:p>
+            <w:r>
+              <w:rPr>
+                <w:sz w:val="19"/>
+              </w:rPr>
+            </w:r>
+            <w:r>
+              <w:rPr>
+                <w:sz w:val="19"/>
+              </w:rPr>
+              <w:t>+183%</w:t>
+            </w:r>
+          </w:p>
+        </w:tc>
+        <w:tc>
+          <w:tcPr>
+            <w:tcW w:type="dxa" w:w="2448"/>
+          </w:tcPr>
+          <w:p>
+            <w:r>
+              <w:rPr>
+                <w:sz w:val="19"/>
+              </w:rPr>
+            </w:r>
+            <w:r>
+              <w:rPr>
+                <w:sz w:val="19"/>
+              </w:rPr>
+              <w:t>+5.6% (H trades ABOVE A)</w:t>
+            </w:r>
+          </w:p>
+        </w:tc>
+      </w:tr>
+      <w:tr>
+        <w:tc>
+          <w:tcPr>
+            <w:tcW w:type="dxa" w:w="2592"/>
+          </w:tcPr>
+          <w:p>
+            <w:r>
+              <w:rPr>
+                <w:sz w:val="19"/>
+              </w:rPr>
+            </w:r>
+            <w:r>
+              <w:rPr>
+                <w:sz w:val="19"/>
+              </w:rPr>
+              <w:t>CCTC 三环 6951</w:t>
+            </w:r>
+          </w:p>
+        </w:tc>
+        <w:tc>
+          <w:tcPr>
+            <w:tcW w:type="dxa" w:w="2304"/>
+          </w:tcPr>
+          <w:p>
+            <w:r>
+              <w:rPr>
+                <w:sz w:val="19"/>
+              </w:rPr>
+            </w:r>
+            <w:r>
+              <w:rPr>
+                <w:sz w:val="19"/>
+              </w:rPr>
+              <w:t>65.4x</w:t>
+            </w:r>
+          </w:p>
+        </w:tc>
+        <w:tc>
+          <w:tcPr>
+            <w:tcW w:type="dxa" w:w="1152"/>
+          </w:tcPr>
+          <w:p>
+            <w:r>
+              <w:rPr>
+                <w:sz w:val="19"/>
+              </w:rPr>
+            </w:r>
+            <w:r>
+              <w:rPr>
+                <w:sz w:val="19"/>
+              </w:rPr>
+              <w:t>19.2x</w:t>
+            </w:r>
+          </w:p>
+        </w:tc>
+        <w:tc>
+          <w:tcPr>
+            <w:tcW w:type="dxa" w:w="1584"/>
+          </w:tcPr>
+          <w:p>
+            <w:r>
+              <w:rPr>
+                <w:sz w:val="19"/>
+              </w:rPr>
+            </w:r>
+            <w:r>
+              <w:rPr>
+                <w:sz w:val="19"/>
+              </w:rPr>
+              <w:t>+55%</w:t>
+            </w:r>
+          </w:p>
+        </w:tc>
+        <w:tc>
+          <w:tcPr>
+            <w:tcW w:type="dxa" w:w="2448"/>
+          </w:tcPr>
+          <w:p>
+            <w:r>
+              <w:rPr>
+                <w:sz w:val="19"/>
+              </w:rPr>
+            </w:r>
+            <w:r>
+              <w:rPr>
+                <w:sz w:val="19"/>
+              </w:rPr>
+              <w:t>+9.7%</w:t>
+            </w:r>
+          </w:p>
+        </w:tc>
+      </w:tr>
+      <w:tr>
+        <w:tc>
+          <w:tcPr>
+            <w:tcW w:type="dxa" w:w="2592"/>
+          </w:tcPr>
+          <w:p>
+            <w:r>
+              <w:rPr>
+                <w:sz w:val="19"/>
+              </w:rPr>
+            </w:r>
+            <w:r>
+              <w:rPr>
+                <w:sz w:val="19"/>
+              </w:rPr>
+              <w:t>Anker 安克 0668</w:t>
+            </w:r>
+          </w:p>
+        </w:tc>
+        <w:tc>
+          <w:tcPr>
+            <w:tcW w:type="dxa" w:w="2304"/>
+          </w:tcPr>
+          <w:p>
+            <w:r>
+              <w:rPr>
+                <w:sz w:val="19"/>
+              </w:rPr>
+            </w:r>
+            <w:r>
+              <w:rPr>
+                <w:sz w:val="19"/>
+              </w:rPr>
+              <w:t>~22x</w:t>
+            </w:r>
+          </w:p>
+        </w:tc>
+        <w:tc>
+          <w:tcPr>
+            <w:tcW w:type="dxa" w:w="1152"/>
+          </w:tcPr>
+          <w:p>
+            <w:r>
+              <w:rPr>
+                <w:sz w:val="19"/>
+              </w:rPr>
+            </w:r>
+            <w:r>
+              <w:rPr>
+                <w:sz w:val="19"/>
+              </w:rPr>
+              <w:t>2.0x</w:t>
+            </w:r>
+          </w:p>
+        </w:tc>
+        <w:tc>
+          <w:tcPr>
+            <w:tcW w:type="dxa" w:w="1584"/>
+          </w:tcPr>
+          <w:p>
+            <w:r>
+              <w:rPr>
+                <w:sz w:val="19"/>
+              </w:rPr>
+            </w:r>
+            <w:r>
+              <w:rPr>
+                <w:sz w:val="19"/>
+              </w:rPr>
+              <w:t>+29%</w:t>
+            </w:r>
+          </w:p>
+        </w:tc>
+        <w:tc>
+          <w:tcPr>
+            <w:tcW w:type="dxa" w:w="2448"/>
+          </w:tcPr>
+          <w:p>
+            <w:r>
+              <w:rPr>
+                <w:sz w:val="19"/>
+              </w:rPr>
+            </w:r>
+            <w:r>
+              <w:rPr>
+                <w:b/>
+                <w:sz w:val="19"/>
+              </w:rPr>
+              <w:t>+27%</w:t>
+            </w:r>
+          </w:p>
+        </w:tc>
+      </w:tr>
+      <w:tr>
+        <w:tc>
+          <w:tcPr>
+            <w:tcW w:type="dxa" w:w="2592"/>
+          </w:tcPr>
+          <w:p>
+            <w:r>
+              <w:rPr>
+                <w:sz w:val="19"/>
+              </w:rPr>
+            </w:r>
+            <w:r>
+              <w:rPr>
+                <w:sz w:val="19"/>
+              </w:rPr>
+              <w:t>Luxshare 立讯 2475</w:t>
+            </w:r>
+          </w:p>
+        </w:tc>
+        <w:tc>
+          <w:tcPr>
+            <w:tcW w:type="dxa" w:w="2304"/>
+          </w:tcPr>
+          <w:p>
+            <w:r>
+              <w:rPr>
+                <w:sz w:val="19"/>
+              </w:rPr>
+            </w:r>
+            <w:r>
+              <w:rPr>
+                <w:sz w:val="19"/>
+              </w:rPr>
+              <w:t>26.5x</w:t>
+            </w:r>
+          </w:p>
+        </w:tc>
+        <w:tc>
+          <w:tcPr>
+            <w:tcW w:type="dxa" w:w="1152"/>
+          </w:tcPr>
+          <w:p>
+            <w:r>
+              <w:rPr>
+                <w:sz w:val="19"/>
+              </w:rPr>
+            </w:r>
+            <w:r>
+              <w:rPr>
+                <w:sz w:val="19"/>
+              </w:rPr>
+              <w:t>1.2x</w:t>
+            </w:r>
+          </w:p>
+        </w:tc>
+        <w:tc>
+          <w:tcPr>
+            <w:tcW w:type="dxa" w:w="1584"/>
+          </w:tcPr>
+          <w:p>
+            <w:r>
+              <w:rPr>
+                <w:sz w:val="19"/>
+              </w:rPr>
+            </w:r>
+            <w:r>
+              <w:rPr>
+                <w:sz w:val="19"/>
+              </w:rPr>
+              <w:t>+40%</w:t>
+            </w:r>
+          </w:p>
+        </w:tc>
+        <w:tc>
+          <w:tcPr>
+            <w:tcW w:type="dxa" w:w="2448"/>
+          </w:tcPr>
+          <w:p>
+            <w:r>
+              <w:rPr>
+                <w:sz w:val="19"/>
+              </w:rPr>
+            </w:r>
+            <w:r>
+              <w:rPr>
+                <w:sz w:val="19"/>
+              </w:rPr>
+              <w:t>+0.3%</w:t>
+            </w:r>
+          </w:p>
+        </w:tc>
+      </w:tr>
+      <w:tr>
+        <w:tc>
+          <w:tcPr>
+            <w:tcW w:type="dxa" w:w="2592"/>
+          </w:tcPr>
+          <w:p>
+            <w:r>
+              <w:rPr>
+                <w:sz w:val="19"/>
+              </w:rPr>
+            </w:r>
+            <w:r>
+              <w:rPr>
+                <w:sz w:val="19"/>
+              </w:rPr>
+              <w:t>Creality 创想三维 3388</w:t>
+            </w:r>
+          </w:p>
+        </w:tc>
+        <w:tc>
+          <w:tcPr>
+            <w:tcW w:type="dxa" w:w="2304"/>
+          </w:tcPr>
+          <w:p>
+            <w:r>
+              <w:rPr>
+                <w:sz w:val="19"/>
+              </w:rPr>
+            </w:r>
+            <w:r>
+              <w:rPr>
+                <w:sz w:val="19"/>
+              </w:rPr>
+              <w:t>n/m</w:t>
+            </w:r>
+          </w:p>
+        </w:tc>
+        <w:tc>
+          <w:tcPr>
+            <w:tcW w:type="dxa" w:w="1152"/>
+          </w:tcPr>
+          <w:p>
+            <w:r>
+              <w:rPr>
+                <w:sz w:val="19"/>
+              </w:rPr>
+            </w:r>
+            <w:r>
+              <w:rPr>
+                <w:sz w:val="19"/>
+              </w:rPr>
+              <w:t>2.8x</w:t>
+            </w:r>
+          </w:p>
+        </w:tc>
+        <w:tc>
+          <w:tcPr>
+            <w:tcW w:type="dxa" w:w="1584"/>
+          </w:tcPr>
+          <w:p>
+            <w:r>
+              <w:rPr>
+                <w:sz w:val="19"/>
+              </w:rPr>
+            </w:r>
+            <w:r>
+              <w:rPr>
+                <w:sz w:val="19"/>
+              </w:rPr>
+              <w:t>+76%</w:t>
+            </w:r>
+          </w:p>
+        </w:tc>
+        <w:tc>
+          <w:tcPr>
+            <w:tcW w:type="dxa" w:w="2448"/>
+          </w:tcPr>
+          <w:p>
+            <w:r>
+              <w:rPr>
+                <w:sz w:val="19"/>
+              </w:rPr>
+            </w:r>
+            <w:r>
+              <w:rPr>
+                <w:sz w:val="19"/>
+              </w:rPr>
+              <w:t>+29%</w:t>
+            </w:r>
+          </w:p>
+        </w:tc>
+      </w:tr>
+      <w:tr>
+        <w:tc>
+          <w:tcPr>
+            <w:tcW w:type="dxa" w:w="2592"/>
+          </w:tcPr>
+          <w:p>
+            <w:r>
+              <w:rPr>
+                <w:sz w:val="19"/>
+              </w:rPr>
+            </w:r>
+            <w:r>
+              <w:rPr>
+                <w:sz w:val="19"/>
+              </w:rPr>
+              <w:t>Dtech 鼎泰 1377</w:t>
+            </w:r>
+          </w:p>
+        </w:tc>
+        <w:tc>
+          <w:tcPr>
+            <w:tcW w:type="dxa" w:w="2304"/>
+          </w:tcPr>
+          <w:p>
+            <w:r>
+              <w:rPr>
+                <w:sz w:val="19"/>
+              </w:rPr>
+            </w:r>
+            <w:r>
+              <w:rPr>
+                <w:sz w:val="19"/>
+              </w:rPr>
+              <w:t>very high (AI-PCB mania)</w:t>
+            </w:r>
+          </w:p>
+        </w:tc>
+        <w:tc>
+          <w:tcPr>
+            <w:tcW w:type="dxa" w:w="1152"/>
+          </w:tcPr>
+          <w:p>
+            <w:r>
+              <w:rPr>
+                <w:sz w:val="19"/>
+              </w:rPr>
+            </w:r>
+            <w:r>
+              <w:rPr>
+                <w:sz w:val="19"/>
+              </w:rPr>
+              <w:t>—</w:t>
+            </w:r>
+          </w:p>
+        </w:tc>
+        <w:tc>
+          <w:tcPr>
+            <w:tcW w:type="dxa" w:w="1584"/>
+          </w:tcPr>
+          <w:p>
+            <w:r>
+              <w:rPr>
+                <w:sz w:val="19"/>
+              </w:rPr>
+            </w:r>
+            <w:r>
+              <w:rPr>
+                <w:sz w:val="19"/>
+              </w:rPr>
+              <w:t>+115%</w:t>
+            </w:r>
+          </w:p>
+        </w:tc>
+        <w:tc>
+          <w:tcPr>
+            <w:tcW w:type="dxa" w:w="2448"/>
+          </w:tcPr>
+          <w:p>
+            <w:r>
+              <w:rPr>
+                <w:sz w:val="19"/>
+              </w:rPr>
+            </w:r>
+            <w:r>
+              <w:rPr>
+                <w:sz w:val="19"/>
+              </w:rPr>
+              <w:t>−12%</w:t>
+            </w:r>
+          </w:p>
+        </w:tc>
+      </w:tr>
+      <w:tr>
+        <w:tc>
+          <w:tcPr>
+            <w:tcW w:type="dxa" w:w="2592"/>
+          </w:tcPr>
+          <w:p>
+            <w:r>
+              <w:rPr>
+                <w:sz w:val="19"/>
+              </w:rPr>
+            </w:r>
+            <w:r>
+              <w:rPr>
+                <w:b/>
+                <w:sz w:val="19"/>
+              </w:rPr>
+              <w:t>Lingyi 领益 1688</w:t>
+            </w:r>
+          </w:p>
+        </w:tc>
+        <w:tc>
+          <w:tcPr>
+            <w:tcW w:type="dxa" w:w="2304"/>
+          </w:tcPr>
+          <w:p>
+            <w:r>
+              <w:rPr>
+                <w:sz w:val="19"/>
+              </w:rPr>
+            </w:r>
+            <w:r>
+              <w:rPr>
+                <w:sz w:val="19"/>
+              </w:rPr>
+              <w:t>~21x (H basis)</w:t>
+            </w:r>
+          </w:p>
+        </w:tc>
+        <w:tc>
+          <w:tcPr>
+            <w:tcW w:type="dxa" w:w="1152"/>
+          </w:tcPr>
+          <w:p>
+            <w:r>
+              <w:rPr>
+                <w:sz w:val="19"/>
+              </w:rPr>
+            </w:r>
+            <w:r>
+              <w:rPr>
+                <w:sz w:val="19"/>
+              </w:rPr>
+              <w:t>0.8x</w:t>
+            </w:r>
+          </w:p>
+        </w:tc>
+        <w:tc>
+          <w:tcPr>
+            <w:tcW w:type="dxa" w:w="1584"/>
+          </w:tcPr>
+          <w:p>
+            <w:r>
+              <w:rPr>
+                <w:sz w:val="19"/>
+              </w:rPr>
+            </w:r>
+            <w:r>
+              <w:rPr>
+                <w:sz w:val="19"/>
+              </w:rPr>
+              <w:t>+7%</w:t>
+            </w:r>
+          </w:p>
+        </w:tc>
+        <w:tc>
+          <w:tcPr>
+            <w:tcW w:type="dxa" w:w="2448"/>
+          </w:tcPr>
+          <w:p>
+            <w:r>
+              <w:rPr>
+                <w:sz w:val="19"/>
+              </w:rPr>
+            </w:r>
+            <w:r>
+              <w:rPr>
+                <w:b/>
+                <w:sz w:val="19"/>
+              </w:rPr>
+              <w:t>−38%</w:t>
+            </w:r>
+          </w:p>
+        </w:tc>
+      </w:tr>
+    </w:tbl>
+    <w:p/>
+    <w:p>
+      <w:r>
+        <w:t>The pattern on that shelf is brutal and simple: HK pays up for franchise and AI linkage (Anker +27%, Innolight's H trading above its A) and it punishes pass-through processing — Lingyi, the closest thing to Longsys's business model on the list, sits 38% below its own June offer at 0.8x sales. Longsys screens as the cheapest name on the shelf at ~8x — but it's the only one whose trailing earnings are an inventory gain. Put the normalised RMB 6–10bn under it and it lands at 10–17x: middle of the shelf, for the shelf's most cyclical model. There's no free cheapness here.</w:t>
       </w:r>
     </w:p>
     <w:p>
@@ -4717,7 +6060,7 @@
         </w:tc>
         <w:tc>
           <w:tcPr>
-            <w:tcW w:type="dxa" w:w="2016"/>
+            <w:tcW w:type="dxa" w:w="1872"/>
           </w:tcPr>
           <w:p>
             <w:r/>
@@ -4726,13 +6069,13 @@
                 <w:b/>
                 <w:sz w:val="19"/>
               </w:rPr>
-              <w:t>P/S (FY25 rev)</w:t>
+              <w:t>P/S</w:t>
             </w:r>
           </w:p>
         </w:tc>
         <w:tc>
           <w:tcPr>
-            <w:tcW w:type="dxa" w:w="1008"/>
+            <w:tcW w:type="dxa" w:w="864"/>
           </w:tcPr>
           <w:p>
             <w:r/>
@@ -4741,7 +6084,7 @@
                 <w:b/>
                 <w:sz w:val="19"/>
               </w:rPr>
-              <w:t>GM</w:t>
+              <w:t>P/E</w:t>
             </w:r>
           </w:p>
         </w:tc>
@@ -4762,7 +6105,7 @@
         </w:tc>
         <w:tc>
           <w:tcPr>
-            <w:tcW w:type="dxa" w:w="1872"/>
+            <w:tcW w:type="dxa" w:w="1728"/>
           </w:tcPr>
           <w:p>
             <w:r/>
@@ -4786,7 +6129,7 @@
                 <w:b/>
                 <w:sz w:val="19"/>
               </w:rPr>
-              <w:t>What moved it</w:t>
+              <w:t>Note</w:t>
             </w:r>
           </w:p>
         </w:tc>
@@ -4813,7 +6156,7 @@
         </w:tc>
         <w:tc>
           <w:tcPr>
-            <w:tcW w:type="dxa" w:w="2016"/>
+            <w:tcW w:type="dxa" w:w="1872"/>
           </w:tcPr>
           <w:p>
             <w:r>
@@ -4826,13 +6169,13 @@
                 <w:b/>
                 <w:sz w:val="19"/>
               </w:rPr>
-              <w:t>17–23x</w:t>
+              <w:t>17–23x FY25</w:t>
             </w:r>
           </w:p>
         </w:tc>
         <w:tc>
           <w:tcPr>
-            <w:tcW w:type="dxa" w:w="1008"/>
+            <w:tcW w:type="dxa" w:w="864"/>
           </w:tcPr>
           <w:p>
             <w:r>
@@ -4844,7 +6187,7 @@
               <w:rPr>
                 <w:sz w:val="19"/>
               </w:rPr>
-              <w:t>13.9%</w:t>
+              <w:t>n/m</w:t>
             </w:r>
           </w:p>
         </w:tc>
@@ -4868,7 +6211,7 @@
         </w:tc>
         <w:tc>
           <w:tcPr>
-            <w:tcW w:type="dxa" w:w="1872"/>
+            <w:tcW w:type="dxa" w:w="1728"/>
           </w:tcPr>
           <w:p>
             <w:r>
@@ -4898,7 +6241,7 @@
               <w:rPr>
                 <w:sz w:val="19"/>
               </w:rPr>
-              <w:t>one customer = 32% of revenue</w:t>
+              <w:t>GM 13.9%; one customer = 32% of rev</w:t>
             </w:r>
           </w:p>
         </w:tc>
@@ -4924,7 +6267,7 @@
         </w:tc>
         <w:tc>
           <w:tcPr>
-            <w:tcW w:type="dxa" w:w="2016"/>
+            <w:tcW w:type="dxa" w:w="1872"/>
           </w:tcPr>
           <w:p>
             <w:r>
@@ -4936,13 +6279,13 @@
               <w:rPr>
                 <w:sz w:val="19"/>
               </w:rPr>
-              <w:t>26.6x (18.3x TTM)</w:t>
+              <w:t>26.6x FY25 / 18.3x TTM</w:t>
             </w:r>
           </w:p>
         </w:tc>
         <w:tc>
           <w:tcPr>
-            <w:tcW w:type="dxa" w:w="1008"/>
+            <w:tcW w:type="dxa" w:w="864"/>
           </w:tcPr>
           <w:p>
             <w:r>
@@ -4954,7 +6297,7 @@
               <w:rPr>
                 <w:sz w:val="19"/>
               </w:rPr>
-              <w:t>35%</w:t>
+              <w:t>n/m</w:t>
             </w:r>
           </w:p>
         </w:tc>
@@ -4978,7 +6321,7 @@
         </w:tc>
         <w:tc>
           <w:tcPr>
-            <w:tcW w:type="dxa" w:w="1872"/>
+            <w:tcW w:type="dxa" w:w="1728"/>
           </w:tcPr>
           <w:p>
             <w:r>
@@ -5008,7 +6351,7 @@
               <w:rPr>
                 <w:sz w:val="19"/>
               </w:rPr>
-              <w:t>float + loss trajectory (below)</w:t>
+              <w:t>adj. loss +247%, float just expanded</w:t>
             </w:r>
           </w:p>
         </w:tc>
@@ -5028,13 +6371,13 @@
               <w:rPr>
                 <w:sz w:val="19"/>
               </w:rPr>
-              <w:t>OneRobotics 6600</w:t>
+              <w:t>UISEE 驭势 1511</w:t>
             </w:r>
           </w:p>
         </w:tc>
         <w:tc>
           <w:tcPr>
-            <w:tcW w:type="dxa" w:w="2016"/>
+            <w:tcW w:type="dxa" w:w="1872"/>
           </w:tcPr>
           <w:p>
             <w:r>
@@ -5046,13 +6389,13 @@
               <w:rPr>
                 <w:sz w:val="19"/>
               </w:rPr>
-              <w:t>11.5x</w:t>
+              <w:t>25.6x</w:t>
             </w:r>
           </w:p>
         </w:tc>
         <w:tc>
           <w:tcPr>
-            <w:tcW w:type="dxa" w:w="1008"/>
+            <w:tcW w:type="dxa" w:w="864"/>
           </w:tcPr>
           <w:p>
             <w:r>
@@ -5064,7 +6407,7 @@
               <w:rPr>
                 <w:sz w:val="19"/>
               </w:rPr>
-              <w:t>50%</w:t>
+              <w:t>n/m</w:t>
             </w:r>
           </w:p>
         </w:tc>
@@ -5082,13 +6425,13 @@
               <w:rPr>
                 <w:sz w:val="19"/>
               </w:rPr>
-              <w:t>+32%, slowing</w:t>
+              <w:t>+24%</w:t>
             </w:r>
           </w:p>
         </w:tc>
         <w:tc>
           <w:tcPr>
-            <w:tcW w:type="dxa" w:w="1872"/>
+            <w:tcW w:type="dxa" w:w="1728"/>
           </w:tcPr>
           <w:p>
             <w:r>
@@ -5098,10 +6441,9 @@
             </w:r>
             <w:r>
               <w:rPr>
-                <w:b/>
-                <w:sz w:val="19"/>
-              </w:rPr>
-              <w:t>−31%, at all-time low</w:t>
+                <w:sz w:val="19"/>
+              </w:rPr>
+              <w:t>−7%</w:t>
             </w:r>
           </w:p>
         </w:tc>
@@ -5114,12 +6456,6 @@
               <w:rPr>
                 <w:sz w:val="19"/>
               </w:rPr>
-            </w:r>
-            <w:r>
-              <w:rPr>
-                <w:sz w:val="19"/>
-              </w:rPr>
-              <w:t>unlock + growth deceleration</w:t>
             </w:r>
           </w:p>
         </w:tc>
@@ -5139,13 +6475,13 @@
               <w:rPr>
                 <w:sz w:val="19"/>
               </w:rPr>
-              <w:t>Ninebot 689009 (profitable ref.)</w:t>
+              <w:t>Momenta 6880</w:t>
             </w:r>
           </w:p>
         </w:tc>
         <w:tc>
           <w:tcPr>
-            <w:tcW w:type="dxa" w:w="2016"/>
+            <w:tcW w:type="dxa" w:w="1872"/>
           </w:tcPr>
           <w:p>
             <w:r>
@@ -5157,13 +6493,13 @@
               <w:rPr>
                 <w:sz w:val="19"/>
               </w:rPr>
-              <w:t>1.3x TTM</w:t>
+              <w:t>20.2x</w:t>
             </w:r>
           </w:p>
         </w:tc>
         <w:tc>
           <w:tcPr>
-            <w:tcW w:type="dxa" w:w="1008"/>
+            <w:tcW w:type="dxa" w:w="864"/>
           </w:tcPr>
           <w:p>
             <w:r>
@@ -5175,7 +6511,7 @@
               <w:rPr>
                 <w:sz w:val="19"/>
               </w:rPr>
-              <w:t>—</w:t>
+              <w:t>n/m</w:t>
             </w:r>
           </w:p>
         </w:tc>
@@ -5193,13 +6529,13 @@
               <w:rPr>
                 <w:sz w:val="19"/>
               </w:rPr>
-              <w:t>—</w:t>
+              <w:t>+82%</w:t>
             </w:r>
           </w:p>
         </w:tc>
         <w:tc>
           <w:tcPr>
-            <w:tcW w:type="dxa" w:w="1872"/>
+            <w:tcW w:type="dxa" w:w="1728"/>
           </w:tcPr>
           <w:p>
             <w:r>
@@ -5211,7 +6547,7 @@
               <w:rPr>
                 <w:sz w:val="19"/>
               </w:rPr>
-              <w:t>−42% 1yr</w:t>
+              <w:t>−22%</w:t>
             </w:r>
           </w:p>
         </w:tc>
@@ -5229,7 +6565,7 @@
               <w:rPr>
                 <w:sz w:val="19"/>
               </w:rPr>
-              <w:t>what profitable robots fetch</w:t>
+              <w:t>HK$3.9bn ttm loss</w:t>
             </w:r>
           </w:p>
         </w:tc>
@@ -5249,13 +6585,13 @@
               <w:rPr>
                 <w:sz w:val="19"/>
               </w:rPr>
-              <w:t>Mech-Mind 9615 (top of the barrel)</w:t>
+              <w:t>Rokae 3752</w:t>
             </w:r>
           </w:p>
         </w:tc>
         <w:tc>
           <w:tcPr>
-            <w:tcW w:type="dxa" w:w="2016"/>
+            <w:tcW w:type="dxa" w:w="1872"/>
           </w:tcPr>
           <w:p>
             <w:r>
@@ -5267,13 +6603,13 @@
               <w:rPr>
                 <w:sz w:val="19"/>
               </w:rPr>
-              <w:t>~29x at IPO</w:t>
+              <w:t>19.6x</w:t>
             </w:r>
           </w:p>
         </w:tc>
         <w:tc>
           <w:tcPr>
-            <w:tcW w:type="dxa" w:w="1008"/>
+            <w:tcW w:type="dxa" w:w="864"/>
           </w:tcPr>
           <w:p>
             <w:r>
@@ -5285,7 +6621,7 @@
               <w:rPr>
                 <w:sz w:val="19"/>
               </w:rPr>
-              <w:t>65%</w:t>
+              <w:t>n/m</w:t>
             </w:r>
           </w:p>
         </w:tc>
@@ -5303,7 +6639,63 @@
               <w:rPr>
                 <w:sz w:val="19"/>
               </w:rPr>
-              <w:t>+73%</w:t>
+              <w:t>+60%</w:t>
+            </w:r>
+          </w:p>
+        </w:tc>
+        <w:tc>
+          <w:tcPr>
+            <w:tcW w:type="dxa" w:w="1728"/>
+          </w:tcPr>
+          <w:p>
+            <w:r>
+              <w:rPr>
+                <w:sz w:val="19"/>
+              </w:rPr>
+            </w:r>
+            <w:r>
+              <w:rPr>
+                <w:sz w:val="19"/>
+              </w:rPr>
+              <w:t>+41%</w:t>
+            </w:r>
+          </w:p>
+        </w:tc>
+        <w:tc>
+          <w:tcPr>
+            <w:tcW w:type="dxa" w:w="2736"/>
+          </w:tcPr>
+          <w:p>
+            <w:r>
+              <w:rPr>
+                <w:sz w:val="19"/>
+              </w:rPr>
+            </w:r>
+            <w:r>
+              <w:rPr>
+                <w:sz w:val="19"/>
+              </w:rPr>
+              <w:t>−18.5% on Sep 1 alone (Mech-Mind debut repriced it)</w:t>
+            </w:r>
+          </w:p>
+        </w:tc>
+      </w:tr>
+      <w:tr>
+        <w:tc>
+          <w:tcPr>
+            <w:tcW w:type="dxa" w:w="2736"/>
+          </w:tcPr>
+          <w:p>
+            <w:r>
+              <w:rPr>
+                <w:sz w:val="19"/>
+              </w:rPr>
+            </w:r>
+            <w:r>
+              <w:rPr>
+                <w:sz w:val="19"/>
+              </w:rPr>
+              <w:t>LDRobot 乐动 1236</w:t>
             </w:r>
           </w:p>
         </w:tc>
@@ -5321,7 +6713,61 @@
               <w:rPr>
                 <w:sz w:val="19"/>
               </w:rPr>
-              <w:t>lists today</w:t>
+              <w:t>14.4x</w:t>
+            </w:r>
+          </w:p>
+        </w:tc>
+        <w:tc>
+          <w:tcPr>
+            <w:tcW w:type="dxa" w:w="864"/>
+          </w:tcPr>
+          <w:p>
+            <w:r>
+              <w:rPr>
+                <w:sz w:val="19"/>
+              </w:rPr>
+            </w:r>
+            <w:r>
+              <w:rPr>
+                <w:sz w:val="19"/>
+              </w:rPr>
+              <w:t>n/m</w:t>
+            </w:r>
+          </w:p>
+        </w:tc>
+        <w:tc>
+          <w:tcPr>
+            <w:tcW w:type="dxa" w:w="1584"/>
+          </w:tcPr>
+          <w:p>
+            <w:r>
+              <w:rPr>
+                <w:sz w:val="19"/>
+              </w:rPr>
+            </w:r>
+            <w:r>
+              <w:rPr>
+                <w:sz w:val="19"/>
+              </w:rPr>
+              <w:t>+60%</w:t>
+            </w:r>
+          </w:p>
+        </w:tc>
+        <w:tc>
+          <w:tcPr>
+            <w:tcW w:type="dxa" w:w="1728"/>
+          </w:tcPr>
+          <w:p>
+            <w:r>
+              <w:rPr>
+                <w:sz w:val="19"/>
+              </w:rPr>
+            </w:r>
+            <w:r>
+              <w:rPr>
+                <w:sz w:val="19"/>
+              </w:rPr>
+              <w:t>+36%</w:t>
             </w:r>
           </w:p>
         </w:tc>
@@ -5335,11 +6781,746 @@
                 <w:sz w:val="19"/>
               </w:rPr>
             </w:r>
-            <w:r>
-              <w:rPr>
-                <w:sz w:val="19"/>
-              </w:rPr>
-              <w:t>the contrast case</w:t>
+          </w:p>
+        </w:tc>
+      </w:tr>
+      <w:tr>
+        <w:tc>
+          <w:tcPr>
+            <w:tcW w:type="dxa" w:w="2736"/>
+          </w:tcPr>
+          <w:p>
+            <w:r>
+              <w:rPr>
+                <w:sz w:val="19"/>
+              </w:rPr>
+            </w:r>
+            <w:r>
+              <w:rPr>
+                <w:sz w:val="19"/>
+              </w:rPr>
+              <w:t>Robotphoenix 翼菲 6871</w:t>
+            </w:r>
+          </w:p>
+        </w:tc>
+        <w:tc>
+          <w:tcPr>
+            <w:tcW w:type="dxa" w:w="1872"/>
+          </w:tcPr>
+          <w:p>
+            <w:r>
+              <w:rPr>
+                <w:sz w:val="19"/>
+              </w:rPr>
+            </w:r>
+            <w:r>
+              <w:rPr>
+                <w:sz w:val="19"/>
+              </w:rPr>
+              <w:t>13.0x</w:t>
+            </w:r>
+          </w:p>
+        </w:tc>
+        <w:tc>
+          <w:tcPr>
+            <w:tcW w:type="dxa" w:w="864"/>
+          </w:tcPr>
+          <w:p>
+            <w:r>
+              <w:rPr>
+                <w:sz w:val="19"/>
+              </w:rPr>
+            </w:r>
+            <w:r>
+              <w:rPr>
+                <w:sz w:val="19"/>
+              </w:rPr>
+              <w:t>n/m</w:t>
+            </w:r>
+          </w:p>
+        </w:tc>
+        <w:tc>
+          <w:tcPr>
+            <w:tcW w:type="dxa" w:w="1584"/>
+          </w:tcPr>
+          <w:p>
+            <w:r>
+              <w:rPr>
+                <w:sz w:val="19"/>
+              </w:rPr>
+            </w:r>
+            <w:r>
+              <w:rPr>
+                <w:sz w:val="19"/>
+              </w:rPr>
+              <w:t>+45%</w:t>
+            </w:r>
+          </w:p>
+        </w:tc>
+        <w:tc>
+          <w:tcPr>
+            <w:tcW w:type="dxa" w:w="1728"/>
+          </w:tcPr>
+          <w:p>
+            <w:r>
+              <w:rPr>
+                <w:sz w:val="19"/>
+              </w:rPr>
+            </w:r>
+            <w:r>
+              <w:rPr>
+                <w:sz w:val="19"/>
+              </w:rPr>
+              <w:t>−10%</w:t>
+            </w:r>
+          </w:p>
+        </w:tc>
+        <w:tc>
+          <w:tcPr>
+            <w:tcW w:type="dxa" w:w="2736"/>
+          </w:tcPr>
+          <w:p>
+            <w:r>
+              <w:rPr>
+                <w:sz w:val="19"/>
+              </w:rPr>
+            </w:r>
+          </w:p>
+        </w:tc>
+      </w:tr>
+      <w:tr>
+        <w:tc>
+          <w:tcPr>
+            <w:tcW w:type="dxa" w:w="2736"/>
+          </w:tcPr>
+          <w:p>
+            <w:r>
+              <w:rPr>
+                <w:sz w:val="19"/>
+              </w:rPr>
+            </w:r>
+            <w:r>
+              <w:rPr>
+                <w:sz w:val="19"/>
+              </w:rPr>
+              <w:t>Seer 仙工 6106</w:t>
+            </w:r>
+          </w:p>
+        </w:tc>
+        <w:tc>
+          <w:tcPr>
+            <w:tcW w:type="dxa" w:w="1872"/>
+          </w:tcPr>
+          <w:p>
+            <w:r>
+              <w:rPr>
+                <w:sz w:val="19"/>
+              </w:rPr>
+            </w:r>
+            <w:r>
+              <w:rPr>
+                <w:sz w:val="19"/>
+              </w:rPr>
+              <w:t>11.8x</w:t>
+            </w:r>
+          </w:p>
+        </w:tc>
+        <w:tc>
+          <w:tcPr>
+            <w:tcW w:type="dxa" w:w="864"/>
+          </w:tcPr>
+          <w:p>
+            <w:r>
+              <w:rPr>
+                <w:sz w:val="19"/>
+              </w:rPr>
+            </w:r>
+            <w:r>
+              <w:rPr>
+                <w:sz w:val="19"/>
+              </w:rPr>
+              <w:t>n/m</w:t>
+            </w:r>
+          </w:p>
+        </w:tc>
+        <w:tc>
+          <w:tcPr>
+            <w:tcW w:type="dxa" w:w="1584"/>
+          </w:tcPr>
+          <w:p>
+            <w:r>
+              <w:rPr>
+                <w:sz w:val="19"/>
+              </w:rPr>
+            </w:r>
+            <w:r>
+              <w:rPr>
+                <w:sz w:val="19"/>
+              </w:rPr>
+              <w:t>+30%</w:t>
+            </w:r>
+          </w:p>
+        </w:tc>
+        <w:tc>
+          <w:tcPr>
+            <w:tcW w:type="dxa" w:w="1728"/>
+          </w:tcPr>
+          <w:p>
+            <w:r>
+              <w:rPr>
+                <w:sz w:val="19"/>
+              </w:rPr>
+            </w:r>
+            <w:r>
+              <w:rPr>
+                <w:sz w:val="19"/>
+              </w:rPr>
+              <w:t>−34%</w:t>
+            </w:r>
+          </w:p>
+        </w:tc>
+        <w:tc>
+          <w:tcPr>
+            <w:tcW w:type="dxa" w:w="2736"/>
+          </w:tcPr>
+          <w:p>
+            <w:r>
+              <w:rPr>
+                <w:sz w:val="19"/>
+              </w:rPr>
+            </w:r>
+          </w:p>
+        </w:tc>
+      </w:tr>
+      <w:tr>
+        <w:tc>
+          <w:tcPr>
+            <w:tcW w:type="dxa" w:w="2736"/>
+          </w:tcPr>
+          <w:p>
+            <w:r>
+              <w:rPr>
+                <w:sz w:val="19"/>
+              </w:rPr>
+            </w:r>
+            <w:r>
+              <w:rPr>
+                <w:sz w:val="19"/>
+              </w:rPr>
+              <w:t>Galaxis 凯乐士 2729</w:t>
+            </w:r>
+          </w:p>
+        </w:tc>
+        <w:tc>
+          <w:tcPr>
+            <w:tcW w:type="dxa" w:w="1872"/>
+          </w:tcPr>
+          <w:p>
+            <w:r>
+              <w:rPr>
+                <w:sz w:val="19"/>
+              </w:rPr>
+            </w:r>
+            <w:r>
+              <w:rPr>
+                <w:sz w:val="19"/>
+              </w:rPr>
+              <w:t>11.7x</w:t>
+            </w:r>
+          </w:p>
+        </w:tc>
+        <w:tc>
+          <w:tcPr>
+            <w:tcW w:type="dxa" w:w="864"/>
+          </w:tcPr>
+          <w:p>
+            <w:r>
+              <w:rPr>
+                <w:sz w:val="19"/>
+              </w:rPr>
+            </w:r>
+            <w:r>
+              <w:rPr>
+                <w:sz w:val="19"/>
+              </w:rPr>
+              <w:t>n/m</w:t>
+            </w:r>
+          </w:p>
+        </w:tc>
+        <w:tc>
+          <w:tcPr>
+            <w:tcW w:type="dxa" w:w="1584"/>
+          </w:tcPr>
+          <w:p>
+            <w:r>
+              <w:rPr>
+                <w:sz w:val="19"/>
+              </w:rPr>
+            </w:r>
+            <w:r>
+              <w:rPr>
+                <w:sz w:val="19"/>
+              </w:rPr>
+              <w:t>+26%</w:t>
+            </w:r>
+          </w:p>
+        </w:tc>
+        <w:tc>
+          <w:tcPr>
+            <w:tcW w:type="dxa" w:w="1728"/>
+          </w:tcPr>
+          <w:p>
+            <w:r>
+              <w:rPr>
+                <w:sz w:val="19"/>
+              </w:rPr>
+            </w:r>
+            <w:r>
+              <w:rPr>
+                <w:sz w:val="19"/>
+              </w:rPr>
+              <w:t>+99%</w:t>
+            </w:r>
+          </w:p>
+        </w:tc>
+        <w:tc>
+          <w:tcPr>
+            <w:tcW w:type="dxa" w:w="2736"/>
+          </w:tcPr>
+          <w:p>
+            <w:r>
+              <w:rPr>
+                <w:sz w:val="19"/>
+              </w:rPr>
+            </w:r>
+          </w:p>
+        </w:tc>
+      </w:tr>
+      <w:tr>
+        <w:tc>
+          <w:tcPr>
+            <w:tcW w:type="dxa" w:w="2736"/>
+          </w:tcPr>
+          <w:p>
+            <w:r>
+              <w:rPr>
+                <w:sz w:val="19"/>
+              </w:rPr>
+            </w:r>
+            <w:r>
+              <w:rPr>
+                <w:sz w:val="19"/>
+              </w:rPr>
+              <w:t>OneRobotics 6600</w:t>
+            </w:r>
+          </w:p>
+        </w:tc>
+        <w:tc>
+          <w:tcPr>
+            <w:tcW w:type="dxa" w:w="1872"/>
+          </w:tcPr>
+          <w:p>
+            <w:r>
+              <w:rPr>
+                <w:sz w:val="19"/>
+              </w:rPr>
+            </w:r>
+            <w:r>
+              <w:rPr>
+                <w:sz w:val="19"/>
+              </w:rPr>
+              <w:t>11.3x</w:t>
+            </w:r>
+          </w:p>
+        </w:tc>
+        <w:tc>
+          <w:tcPr>
+            <w:tcW w:type="dxa" w:w="864"/>
+          </w:tcPr>
+          <w:p>
+            <w:r>
+              <w:rPr>
+                <w:sz w:val="19"/>
+              </w:rPr>
+            </w:r>
+            <w:r>
+              <w:rPr>
+                <w:sz w:val="19"/>
+              </w:rPr>
+              <w:t>n/m</w:t>
+            </w:r>
+          </w:p>
+        </w:tc>
+        <w:tc>
+          <w:tcPr>
+            <w:tcW w:type="dxa" w:w="1584"/>
+          </w:tcPr>
+          <w:p>
+            <w:r>
+              <w:rPr>
+                <w:sz w:val="19"/>
+              </w:rPr>
+            </w:r>
+            <w:r>
+              <w:rPr>
+                <w:sz w:val="19"/>
+              </w:rPr>
+              <w:t>+48% FY25, slowing</w:t>
+            </w:r>
+          </w:p>
+        </w:tc>
+        <w:tc>
+          <w:tcPr>
+            <w:tcW w:type="dxa" w:w="1728"/>
+          </w:tcPr>
+          <w:p>
+            <w:r>
+              <w:rPr>
+                <w:sz w:val="19"/>
+              </w:rPr>
+            </w:r>
+            <w:r>
+              <w:rPr>
+                <w:b/>
+                <w:sz w:val="19"/>
+              </w:rPr>
+              <w:t>−33%, at lows</w:t>
+            </w:r>
+          </w:p>
+        </w:tc>
+        <w:tc>
+          <w:tcPr>
+            <w:tcW w:type="dxa" w:w="2736"/>
+          </w:tcPr>
+          <w:p>
+            <w:r>
+              <w:rPr>
+                <w:sz w:val="19"/>
+              </w:rPr>
+            </w:r>
+            <w:r>
+              <w:rPr>
+                <w:sz w:val="19"/>
+              </w:rPr>
+              <w:t>GM 50%</w:t>
+            </w:r>
+          </w:p>
+        </w:tc>
+      </w:tr>
+      <w:tr>
+        <w:tc>
+          <w:tcPr>
+            <w:tcW w:type="dxa" w:w="2736"/>
+          </w:tcPr>
+          <w:p>
+            <w:r>
+              <w:rPr>
+                <w:sz w:val="19"/>
+              </w:rPr>
+            </w:r>
+            <w:r>
+              <w:rPr>
+                <w:sz w:val="19"/>
+              </w:rPr>
+              <w:t>EACON 易控 7687</w:t>
+            </w:r>
+          </w:p>
+        </w:tc>
+        <w:tc>
+          <w:tcPr>
+            <w:tcW w:type="dxa" w:w="1872"/>
+          </w:tcPr>
+          <w:p>
+            <w:r>
+              <w:rPr>
+                <w:sz w:val="19"/>
+              </w:rPr>
+            </w:r>
+            <w:r>
+              <w:rPr>
+                <w:sz w:val="19"/>
+              </w:rPr>
+              <w:t>7.4x</w:t>
+            </w:r>
+          </w:p>
+        </w:tc>
+        <w:tc>
+          <w:tcPr>
+            <w:tcW w:type="dxa" w:w="864"/>
+          </w:tcPr>
+          <w:p>
+            <w:r>
+              <w:rPr>
+                <w:sz w:val="19"/>
+              </w:rPr>
+            </w:r>
+            <w:r>
+              <w:rPr>
+                <w:sz w:val="19"/>
+              </w:rPr>
+              <w:t>n/m</w:t>
+            </w:r>
+          </w:p>
+        </w:tc>
+        <w:tc>
+          <w:tcPr>
+            <w:tcW w:type="dxa" w:w="1584"/>
+          </w:tcPr>
+          <w:p>
+            <w:r>
+              <w:rPr>
+                <w:sz w:val="19"/>
+              </w:rPr>
+            </w:r>
+            <w:r>
+              <w:rPr>
+                <w:sz w:val="19"/>
+              </w:rPr>
+              <w:t>+46%</w:t>
+            </w:r>
+          </w:p>
+        </w:tc>
+        <w:tc>
+          <w:tcPr>
+            <w:tcW w:type="dxa" w:w="1728"/>
+          </w:tcPr>
+          <w:p>
+            <w:r>
+              <w:rPr>
+                <w:sz w:val="19"/>
+              </w:rPr>
+            </w:r>
+            <w:r>
+              <w:rPr>
+                <w:sz w:val="19"/>
+              </w:rPr>
+              <w:t>−14%</w:t>
+            </w:r>
+          </w:p>
+        </w:tc>
+        <w:tc>
+          <w:tcPr>
+            <w:tcW w:type="dxa" w:w="2736"/>
+          </w:tcPr>
+          <w:p>
+            <w:r>
+              <w:rPr>
+                <w:sz w:val="19"/>
+              </w:rPr>
+            </w:r>
+          </w:p>
+        </w:tc>
+      </w:tr>
+      <w:tr>
+        <w:tc>
+          <w:tcPr>
+            <w:tcW w:type="dxa" w:w="2736"/>
+          </w:tcPr>
+          <w:p>
+            <w:r>
+              <w:rPr>
+                <w:sz w:val="19"/>
+              </w:rPr>
+            </w:r>
+            <w:r>
+              <w:rPr>
+                <w:sz w:val="19"/>
+              </w:rPr>
+              <w:t>Estun 2715 (profitable)</w:t>
+            </w:r>
+          </w:p>
+        </w:tc>
+        <w:tc>
+          <w:tcPr>
+            <w:tcW w:type="dxa" w:w="1872"/>
+          </w:tcPr>
+          <w:p>
+            <w:r>
+              <w:rPr>
+                <w:sz w:val="19"/>
+              </w:rPr>
+            </w:r>
+            <w:r>
+              <w:rPr>
+                <w:sz w:val="19"/>
+              </w:rPr>
+              <w:t>5.5x</w:t>
+            </w:r>
+          </w:p>
+        </w:tc>
+        <w:tc>
+          <w:tcPr>
+            <w:tcW w:type="dxa" w:w="864"/>
+          </w:tcPr>
+          <w:p>
+            <w:r>
+              <w:rPr>
+                <w:sz w:val="19"/>
+              </w:rPr>
+            </w:r>
+            <w:r>
+              <w:rPr>
+                <w:sz w:val="19"/>
+              </w:rPr>
+              <w:t>147x</w:t>
+            </w:r>
+          </w:p>
+        </w:tc>
+        <w:tc>
+          <w:tcPr>
+            <w:tcW w:type="dxa" w:w="1584"/>
+          </w:tcPr>
+          <w:p>
+            <w:r>
+              <w:rPr>
+                <w:sz w:val="19"/>
+              </w:rPr>
+            </w:r>
+            <w:r>
+              <w:rPr>
+                <w:sz w:val="19"/>
+              </w:rPr>
+              <w:t>+12%</w:t>
+            </w:r>
+          </w:p>
+        </w:tc>
+        <w:tc>
+          <w:tcPr>
+            <w:tcW w:type="dxa" w:w="1728"/>
+          </w:tcPr>
+          <w:p>
+            <w:r>
+              <w:rPr>
+                <w:sz w:val="19"/>
+              </w:rPr>
+            </w:r>
+            <w:r>
+              <w:rPr>
+                <w:sz w:val="19"/>
+              </w:rPr>
+              <w:t>+9%</w:t>
+            </w:r>
+          </w:p>
+        </w:tc>
+        <w:tc>
+          <w:tcPr>
+            <w:tcW w:type="dxa" w:w="2736"/>
+          </w:tcPr>
+          <w:p>
+            <w:r>
+              <w:rPr>
+                <w:sz w:val="19"/>
+              </w:rPr>
+            </w:r>
+          </w:p>
+        </w:tc>
+      </w:tr>
+      <w:tr>
+        <w:tc>
+          <w:tcPr>
+            <w:tcW w:type="dxa" w:w="2736"/>
+          </w:tcPr>
+          <w:p>
+            <w:r>
+              <w:rPr>
+                <w:sz w:val="19"/>
+              </w:rPr>
+            </w:r>
+            <w:r>
+              <w:rPr>
+                <w:sz w:val="19"/>
+              </w:rPr>
+              <w:t>Ninebot 689009 (profitable ref.)</w:t>
+            </w:r>
+          </w:p>
+        </w:tc>
+        <w:tc>
+          <w:tcPr>
+            <w:tcW w:type="dxa" w:w="1872"/>
+          </w:tcPr>
+          <w:p>
+            <w:r>
+              <w:rPr>
+                <w:sz w:val="19"/>
+              </w:rPr>
+            </w:r>
+            <w:r>
+              <w:rPr>
+                <w:sz w:val="19"/>
+              </w:rPr>
+              <w:t>1.3x</w:t>
+            </w:r>
+          </w:p>
+        </w:tc>
+        <w:tc>
+          <w:tcPr>
+            <w:tcW w:type="dxa" w:w="864"/>
+          </w:tcPr>
+          <w:p>
+            <w:r>
+              <w:rPr>
+                <w:sz w:val="19"/>
+              </w:rPr>
+            </w:r>
+            <w:r>
+              <w:rPr>
+                <w:sz w:val="19"/>
+              </w:rPr>
+              <w:t>~20x</w:t>
+            </w:r>
+          </w:p>
+        </w:tc>
+        <w:tc>
+          <w:tcPr>
+            <w:tcW w:type="dxa" w:w="1584"/>
+          </w:tcPr>
+          <w:p>
+            <w:r>
+              <w:rPr>
+                <w:sz w:val="19"/>
+              </w:rPr>
+            </w:r>
+            <w:r>
+              <w:rPr>
+                <w:sz w:val="19"/>
+              </w:rPr>
+              <w:t>—</w:t>
+            </w:r>
+          </w:p>
+        </w:tc>
+        <w:tc>
+          <w:tcPr>
+            <w:tcW w:type="dxa" w:w="1728"/>
+          </w:tcPr>
+          <w:p>
+            <w:r>
+              <w:rPr>
+                <w:sz w:val="19"/>
+              </w:rPr>
+            </w:r>
+            <w:r>
+              <w:rPr>
+                <w:sz w:val="19"/>
+              </w:rPr>
+              <w:t>—</w:t>
+            </w:r>
+          </w:p>
+        </w:tc>
+        <w:tc>
+          <w:tcPr>
+            <w:tcW w:type="dxa" w:w="2736"/>
+          </w:tcPr>
+          <w:p>
+            <w:r>
+              <w:rPr>
+                <w:sz w:val="19"/>
+              </w:rPr>
+            </w:r>
+            <w:r>
+              <w:rPr>
+                <w:sz w:val="19"/>
+              </w:rPr>
+              <w:t>what profitable robots actually fetch</w:t>
             </w:r>
           </w:p>
         </w:tc>
@@ -5379,16 +7560,16 @@
         <w:pStyle w:val="ListBullet"/>
       </w:pPr>
       <w:r>
-        <w:t xml:space="preserve">Put Excelland against that tape and the question answers itself: it's asking </w:t>
+        <w:t xml:space="preserve">Now read the full shelf. Ten listed robots, nine loss-making, median around </w:t>
       </w:r>
       <w:r>
         <w:rPr>
           <w:b/>
         </w:rPr>
-        <w:t>17–23x sales for the worst margin (14%), the worst concentration, and the weakest balance sheet in the cohort</w:t>
-      </w:r>
-      <w:r>
-        <w:t xml:space="preserve"> — above OneRobotics' 11.5x with none of its franchise, and just under YunJi's multiple with a third of its gross margin. The only bull path is the 18C small-float momentum game — 45m-share float, cheap ticket — and the 8x book says even the flippers aren't showing up.</w:t>
+        <w:t>13x sales</w:t>
+      </w:r>
+      <w:r>
+        <w:t xml:space="preserve"> — and six of the ten are underwater versus their own offer price. The winners (Galaxis +99%, Rokae +41%, LDRobot +36%) all have something Excelland doesn't: a real margin, a real niche, or momentum-grade growth. Excelland walks in asking 17–23x — top-quartile price — with the worst gross margin on the list (14%), the worst customer concentration, and the weakest balance sheet. And notice what happened to Rokae on Sep 1: down 18.5% in a day just because Mech-Mind listed and gave the market a better robot to own. This shelf reprices on every new supply, and there are 40+ robot IPOs still queued.</w:t>
       </w:r>
     </w:p>
     <w:p>

</xml_diff>

<commit_message>
IPO note v12: Longsys moat block (280m own controllers/Lexar/Zilia/enterprise vs the 88%-wafer test — owns packaging+channel+brand, not the wafer) and AI-memory peer table (fab owners 11-12x sales vs assemblers 2x; Micron 6.65x / SanDisk 7.3x forward vs Longsys ~5x — same cycle, better business, near-same multiple); Broadcom close-out (AI $16.7bn beat vs $16.0bn guide, FY27-28 doubling, stock -2.8%: buy the flush not the print)
Co-Authored-By: Claude Fable 5 <noreply@anthropic.com>
</commit_message>
<xml_diff>
--- a/SHEIN_MechMind_HK_IPO_Note.docx
+++ b/SHEIN_MechMind_HK_IPO_Note.docx
@@ -4577,6 +4577,110 @@
         <w:pStyle w:val="Heading2"/>
       </w:pPr>
       <w:r>
+        <w:t>Does it have a moat at all? Some — just not where the money is being made</w:t>
+      </w:r>
+    </w:p>
+    <w:p>
+      <w:pPr>
+        <w:pStyle w:val="ListBullet"/>
+      </w:pPr>
+      <w:r>
+        <w:t xml:space="preserve">Fair is fair, there are real assets here. It ships </w:t>
+      </w:r>
+      <w:r>
+        <w:rPr>
+          <w:b/>
+        </w:rPr>
+        <w:t>over 280 million self-developed controller chips</w:t>
+      </w:r>
+      <w:r>
+        <w:t xml:space="preserve">, which is the piece of a module that is actually IP rather than assembly, and R&amp;D was up 91%. </w:t>
+      </w:r>
+      <w:r>
+        <w:rPr>
+          <w:b/>
+        </w:rPr>
+        <w:t>Lexar</w:t>
+      </w:r>
+      <w:r>
+        <w:t xml:space="preserve"> — bought from Micron in 2017 — is a genuine global consumer brand doing RMB 4.0bn in the half, +85%. </w:t>
+      </w:r>
+      <w:r>
+        <w:rPr>
+          <w:b/>
+        </w:rPr>
+        <w:t>Zilia</w:t>
+      </w:r>
+      <w:r>
+        <w:t xml:space="preserve"> gives it local manufacturing inside Brazil's tariff wall, +185% and worth another RMB 4.0bn. Enterprise SSDs are up 209% off a small base, which is the one line with actual AI pull. Five of its own plants, and unusually low customer concentration — biggest customer just 7.6%. This is not a garage operation.</w:t>
+      </w:r>
+    </w:p>
+    <w:p>
+      <w:pPr>
+        <w:pStyle w:val="ListBullet"/>
+      </w:pPr>
+      <w:r>
+        <w:t xml:space="preserve">But apply the test that matters: </w:t>
+      </w:r>
+      <w:r>
+        <w:rPr>
+          <w:b/>
+        </w:rPr>
+        <w:t>does any of it let you set price?</w:t>
+      </w:r>
+      <w:r>
+        <w:t xml:space="preserve"> The controller is the strongest claim — except a controller is maybe a tenth of module cost while </w:t>
+      </w:r>
+      <w:r>
+        <w:rPr>
+          <w:b/>
+        </w:rPr>
+        <w:t>wafers are 88%</w:t>
+      </w:r>
+      <w:r>
+        <w:t xml:space="preserve">, and its top five suppliers are 52% of purchases. Lexar and Zilia are brands in categories where shoppers pick on price per gigabyte. Enterprise is real but small, and everyone from Samsung to SanDisk is chasing the same AI sockets with their own silicon. The 2023 tape settled the argument: when wafer prices fell, Longsys's gross margin went to </w:t>
+      </w:r>
+      <w:r>
+        <w:rPr>
+          <w:b/>
+        </w:rPr>
+        <w:t>4.7%</w:t>
+      </w:r>
+      <w:r>
+        <w:t xml:space="preserve"> and embedded ASPs dropped 68%. A moat that vanishes the moment your input price moves is a brand, not a moat.</w:t>
+      </w:r>
+    </w:p>
+    <w:p>
+      <w:pPr>
+        <w:pStyle w:val="ListBullet"/>
+      </w:pPr>
+      <w:r>
+        <w:t xml:space="preserve">Put simply — Longsys owns the </w:t>
+      </w:r>
+      <w:r>
+        <w:rPr>
+          <w:b/>
+        </w:rPr>
+        <w:t>packaging, the channel and the brand</w:t>
+      </w:r>
+      <w:r>
+        <w:t xml:space="preserve">. It does not own the </w:t>
+      </w:r>
+      <w:r>
+        <w:rPr>
+          <w:b/>
+        </w:rPr>
+        <w:t>wafer</w:t>
+      </w:r>
+      <w:r>
+        <w:t>, and in memory the wafer is where the pricing power lives. That's the whole difference between it and the names in the next table.</w:t>
+      </w:r>
+    </w:p>
+    <w:p>
+      <w:pPr>
+        <w:pStyle w:val="Heading2"/>
+      </w:pPr>
+      <w:r>
         <w:t>Longsys vs Ingenic — same cycle, different machines</w:t>
       </w:r>
     </w:p>
@@ -5044,8 +5148,11 @@
       </w:r>
     </w:p>
     <w:p>
-      <w:r>
-        <w:t>One more sanity check — the 2026 A+H hardware shelf, since Longsys joins it next week. Same H-share, same season, very different receptions:</w:t>
+      <w:pPr>
+        <w:pStyle w:val="Heading2"/>
+      </w:pPr>
+      <w:r>
+        <w:t>Against the AI-memory complex — the table that settles it</w:t>
       </w:r>
     </w:p>
     <w:tbl>
@@ -5064,6 +5171,907 @@
       <w:tr>
         <w:tc>
           <w:tcPr>
+            <w:tcW w:type="dxa" w:w="3168"/>
+          </w:tcPr>
+          <w:p>
+            <w:r/>
+            <w:r>
+              <w:rPr>
+                <w:b/>
+                <w:sz w:val="19"/>
+              </w:rPr>
+            </w:r>
+          </w:p>
+        </w:tc>
+        <w:tc>
+          <w:tcPr>
+            <w:tcW w:type="dxa" w:w="1728"/>
+          </w:tcPr>
+          <w:p>
+            <w:r/>
+            <w:r>
+              <w:rPr>
+                <w:b/>
+                <w:sz w:val="19"/>
+              </w:rPr>
+              <w:t>Trail P/E</w:t>
+            </w:r>
+          </w:p>
+        </w:tc>
+        <w:tc>
+          <w:tcPr>
+            <w:tcW w:type="dxa" w:w="2304"/>
+          </w:tcPr>
+          <w:p>
+            <w:r/>
+            <w:r>
+              <w:rPr>
+                <w:b/>
+                <w:sz w:val="19"/>
+              </w:rPr>
+              <w:t>Fwd P/E</w:t>
+            </w:r>
+          </w:p>
+        </w:tc>
+        <w:tc>
+          <w:tcPr>
+            <w:tcW w:type="dxa" w:w="1440"/>
+          </w:tcPr>
+          <w:p>
+            <w:r/>
+            <w:r>
+              <w:rPr>
+                <w:b/>
+                <w:sz w:val="19"/>
+              </w:rPr>
+              <w:t>P/S</w:t>
+            </w:r>
+          </w:p>
+        </w:tc>
+        <w:tc>
+          <w:tcPr>
+            <w:tcW w:type="dxa" w:w="2736"/>
+          </w:tcPr>
+          <w:p>
+            <w:r/>
+            <w:r>
+              <w:rPr>
+                <w:b/>
+                <w:sz w:val="19"/>
+              </w:rPr>
+              <w:t>Owns the wafer?</w:t>
+            </w:r>
+          </w:p>
+        </w:tc>
+      </w:tr>
+      <w:tr>
+        <w:tc>
+          <w:tcPr>
+            <w:tcW w:type="dxa" w:w="3168"/>
+          </w:tcPr>
+          <w:p>
+            <w:r>
+              <w:rPr>
+                <w:sz w:val="19"/>
+              </w:rPr>
+            </w:r>
+            <w:r>
+              <w:rPr>
+                <w:b/>
+                <w:sz w:val="19"/>
+              </w:rPr>
+              <w:t>Longsys H @ max</w:t>
+            </w:r>
+          </w:p>
+        </w:tc>
+        <w:tc>
+          <w:tcPr>
+            <w:tcW w:type="dxa" w:w="1728"/>
+          </w:tcPr>
+          <w:p>
+            <w:r>
+              <w:rPr>
+                <w:sz w:val="19"/>
+              </w:rPr>
+            </w:r>
+            <w:r>
+              <w:rPr>
+                <w:b/>
+                <w:sz w:val="19"/>
+              </w:rPr>
+              <w:t>~8x</w:t>
+            </w:r>
+          </w:p>
+        </w:tc>
+        <w:tc>
+          <w:tcPr>
+            <w:tcW w:type="dxa" w:w="2304"/>
+          </w:tcPr>
+          <w:p>
+            <w:r>
+              <w:rPr>
+                <w:sz w:val="19"/>
+              </w:rPr>
+            </w:r>
+            <w:r>
+              <w:rPr>
+                <w:sz w:val="19"/>
+              </w:rPr>
+              <w:t>~5x (2026E annualised)</w:t>
+            </w:r>
+          </w:p>
+        </w:tc>
+        <w:tc>
+          <w:tcPr>
+            <w:tcW w:type="dxa" w:w="1440"/>
+          </w:tcPr>
+          <w:p>
+            <w:r>
+              <w:rPr>
+                <w:sz w:val="19"/>
+              </w:rPr>
+            </w:r>
+            <w:r>
+              <w:rPr>
+                <w:b/>
+                <w:sz w:val="19"/>
+              </w:rPr>
+              <w:t>~2x</w:t>
+            </w:r>
+          </w:p>
+        </w:tc>
+        <w:tc>
+          <w:tcPr>
+            <w:tcW w:type="dxa" w:w="2736"/>
+          </w:tcPr>
+          <w:p>
+            <w:r>
+              <w:rPr>
+                <w:sz w:val="19"/>
+              </w:rPr>
+            </w:r>
+            <w:r>
+              <w:rPr>
+                <w:b/>
+                <w:sz w:val="19"/>
+              </w:rPr>
+              <w:t>No</w:t>
+            </w:r>
+            <w:r>
+              <w:rPr>
+                <w:sz w:val="19"/>
+              </w:rPr>
+              <w:t xml:space="preserve"> — buys it, 88% of COGS</w:t>
+            </w:r>
+          </w:p>
+        </w:tc>
+      </w:tr>
+      <w:tr>
+        <w:tc>
+          <w:tcPr>
+            <w:tcW w:type="dxa" w:w="3168"/>
+          </w:tcPr>
+          <w:p>
+            <w:r>
+              <w:rPr>
+                <w:sz w:val="19"/>
+              </w:rPr>
+            </w:r>
+            <w:r>
+              <w:rPr>
+                <w:sz w:val="19"/>
+              </w:rPr>
+              <w:t>Deminli 001309 (purest module comp)</w:t>
+            </w:r>
+          </w:p>
+        </w:tc>
+        <w:tc>
+          <w:tcPr>
+            <w:tcW w:type="dxa" w:w="1728"/>
+          </w:tcPr>
+          <w:p>
+            <w:r>
+              <w:rPr>
+                <w:sz w:val="19"/>
+              </w:rPr>
+            </w:r>
+            <w:r>
+              <w:rPr>
+                <w:sz w:val="19"/>
+              </w:rPr>
+              <w:t>14.5x</w:t>
+            </w:r>
+          </w:p>
+        </w:tc>
+        <w:tc>
+          <w:tcPr>
+            <w:tcW w:type="dxa" w:w="2304"/>
+          </w:tcPr>
+          <w:p>
+            <w:r>
+              <w:rPr>
+                <w:sz w:val="19"/>
+              </w:rPr>
+            </w:r>
+            <w:r>
+              <w:rPr>
+                <w:sz w:val="19"/>
+              </w:rPr>
+              <w:t>—</w:t>
+            </w:r>
+          </w:p>
+        </w:tc>
+        <w:tc>
+          <w:tcPr>
+            <w:tcW w:type="dxa" w:w="1440"/>
+          </w:tcPr>
+          <w:p>
+            <w:r>
+              <w:rPr>
+                <w:sz w:val="19"/>
+              </w:rPr>
+            </w:r>
+            <w:r>
+              <w:rPr>
+                <w:sz w:val="19"/>
+              </w:rPr>
+              <w:t>~2x</w:t>
+            </w:r>
+          </w:p>
+        </w:tc>
+        <w:tc>
+          <w:tcPr>
+            <w:tcW w:type="dxa" w:w="2736"/>
+          </w:tcPr>
+          <w:p>
+            <w:r>
+              <w:rPr>
+                <w:sz w:val="19"/>
+              </w:rPr>
+            </w:r>
+            <w:r>
+              <w:rPr>
+                <w:sz w:val="19"/>
+              </w:rPr>
+              <w:t>No</w:t>
+            </w:r>
+          </w:p>
+        </w:tc>
+      </w:tr>
+      <w:tr>
+        <w:tc>
+          <w:tcPr>
+            <w:tcW w:type="dxa" w:w="3168"/>
+          </w:tcPr>
+          <w:p>
+            <w:r>
+              <w:rPr>
+                <w:sz w:val="19"/>
+              </w:rPr>
+            </w:r>
+            <w:r>
+              <w:rPr>
+                <w:sz w:val="19"/>
+              </w:rPr>
+              <w:t>Micron</w:t>
+            </w:r>
+          </w:p>
+        </w:tc>
+        <w:tc>
+          <w:tcPr>
+            <w:tcW w:type="dxa" w:w="1728"/>
+          </w:tcPr>
+          <w:p>
+            <w:r>
+              <w:rPr>
+                <w:sz w:val="19"/>
+              </w:rPr>
+            </w:r>
+            <w:r>
+              <w:rPr>
+                <w:sz w:val="19"/>
+              </w:rPr>
+              <w:t>21.6x</w:t>
+            </w:r>
+          </w:p>
+        </w:tc>
+        <w:tc>
+          <w:tcPr>
+            <w:tcW w:type="dxa" w:w="2304"/>
+          </w:tcPr>
+          <w:p>
+            <w:r>
+              <w:rPr>
+                <w:sz w:val="19"/>
+              </w:rPr>
+            </w:r>
+            <w:r>
+              <w:rPr>
+                <w:b/>
+                <w:sz w:val="19"/>
+              </w:rPr>
+              <w:t>6.65x</w:t>
+            </w:r>
+          </w:p>
+        </w:tc>
+        <w:tc>
+          <w:tcPr>
+            <w:tcW w:type="dxa" w:w="1440"/>
+          </w:tcPr>
+          <w:p>
+            <w:r>
+              <w:rPr>
+                <w:sz w:val="19"/>
+              </w:rPr>
+            </w:r>
+            <w:r>
+              <w:rPr>
+                <w:b/>
+                <w:sz w:val="19"/>
+              </w:rPr>
+              <w:t>11.8x</w:t>
+            </w:r>
+          </w:p>
+        </w:tc>
+        <w:tc>
+          <w:tcPr>
+            <w:tcW w:type="dxa" w:w="2736"/>
+          </w:tcPr>
+          <w:p>
+            <w:r>
+              <w:rPr>
+                <w:sz w:val="19"/>
+              </w:rPr>
+            </w:r>
+            <w:r>
+              <w:rPr>
+                <w:sz w:val="19"/>
+              </w:rPr>
+              <w:t>Yes — fabs + HBM</w:t>
+            </w:r>
+          </w:p>
+        </w:tc>
+      </w:tr>
+      <w:tr>
+        <w:tc>
+          <w:tcPr>
+            <w:tcW w:type="dxa" w:w="3168"/>
+          </w:tcPr>
+          <w:p>
+            <w:r>
+              <w:rPr>
+                <w:sz w:val="19"/>
+              </w:rPr>
+            </w:r>
+            <w:r>
+              <w:rPr>
+                <w:sz w:val="19"/>
+              </w:rPr>
+              <w:t>SanDisk</w:t>
+            </w:r>
+          </w:p>
+        </w:tc>
+        <w:tc>
+          <w:tcPr>
+            <w:tcW w:type="dxa" w:w="1728"/>
+          </w:tcPr>
+          <w:p>
+            <w:r>
+              <w:rPr>
+                <w:sz w:val="19"/>
+              </w:rPr>
+            </w:r>
+            <w:r>
+              <w:rPr>
+                <w:sz w:val="19"/>
+              </w:rPr>
+              <w:t>21.2x</w:t>
+            </w:r>
+          </w:p>
+        </w:tc>
+        <w:tc>
+          <w:tcPr>
+            <w:tcW w:type="dxa" w:w="2304"/>
+          </w:tcPr>
+          <w:p>
+            <w:r>
+              <w:rPr>
+                <w:sz w:val="19"/>
+              </w:rPr>
+            </w:r>
+            <w:r>
+              <w:rPr>
+                <w:b/>
+                <w:sz w:val="19"/>
+              </w:rPr>
+              <w:t>7.30x</w:t>
+            </w:r>
+          </w:p>
+        </w:tc>
+        <w:tc>
+          <w:tcPr>
+            <w:tcW w:type="dxa" w:w="1440"/>
+          </w:tcPr>
+          <w:p>
+            <w:r>
+              <w:rPr>
+                <w:sz w:val="19"/>
+              </w:rPr>
+            </w:r>
+            <w:r>
+              <w:rPr>
+                <w:b/>
+                <w:sz w:val="19"/>
+              </w:rPr>
+              <w:t>11.0x</w:t>
+            </w:r>
+          </w:p>
+        </w:tc>
+        <w:tc>
+          <w:tcPr>
+            <w:tcW w:type="dxa" w:w="2736"/>
+          </w:tcPr>
+          <w:p>
+            <w:r>
+              <w:rPr>
+                <w:sz w:val="19"/>
+              </w:rPr>
+            </w:r>
+            <w:r>
+              <w:rPr>
+                <w:sz w:val="19"/>
+              </w:rPr>
+              <w:t>Yes — Kioxia JV fabs</w:t>
+            </w:r>
+          </w:p>
+        </w:tc>
+      </w:tr>
+      <w:tr>
+        <w:tc>
+          <w:tcPr>
+            <w:tcW w:type="dxa" w:w="3168"/>
+          </w:tcPr>
+          <w:p>
+            <w:r>
+              <w:rPr>
+                <w:sz w:val="19"/>
+              </w:rPr>
+            </w:r>
+            <w:r>
+              <w:rPr>
+                <w:sz w:val="19"/>
+              </w:rPr>
+              <w:t>Silicon Motion (controller designer)</w:t>
+            </w:r>
+          </w:p>
+        </w:tc>
+        <w:tc>
+          <w:tcPr>
+            <w:tcW w:type="dxa" w:w="1728"/>
+          </w:tcPr>
+          <w:p>
+            <w:r>
+              <w:rPr>
+                <w:sz w:val="19"/>
+              </w:rPr>
+            </w:r>
+            <w:r>
+              <w:rPr>
+                <w:sz w:val="19"/>
+              </w:rPr>
+              <w:t>28.4x</w:t>
+            </w:r>
+          </w:p>
+        </w:tc>
+        <w:tc>
+          <w:tcPr>
+            <w:tcW w:type="dxa" w:w="2304"/>
+          </w:tcPr>
+          <w:p>
+            <w:r>
+              <w:rPr>
+                <w:sz w:val="19"/>
+              </w:rPr>
+            </w:r>
+            <w:r>
+              <w:rPr>
+                <w:sz w:val="19"/>
+              </w:rPr>
+              <w:t>17.2x</w:t>
+            </w:r>
+          </w:p>
+        </w:tc>
+        <w:tc>
+          <w:tcPr>
+            <w:tcW w:type="dxa" w:w="1440"/>
+          </w:tcPr>
+          <w:p>
+            <w:r>
+              <w:rPr>
+                <w:sz w:val="19"/>
+              </w:rPr>
+            </w:r>
+            <w:r>
+              <w:rPr>
+                <w:sz w:val="19"/>
+              </w:rPr>
+              <w:t>6.0x</w:t>
+            </w:r>
+          </w:p>
+        </w:tc>
+        <w:tc>
+          <w:tcPr>
+            <w:tcW w:type="dxa" w:w="2736"/>
+          </w:tcPr>
+          <w:p>
+            <w:r>
+              <w:rPr>
+                <w:sz w:val="19"/>
+              </w:rPr>
+            </w:r>
+            <w:r>
+              <w:rPr>
+                <w:sz w:val="19"/>
+              </w:rPr>
+              <w:t>No, but owns the IP</w:t>
+            </w:r>
+          </w:p>
+        </w:tc>
+      </w:tr>
+      <w:tr>
+        <w:tc>
+          <w:tcPr>
+            <w:tcW w:type="dxa" w:w="3168"/>
+          </w:tcPr>
+          <w:p>
+            <w:r>
+              <w:rPr>
+                <w:sz w:val="19"/>
+              </w:rPr>
+            </w:r>
+            <w:r>
+              <w:rPr>
+                <w:sz w:val="19"/>
+              </w:rPr>
+              <w:t>GigaDevice (niche designer)</w:t>
+            </w:r>
+          </w:p>
+        </w:tc>
+        <w:tc>
+          <w:tcPr>
+            <w:tcW w:type="dxa" w:w="1728"/>
+          </w:tcPr>
+          <w:p>
+            <w:r>
+              <w:rPr>
+                <w:sz w:val="19"/>
+              </w:rPr>
+            </w:r>
+            <w:r>
+              <w:rPr>
+                <w:sz w:val="19"/>
+              </w:rPr>
+              <w:t>36x</w:t>
+            </w:r>
+          </w:p>
+        </w:tc>
+        <w:tc>
+          <w:tcPr>
+            <w:tcW w:type="dxa" w:w="2304"/>
+          </w:tcPr>
+          <w:p>
+            <w:r>
+              <w:rPr>
+                <w:sz w:val="19"/>
+              </w:rPr>
+            </w:r>
+            <w:r>
+              <w:rPr>
+                <w:sz w:val="19"/>
+              </w:rPr>
+              <w:t>—</w:t>
+            </w:r>
+          </w:p>
+        </w:tc>
+        <w:tc>
+          <w:tcPr>
+            <w:tcW w:type="dxa" w:w="1440"/>
+          </w:tcPr>
+          <w:p>
+            <w:r>
+              <w:rPr>
+                <w:sz w:val="19"/>
+              </w:rPr>
+            </w:r>
+            <w:r>
+              <w:rPr>
+                <w:sz w:val="19"/>
+              </w:rPr>
+              <w:t>—</w:t>
+            </w:r>
+          </w:p>
+        </w:tc>
+        <w:tc>
+          <w:tcPr>
+            <w:tcW w:type="dxa" w:w="2736"/>
+          </w:tcPr>
+          <w:p>
+            <w:r>
+              <w:rPr>
+                <w:sz w:val="19"/>
+              </w:rPr>
+            </w:r>
+            <w:r>
+              <w:rPr>
+                <w:sz w:val="19"/>
+              </w:rPr>
+              <w:t>No, but owns the design</w:t>
+            </w:r>
+          </w:p>
+        </w:tc>
+      </w:tr>
+      <w:tr>
+        <w:tc>
+          <w:tcPr>
+            <w:tcW w:type="dxa" w:w="3168"/>
+          </w:tcPr>
+          <w:p>
+            <w:r>
+              <w:rPr>
+                <w:sz w:val="19"/>
+              </w:rPr>
+            </w:r>
+            <w:r>
+              <w:rPr>
+                <w:sz w:val="19"/>
+              </w:rPr>
+              <w:t>Montage (interconnect designer)</w:t>
+            </w:r>
+          </w:p>
+        </w:tc>
+        <w:tc>
+          <w:tcPr>
+            <w:tcW w:type="dxa" w:w="1728"/>
+          </w:tcPr>
+          <w:p>
+            <w:r>
+              <w:rPr>
+                <w:sz w:val="19"/>
+              </w:rPr>
+            </w:r>
+            <w:r>
+              <w:rPr>
+                <w:sz w:val="19"/>
+              </w:rPr>
+              <w:t>106x</w:t>
+            </w:r>
+          </w:p>
+        </w:tc>
+        <w:tc>
+          <w:tcPr>
+            <w:tcW w:type="dxa" w:w="2304"/>
+          </w:tcPr>
+          <w:p>
+            <w:r>
+              <w:rPr>
+                <w:sz w:val="19"/>
+              </w:rPr>
+            </w:r>
+            <w:r>
+              <w:rPr>
+                <w:sz w:val="19"/>
+              </w:rPr>
+              <w:t>—</w:t>
+            </w:r>
+          </w:p>
+        </w:tc>
+        <w:tc>
+          <w:tcPr>
+            <w:tcW w:type="dxa" w:w="1440"/>
+          </w:tcPr>
+          <w:p>
+            <w:r>
+              <w:rPr>
+                <w:sz w:val="19"/>
+              </w:rPr>
+            </w:r>
+            <w:r>
+              <w:rPr>
+                <w:sz w:val="19"/>
+              </w:rPr>
+              <w:t>—</w:t>
+            </w:r>
+          </w:p>
+        </w:tc>
+        <w:tc>
+          <w:tcPr>
+            <w:tcW w:type="dxa" w:w="2736"/>
+          </w:tcPr>
+          <w:p>
+            <w:r>
+              <w:rPr>
+                <w:sz w:val="19"/>
+              </w:rPr>
+            </w:r>
+            <w:r>
+              <w:rPr>
+                <w:sz w:val="19"/>
+              </w:rPr>
+              <w:t>No, but owns the design</w:t>
+            </w:r>
+          </w:p>
+        </w:tc>
+      </w:tr>
+      <w:tr>
+        <w:tc>
+          <w:tcPr>
+            <w:tcW w:type="dxa" w:w="3168"/>
+          </w:tcPr>
+          <w:p>
+            <w:r>
+              <w:rPr>
+                <w:sz w:val="19"/>
+              </w:rPr>
+            </w:r>
+            <w:r>
+              <w:rPr>
+                <w:sz w:val="19"/>
+              </w:rPr>
+              <w:t>Ingenic 3223 (our preferred)</w:t>
+            </w:r>
+          </w:p>
+        </w:tc>
+        <w:tc>
+          <w:tcPr>
+            <w:tcW w:type="dxa" w:w="1728"/>
+          </w:tcPr>
+          <w:p>
+            <w:r>
+              <w:rPr>
+                <w:sz w:val="19"/>
+              </w:rPr>
+            </w:r>
+            <w:r>
+              <w:rPr>
+                <w:sz w:val="19"/>
+              </w:rPr>
+              <w:t>~33x at H px</w:t>
+            </w:r>
+          </w:p>
+        </w:tc>
+        <w:tc>
+          <w:tcPr>
+            <w:tcW w:type="dxa" w:w="2304"/>
+          </w:tcPr>
+          <w:p>
+            <w:r>
+              <w:rPr>
+                <w:sz w:val="19"/>
+              </w:rPr>
+            </w:r>
+            <w:r>
+              <w:rPr>
+                <w:sz w:val="19"/>
+              </w:rPr>
+              <w:t>~19x</w:t>
+            </w:r>
+          </w:p>
+        </w:tc>
+        <w:tc>
+          <w:tcPr>
+            <w:tcW w:type="dxa" w:w="1440"/>
+          </w:tcPr>
+          <w:p>
+            <w:r>
+              <w:rPr>
+                <w:sz w:val="19"/>
+              </w:rPr>
+            </w:r>
+            <w:r>
+              <w:rPr>
+                <w:sz w:val="19"/>
+              </w:rPr>
+              <w:t>—</w:t>
+            </w:r>
+          </w:p>
+        </w:tc>
+        <w:tc>
+          <w:tcPr>
+            <w:tcW w:type="dxa" w:w="2736"/>
+          </w:tcPr>
+          <w:p>
+            <w:r>
+              <w:rPr>
+                <w:sz w:val="19"/>
+              </w:rPr>
+            </w:r>
+            <w:r>
+              <w:rPr>
+                <w:sz w:val="19"/>
+              </w:rPr>
+              <w:t>No, but owns the design + the socket</w:t>
+            </w:r>
+          </w:p>
+        </w:tc>
+      </w:tr>
+    </w:tbl>
+    <w:p/>
+    <w:p>
+      <w:r>
+        <w:t xml:space="preserve">Two things jump out, and they point the same way. First, the fab owners trade at </w:t>
+      </w:r>
+      <w:r>
+        <w:rPr>
+          <w:b/>
+        </w:rPr>
+        <w:t>11–12x sales</w:t>
+      </w:r>
+      <w:r>
+        <w:t xml:space="preserve"> while the assemblers trade at </w:t>
+      </w:r>
+      <w:r>
+        <w:rPr>
+          <w:b/>
+        </w:rPr>
+        <w:t>~2x</w:t>
+      </w:r>
+      <w:r>
+        <w:t xml:space="preserve">. That five-fold gap isn't a mispricing waiting to be arbitraged — it is precisely the market pricing who controls the scarce thing. Second, and this is the part that kills the cheap-optics case: Micron trades at </w:t>
+      </w:r>
+      <w:r>
+        <w:rPr>
+          <w:b/>
+        </w:rPr>
+        <w:t>6.65x forward earnings</w:t>
+      </w:r>
+      <w:r>
+        <w:t xml:space="preserve"> and SanDisk at </w:t>
+      </w:r>
+      <w:r>
+        <w:rPr>
+          <w:b/>
+        </w:rPr>
+        <w:t>7.3x</w:t>
+      </w:r>
+      <w:r>
+        <w:t xml:space="preserve"> — barely above Longsys's ~5x. So the street is offering you the companies that </w:t>
+      </w:r>
+      <w:r>
+        <w:rPr>
+          <w:b/>
+        </w:rPr>
+        <w:t>own the shortage</w:t>
+      </w:r>
+      <w:r>
+        <w:t>, in the same cycle, at almost the same forward multiple. Why would you take the assembler?</w:t>
+      </w:r>
+    </w:p>
+    <w:p>
+      <w:r>
+        <w:t>The forward multiples also tell you what the street actually believes: trailing 21x collapsing to forward 7x means the analysts think memory earnings still explode from here. That is the bull case for the whole complex — and if you buy it, buy it through Micron or SanDisk, who capture it directly, rather than through a company whose version of the same upside is an inventory pile it has to keep re-buying at higher prices.</w:t>
+      </w:r>
+    </w:p>
+    <w:p>
+      <w:r>
+        <w:t>One more sanity check — the 2026 A+H hardware shelf, since Longsys joins it next week. Same H-share, same season, very different receptions:</w:t>
+      </w:r>
+    </w:p>
+    <w:tbl>
+      <w:tblPr>
+        <w:tblStyle w:val="LightGrid-Accent1"/>
+        <w:tblW w:type="auto" w:w="0"/>
+        <w:tblLook w:firstColumn="1" w:firstRow="1" w:lastColumn="0" w:lastRow="0" w:noHBand="0" w:noVBand="1" w:val="04A0"/>
+      </w:tblPr>
+      <w:tblGrid>
+        <w:gridCol w:w="1728"/>
+        <w:gridCol w:w="1728"/>
+        <w:gridCol w:w="1728"/>
+        <w:gridCol w:w="1728"/>
+        <w:gridCol w:w="1728"/>
+      </w:tblGrid>
+      <w:tr>
+        <w:tc>
+          <w:tcPr>
             <w:tcW w:type="dxa" w:w="2592"/>
           </w:tcPr>
           <w:p>
@@ -5902,7 +6910,7 @@
         <w:t>Verdict: this is the trade your own deduction warns about — buying the top of an inventory-gain cycle from insiders who are selling it to you.</w:t>
       </w:r>
       <w:r>
-        <w:t xml:space="preserve"> The anchor and stabiliser make the debut low-risk but also low-fun; the real exposure is the Q4 gross-margin print. Skip, or flip small and be out before the cheap inventory runs dry. If you want this cycle in the book, own Ingenic, rent Longsys — or don't rent it at all.</w:t>
+        <w:t xml:space="preserve"> The anchor and stabiliser make the debut low-risk but also low-fun; the real exposure is the Q4 gross-margin print. Skip, or flip small and be out before the cheap inventory runs dry. If you want this cycle in the book: own Ingenic for the China leg, or Micron/SanDisk for the pure version at a forward multiple barely different from what Longsys is asking. Rent Longsys at most — or skip it entirely.</w:t>
       </w:r>
     </w:p>
     <w:p>
@@ -7591,39 +8599,12 @@
         <w:pStyle w:val="Heading1"/>
       </w:pPr>
       <w:r>
-        <w:t>7. Broadcom (AVGO) — reports Wednesday night; what you need before the print</w:t>
+        <w:t>7. Broadcom (AVGO) — it printed; beat and fell anyway</w:t>
       </w:r>
     </w:p>
     <w:p>
       <w:r>
-        <w:t xml:space="preserve">Prints </w:t>
-      </w:r>
-      <w:r>
-        <w:rPr>
-          <w:b/>
-        </w:rPr>
-        <w:t>Wed 2 Sep after the US close</w:t>
-      </w:r>
-      <w:r>
-        <w:t xml:space="preserve"> (Thu morning our time), call 5pm ET — landing mid-VMware Explore. Stock $370, market cap $1.76T, </w:t>
-      </w:r>
-      <w:r>
-        <w:rPr>
-          <w:b/>
-        </w:rPr>
-        <w:t>25% below the June all-time high</w:t>
-      </w:r>
-      <w:r>
-        <w:t xml:space="preserve">, and down ~12% over the 60 days into the print. Options imply a </w:t>
-      </w:r>
-      <w:r>
-        <w:rPr>
-          <w:b/>
-        </w:rPr>
-        <w:t>±7–9% move</w:t>
-      </w:r>
-      <w:r>
-        <w:t>.</w:t>
+        <w:t>Reported Wed 2 Sep after the US close. Everything below was written going in — kept as-is because the pre-print framework is what called the reaction — with the result at the end.</w:t>
       </w:r>
     </w:p>
     <w:p>
@@ -7848,6 +8829,71 @@
     </w:p>
     <w:p>
       <w:pPr>
+        <w:pStyle w:val="Heading2"/>
+      </w:pPr>
+      <w:r>
+        <w:t>Update — it printed Wednesday night, and the pattern held</w:t>
+      </w:r>
+    </w:p>
+    <w:p>
+      <w:pPr>
+        <w:pStyle w:val="ListBullet"/>
+      </w:pPr>
+      <w:r>
+        <w:t xml:space="preserve">The numbers were good: </w:t>
+      </w:r>
+      <w:r>
+        <w:rPr>
+          <w:b/>
+        </w:rPr>
+        <w:t>AI revenue $16.7bn against the $16.0bn guide, +221% year-on-year and +54% sequentially</w:t>
+      </w:r>
+      <w:r>
+        <w:t xml:space="preserve">. Q4 guided to ~93% revenue growth with AI tripling, and they finally put shape on the out-years — </w:t>
+      </w:r>
+      <w:r>
+        <w:rPr>
+          <w:b/>
+        </w:rPr>
+        <w:t>AI revenue doubling in both 2027 and 2028</w:t>
+      </w:r>
+      <w:r>
+        <w:t>.</w:t>
+      </w:r>
+    </w:p>
+    <w:p>
+      <w:pPr>
+        <w:pStyle w:val="ListBullet"/>
+      </w:pPr>
+      <w:r>
+        <w:t xml:space="preserve">And the stock </w:t>
+      </w:r>
+      <w:r>
+        <w:rPr>
+          <w:b/>
+        </w:rPr>
+        <w:t>fell 2.8% to $357</w:t>
+      </w:r>
+      <w:r>
+        <w:t>. Read that again: a clean beat, a raised trajectory, and it still went down. This is the ninth straight beat that the market refused to pay for — the guide was measured against a whisper that had already climbed, and the reaction reverted to the June template.</w:t>
+      </w:r>
+    </w:p>
+    <w:p>
+      <w:pPr>
+        <w:pStyle w:val="ListBullet"/>
+      </w:pPr>
+      <w:r>
+        <w:rPr>
+          <w:b/>
+        </w:rPr>
+        <w:t>The lesson we flagged before the print is now confirmed twice over: this name does not pay you for owning it into results.</w:t>
+      </w:r>
+      <w:r>
+        <w:t xml:space="preserve"> The trade that has worked all cycle is buying the post-print flush, not the print. At $357 you're roughly 28% below the June high with the AI trajectory now formally doubling for two more years — that's a considerably better entry than anything on offer 48 hours ago, and it's the setup we'd rather have.</w:t>
+      </w:r>
+    </w:p>
+    <w:p>
+      <w:pPr>
         <w:pStyle w:val="ListBullet"/>
       </w:pPr>
       <w:r>
@@ -7971,7 +9017,7 @@
         <w:t>Broadcom</w:t>
       </w:r>
       <w:r>
-        <w:t xml:space="preserve"> — prints Wed night US. Scripted beat likely; the stock only pays on a raise (FY27 quantified above $100bn, OpenAI shipping early, or a new name). Positioning finally favours longs (−12% run-in vs +39% into June), but base case is flat-to-down on an as-scripted print. Trade the flush, not the print.</w:t>
+        <w:t xml:space="preserve"> — printed Wednesday: AI $16.7bn vs a $16.0bn guide, +221%, and AI now guided to double in both 2027 and 2028 — and the stock fell 2.8% anyway. Ninth straight beat the market wouldn't pay for. At $357 (−28% off the June high) the entry is finally decent; buy the flush, never the print.</w:t>
       </w:r>
     </w:p>
     <w:p>

</xml_diff>

<commit_message>
IPO note v13: Longsys vs the A+H semi H-share cohort (GigaDevice +200%, Montage +167%, SICC +55%, Novosense +40%, Fortior -3% as the no-AI-story control) — cohort tailwind conceded as the real bull case, but every winner owns a design and is capitalised at 41-100x+ vs Longsys at 8x/2x as an assembler; verdict softened to trade-not-own
Co-Authored-By: Claude Fable 5 <noreply@anthropic.com>
</commit_message>
<xml_diff>
--- a/SHEIN_MechMind_HK_IPO_Note.docx
+++ b/SHEIN_MechMind_HK_IPO_Note.docx
@@ -6049,6 +6049,1137 @@
     <w:p>
       <w:r>
         <w:t>The forward multiples also tell you what the street actually believes: trailing 21x collapsing to forward 7x means the analysts think memory earnings still explode from here. That is the bull case for the whole complex — and if you buy it, buy it through Micron or SanDisk, who capture it directly, rather than through a company whose version of the same upside is an inventory pile it has to keep re-buying at higher prices.</w:t>
+      </w:r>
+    </w:p>
+    <w:p>
+      <w:pPr>
+        <w:pStyle w:val="Heading2"/>
+      </w:pPr>
+      <w:r>
+        <w:t>The cohort Longsys is actually joining — A+H semis in HK</w:t>
+      </w:r>
+    </w:p>
+    <w:p>
+      <w:r>
+        <w:t>This is the most useful shelf of the three, because these are the same trade: a Chinese chip company with a listed A-share bringing an H-line to Hong Kong. Five have done it before Longsys (prices from our own book, 28 Aug; Ingenic 1 Sep):</w:t>
+      </w:r>
+    </w:p>
+    <w:tbl>
+      <w:tblPr>
+        <w:tblStyle w:val="LightGrid-Accent1"/>
+        <w:tblW w:type="auto" w:w="0"/>
+        <w:tblLook w:firstColumn="1" w:firstRow="1" w:lastColumn="0" w:lastRow="0" w:noHBand="0" w:noVBand="1" w:val="04A0"/>
+      </w:tblPr>
+      <w:tblGrid>
+        <w:gridCol w:w="1234"/>
+        <w:gridCol w:w="1234"/>
+        <w:gridCol w:w="1234"/>
+        <w:gridCol w:w="1234"/>
+        <w:gridCol w:w="1234"/>
+        <w:gridCol w:w="1234"/>
+        <w:gridCol w:w="1234"/>
+      </w:tblGrid>
+      <w:tr>
+        <w:tc>
+          <w:tcPr>
+            <w:tcW w:type="dxa" w:w="2160"/>
+          </w:tcPr>
+          <w:p>
+            <w:r/>
+            <w:r>
+              <w:rPr>
+                <w:b/>
+                <w:sz w:val="19"/>
+              </w:rPr>
+              <w:t>H-share</w:t>
+            </w:r>
+          </w:p>
+        </w:tc>
+        <w:tc>
+          <w:tcPr>
+            <w:tcW w:type="dxa" w:w="1152"/>
+          </w:tcPr>
+          <w:p>
+            <w:r/>
+            <w:r>
+              <w:rPr>
+                <w:b/>
+                <w:sz w:val="19"/>
+              </w:rPr>
+              <w:t>Listed</w:t>
+            </w:r>
+          </w:p>
+        </w:tc>
+        <w:tc>
+          <w:tcPr>
+            <w:tcW w:type="dxa" w:w="1152"/>
+          </w:tcPr>
+          <w:p>
+            <w:r/>
+            <w:r>
+              <w:rPr>
+                <w:b/>
+                <w:sz w:val="19"/>
+              </w:rPr>
+              <w:t>Offer</w:t>
+            </w:r>
+          </w:p>
+        </w:tc>
+        <w:tc>
+          <w:tcPr>
+            <w:tcW w:type="dxa" w:w="1152"/>
+          </w:tcPr>
+          <w:p>
+            <w:r/>
+            <w:r>
+              <w:rPr>
+                <w:b/>
+                <w:sz w:val="19"/>
+              </w:rPr>
+              <w:t>Now</w:t>
+            </w:r>
+          </w:p>
+        </w:tc>
+        <w:tc>
+          <w:tcPr>
+            <w:tcW w:type="dxa" w:w="1152"/>
+          </w:tcPr>
+          <w:p>
+            <w:r/>
+            <w:r>
+              <w:rPr>
+                <w:b/>
+                <w:sz w:val="19"/>
+              </w:rPr>
+              <w:t>Day 1</w:t>
+            </w:r>
+          </w:p>
+        </w:tc>
+        <w:tc>
+          <w:tcPr>
+            <w:tcW w:type="dxa" w:w="1296"/>
+          </w:tcPr>
+          <w:p>
+            <w:r/>
+            <w:r>
+              <w:rPr>
+                <w:b/>
+                <w:sz w:val="19"/>
+              </w:rPr>
+              <w:t>vs offer</w:t>
+            </w:r>
+          </w:p>
+        </w:tc>
+        <w:tc>
+          <w:tcPr>
+            <w:tcW w:type="dxa" w:w="3312"/>
+          </w:tcPr>
+          <w:p>
+            <w:r/>
+            <w:r>
+              <w:rPr>
+                <w:b/>
+                <w:sz w:val="19"/>
+              </w:rPr>
+              <w:t>What it owns</w:t>
+            </w:r>
+          </w:p>
+        </w:tc>
+      </w:tr>
+      <w:tr>
+        <w:tc>
+          <w:tcPr>
+            <w:tcW w:type="dxa" w:w="2160"/>
+          </w:tcPr>
+          <w:p>
+            <w:r>
+              <w:rPr>
+                <w:sz w:val="19"/>
+              </w:rPr>
+            </w:r>
+            <w:r>
+              <w:rPr>
+                <w:sz w:val="19"/>
+              </w:rPr>
+              <w:t>GigaDevice 3986</w:t>
+            </w:r>
+          </w:p>
+        </w:tc>
+        <w:tc>
+          <w:tcPr>
+            <w:tcW w:type="dxa" w:w="1152"/>
+          </w:tcPr>
+          <w:p>
+            <w:r>
+              <w:rPr>
+                <w:sz w:val="19"/>
+              </w:rPr>
+            </w:r>
+            <w:r>
+              <w:rPr>
+                <w:sz w:val="19"/>
+              </w:rPr>
+              <w:t>Jan '26</w:t>
+            </w:r>
+          </w:p>
+        </w:tc>
+        <w:tc>
+          <w:tcPr>
+            <w:tcW w:type="dxa" w:w="1152"/>
+          </w:tcPr>
+          <w:p>
+            <w:r>
+              <w:rPr>
+                <w:sz w:val="19"/>
+              </w:rPr>
+            </w:r>
+            <w:r>
+              <w:rPr>
+                <w:sz w:val="19"/>
+              </w:rPr>
+              <w:t>162.00</w:t>
+            </w:r>
+          </w:p>
+        </w:tc>
+        <w:tc>
+          <w:tcPr>
+            <w:tcW w:type="dxa" w:w="1152"/>
+          </w:tcPr>
+          <w:p>
+            <w:r>
+              <w:rPr>
+                <w:sz w:val="19"/>
+              </w:rPr>
+            </w:r>
+            <w:r>
+              <w:rPr>
+                <w:sz w:val="19"/>
+              </w:rPr>
+              <w:t>486.00</w:t>
+            </w:r>
+          </w:p>
+        </w:tc>
+        <w:tc>
+          <w:tcPr>
+            <w:tcW w:type="dxa" w:w="1152"/>
+          </w:tcPr>
+          <w:p>
+            <w:r>
+              <w:rPr>
+                <w:sz w:val="19"/>
+              </w:rPr>
+            </w:r>
+            <w:r>
+              <w:rPr>
+                <w:sz w:val="19"/>
+              </w:rPr>
+              <w:t>+37.5%</w:t>
+            </w:r>
+          </w:p>
+        </w:tc>
+        <w:tc>
+          <w:tcPr>
+            <w:tcW w:type="dxa" w:w="1296"/>
+          </w:tcPr>
+          <w:p>
+            <w:r>
+              <w:rPr>
+                <w:sz w:val="19"/>
+              </w:rPr>
+            </w:r>
+            <w:r>
+              <w:rPr>
+                <w:b/>
+                <w:sz w:val="19"/>
+              </w:rPr>
+              <w:t>+200%</w:t>
+            </w:r>
+          </w:p>
+        </w:tc>
+        <w:tc>
+          <w:tcPr>
+            <w:tcW w:type="dxa" w:w="3312"/>
+          </w:tcPr>
+          <w:p>
+            <w:r>
+              <w:rPr>
+                <w:sz w:val="19"/>
+              </w:rPr>
+            </w:r>
+            <w:r>
+              <w:rPr>
+                <w:sz w:val="19"/>
+              </w:rPr>
+              <w:t>NOR / niche DRAM / MCU designs</w:t>
+            </w:r>
+          </w:p>
+        </w:tc>
+      </w:tr>
+      <w:tr>
+        <w:tc>
+          <w:tcPr>
+            <w:tcW w:type="dxa" w:w="2160"/>
+          </w:tcPr>
+          <w:p>
+            <w:r>
+              <w:rPr>
+                <w:sz w:val="19"/>
+              </w:rPr>
+            </w:r>
+            <w:r>
+              <w:rPr>
+                <w:sz w:val="19"/>
+              </w:rPr>
+              <w:t>Montage 6809</w:t>
+            </w:r>
+          </w:p>
+        </w:tc>
+        <w:tc>
+          <w:tcPr>
+            <w:tcW w:type="dxa" w:w="1152"/>
+          </w:tcPr>
+          <w:p>
+            <w:r>
+              <w:rPr>
+                <w:sz w:val="19"/>
+              </w:rPr>
+            </w:r>
+            <w:r>
+              <w:rPr>
+                <w:sz w:val="19"/>
+              </w:rPr>
+              <w:t>Feb '26</w:t>
+            </w:r>
+          </w:p>
+        </w:tc>
+        <w:tc>
+          <w:tcPr>
+            <w:tcW w:type="dxa" w:w="1152"/>
+          </w:tcPr>
+          <w:p>
+            <w:r>
+              <w:rPr>
+                <w:sz w:val="19"/>
+              </w:rPr>
+            </w:r>
+            <w:r>
+              <w:rPr>
+                <w:sz w:val="19"/>
+              </w:rPr>
+              <w:t>106.89</w:t>
+            </w:r>
+          </w:p>
+        </w:tc>
+        <w:tc>
+          <w:tcPr>
+            <w:tcW w:type="dxa" w:w="1152"/>
+          </w:tcPr>
+          <w:p>
+            <w:r>
+              <w:rPr>
+                <w:sz w:val="19"/>
+              </w:rPr>
+            </w:r>
+            <w:r>
+              <w:rPr>
+                <w:sz w:val="19"/>
+              </w:rPr>
+              <w:t>285.00</w:t>
+            </w:r>
+          </w:p>
+        </w:tc>
+        <w:tc>
+          <w:tcPr>
+            <w:tcW w:type="dxa" w:w="1152"/>
+          </w:tcPr>
+          <w:p>
+            <w:r>
+              <w:rPr>
+                <w:sz w:val="19"/>
+              </w:rPr>
+            </w:r>
+            <w:r>
+              <w:rPr>
+                <w:sz w:val="19"/>
+              </w:rPr>
+              <w:t>+63.7%</w:t>
+            </w:r>
+          </w:p>
+        </w:tc>
+        <w:tc>
+          <w:tcPr>
+            <w:tcW w:type="dxa" w:w="1296"/>
+          </w:tcPr>
+          <w:p>
+            <w:r>
+              <w:rPr>
+                <w:sz w:val="19"/>
+              </w:rPr>
+            </w:r>
+            <w:r>
+              <w:rPr>
+                <w:b/>
+                <w:sz w:val="19"/>
+              </w:rPr>
+              <w:t>+167%</w:t>
+            </w:r>
+          </w:p>
+        </w:tc>
+        <w:tc>
+          <w:tcPr>
+            <w:tcW w:type="dxa" w:w="3312"/>
+          </w:tcPr>
+          <w:p>
+            <w:r>
+              <w:rPr>
+                <w:sz w:val="19"/>
+              </w:rPr>
+            </w:r>
+            <w:r>
+              <w:rPr>
+                <w:sz w:val="19"/>
+              </w:rPr>
+              <w:t>DDR5 interconnect designs</w:t>
+            </w:r>
+          </w:p>
+        </w:tc>
+      </w:tr>
+      <w:tr>
+        <w:tc>
+          <w:tcPr>
+            <w:tcW w:type="dxa" w:w="2160"/>
+          </w:tcPr>
+          <w:p>
+            <w:r>
+              <w:rPr>
+                <w:sz w:val="19"/>
+              </w:rPr>
+            </w:r>
+            <w:r>
+              <w:rPr>
+                <w:sz w:val="19"/>
+              </w:rPr>
+              <w:t>SICC 天岳 2631</w:t>
+            </w:r>
+          </w:p>
+        </w:tc>
+        <w:tc>
+          <w:tcPr>
+            <w:tcW w:type="dxa" w:w="1152"/>
+          </w:tcPr>
+          <w:p>
+            <w:r>
+              <w:rPr>
+                <w:sz w:val="19"/>
+              </w:rPr>
+            </w:r>
+            <w:r>
+              <w:rPr>
+                <w:sz w:val="19"/>
+              </w:rPr>
+              <w:t>Aug '25</w:t>
+            </w:r>
+          </w:p>
+        </w:tc>
+        <w:tc>
+          <w:tcPr>
+            <w:tcW w:type="dxa" w:w="1152"/>
+          </w:tcPr>
+          <w:p>
+            <w:r>
+              <w:rPr>
+                <w:sz w:val="19"/>
+              </w:rPr>
+            </w:r>
+            <w:r>
+              <w:rPr>
+                <w:sz w:val="19"/>
+              </w:rPr>
+              <w:t>42.80</w:t>
+            </w:r>
+          </w:p>
+        </w:tc>
+        <w:tc>
+          <w:tcPr>
+            <w:tcW w:type="dxa" w:w="1152"/>
+          </w:tcPr>
+          <w:p>
+            <w:r>
+              <w:rPr>
+                <w:sz w:val="19"/>
+              </w:rPr>
+            </w:r>
+            <w:r>
+              <w:rPr>
+                <w:sz w:val="19"/>
+              </w:rPr>
+              <w:t>66.20</w:t>
+            </w:r>
+          </w:p>
+        </w:tc>
+        <w:tc>
+          <w:tcPr>
+            <w:tcW w:type="dxa" w:w="1152"/>
+          </w:tcPr>
+          <w:p>
+            <w:r>
+              <w:rPr>
+                <w:sz w:val="19"/>
+              </w:rPr>
+            </w:r>
+            <w:r>
+              <w:rPr>
+                <w:sz w:val="19"/>
+              </w:rPr>
+              <w:t>+6.4%</w:t>
+            </w:r>
+          </w:p>
+        </w:tc>
+        <w:tc>
+          <w:tcPr>
+            <w:tcW w:type="dxa" w:w="1296"/>
+          </w:tcPr>
+          <w:p>
+            <w:r>
+              <w:rPr>
+                <w:sz w:val="19"/>
+              </w:rPr>
+            </w:r>
+            <w:r>
+              <w:rPr>
+                <w:sz w:val="19"/>
+              </w:rPr>
+              <w:t>+55%</w:t>
+            </w:r>
+          </w:p>
+        </w:tc>
+        <w:tc>
+          <w:tcPr>
+            <w:tcW w:type="dxa" w:w="3312"/>
+          </w:tcPr>
+          <w:p>
+            <w:r>
+              <w:rPr>
+                <w:sz w:val="19"/>
+              </w:rPr>
+            </w:r>
+            <w:r>
+              <w:rPr>
+                <w:sz w:val="19"/>
+              </w:rPr>
+              <w:t>SiC substrate crystal tech</w:t>
+            </w:r>
+          </w:p>
+        </w:tc>
+      </w:tr>
+      <w:tr>
+        <w:tc>
+          <w:tcPr>
+            <w:tcW w:type="dxa" w:w="2160"/>
+          </w:tcPr>
+          <w:p>
+            <w:r>
+              <w:rPr>
+                <w:sz w:val="19"/>
+              </w:rPr>
+            </w:r>
+            <w:r>
+              <w:rPr>
+                <w:sz w:val="19"/>
+              </w:rPr>
+              <w:t>Novosense 2676</w:t>
+            </w:r>
+          </w:p>
+        </w:tc>
+        <w:tc>
+          <w:tcPr>
+            <w:tcW w:type="dxa" w:w="1152"/>
+          </w:tcPr>
+          <w:p>
+            <w:r>
+              <w:rPr>
+                <w:sz w:val="19"/>
+              </w:rPr>
+            </w:r>
+            <w:r>
+              <w:rPr>
+                <w:sz w:val="19"/>
+              </w:rPr>
+              <w:t>Dec '25</w:t>
+            </w:r>
+          </w:p>
+        </w:tc>
+        <w:tc>
+          <w:tcPr>
+            <w:tcW w:type="dxa" w:w="1152"/>
+          </w:tcPr>
+          <w:p>
+            <w:r>
+              <w:rPr>
+                <w:sz w:val="19"/>
+              </w:rPr>
+            </w:r>
+            <w:r>
+              <w:rPr>
+                <w:sz w:val="19"/>
+              </w:rPr>
+              <w:t>116.00</w:t>
+            </w:r>
+          </w:p>
+        </w:tc>
+        <w:tc>
+          <w:tcPr>
+            <w:tcW w:type="dxa" w:w="1152"/>
+          </w:tcPr>
+          <w:p>
+            <w:r>
+              <w:rPr>
+                <w:sz w:val="19"/>
+              </w:rPr>
+            </w:r>
+            <w:r>
+              <w:rPr>
+                <w:sz w:val="19"/>
+              </w:rPr>
+              <w:t>162.40</w:t>
+            </w:r>
+          </w:p>
+        </w:tc>
+        <w:tc>
+          <w:tcPr>
+            <w:tcW w:type="dxa" w:w="1152"/>
+          </w:tcPr>
+          <w:p>
+            <w:r>
+              <w:rPr>
+                <w:sz w:val="19"/>
+              </w:rPr>
+            </w:r>
+            <w:r>
+              <w:rPr>
+                <w:sz w:val="19"/>
+              </w:rPr>
+              <w:t>−4.3%</w:t>
+            </w:r>
+          </w:p>
+        </w:tc>
+        <w:tc>
+          <w:tcPr>
+            <w:tcW w:type="dxa" w:w="1296"/>
+          </w:tcPr>
+          <w:p>
+            <w:r>
+              <w:rPr>
+                <w:sz w:val="19"/>
+              </w:rPr>
+            </w:r>
+            <w:r>
+              <w:rPr>
+                <w:sz w:val="19"/>
+              </w:rPr>
+              <w:t>+40%</w:t>
+            </w:r>
+          </w:p>
+        </w:tc>
+        <w:tc>
+          <w:tcPr>
+            <w:tcW w:type="dxa" w:w="3312"/>
+          </w:tcPr>
+          <w:p>
+            <w:r>
+              <w:rPr>
+                <w:sz w:val="19"/>
+              </w:rPr>
+            </w:r>
+            <w:r>
+              <w:rPr>
+                <w:sz w:val="19"/>
+              </w:rPr>
+              <w:t>analog designs</w:t>
+            </w:r>
+          </w:p>
+        </w:tc>
+      </w:tr>
+      <w:tr>
+        <w:tc>
+          <w:tcPr>
+            <w:tcW w:type="dxa" w:w="2160"/>
+          </w:tcPr>
+          <w:p>
+            <w:r>
+              <w:rPr>
+                <w:sz w:val="19"/>
+              </w:rPr>
+            </w:r>
+            <w:r>
+              <w:rPr>
+                <w:sz w:val="19"/>
+              </w:rPr>
+              <w:t>Fortior 峰岹 1304</w:t>
+            </w:r>
+          </w:p>
+        </w:tc>
+        <w:tc>
+          <w:tcPr>
+            <w:tcW w:type="dxa" w:w="1152"/>
+          </w:tcPr>
+          <w:p>
+            <w:r>
+              <w:rPr>
+                <w:sz w:val="19"/>
+              </w:rPr>
+            </w:r>
+            <w:r>
+              <w:rPr>
+                <w:sz w:val="19"/>
+              </w:rPr>
+              <w:t>Jul '25</w:t>
+            </w:r>
+          </w:p>
+        </w:tc>
+        <w:tc>
+          <w:tcPr>
+            <w:tcW w:type="dxa" w:w="1152"/>
+          </w:tcPr>
+          <w:p>
+            <w:r>
+              <w:rPr>
+                <w:sz w:val="19"/>
+              </w:rPr>
+            </w:r>
+            <w:r>
+              <w:rPr>
+                <w:sz w:val="19"/>
+              </w:rPr>
+              <w:t>120.50</w:t>
+            </w:r>
+          </w:p>
+        </w:tc>
+        <w:tc>
+          <w:tcPr>
+            <w:tcW w:type="dxa" w:w="1152"/>
+          </w:tcPr>
+          <w:p>
+            <w:r>
+              <w:rPr>
+                <w:sz w:val="19"/>
+              </w:rPr>
+            </w:r>
+            <w:r>
+              <w:rPr>
+                <w:sz w:val="19"/>
+              </w:rPr>
+              <w:t>117.40</w:t>
+            </w:r>
+          </w:p>
+        </w:tc>
+        <w:tc>
+          <w:tcPr>
+            <w:tcW w:type="dxa" w:w="1152"/>
+          </w:tcPr>
+          <w:p>
+            <w:r>
+              <w:rPr>
+                <w:sz w:val="19"/>
+              </w:rPr>
+            </w:r>
+            <w:r>
+              <w:rPr>
+                <w:sz w:val="19"/>
+              </w:rPr>
+              <w:t>+16.0%</w:t>
+            </w:r>
+          </w:p>
+        </w:tc>
+        <w:tc>
+          <w:tcPr>
+            <w:tcW w:type="dxa" w:w="1296"/>
+          </w:tcPr>
+          <w:p>
+            <w:r>
+              <w:rPr>
+                <w:sz w:val="19"/>
+              </w:rPr>
+            </w:r>
+            <w:r>
+              <w:rPr>
+                <w:sz w:val="19"/>
+              </w:rPr>
+              <w:t>−2.6%</w:t>
+            </w:r>
+          </w:p>
+        </w:tc>
+        <w:tc>
+          <w:tcPr>
+            <w:tcW w:type="dxa" w:w="3312"/>
+          </w:tcPr>
+          <w:p>
+            <w:r>
+              <w:rPr>
+                <w:sz w:val="19"/>
+              </w:rPr>
+            </w:r>
+            <w:r>
+              <w:rPr>
+                <w:sz w:val="19"/>
+              </w:rPr>
+              <w:t>motor-driver designs (no AI story)</w:t>
+            </w:r>
+          </w:p>
+        </w:tc>
+      </w:tr>
+      <w:tr>
+        <w:tc>
+          <w:tcPr>
+            <w:tcW w:type="dxa" w:w="2160"/>
+          </w:tcPr>
+          <w:p>
+            <w:r>
+              <w:rPr>
+                <w:sz w:val="19"/>
+              </w:rPr>
+            </w:r>
+            <w:r>
+              <w:rPr>
+                <w:sz w:val="19"/>
+              </w:rPr>
+              <w:t>Ingenic 3223</w:t>
+            </w:r>
+          </w:p>
+        </w:tc>
+        <w:tc>
+          <w:tcPr>
+            <w:tcW w:type="dxa" w:w="1152"/>
+          </w:tcPr>
+          <w:p>
+            <w:r>
+              <w:rPr>
+                <w:sz w:val="19"/>
+              </w:rPr>
+            </w:r>
+            <w:r>
+              <w:rPr>
+                <w:sz w:val="19"/>
+              </w:rPr>
+              <w:t>Aug '26</w:t>
+            </w:r>
+          </w:p>
+        </w:tc>
+        <w:tc>
+          <w:tcPr>
+            <w:tcW w:type="dxa" w:w="1152"/>
+          </w:tcPr>
+          <w:p>
+            <w:r>
+              <w:rPr>
+                <w:sz w:val="19"/>
+              </w:rPr>
+            </w:r>
+            <w:r>
+              <w:rPr>
+                <w:sz w:val="19"/>
+              </w:rPr>
+              <w:t>100.00</w:t>
+            </w:r>
+          </w:p>
+        </w:tc>
+        <w:tc>
+          <w:tcPr>
+            <w:tcW w:type="dxa" w:w="1152"/>
+          </w:tcPr>
+          <w:p>
+            <w:r>
+              <w:rPr>
+                <w:sz w:val="19"/>
+              </w:rPr>
+            </w:r>
+            <w:r>
+              <w:rPr>
+                <w:sz w:val="19"/>
+              </w:rPr>
+              <w:t>~100</w:t>
+            </w:r>
+          </w:p>
+        </w:tc>
+        <w:tc>
+          <w:tcPr>
+            <w:tcW w:type="dxa" w:w="1152"/>
+          </w:tcPr>
+          <w:p>
+            <w:r>
+              <w:rPr>
+                <w:sz w:val="19"/>
+              </w:rPr>
+            </w:r>
+            <w:r>
+              <w:rPr>
+                <w:sz w:val="19"/>
+              </w:rPr>
+              <w:t>0.0%</w:t>
+            </w:r>
+          </w:p>
+        </w:tc>
+        <w:tc>
+          <w:tcPr>
+            <w:tcW w:type="dxa" w:w="1296"/>
+          </w:tcPr>
+          <w:p>
+            <w:r>
+              <w:rPr>
+                <w:sz w:val="19"/>
+              </w:rPr>
+            </w:r>
+            <w:r>
+              <w:rPr>
+                <w:sz w:val="19"/>
+              </w:rPr>
+              <w:t>~0%</w:t>
+            </w:r>
+          </w:p>
+        </w:tc>
+        <w:tc>
+          <w:tcPr>
+            <w:tcW w:type="dxa" w:w="3312"/>
+          </w:tcPr>
+          <w:p>
+            <w:r>
+              <w:rPr>
+                <w:sz w:val="19"/>
+              </w:rPr>
+            </w:r>
+            <w:r>
+              <w:rPr>
+                <w:sz w:val="19"/>
+              </w:rPr>
+              <w:t>auto SRAM / niche DRAM designs</w:t>
+            </w:r>
+          </w:p>
+        </w:tc>
+      </w:tr>
+      <w:tr>
+        <w:tc>
+          <w:tcPr>
+            <w:tcW w:type="dxa" w:w="2160"/>
+          </w:tcPr>
+          <w:p>
+            <w:r>
+              <w:rPr>
+                <w:sz w:val="19"/>
+              </w:rPr>
+            </w:r>
+            <w:r>
+              <w:rPr>
+                <w:b/>
+                <w:sz w:val="19"/>
+              </w:rPr>
+              <w:t>Longsys 9976</w:t>
+            </w:r>
+          </w:p>
+        </w:tc>
+        <w:tc>
+          <w:tcPr>
+            <w:tcW w:type="dxa" w:w="1152"/>
+          </w:tcPr>
+          <w:p>
+            <w:r>
+              <w:rPr>
+                <w:sz w:val="19"/>
+              </w:rPr>
+            </w:r>
+            <w:r>
+              <w:rPr>
+                <w:b/>
+                <w:sz w:val="19"/>
+              </w:rPr>
+              <w:t>8 Sep</w:t>
+            </w:r>
+          </w:p>
+        </w:tc>
+        <w:tc>
+          <w:tcPr>
+            <w:tcW w:type="dxa" w:w="1152"/>
+          </w:tcPr>
+          <w:p>
+            <w:r>
+              <w:rPr>
+                <w:sz w:val="19"/>
+              </w:rPr>
+            </w:r>
+            <w:r>
+              <w:rPr>
+                <w:b/>
+                <w:sz w:val="19"/>
+              </w:rPr>
+              <w:t>≤240.60</w:t>
+            </w:r>
+          </w:p>
+        </w:tc>
+        <w:tc>
+          <w:tcPr>
+            <w:tcW w:type="dxa" w:w="1152"/>
+          </w:tcPr>
+          <w:p>
+            <w:r>
+              <w:rPr>
+                <w:sz w:val="19"/>
+              </w:rPr>
+            </w:r>
+            <w:r>
+              <w:rPr>
+                <w:sz w:val="19"/>
+              </w:rPr>
+              <w:t>—</w:t>
+            </w:r>
+          </w:p>
+        </w:tc>
+        <w:tc>
+          <w:tcPr>
+            <w:tcW w:type="dxa" w:w="1152"/>
+          </w:tcPr>
+          <w:p>
+            <w:r>
+              <w:rPr>
+                <w:sz w:val="19"/>
+              </w:rPr>
+            </w:r>
+            <w:r>
+              <w:rPr>
+                <w:sz w:val="19"/>
+              </w:rPr>
+              <w:t>—</w:t>
+            </w:r>
+          </w:p>
+        </w:tc>
+        <w:tc>
+          <w:tcPr>
+            <w:tcW w:type="dxa" w:w="1296"/>
+          </w:tcPr>
+          <w:p>
+            <w:r>
+              <w:rPr>
+                <w:sz w:val="19"/>
+              </w:rPr>
+            </w:r>
+            <w:r>
+              <w:rPr>
+                <w:sz w:val="19"/>
+              </w:rPr>
+              <w:t>—</w:t>
+            </w:r>
+          </w:p>
+        </w:tc>
+        <w:tc>
+          <w:tcPr>
+            <w:tcW w:type="dxa" w:w="3312"/>
+          </w:tcPr>
+          <w:p>
+            <w:r>
+              <w:rPr>
+                <w:sz w:val="19"/>
+              </w:rPr>
+            </w:r>
+            <w:r>
+              <w:rPr>
+                <w:b/>
+                <w:sz w:val="19"/>
+              </w:rPr>
+              <w:t>packaging, brand, channel</w:t>
+            </w:r>
+          </w:p>
+        </w:tc>
+      </w:tr>
+    </w:tbl>
+    <w:p/>
+    <w:p>
+      <w:r>
+        <w:t>Two honest conclusions, and they pull in opposite directions.</w:t>
+      </w:r>
+    </w:p>
+    <w:p>
+      <w:pPr>
+        <w:pStyle w:val="ListNumber"/>
+      </w:pPr>
+      <w:r>
+        <w:rPr>
+          <w:b/>
+        </w:rPr>
+        <w:t>The bull one first, because it's real: this cohort has been the best trade in Hong Kong this year.</w:t>
+      </w:r>
+      <w:r>
+        <w:t xml:space="preserve"> Four of the five are up big, two of them tripled, and the day-one pops were healthy (GigaDevice +38%, Montage +64%). If you simply pattern-match — Chinese semi, A+H, deep discount, memory cycle — you buy Longsys and don't overthink it. That tailwind is the strongest argument against our skip call, and we'd rather say so than pretend it isn't there. Note also who the one loser is: </w:t>
+      </w:r>
+      <w:r>
+        <w:rPr>
+          <w:b/>
+        </w:rPr>
+        <w:t>Fortior, the only name in the group with no AI or memory story.</w:t>
+      </w:r>
+      <w:r>
+        <w:t xml:space="preserve"> The market in HK is paying for the theme, and Longsys has the theme.</w:t>
+      </w:r>
+    </w:p>
+    <w:p>
+      <w:pPr>
+        <w:pStyle w:val="ListNumber"/>
+      </w:pPr>
+      <w:r>
+        <w:rPr>
+          <w:b/>
+        </w:rPr>
+        <w:t>But look at the right-hand column — every single winner owns a design.</w:t>
+      </w:r>
+      <w:r>
+        <w:t xml:space="preserve"> GigaDevice owns NOR and niche DRAM, Montage owns the DDR5 interconnect, SICC owns crystal growth, Novosense owns analog IP, Ingenic owns auto-qualified sockets. And the market prices that ownership explicitly: GigaDevice trades around </w:t>
+      </w:r>
+      <w:r>
+        <w:rPr>
+          <w:b/>
+        </w:rPr>
+        <w:t>41x trailing earnings and ~20x sales</w:t>
+      </w:r>
+      <w:r>
+        <w:t xml:space="preserve">, Montage above </w:t>
+      </w:r>
+      <w:r>
+        <w:rPr>
+          <w:b/>
+        </w:rPr>
+        <w:t>100x</w:t>
+      </w:r>
+      <w:r>
+        <w:t xml:space="preserve">, Novosense at </w:t>
+      </w:r>
+      <w:r>
+        <w:rPr>
+          <w:b/>
+        </w:rPr>
+        <w:t>11x sales while losing money</w:t>
+      </w:r>
+      <w:r>
+        <w:t xml:space="preserve">. Longsys arrives at </w:t>
+      </w:r>
+      <w:r>
+        <w:rPr>
+          <w:b/>
+        </w:rPr>
+        <w:t>~8x earnings and ~2x sales.</w:t>
+      </w:r>
+      <w:r>
+        <w:t xml:space="preserve"> That is not the market overlooking a bargain — it's the market saying these are different asset classes. Designer earnings get capitalised; assembler earnings get discounted, because everyone remembers 2023, when Longsys's gross margin hit 4.7% and GigaDevice's never went below thirty.</w:t>
+      </w:r>
+    </w:p>
+    <w:p>
+      <w:r>
+        <w:t xml:space="preserve">So where does that leave the price? We'd say the discount is </w:t>
+      </w:r>
+      <w:r>
+        <w:rPr>
+          <w:b/>
+        </w:rPr>
+        <w:t>deserved but slightly overdone for the debut, and correct for the holding.</w:t>
+      </w:r>
+      <w:r>
+        <w:t xml:space="preserve"> The cohort tailwind, the 44% A/H discount and a stabilising agent make a decent day one genuinely likely — more likely than we implied earlier, and better odds than Ingenic's flat debut suggests, since Ingenic came with no theme premium and a 927x book of pure flippers. What we won't do is confuse that with value. Longsys at 8x is not GigaDevice at 41x waiting to converge; it is a different business being priced correctly by a market that has already run this experiment five times.</w:t>
       </w:r>
     </w:p>
     <w:p>

</xml_diff>